<commit_message>
Atualização e unificação da documentação de experimentos
</commit_message>
<xml_diff>
--- a/Documentation/Documentacao Unificada de Experimentos.docx
+++ b/Documentation/Documentacao Unificada de Experimentos.docx
@@ -94,22 +94,7 @@
         <w:t>→</w:t>
       </w:r>
       <w:r>
-        <w:t xml:space="preserve"> Artigo de referência - </w:t>
-      </w:r>
-      <w:r>
-        <w:t>An</w:t>
-      </w:r>
-      <w:r>
-        <w:t xml:space="preserve"> image is Worth 16x16 words: Transformers for i</w:t>
-      </w:r>
-      <w:r>
-        <w:t>ma</w:t>
-      </w:r>
-      <w:r>
-        <w:t>ge recognition at scale</w:t>
-      </w:r>
-      <w:r>
-        <w:t xml:space="preserve">. </w:t>
+        <w:t xml:space="preserve"> Artigo de referência - An image is Worth 16x16 words: Transformers for image recognition at scale. </w:t>
       </w:r>
     </w:p>
     <w:p>
@@ -210,10 +195,7 @@
         <w:t>O repositório oficial do ViT usa TFRecords</w:t>
       </w:r>
       <w:r>
-        <w:t xml:space="preserve">, </w:t>
-      </w:r>
-      <w:r>
-        <w:t>(A descrição do TFRecords está detalhada no item B dessa seção. No tópico referente à ResNet);</w:t>
+        <w:t>, (A descrição do TFRecords está detalhada no item B dessa seção. No tópico referente à ResNet);</w:t>
       </w:r>
     </w:p>
     <w:p>
@@ -335,28 +317,7 @@
           <w:b/>
           <w:bCs/>
         </w:rPr>
-        <w:t xml:space="preserve">Configurações estruturais para </w:t>
-      </w:r>
-      <w:r>
-        <w:rPr>
-          <w:b/>
-          <w:bCs/>
-        </w:rPr>
-        <w:t>o</w:t>
-      </w:r>
-      <w:r>
-        <w:rPr>
-          <w:b/>
-          <w:bCs/>
-        </w:rPr>
-        <w:t xml:space="preserve"> modelo ViT</w:t>
-      </w:r>
-      <w:r>
-        <w:rPr>
-          <w:b/>
-          <w:bCs/>
-        </w:rPr>
-        <w:t>:</w:t>
+        <w:t>Configurações estruturais para o modelo ViT:</w:t>
       </w:r>
     </w:p>
     <w:p>
@@ -1352,13 +1313,7 @@
         <w:t xml:space="preserve">Log de resultados: </w:t>
       </w:r>
       <w:r>
-        <w:t>neste</w:t>
-      </w:r>
-      <w:r>
-        <w:t xml:space="preserve"> experimento, o treino </w:t>
-      </w:r>
-      <w:r>
-        <w:t>apresentou um erro</w:t>
+        <w:t>neste experimento, o treino apresentou um erro</w:t>
       </w:r>
       <w:r>
         <w:t xml:space="preserve"> referente às API’s de validação dos resultados:</w:t>
@@ -1414,6 +1369,7 @@
         <w:rPr>
           <w:b/>
           <w:bCs/>
+          <w:noProof/>
         </w:rPr>
         <w:drawing>
           <wp:inline distT="0" distB="0" distL="0" distR="0" wp14:anchorId="1E53A97A" wp14:editId="565F81FF">
@@ -1919,13 +1875,7 @@
         <w:t>Configuração do treinamento (Fine-Tunning):</w:t>
       </w:r>
       <w:r>
-        <w:t xml:space="preserve"> Os valores dos parâmetros utilizados para o treinamento do modelo estão descritos pela Figura </w:t>
-      </w:r>
-      <w:r>
-        <w:t>7</w:t>
-      </w:r>
-      <w:r>
-        <w:t>, seguindo estritamente as definições do artigo</w:t>
+        <w:t xml:space="preserve"> Os valores dos parâmetros utilizados para o treinamento do modelo estão descritos pela Figura 7, seguindo estritamente as definições do artigo</w:t>
       </w:r>
     </w:p>
     <w:p>
@@ -2230,14 +2180,7 @@
           <w:b/>
           <w:bCs/>
         </w:rPr>
-        <w:t>Análise da validação:</w:t>
-      </w:r>
-      <w:r>
-        <w:rPr>
-          <w:b/>
-          <w:bCs/>
-        </w:rPr>
-        <w:t xml:space="preserve"> </w:t>
+        <w:t xml:space="preserve">Análise da validação: </w:t>
       </w:r>
       <w:r>
         <w:t>Top-1 = 0 Em todas as etapas. O batch pequeno explica a instabilidade do treino, mas não explica o valor da validação. O mais provável é que exista algum erro no processo de validação propriamente dito, não no treino como um todo. Testes futuros vão permitir a solução desta incógnita. Se este for o caso, não é necessário preocupações por agora.</w:t>
@@ -2347,14 +2290,7 @@
           <w:b/>
           <w:bCs/>
         </w:rPr>
-        <w:t>Implementação da arquitetura ResNet-50</w:t>
-      </w:r>
-      <w:r>
-        <w:rPr>
-          <w:b/>
-          <w:bCs/>
-        </w:rPr>
-        <w:t xml:space="preserve"> </w:t>
+        <w:t xml:space="preserve">Implementação da arquitetura ResNet-50 </w:t>
       </w:r>
       <w:r>
         <w:rPr>
@@ -2363,13 +2299,7 @@
         <w:t>→</w:t>
       </w:r>
       <w:r>
-        <w:t xml:space="preserve"> </w:t>
-      </w:r>
-      <w:r>
-        <w:t>Artigo de referência - Deep Residual Learning for Image Recognition</w:t>
-      </w:r>
-      <w:r>
-        <w:t>.</w:t>
+        <w:t xml:space="preserve"> Artigo de referência - Deep Residual Learning for Image Recognition.</w:t>
       </w:r>
     </w:p>
     <w:p>
@@ -2414,14 +2344,7 @@
           <w:b/>
           <w:bCs/>
         </w:rPr>
-        <w:t>Carregamento dos dados</w:t>
-      </w:r>
-      <w:r>
-        <w:rPr>
-          <w:b/>
-          <w:bCs/>
-        </w:rPr>
-        <w:t xml:space="preserve">: </w:t>
+        <w:t xml:space="preserve">Carregamento dos dados: </w:t>
       </w:r>
       <w:r>
         <w:rPr>
@@ -3013,10 +2936,7 @@
         <w:jc w:val="both"/>
       </w:pPr>
       <w:r>
-        <w:t>A</w:t>
-      </w:r>
-      <w:r>
-        <w:t xml:space="preserve">s definições estruturais da arquitetura ResNet-50 seguem fielmente às especificações descritas pelos autores, conforme é exibido pela figura </w:t>
+        <w:t xml:space="preserve">As definições estruturais da arquitetura ResNet-50 seguem fielmente às especificações descritas pelos autores, conforme é exibido pela figura </w:t>
       </w:r>
       <w:r>
         <w:t>12</w:t>
@@ -3997,13 +3917,7 @@
         <w:t xml:space="preserve">STEP_PER_EPOCH = </w:t>
       </w:r>
       <w:r>
-        <w:t>347 e EPOCHS =</w:t>
-      </w:r>
-      <w:r>
-        <w:t xml:space="preserve"> </w:t>
-      </w:r>
-      <w:r>
-        <w:t>5</w:t>
+        <w:t>347 e EPOCHS = 5</w:t>
       </w:r>
     </w:p>
     <w:p>
@@ -4029,10 +3943,7 @@
         <w:t>→</w:t>
       </w:r>
       <w:r>
-        <w:t xml:space="preserve"> </w:t>
-      </w:r>
-      <w:r>
-        <w:t>Parâmetros:</w:t>
+        <w:t xml:space="preserve"> Parâmetros:</w:t>
       </w:r>
     </w:p>
     <w:p>
@@ -4067,14 +3978,7 @@
           <w:sz w:val="18"/>
           <w:szCs w:val="18"/>
         </w:rPr>
-        <w:t xml:space="preserve"> 1</w:t>
-      </w:r>
-      <w:r>
-        <w:rPr>
-          <w:sz w:val="18"/>
-          <w:szCs w:val="18"/>
-        </w:rPr>
-        <w:t>6</w:t>
+        <w:t xml:space="preserve"> 16</w:t>
       </w:r>
       <w:r>
         <w:rPr>
@@ -4205,14 +4109,7 @@
           <w:sz w:val="18"/>
           <w:szCs w:val="18"/>
         </w:rPr>
-        <w:t xml:space="preserve"> </w:t>
-      </w:r>
-      <w:r>
-        <w:rPr>
-          <w:sz w:val="18"/>
-          <w:szCs w:val="18"/>
-        </w:rPr>
-        <w:t>17</w:t>
+        <w:t xml:space="preserve"> 17</w:t>
       </w:r>
       <w:r>
         <w:rPr>
@@ -4323,42 +4220,7 @@
           <w:b/>
           <w:bCs/>
         </w:rPr>
-        <w:t xml:space="preserve">Análise da </w:t>
-      </w:r>
-      <w:r>
-        <w:rPr>
-          <w:b/>
-          <w:bCs/>
-        </w:rPr>
-        <w:t>perda</w:t>
-      </w:r>
-      <w:r>
-        <w:rPr>
-          <w:b/>
-          <w:bCs/>
-        </w:rPr>
-        <w:t xml:space="preserve"> </w:t>
-      </w:r>
-      <w:r>
-        <w:rPr>
-          <w:b/>
-          <w:bCs/>
-        </w:rPr>
-        <w:t>no</w:t>
-      </w:r>
-      <w:r>
-        <w:rPr>
-          <w:b/>
-          <w:bCs/>
-        </w:rPr>
-        <w:t xml:space="preserve"> treinamento:</w:t>
-      </w:r>
-      <w:r>
-        <w:rPr>
-          <w:b/>
-          <w:bCs/>
-        </w:rPr>
-        <w:t xml:space="preserve"> </w:t>
+        <w:t xml:space="preserve">Análise da perda no treinamento: </w:t>
       </w:r>
       <w:r>
         <w:t>Na primeira época, a loss apresenta valor aproximado de 6.99, estabilizando em torno de 6.87 nas épocas seguintes. Para um problema de classificação com 1000 classes, a perda teórica associada a uma predição aleatória é dada por log(1000) ≈ 6.907. Portanto, os valores observados estão extremamente próximos do comportamento esperado para um modelo inicialmente não treinado, com uma leve redução ao longo das épocas.</w:t>
@@ -4402,21 +4264,7 @@
           <w:b/>
           <w:bCs/>
         </w:rPr>
-        <w:t xml:space="preserve"> </w:t>
-      </w:r>
-      <w:r>
-        <w:rPr>
-          <w:b/>
-          <w:bCs/>
-        </w:rPr>
-        <w:t>no</w:t>
-      </w:r>
-      <w:r>
-        <w:rPr>
-          <w:b/>
-          <w:bCs/>
-        </w:rPr>
-        <w:t xml:space="preserve"> treinamento</w:t>
+        <w:t xml:space="preserve"> no treinamento</w:t>
       </w:r>
       <w:r>
         <w:rPr>
@@ -4475,14 +4323,7 @@
           <w:sz w:val="18"/>
           <w:szCs w:val="18"/>
         </w:rPr>
-        <w:t xml:space="preserve"> </w:t>
-      </w:r>
-      <w:r>
-        <w:rPr>
-          <w:sz w:val="18"/>
-          <w:szCs w:val="18"/>
-        </w:rPr>
-        <w:t>18</w:t>
+        <w:t xml:space="preserve"> 18</w:t>
       </w:r>
       <w:r>
         <w:rPr>
@@ -4589,20 +4430,10 @@
           <w:b/>
           <w:bCs/>
         </w:rPr>
-        <w:t>Análise da acurácia n</w:t>
-      </w:r>
-      <w:r>
-        <w:rPr>
-          <w:b/>
-          <w:bCs/>
-        </w:rPr>
-        <w:t>a validação:</w:t>
-      </w:r>
-      <w:r>
-        <w:t xml:space="preserve"> </w:t>
-      </w:r>
-      <w:r>
-        <w:t>No conjunto de validação, tanto a acurácia Top-1 quanto a Top-5 permanecem zeradas ao longo das cinco épocas. Esse comportamento, embora à primeira vista possa parecer preocupante, é esperado nesse estágio inicial do treinamento. A ResNet-50 treinada do zero no ImageNet normalmente não apresenta ganhos mensuráveis em validação nas primeiras épocas, especialmente quando se utiliza um learning rate inicial alto (0.1), conforme descrito no artigo original.</w:t>
+        <w:t>Análise da acurácia na validação:</w:t>
+      </w:r>
+      <w:r>
+        <w:t xml:space="preserve"> No conjunto de validação, tanto a acurácia Top-1 quanto a Top-5 permanecem zeradas ao longo das cinco épocas. Esse comportamento, embora à primeira vista possa parecer preocupante, é esperado nesse estágio inicial do treinamento. A ResNet-50 treinada do zero no ImageNet normalmente não apresenta ganhos mensuráveis em validação nas primeiras épocas, especialmente quando se utiliza um learning rate inicial alto (0.1), conforme descrito no artigo original.</w:t>
       </w:r>
     </w:p>
     <w:p>
@@ -4960,14 +4791,7 @@
           <w:sz w:val="18"/>
           <w:szCs w:val="18"/>
         </w:rPr>
-        <w:t xml:space="preserve"> 1</w:t>
-      </w:r>
-      <w:r>
-        <w:rPr>
-          <w:sz w:val="18"/>
-          <w:szCs w:val="18"/>
-        </w:rPr>
-        <w:t>9</w:t>
+        <w:t xml:space="preserve"> 19</w:t>
       </w:r>
       <w:r>
         <w:rPr>
@@ -5076,13 +4900,7 @@
         <w:jc w:val="both"/>
       </w:pPr>
       <w:r>
-        <w:t xml:space="preserve">A figura </w:t>
-      </w:r>
-      <w:r>
-        <w:t>20</w:t>
-      </w:r>
-      <w:r>
-        <w:t xml:space="preserve"> apresenta uma tabela com uma relação estimada entre o tamanho e complexidade da base de dados com a conversão prévia para TFRecords. De modo geral, a conversão para TFRecords se mostra apenas vantajoso para casos onde a base de dados é extensa, ou quando houver treinamento distribuído.</w:t>
+        <w:t>A figura 20 apresenta uma tabela com uma relação estimada entre o tamanho e complexidade da base de dados com a conversão prévia para TFRecords. De modo geral, a conversão para TFRecords se mostra apenas vantajoso para casos onde a base de dados é extensa, ou quando houver treinamento distribuído.</w:t>
       </w:r>
     </w:p>
     <w:p>
@@ -5108,14 +4926,7 @@
           <w:sz w:val="18"/>
           <w:szCs w:val="18"/>
         </w:rPr>
-        <w:t xml:space="preserve"> </w:t>
-      </w:r>
-      <w:r>
-        <w:rPr>
-          <w:sz w:val="18"/>
-          <w:szCs w:val="18"/>
-        </w:rPr>
-        <w:t>20</w:t>
+        <w:t xml:space="preserve"> 20</w:t>
       </w:r>
       <w:r>
         <w:rPr>
@@ -5268,14 +5079,7 @@
           <w:b/>
           <w:bCs/>
         </w:rPr>
-        <w:t xml:space="preserve">Referências que guiaram </w:t>
-      </w:r>
-      <w:r>
-        <w:rPr>
-          <w:b/>
-          <w:bCs/>
-        </w:rPr>
-        <w:t>o estudo:</w:t>
+        <w:t>Referências que guiaram o estudo:</w:t>
       </w:r>
     </w:p>
     <w:p>
@@ -5504,10 +5308,7 @@
         <w:t>STEP</w:t>
       </w:r>
       <w:r>
-        <w:t>_PER_EPOCH = 100</w:t>
-      </w:r>
-      <w:r>
-        <w:t xml:space="preserve"> (limitado)</w:t>
+        <w:t>_PER_EPOCH = 100 (limitado)</w:t>
       </w:r>
     </w:p>
     <w:p>
@@ -5640,10 +5441,7 @@
         <w:t>STEP</w:t>
       </w:r>
       <w:r>
-        <w:t>_PER_EPOCH = 500~1000</w:t>
-      </w:r>
-      <w:r>
-        <w:t xml:space="preserve"> (também limitado dependendo do tamanho da base de dados)</w:t>
+        <w:t>_PER_EPOCH = 500~1000 (também limitado dependendo do tamanho da base de dados)</w:t>
       </w:r>
     </w:p>
     <w:bookmarkEnd w:id="0"/>
@@ -5763,10 +5561,7 @@
         <w:ind w:left="2124"/>
       </w:pPr>
       <w:r>
-        <w:t xml:space="preserve">EPOCHS = </w:t>
-      </w:r>
-      <w:r>
-        <w:t>200~500</w:t>
+        <w:t>EPOCHS = 200~500</w:t>
       </w:r>
     </w:p>
     <w:p>
@@ -5775,10 +5570,7 @@
         <w:ind w:left="2124"/>
       </w:pPr>
       <w:r>
-        <w:t>TOTAL_STEPS = EPOCHS</w:t>
-      </w:r>
-      <w:r>
-        <w:t xml:space="preserve"> * </w:t>
+        <w:t xml:space="preserve">TOTAL_STEPS = EPOCHS * </w:t>
       </w:r>
       <w:r>
         <w:t>STEP</w:t>
@@ -6006,6 +5798,100 @@
           <w:bCs/>
         </w:rPr>
       </w:pPr>
+      <w:r>
+        <w:rPr>
+          <w:noProof/>
+        </w:rPr>
+        <mc:AlternateContent>
+          <mc:Choice Requires="wps">
+            <w:drawing>
+              <wp:anchor distT="0" distB="0" distL="114300" distR="114300" simplePos="0" relativeHeight="251663360" behindDoc="0" locked="0" layoutInCell="1" allowOverlap="1" wp14:anchorId="47B05350" wp14:editId="3279CB82">
+                <wp:simplePos x="0" y="0"/>
+                <wp:positionH relativeFrom="margin">
+                  <wp:align>center</wp:align>
+                </wp:positionH>
+                <wp:positionV relativeFrom="paragraph">
+                  <wp:posOffset>380531</wp:posOffset>
+                </wp:positionV>
+                <wp:extent cx="7020000" cy="0"/>
+                <wp:effectExtent l="0" t="0" r="0" b="0"/>
+                <wp:wrapNone/>
+                <wp:docPr id="1405707870" name="Conector reto 1"/>
+                <wp:cNvGraphicFramePr/>
+                <a:graphic xmlns:a="http://schemas.openxmlformats.org/drawingml/2006/main">
+                  <a:graphicData uri="http://schemas.microsoft.com/office/word/2010/wordprocessingShape">
+                    <wps:wsp>
+                      <wps:cNvCnPr/>
+                      <wps:spPr>
+                        <a:xfrm flipV="1">
+                          <a:off x="0" y="0"/>
+                          <a:ext cx="7020000" cy="0"/>
+                        </a:xfrm>
+                        <a:prstGeom prst="line">
+                          <a:avLst/>
+                        </a:prstGeom>
+                        <a:ln w="12700">
+                          <a:solidFill>
+                            <a:schemeClr val="tx1"/>
+                          </a:solidFill>
+                          <a:prstDash val="solid"/>
+                        </a:ln>
+                      </wps:spPr>
+                      <wps:style>
+                        <a:lnRef idx="1">
+                          <a:schemeClr val="accent1"/>
+                        </a:lnRef>
+                        <a:fillRef idx="0">
+                          <a:schemeClr val="accent1"/>
+                        </a:fillRef>
+                        <a:effectRef idx="0">
+                          <a:schemeClr val="accent1"/>
+                        </a:effectRef>
+                        <a:fontRef idx="minor">
+                          <a:schemeClr val="tx1"/>
+                        </a:fontRef>
+                      </wps:style>
+                      <wps:bodyPr/>
+                    </wps:wsp>
+                  </a:graphicData>
+                </a:graphic>
+                <wp14:sizeRelH relativeFrom="margin">
+                  <wp14:pctWidth>0</wp14:pctWidth>
+                </wp14:sizeRelH>
+                <wp14:sizeRelV relativeFrom="margin">
+                  <wp14:pctHeight>0</wp14:pctHeight>
+                </wp14:sizeRelV>
+              </wp:anchor>
+            </w:drawing>
+          </mc:Choice>
+          <mc:Fallback>
+            <w:pict>
+              <v:line w14:anchorId="554A1FEF" id="Conector reto 1" o:spid="_x0000_s1026" style="position:absolute;flip:y;z-index:251663360;visibility:visible;mso-wrap-style:square;mso-width-percent:0;mso-height-percent:0;mso-wrap-distance-left:9pt;mso-wrap-distance-top:0;mso-wrap-distance-right:9pt;mso-wrap-distance-bottom:0;mso-position-horizontal:center;mso-position-horizontal-relative:margin;mso-position-vertical:absolute;mso-position-vertical-relative:text;mso-width-percent:0;mso-height-percent:0;mso-width-relative:margin;mso-height-relative:margin" from="0,29.95pt" to="552.75pt,29.95pt" o:gfxdata="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" strokecolor="black [3213]" strokeweight="1pt">
+                <v:stroke joinstyle="miter"/>
+                <w10:wrap anchorx="margin"/>
+              </v:line>
+            </w:pict>
+          </mc:Fallback>
+        </mc:AlternateContent>
+      </w:r>
+    </w:p>
+    <w:p>
+      <w:pPr>
+        <w:jc w:val="both"/>
+        <w:rPr>
+          <w:b/>
+          <w:bCs/>
+        </w:rPr>
+      </w:pPr>
+    </w:p>
+    <w:p>
+      <w:pPr>
+        <w:jc w:val="both"/>
+        <w:rPr>
+          <w:b/>
+          <w:bCs/>
+        </w:rPr>
+      </w:pPr>
     </w:p>
     <w:p>
       <w:pPr>
@@ -6211,17 +6097,6 @@
     <w:p>
       <w:pPr>
         <w:pStyle w:val="PargrafodaLista"/>
-        <w:ind w:left="1440"/>
-        <w:jc w:val="both"/>
-        <w:rPr>
-          <w:b/>
-          <w:bCs/>
-        </w:rPr>
-      </w:pPr>
-    </w:p>
-    <w:p>
-      <w:pPr>
-        <w:pStyle w:val="PargrafodaLista"/>
         <w:numPr>
           <w:ilvl w:val="0"/>
           <w:numId w:val="11"/>
@@ -6229,6 +6104,7 @@
         <w:jc w:val="both"/>
       </w:pPr>
       <w:r>
+        <w:lastRenderedPageBreak/>
         <w:t xml:space="preserve">Parâmetros utilizados: Tanto as configurações voltadas para o carregamento dos dados, quanto as configurações exigidas pela arquitetura Vision Transformers estão descritas na Figura </w:t>
       </w:r>
       <w:r>
@@ -6256,7 +6132,6 @@
           <w:sz w:val="18"/>
           <w:szCs w:val="18"/>
         </w:rPr>
-        <w:lastRenderedPageBreak/>
         <w:t>Figura</w:t>
       </w:r>
       <w:r>
@@ -6395,13 +6270,7 @@
         <w:t>Observação:</w:t>
       </w:r>
       <w:r>
-        <w:t xml:space="preserve"> Análise da função de perda na primeira época (loss=1.0986) garante a classificação no número correto de classes, uma vez que o modelo (por ainda não ter conhecimento), prevê em média a probabilidade p(class) = 1/</w:t>
-      </w:r>
-      <w:r>
-        <w:t>3.</w:t>
-      </w:r>
-      <w:r>
-        <w:t xml:space="preserve"> Para uma amostra, a cross-entropy (utilizada neste modelo) é calculada por L = -log(py), sendo ‘py’ a probabilidade atribuída à classe correta, portanto:</w:t>
+        <w:t xml:space="preserve"> Análise da função de perda na primeira época (loss=1.0986) garante a classificação no número correto de classes, uma vez que o modelo (por ainda não ter conhecimento), prevê em média a probabilidade p(class) = 1/3. Para uma amostra, a cross-entropy (utilizada neste modelo) é calculada por L = -log(py), sendo ‘py’ a probabilidade atribuída à classe correta, portanto:</w:t>
       </w:r>
     </w:p>
     <w:p>
@@ -6427,14 +6296,7 @@
           <w:sz w:val="18"/>
           <w:szCs w:val="18"/>
         </w:rPr>
-        <w:t xml:space="preserve"> </w:t>
-      </w:r>
-      <w:r>
-        <w:rPr>
-          <w:sz w:val="18"/>
-          <w:szCs w:val="18"/>
-        </w:rPr>
-        <w:t>22</w:t>
+        <w:t xml:space="preserve"> 22</w:t>
       </w:r>
       <w:r>
         <w:rPr>
@@ -6554,38 +6416,6 @@
     <w:p>
       <w:pPr>
         <w:pStyle w:val="PargrafodaLista"/>
-        <w:ind w:left="2160"/>
-        <w:jc w:val="both"/>
-        <w:rPr>
-          <w:rFonts w:eastAsiaTheme="minorEastAsia"/>
-          <w:color w:val="000000" w:themeColor="text1"/>
-        </w:rPr>
-      </w:pPr>
-    </w:p>
-    <w:p>
-      <w:pPr>
-        <w:pStyle w:val="PargrafodaLista"/>
-        <w:ind w:left="2160"/>
-        <w:jc w:val="both"/>
-        <w:rPr>
-          <w:rFonts w:eastAsiaTheme="minorEastAsia"/>
-          <w:color w:val="000000" w:themeColor="text1"/>
-        </w:rPr>
-      </w:pPr>
-    </w:p>
-    <w:p>
-      <w:pPr>
-        <w:pStyle w:val="PargrafodaLista"/>
-        <w:ind w:left="2160"/>
-        <w:jc w:val="both"/>
-        <w:rPr>
-          <w:color w:val="000000" w:themeColor="text1"/>
-        </w:rPr>
-      </w:pPr>
-    </w:p>
-    <w:p>
-      <w:pPr>
-        <w:pStyle w:val="PargrafodaLista"/>
         <w:numPr>
           <w:ilvl w:val="0"/>
           <w:numId w:val="11"/>
@@ -6639,14 +6469,7 @@
           <w:sz w:val="18"/>
           <w:szCs w:val="18"/>
         </w:rPr>
-        <w:t xml:space="preserve"> </w:t>
-      </w:r>
-      <w:r>
-        <w:rPr>
-          <w:sz w:val="18"/>
-          <w:szCs w:val="18"/>
-        </w:rPr>
-        <w:t>23</w:t>
+        <w:t xml:space="preserve"> 23</w:t>
       </w:r>
       <w:r>
         <w:rPr>
@@ -6816,14 +6639,7 @@
           <w:sz w:val="18"/>
           <w:szCs w:val="18"/>
         </w:rPr>
-        <w:t xml:space="preserve"> </w:t>
-      </w:r>
-      <w:r>
-        <w:rPr>
-          <w:sz w:val="18"/>
-          <w:szCs w:val="18"/>
-        </w:rPr>
-        <w:t>24</w:t>
+        <w:t xml:space="preserve"> 24</w:t>
       </w:r>
       <w:r>
         <w:rPr>
@@ -7094,13 +6910,7 @@
         <w:t xml:space="preserve"> </w:t>
       </w:r>
       <w:r>
-        <w:t>Tanto as configurações voltadas para o carregamento dos dados, quanto as configurações exigidas pela arquitetura Vision Transformers estão descritas na Figura 2</w:t>
-      </w:r>
-      <w:r>
-        <w:t>1</w:t>
-      </w:r>
-      <w:r>
-        <w:t>.</w:t>
+        <w:t>Tanto as configurações voltadas para o carregamento dos dados, quanto as configurações exigidas pela arquitetura Vision Transformers estão descritas na Figura 21.</w:t>
       </w:r>
     </w:p>
     <w:p>
@@ -7569,28 +7379,7 @@
           <w:b/>
           <w:bCs/>
         </w:rPr>
-        <w:t xml:space="preserve">Análise dos resultados de </w:t>
-      </w:r>
-      <w:r>
-        <w:rPr>
-          <w:b/>
-          <w:bCs/>
-        </w:rPr>
-        <w:t>validação</w:t>
-      </w:r>
-      <w:r>
-        <w:rPr>
-          <w:b/>
-          <w:bCs/>
-        </w:rPr>
-        <w:t>:</w:t>
-      </w:r>
-      <w:r>
-        <w:rPr>
-          <w:b/>
-          <w:bCs/>
-        </w:rPr>
-        <w:t xml:space="preserve"> </w:t>
+        <w:t xml:space="preserve">Análise dos resultados de validação: </w:t>
       </w:r>
       <w:r>
         <w:t>Apesar de a loss de validação apresentar uma leve redução ao longo das épocas, a acurácia</w:t>
@@ -8114,13 +7903,7 @@
         <w:t>DataLoader</w:t>
       </w:r>
       <w:r>
-        <w:t xml:space="preserve"> específico da arquitetura. Agora, a estrutura esperada segue conforme ilustrado pela figura </w:t>
-      </w:r>
-      <w:r>
-        <w:t>28</w:t>
-      </w:r>
-      <w:r>
-        <w:t>.</w:t>
+        <w:t xml:space="preserve"> específico da arquitetura. Agora, a estrutura esperada segue conforme ilustrado pela figura 28.</w:t>
       </w:r>
     </w:p>
     <w:p>
@@ -8480,25 +8263,13 @@
         <w:t>A acurácia de treino se mantém em torno de 43–44%</w:t>
       </w:r>
       <w:r>
-        <w:t xml:space="preserve"> (Figura </w:t>
-      </w:r>
-      <w:r>
-        <w:t>29</w:t>
-      </w:r>
-      <w:r>
-        <w:t>)</w:t>
+        <w:t xml:space="preserve"> (Figura 29)</w:t>
       </w:r>
       <w:r>
         <w:t>, enquanto a acurácia de validação alcança cerca de 45%</w:t>
       </w:r>
       <w:r>
-        <w:t xml:space="preserve"> (Figura </w:t>
-      </w:r>
-      <w:r>
-        <w:t>30</w:t>
-      </w:r>
-      <w:r>
-        <w:t>)</w:t>
+        <w:t xml:space="preserve"> (Figura 30)</w:t>
       </w:r>
       <w:r>
         <w:t>. É perfeitamente esperado que a validação fique ligeiramente melhor do que o treino nesse estágio, especialmente porque o conjunto de treino passa por augmentations mais agressivas.</w:t>
@@ -8802,21 +8573,7 @@
           <w:b/>
           <w:bCs/>
         </w:rPr>
-        <w:t>(</w:t>
-      </w:r>
-      <w:r>
-        <w:rPr>
-          <w:b/>
-          <w:bCs/>
-        </w:rPr>
-        <w:t>VIT</w:t>
-      </w:r>
-      <w:r>
-        <w:rPr>
-          <w:b/>
-          <w:bCs/>
-        </w:rPr>
-        <w:t xml:space="preserve">) </w:t>
+        <w:t xml:space="preserve">(VIT) </w:t>
       </w:r>
       <w:r>
         <w:rPr>
@@ -8868,10 +8625,7 @@
         <w:t>no e</w:t>
       </w:r>
       <w:r>
-        <w:t>xperimento</w:t>
-      </w:r>
-      <w:r>
-        <w:t xml:space="preserve"> </w:t>
+        <w:t xml:space="preserve">xperimento </w:t>
       </w:r>
       <w:r>
         <w:t>3</w:t>
@@ -8922,13 +8676,7 @@
         <w:t>DataLoader</w:t>
       </w:r>
       <w:r>
-        <w:t xml:space="preserve"> específico da arquitetura. Agora, a estrutura esperada segue conforme ilustrado pela figura </w:t>
-      </w:r>
-      <w:r>
-        <w:t>2</w:t>
-      </w:r>
-      <w:r>
-        <w:t>8.</w:t>
+        <w:t xml:space="preserve"> específico da arquitetura. Agora, a estrutura esperada segue conforme ilustrado pela figura 28.</w:t>
       </w:r>
       <w:bookmarkEnd w:id="2"/>
     </w:p>
@@ -9090,14 +8838,7 @@
           <w:b/>
           <w:bCs/>
         </w:rPr>
-        <w:t>Análise do inicial do log do Pycharm:</w:t>
-      </w:r>
-      <w:r>
-        <w:rPr>
-          <w:b/>
-          <w:bCs/>
-        </w:rPr>
-        <w:t xml:space="preserve"> </w:t>
+        <w:t xml:space="preserve">Análise do inicial do log do Pycharm: </w:t>
       </w:r>
       <w:r>
         <w:t xml:space="preserve">No início do treinamento, a loss em torno de 1.0986 é um sinal positivo (Figura </w:t>
@@ -9244,14 +8985,7 @@
           <w:sz w:val="18"/>
           <w:szCs w:val="18"/>
         </w:rPr>
-        <w:t xml:space="preserve"> </w:t>
-      </w:r>
-      <w:r>
-        <w:rPr>
-          <w:sz w:val="18"/>
-          <w:szCs w:val="18"/>
-        </w:rPr>
-        <w:t>31</w:t>
+        <w:t xml:space="preserve"> 31</w:t>
       </w:r>
       <w:r>
         <w:rPr>
@@ -9265,21 +8999,7 @@
           <w:sz w:val="18"/>
           <w:szCs w:val="18"/>
         </w:rPr>
-        <w:t xml:space="preserve">Métricas </w:t>
-      </w:r>
-      <w:r>
-        <w:rPr>
-          <w:sz w:val="18"/>
-          <w:szCs w:val="18"/>
-        </w:rPr>
-        <w:t xml:space="preserve">de treino </w:t>
-      </w:r>
-      <w:r>
-        <w:rPr>
-          <w:sz w:val="18"/>
-          <w:szCs w:val="18"/>
-        </w:rPr>
-        <w:t>retornadas por época</w:t>
+        <w:t>Métricas de treino retornadas por época</w:t>
       </w:r>
     </w:p>
     <w:p>
@@ -9456,14 +9176,7 @@
           <w:sz w:val="18"/>
           <w:szCs w:val="18"/>
         </w:rPr>
-        <w:t xml:space="preserve"> </w:t>
-      </w:r>
-      <w:r>
-        <w:rPr>
-          <w:sz w:val="18"/>
-          <w:szCs w:val="18"/>
-        </w:rPr>
-        <w:t>32</w:t>
+        <w:t xml:space="preserve"> 32</w:t>
       </w:r>
       <w:r>
         <w:rPr>
@@ -9556,13 +9269,7 @@
         <w:t xml:space="preserve">) </w:t>
       </w:r>
       <w:r>
-        <w:t xml:space="preserve">é demonstrado a seguir pela figura </w:t>
-      </w:r>
-      <w:r>
-        <w:t>33</w:t>
-      </w:r>
-      <w:r>
-        <w:t>. Após as correções, o resultado se mantém semelhante</w:t>
+        <w:t>é demonstrado a seguir pela figura 33. Após as correções, o resultado se mantém semelhante</w:t>
       </w:r>
       <w:r>
         <w:t>, o que pode ser atribuído ao uso de fortes técnicas de data augmentation no treinamento aliadas ao fine-tuning de pesos pré-treinados no ImageNet, favorecendo a capacidade de generalização do modelo.</w:t>
@@ -9645,14 +9352,7 @@
           <w:sz w:val="18"/>
           <w:szCs w:val="18"/>
         </w:rPr>
-        <w:t xml:space="preserve"> </w:t>
-      </w:r>
-      <w:r>
-        <w:rPr>
-          <w:sz w:val="18"/>
-          <w:szCs w:val="18"/>
-        </w:rPr>
-        <w:t>33</w:t>
+        <w:t xml:space="preserve"> 33</w:t>
       </w:r>
       <w:r>
         <w:rPr>
@@ -9729,6 +9429,82 @@
         <w:ind w:left="2208"/>
         <w:jc w:val="both"/>
       </w:pPr>
+      <w:r>
+        <w:rPr>
+          <w:noProof/>
+        </w:rPr>
+        <mc:AlternateContent>
+          <mc:Choice Requires="wps">
+            <w:drawing>
+              <wp:anchor distT="0" distB="0" distL="114300" distR="114300" simplePos="0" relativeHeight="251665408" behindDoc="0" locked="0" layoutInCell="1" allowOverlap="1" wp14:anchorId="0F0972DC" wp14:editId="1B93EC5D">
+                <wp:simplePos x="0" y="0"/>
+                <wp:positionH relativeFrom="margin">
+                  <wp:align>center</wp:align>
+                </wp:positionH>
+                <wp:positionV relativeFrom="paragraph">
+                  <wp:posOffset>286882</wp:posOffset>
+                </wp:positionV>
+                <wp:extent cx="7020000" cy="0"/>
+                <wp:effectExtent l="0" t="0" r="0" b="0"/>
+                <wp:wrapNone/>
+                <wp:docPr id="36160012" name="Conector reto 1"/>
+                <wp:cNvGraphicFramePr/>
+                <a:graphic xmlns:a="http://schemas.openxmlformats.org/drawingml/2006/main">
+                  <a:graphicData uri="http://schemas.microsoft.com/office/word/2010/wordprocessingShape">
+                    <wps:wsp>
+                      <wps:cNvCnPr/>
+                      <wps:spPr>
+                        <a:xfrm flipV="1">
+                          <a:off x="0" y="0"/>
+                          <a:ext cx="7020000" cy="0"/>
+                        </a:xfrm>
+                        <a:prstGeom prst="line">
+                          <a:avLst/>
+                        </a:prstGeom>
+                        <a:ln w="12700">
+                          <a:solidFill>
+                            <a:schemeClr val="tx1"/>
+                          </a:solidFill>
+                          <a:prstDash val="solid"/>
+                        </a:ln>
+                      </wps:spPr>
+                      <wps:style>
+                        <a:lnRef idx="1">
+                          <a:schemeClr val="accent1"/>
+                        </a:lnRef>
+                        <a:fillRef idx="0">
+                          <a:schemeClr val="accent1"/>
+                        </a:fillRef>
+                        <a:effectRef idx="0">
+                          <a:schemeClr val="accent1"/>
+                        </a:effectRef>
+                        <a:fontRef idx="minor">
+                          <a:schemeClr val="tx1"/>
+                        </a:fontRef>
+                      </wps:style>
+                      <wps:bodyPr/>
+                    </wps:wsp>
+                  </a:graphicData>
+                </a:graphic>
+                <wp14:sizeRelH relativeFrom="margin">
+                  <wp14:pctWidth>0</wp14:pctWidth>
+                </wp14:sizeRelH>
+                <wp14:sizeRelV relativeFrom="margin">
+                  <wp14:pctHeight>0</wp14:pctHeight>
+                </wp14:sizeRelV>
+              </wp:anchor>
+            </w:drawing>
+          </mc:Choice>
+          <mc:Fallback>
+            <w:pict>
+              <v:line w14:anchorId="5C796B9C" id="Conector reto 1" o:spid="_x0000_s1026" style="position:absolute;flip:y;z-index:251665408;visibility:visible;mso-wrap-style:square;mso-width-percent:0;mso-height-percent:0;mso-wrap-distance-left:9pt;mso-wrap-distance-top:0;mso-wrap-distance-right:9pt;mso-wrap-distance-bottom:0;mso-position-horizontal:center;mso-position-horizontal-relative:margin;mso-position-vertical:absolute;mso-position-vertical-relative:text;mso-width-percent:0;mso-height-percent:0;mso-width-relative:margin;mso-height-relative:margin" from="0,22.6pt" to="552.75pt,22.6pt" o:gfxdata="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" strokecolor="black [3213]" strokeweight="1pt">
+                <v:stroke joinstyle="miter"/>
+                <w10:wrap anchorx="margin"/>
+              </v:line>
+            </w:pict>
+          </mc:Fallback>
+        </mc:AlternateContent>
+      </w:r>
     </w:p>
     <w:p>
       <w:pPr>
@@ -9772,21 +9548,7 @@
           <w:b/>
           <w:bCs/>
         </w:rPr>
-        <w:t xml:space="preserve">Testes </w:t>
-      </w:r>
-      <w:r>
-        <w:rPr>
-          <w:b/>
-          <w:bCs/>
-        </w:rPr>
-        <w:t xml:space="preserve">voltados à exploração de hiperparâmetros </w:t>
-      </w:r>
-      <w:r>
-        <w:rPr>
-          <w:b/>
-          <w:bCs/>
-        </w:rPr>
-        <w:t>conduzidos para cada uma das arquiteturas</w:t>
+        <w:t>Testes voltados à exploração de hiperparâmetros conduzidos para cada uma das arquiteturas</w:t>
       </w:r>
     </w:p>
     <w:p>
@@ -9852,14 +9614,7 @@
           <w:b/>
           <w:bCs/>
         </w:rPr>
-        <w:t xml:space="preserve"> – </w:t>
-      </w:r>
-      <w:r>
-        <w:rPr>
-          <w:b/>
-          <w:bCs/>
-        </w:rPr>
-        <w:t>EXPLORAÇÃO INICIAL</w:t>
+        <w:t xml:space="preserve"> – EXPLORAÇÃO INICIAL</w:t>
       </w:r>
       <w:r>
         <w:rPr>
@@ -9871,12 +9626,1441 @@
     </w:p>
     <w:p>
       <w:pPr>
-        <w:jc w:val="both"/>
-        <w:rPr>
-          <w:b/>
-          <w:bCs/>
-        </w:rPr>
-      </w:pPr>
+        <w:pStyle w:val="PargrafodaLista"/>
+        <w:ind w:left="1440"/>
+        <w:jc w:val="both"/>
+        <w:rPr>
+          <w:b/>
+          <w:bCs/>
+        </w:rPr>
+      </w:pPr>
+    </w:p>
+    <w:p>
+      <w:pPr>
+        <w:pStyle w:val="PargrafodaLista"/>
+        <w:ind w:left="1440"/>
+        <w:jc w:val="both"/>
+      </w:pPr>
+      <w:r>
+        <w:t>Foi conduzido</w:t>
+      </w:r>
+      <w:r>
+        <w:t xml:space="preserve"> um</w:t>
+      </w:r>
+      <w:r>
+        <w:t xml:space="preserve"> treinamento</w:t>
+      </w:r>
+      <w:r>
+        <w:t xml:space="preserve"> “</w:t>
+      </w:r>
+      <w:r>
+        <w:t xml:space="preserve">from scratch” (sem pré-treino) em um dataset relativamente pequeno: ~11 k imagens de treino e ~2,7 k de validação, distribuídas em 3 classes. Isso impõe um teto realista de desempenho bem abaixo do que o </w:t>
+      </w:r>
+      <w:r>
+        <w:t>artigo</w:t>
+      </w:r>
+      <w:r>
+        <w:t xml:space="preserve"> original da ResNet</w:t>
+      </w:r>
+      <w:r>
+        <w:t>-50</w:t>
+      </w:r>
+      <w:r>
+        <w:t xml:space="preserve"> reporta para ImageNet (1,28M imagens, 1000 classes). Portanto, desde o início, o objetivo aqui </w:t>
+      </w:r>
+      <w:r>
+        <w:t>é</w:t>
+      </w:r>
+      <w:r>
+        <w:t xml:space="preserve"> verificar estabilidade do treinamento, coerência da dinâmica de aprendizado e convergência.</w:t>
+      </w:r>
+    </w:p>
+    <w:p>
+      <w:pPr>
+        <w:pStyle w:val="PargrafodaLista"/>
+        <w:ind w:left="1440"/>
+        <w:jc w:val="both"/>
+      </w:pPr>
+    </w:p>
+    <w:p>
+      <w:pPr>
+        <w:pStyle w:val="PargrafodaLista"/>
+        <w:numPr>
+          <w:ilvl w:val="0"/>
+          <w:numId w:val="18"/>
+        </w:numPr>
+        <w:jc w:val="both"/>
+        <w:rPr>
+          <w:b/>
+          <w:bCs/>
+        </w:rPr>
+      </w:pPr>
+      <w:r>
+        <w:rPr>
+          <w:b/>
+          <w:bCs/>
+        </w:rPr>
+        <w:t>Configuração da rede e parâmetros:</w:t>
+      </w:r>
+    </w:p>
+    <w:p>
+      <w:pPr>
+        <w:pStyle w:val="PargrafodaLista"/>
+        <w:ind w:left="2160"/>
+        <w:jc w:val="both"/>
+        <w:rPr>
+          <w:b/>
+          <w:bCs/>
+        </w:rPr>
+      </w:pPr>
+    </w:p>
+    <w:p>
+      <w:pPr>
+        <w:pStyle w:val="PargrafodaLista"/>
+        <w:ind w:left="708"/>
+        <w:jc w:val="center"/>
+      </w:pPr>
+      <w:r>
+        <w:rPr>
+          <w:sz w:val="18"/>
+          <w:szCs w:val="18"/>
+        </w:rPr>
+        <w:t>Figura</w:t>
+      </w:r>
+      <w:r>
+        <w:rPr>
+          <w:sz w:val="18"/>
+          <w:szCs w:val="18"/>
+        </w:rPr>
+        <w:t xml:space="preserve"> 34: Resultado das épocas iniciais de treinamento</w:t>
+      </w:r>
+    </w:p>
+    <w:p>
+      <w:pPr>
+        <w:pStyle w:val="PargrafodaLista"/>
+        <w:ind w:left="2160"/>
+        <w:jc w:val="both"/>
+        <w:rPr>
+          <w:b/>
+          <w:bCs/>
+        </w:rPr>
+      </w:pPr>
+      <w:r>
+        <w:rPr>
+          <w:noProof/>
+        </w:rPr>
+        <mc:AlternateContent>
+          <mc:Choice Requires="wps">
+            <w:drawing>
+              <wp:anchor distT="0" distB="0" distL="114300" distR="114300" simplePos="0" relativeHeight="251666432" behindDoc="0" locked="0" layoutInCell="1" allowOverlap="1" wp14:anchorId="210522FE" wp14:editId="73E787DF">
+                <wp:simplePos x="0" y="0"/>
+                <wp:positionH relativeFrom="column">
+                  <wp:posOffset>1911985</wp:posOffset>
+                </wp:positionH>
+                <wp:positionV relativeFrom="paragraph">
+                  <wp:posOffset>733425</wp:posOffset>
+                </wp:positionV>
+                <wp:extent cx="302930" cy="280491"/>
+                <wp:effectExtent l="0" t="0" r="0" b="0"/>
+                <wp:wrapNone/>
+                <wp:docPr id="13998604" name="Retângulo 3"/>
+                <wp:cNvGraphicFramePr/>
+                <a:graphic xmlns:a="http://schemas.openxmlformats.org/drawingml/2006/main">
+                  <a:graphicData uri="http://schemas.microsoft.com/office/word/2010/wordprocessingShape">
+                    <wps:wsp>
+                      <wps:cNvSpPr/>
+                      <wps:spPr>
+                        <a:xfrm>
+                          <a:off x="0" y="0"/>
+                          <a:ext cx="302930" cy="280491"/>
+                        </a:xfrm>
+                        <a:prstGeom prst="rect">
+                          <a:avLst/>
+                        </a:prstGeom>
+                        <a:noFill/>
+                        <a:ln>
+                          <a:noFill/>
+                        </a:ln>
+                      </wps:spPr>
+                      <wps:style>
+                        <a:lnRef idx="2">
+                          <a:schemeClr val="accent1">
+                            <a:shade val="15000"/>
+                          </a:schemeClr>
+                        </a:lnRef>
+                        <a:fillRef idx="1">
+                          <a:schemeClr val="accent1"/>
+                        </a:fillRef>
+                        <a:effectRef idx="0">
+                          <a:schemeClr val="accent1"/>
+                        </a:effectRef>
+                        <a:fontRef idx="minor">
+                          <a:schemeClr val="lt1"/>
+                        </a:fontRef>
+                      </wps:style>
+                      <wps:txbx>
+                        <w:txbxContent>
+                          <w:p>
+                            <w:pPr>
+                              <w:jc w:val="center"/>
+                            </w:pPr>
+                            <w:r>
+                              <w:rPr>
+                                <w:noProof/>
+                              </w:rPr>
+                              <w:drawing>
+                                <wp:inline distT="0" distB="0" distL="0" distR="0" wp14:anchorId="6E95738F" wp14:editId="7E530211">
+                                  <wp:extent cx="71032" cy="120015"/>
+                                  <wp:effectExtent l="0" t="0" r="5715" b="0"/>
+                                  <wp:docPr id="1634026789" name="Imagem 1"/>
+                                  <wp:cNvGraphicFramePr>
+                                    <a:graphicFrameLocks xmlns:a="http://schemas.openxmlformats.org/drawingml/2006/main" noChangeAspect="1"/>
+                                  </wp:cNvGraphicFramePr>
+                                  <a:graphic xmlns:a="http://schemas.openxmlformats.org/drawingml/2006/main">
+                                    <a:graphicData uri="http://schemas.openxmlformats.org/drawingml/2006/picture">
+                                      <pic:pic xmlns:pic="http://schemas.openxmlformats.org/drawingml/2006/picture">
+                                        <pic:nvPicPr>
+                                          <pic:cNvPr id="727332644" name=""/>
+                                          <pic:cNvPicPr/>
+                                        </pic:nvPicPr>
+                                        <pic:blipFill rotWithShape="1">
+                                          <a:blip r:embed="rId34"/>
+                                          <a:srcRect l="13396" t="30039" r="85375" b="67009"/>
+                                          <a:stretch>
+                                            <a:fillRect/>
+                                          </a:stretch>
+                                        </pic:blipFill>
+                                        <pic:spPr bwMode="auto">
+                                          <a:xfrm>
+                                            <a:off x="0" y="0"/>
+                                            <a:ext cx="72124" cy="121860"/>
+                                          </a:xfrm>
+                                          <a:prstGeom prst="rect">
+                                            <a:avLst/>
+                                          </a:prstGeom>
+                                          <a:ln>
+                                            <a:noFill/>
+                                          </a:ln>
+                                          <a:extLst>
+                                            <a:ext uri="{53640926-AAD7-44D8-BBD7-CCE9431645EC}">
+                                              <a14:shadowObscured xmlns:a14="http://schemas.microsoft.com/office/drawing/2010/main"/>
+                                            </a:ext>
+                                          </a:extLst>
+                                        </pic:spPr>
+                                      </pic:pic>
+                                    </a:graphicData>
+                                  </a:graphic>
+                                </wp:inline>
+                              </w:drawing>
+                            </w:r>
+                          </w:p>
+                        </w:txbxContent>
+                      </wps:txbx>
+                      <wps:bodyPr rot="0" spcFirstLastPara="0" vertOverflow="overflow" horzOverflow="overflow" vert="horz" wrap="square" lIns="91440" tIns="45720" rIns="91440" bIns="45720" numCol="1" spcCol="0" rtlCol="0" fromWordArt="0" anchor="ctr" anchorCtr="0" forceAA="0" compatLnSpc="1">
+                        <a:prstTxWarp prst="textNoShape">
+                          <a:avLst/>
+                        </a:prstTxWarp>
+                        <a:noAutofit/>
+                      </wps:bodyPr>
+                    </wps:wsp>
+                  </a:graphicData>
+                </a:graphic>
+                <wp14:sizeRelH relativeFrom="margin">
+                  <wp14:pctWidth>0</wp14:pctWidth>
+                </wp14:sizeRelH>
+                <wp14:sizeRelV relativeFrom="margin">
+                  <wp14:pctHeight>0</wp14:pctHeight>
+                </wp14:sizeRelV>
+              </wp:anchor>
+            </w:drawing>
+          </mc:Choice>
+          <mc:Fallback>
+            <w:pict>
+              <v:rect w14:anchorId="210522FE" id="Retângulo 3" o:spid="_x0000_s1026" style="position:absolute;left:0;text-align:left;margin-left:150.55pt;margin-top:57.75pt;width:23.85pt;height:22.1pt;z-index:251666432;visibility:visible;mso-wrap-style:square;mso-width-percent:0;mso-height-percent:0;mso-wrap-distance-left:9pt;mso-wrap-distance-top:0;mso-wrap-distance-right:9pt;mso-wrap-distance-bottom:0;mso-position-horizontal:absolute;mso-position-horizontal-relative:text;mso-position-vertical:absolute;mso-position-vertical-relative:text;mso-width-percent:0;mso-height-percent:0;mso-width-relative:margin;mso-height-relative:margin;v-text-anchor:middle" o:gfxdata="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" filled="f" stroked="f" strokeweight="1pt">
+                <v:textbox>
+                  <w:txbxContent>
+                    <w:p>
+                      <w:pPr>
+                        <w:jc w:val="center"/>
+                      </w:pPr>
+                      <w:r>
+                        <w:rPr>
+                          <w:noProof/>
+                        </w:rPr>
+                        <w:drawing>
+                          <wp:inline distT="0" distB="0" distL="0" distR="0" wp14:anchorId="6E95738F" wp14:editId="7E530211">
+                            <wp:extent cx="71032" cy="120015"/>
+                            <wp:effectExtent l="0" t="0" r="5715" b="0"/>
+                            <wp:docPr id="1634026789" name="Imagem 1"/>
+                            <wp:cNvGraphicFramePr>
+                              <a:graphicFrameLocks xmlns:a="http://schemas.openxmlformats.org/drawingml/2006/main" noChangeAspect="1"/>
+                            </wp:cNvGraphicFramePr>
+                            <a:graphic xmlns:a="http://schemas.openxmlformats.org/drawingml/2006/main">
+                              <a:graphicData uri="http://schemas.openxmlformats.org/drawingml/2006/picture">
+                                <pic:pic xmlns:pic="http://schemas.openxmlformats.org/drawingml/2006/picture">
+                                  <pic:nvPicPr>
+                                    <pic:cNvPr id="727332644" name=""/>
+                                    <pic:cNvPicPr/>
+                                  </pic:nvPicPr>
+                                  <pic:blipFill rotWithShape="1">
+                                    <a:blip r:embed="rId34"/>
+                                    <a:srcRect l="13396" t="30039" r="85375" b="67009"/>
+                                    <a:stretch>
+                                      <a:fillRect/>
+                                    </a:stretch>
+                                  </pic:blipFill>
+                                  <pic:spPr bwMode="auto">
+                                    <a:xfrm>
+                                      <a:off x="0" y="0"/>
+                                      <a:ext cx="72124" cy="121860"/>
+                                    </a:xfrm>
+                                    <a:prstGeom prst="rect">
+                                      <a:avLst/>
+                                    </a:prstGeom>
+                                    <a:ln>
+                                      <a:noFill/>
+                                    </a:ln>
+                                    <a:extLst>
+                                      <a:ext uri="{53640926-AAD7-44D8-BBD7-CCE9431645EC}">
+                                        <a14:shadowObscured xmlns:a14="http://schemas.microsoft.com/office/drawing/2010/main"/>
+                                      </a:ext>
+                                    </a:extLst>
+                                  </pic:spPr>
+                                </pic:pic>
+                              </a:graphicData>
+                            </a:graphic>
+                          </wp:inline>
+                        </w:drawing>
+                      </w:r>
+                    </w:p>
+                  </w:txbxContent>
+                </v:textbox>
+              </v:rect>
+            </w:pict>
+          </mc:Fallback>
+        </mc:AlternateContent>
+      </w:r>
+      <w:r>
+        <w:rPr>
+          <w:noProof/>
+        </w:rPr>
+        <w:drawing>
+          <wp:inline distT="0" distB="0" distL="0" distR="0" wp14:anchorId="1435C35B" wp14:editId="6D942C55">
+            <wp:extent cx="3014242" cy="1812897"/>
+            <wp:effectExtent l="0" t="0" r="0" b="0"/>
+            <wp:docPr id="11720901" name="Imagem 1"/>
+            <wp:cNvGraphicFramePr>
+              <a:graphicFrameLocks xmlns:a="http://schemas.openxmlformats.org/drawingml/2006/main" noChangeAspect="1"/>
+            </wp:cNvGraphicFramePr>
+            <a:graphic xmlns:a="http://schemas.openxmlformats.org/drawingml/2006/main">
+              <a:graphicData uri="http://schemas.openxmlformats.org/drawingml/2006/picture">
+                <pic:pic xmlns:pic="http://schemas.openxmlformats.org/drawingml/2006/picture">
+                  <pic:nvPicPr>
+                    <pic:cNvPr id="727332644" name=""/>
+                    <pic:cNvPicPr/>
+                  </pic:nvPicPr>
+                  <pic:blipFill rotWithShape="1">
+                    <a:blip r:embed="rId34"/>
+                    <a:srcRect t="18053" r="48121" b="37590"/>
+                    <a:stretch>
+                      <a:fillRect/>
+                    </a:stretch>
+                  </pic:blipFill>
+                  <pic:spPr bwMode="auto">
+                    <a:xfrm>
+                      <a:off x="0" y="0"/>
+                      <a:ext cx="3044212" cy="1830922"/>
+                    </a:xfrm>
+                    <a:prstGeom prst="rect">
+                      <a:avLst/>
+                    </a:prstGeom>
+                    <a:ln>
+                      <a:noFill/>
+                    </a:ln>
+                    <a:extLst>
+                      <a:ext uri="{53640926-AAD7-44D8-BBD7-CCE9431645EC}">
+                        <a14:shadowObscured xmlns:a14="http://schemas.microsoft.com/office/drawing/2010/main"/>
+                      </a:ext>
+                    </a:extLst>
+                  </pic:spPr>
+                </pic:pic>
+              </a:graphicData>
+            </a:graphic>
+          </wp:inline>
+        </w:drawing>
+      </w:r>
+    </w:p>
+    <w:p>
+      <w:pPr>
+        <w:pStyle w:val="PargrafodaLista"/>
+        <w:ind w:left="1440"/>
+        <w:jc w:val="both"/>
+      </w:pPr>
+    </w:p>
+    <w:p>
+      <w:pPr>
+        <w:pStyle w:val="PargrafodaLista"/>
+        <w:numPr>
+          <w:ilvl w:val="0"/>
+          <w:numId w:val="16"/>
+        </w:numPr>
+        <w:jc w:val="both"/>
+        <w:rPr>
+          <w:b/>
+          <w:bCs/>
+        </w:rPr>
+      </w:pPr>
+      <w:r>
+        <w:rPr>
+          <w:b/>
+          <w:bCs/>
+        </w:rPr>
+        <w:t>Avaliação das épocas</w:t>
+      </w:r>
+      <w:r>
+        <w:rPr>
+          <w:b/>
+          <w:bCs/>
+        </w:rPr>
+        <w:t xml:space="preserve"> iniciais</w:t>
+      </w:r>
+      <w:r>
+        <w:rPr>
+          <w:b/>
+          <w:bCs/>
+        </w:rPr>
+        <w:t xml:space="preserve"> de treinamento:</w:t>
+      </w:r>
+    </w:p>
+    <w:p>
+      <w:pPr>
+        <w:pStyle w:val="PargrafodaLista"/>
+        <w:ind w:left="2160"/>
+        <w:jc w:val="both"/>
+      </w:pPr>
+      <w:r>
+        <w:t>Nas primeiras épocas</w:t>
+      </w:r>
+      <w:r>
+        <w:t xml:space="preserve"> </w:t>
+      </w:r>
+      <w:r>
+        <w:t>(épocas 1–10)</w:t>
+      </w:r>
+      <w:r>
+        <w:t>, o comportamento é exatamente o esperado para SGD com learning rate alto (0.1)</w:t>
+      </w:r>
+      <w:r>
+        <w:t>, em que:</w:t>
+      </w:r>
+    </w:p>
+    <w:p>
+      <w:pPr>
+        <w:pStyle w:val="PargrafodaLista"/>
+        <w:ind w:left="2160"/>
+        <w:jc w:val="both"/>
+      </w:pPr>
+    </w:p>
+    <w:p>
+      <w:pPr>
+        <w:pStyle w:val="PargrafodaLista"/>
+        <w:ind w:left="2160"/>
+        <w:jc w:val="both"/>
+      </w:pPr>
+    </w:p>
+    <w:p>
+      <w:pPr>
+        <w:pStyle w:val="PargrafodaLista"/>
+        <w:numPr>
+          <w:ilvl w:val="1"/>
+          <w:numId w:val="16"/>
+        </w:numPr>
+        <w:jc w:val="both"/>
+      </w:pPr>
+      <w:r>
+        <w:t xml:space="preserve">A </w:t>
+      </w:r>
+      <w:r>
+        <w:t xml:space="preserve">função </w:t>
+      </w:r>
+      <w:r>
+        <w:t>loss de treino cai rapidamente de ~2.72 para ~1.</w:t>
+      </w:r>
+      <w:r>
+        <w:t>4</w:t>
+      </w:r>
+      <w:r>
+        <w:t>0.</w:t>
+      </w:r>
+    </w:p>
+    <w:p>
+      <w:pPr>
+        <w:pStyle w:val="PargrafodaLista"/>
+        <w:numPr>
+          <w:ilvl w:val="1"/>
+          <w:numId w:val="16"/>
+        </w:numPr>
+        <w:jc w:val="both"/>
+      </w:pPr>
+      <w:r>
+        <w:t>A acurácia de treino sobe de ~44% para ~45%.</w:t>
+      </w:r>
+    </w:p>
+    <w:p>
+      <w:pPr>
+        <w:pStyle w:val="PargrafodaLista"/>
+        <w:numPr>
+          <w:ilvl w:val="1"/>
+          <w:numId w:val="16"/>
+        </w:numPr>
+        <w:jc w:val="both"/>
+      </w:pPr>
+      <w:r>
+        <w:t>A val_accuracy sobe cedo e estabiliza rapidamente em ~45%.</w:t>
+      </w:r>
+    </w:p>
+    <w:p>
+      <w:pPr>
+        <w:pStyle w:val="PargrafodaLista"/>
+        <w:ind w:left="2880"/>
+        <w:jc w:val="both"/>
+      </w:pPr>
+    </w:p>
+    <w:p>
+      <w:pPr>
+        <w:pStyle w:val="PargrafodaLista"/>
+        <w:ind w:left="1440"/>
+        <w:jc w:val="center"/>
+      </w:pPr>
+      <w:r>
+        <w:rPr>
+          <w:sz w:val="18"/>
+          <w:szCs w:val="18"/>
+        </w:rPr>
+        <w:t>Figura</w:t>
+      </w:r>
+      <w:r>
+        <w:rPr>
+          <w:sz w:val="18"/>
+          <w:szCs w:val="18"/>
+        </w:rPr>
+        <w:t xml:space="preserve"> 3</w:t>
+      </w:r>
+      <w:r>
+        <w:rPr>
+          <w:sz w:val="18"/>
+          <w:szCs w:val="18"/>
+        </w:rPr>
+        <w:t>5</w:t>
+      </w:r>
+      <w:r>
+        <w:rPr>
+          <w:sz w:val="18"/>
+          <w:szCs w:val="18"/>
+        </w:rPr>
+        <w:t>: Resultado das épocas iniciais de treinamento</w:t>
+      </w:r>
+    </w:p>
+    <w:p>
+      <w:pPr>
+        <w:ind w:left="2124"/>
+        <w:jc w:val="center"/>
+      </w:pPr>
+      <w:r>
+        <w:drawing>
+          <wp:inline distT="0" distB="0" distL="0" distR="0" wp14:anchorId="667F7415" wp14:editId="4B938E64">
+            <wp:extent cx="3880237" cy="1828054"/>
+            <wp:effectExtent l="0" t="0" r="6350" b="1270"/>
+            <wp:docPr id="1681057850" name="Imagem 1"/>
+            <wp:cNvGraphicFramePr>
+              <a:graphicFrameLocks xmlns:a="http://schemas.openxmlformats.org/drawingml/2006/main" noChangeAspect="1"/>
+            </wp:cNvGraphicFramePr>
+            <a:graphic xmlns:a="http://schemas.openxmlformats.org/drawingml/2006/main">
+              <a:graphicData uri="http://schemas.openxmlformats.org/drawingml/2006/picture">
+                <pic:pic xmlns:pic="http://schemas.openxmlformats.org/drawingml/2006/picture">
+                  <pic:nvPicPr>
+                    <pic:cNvPr id="1681057850" name=""/>
+                    <pic:cNvPicPr/>
+                  </pic:nvPicPr>
+                  <pic:blipFill>
+                    <a:blip r:embed="rId41"/>
+                    <a:stretch>
+                      <a:fillRect/>
+                    </a:stretch>
+                  </pic:blipFill>
+                  <pic:spPr>
+                    <a:xfrm>
+                      <a:off x="0" y="0"/>
+                      <a:ext cx="3880237" cy="1828054"/>
+                    </a:xfrm>
+                    <a:prstGeom prst="rect">
+                      <a:avLst/>
+                    </a:prstGeom>
+                  </pic:spPr>
+                </pic:pic>
+              </a:graphicData>
+            </a:graphic>
+          </wp:inline>
+        </w:drawing>
+      </w:r>
+    </w:p>
+    <w:p>
+      <w:pPr>
+        <w:ind w:left="2124"/>
+        <w:jc w:val="both"/>
+      </w:pPr>
+      <w:r>
+        <w:t xml:space="preserve">Esse padrão apresenta um forte indício que o pipeline de dados não apresenta erros em sua implementação, que </w:t>
+      </w:r>
+      <w:r>
+        <w:t>backpropagation está funcionando</w:t>
+      </w:r>
+      <w:r>
+        <w:t>, e que os pesos estão de fato sendo atualizados e que</w:t>
+      </w:r>
+      <w:r>
+        <w:t xml:space="preserve"> o</w:t>
+      </w:r>
+      <w:r>
+        <w:t xml:space="preserve"> </w:t>
+      </w:r>
+      <w:r>
+        <w:t>learning rate inicial não está instável</w:t>
+      </w:r>
+      <w:r>
+        <w:t xml:space="preserve">, uma vez que </w:t>
+      </w:r>
+      <w:r>
+        <w:t>não há explosão.</w:t>
+      </w:r>
+    </w:p>
+    <w:p>
+      <w:pPr>
+        <w:ind w:left="2124"/>
+        <w:jc w:val="both"/>
+        <w:rPr>
+          <w:u w:val="single"/>
+        </w:rPr>
+      </w:pPr>
+      <w:r>
+        <w:rPr>
+          <w:u w:val="single"/>
+        </w:rPr>
+        <w:t>Como teste de sanidade, o retorno deste resultado se apresenta de maneira positiva.</w:t>
+      </w:r>
+    </w:p>
+    <w:p>
+      <w:pPr>
+        <w:pStyle w:val="PargrafodaLista"/>
+        <w:numPr>
+          <w:ilvl w:val="0"/>
+          <w:numId w:val="16"/>
+        </w:numPr>
+        <w:jc w:val="both"/>
+        <w:rPr>
+          <w:b/>
+          <w:bCs/>
+        </w:rPr>
+      </w:pPr>
+      <w:r>
+        <w:rPr>
+          <w:b/>
+          <w:bCs/>
+        </w:rPr>
+        <w:t>Avaliação das épocas</w:t>
+      </w:r>
+      <w:r>
+        <w:rPr>
+          <w:b/>
+          <w:bCs/>
+        </w:rPr>
+        <w:t xml:space="preserve"> </w:t>
+      </w:r>
+      <w:r>
+        <w:rPr>
+          <w:b/>
+          <w:bCs/>
+        </w:rPr>
+        <w:t>intermediárias</w:t>
+      </w:r>
+      <w:r>
+        <w:rPr>
+          <w:b/>
+          <w:bCs/>
+        </w:rPr>
+        <w:t xml:space="preserve"> de treinamento:</w:t>
+      </w:r>
+    </w:p>
+    <w:p>
+      <w:pPr>
+        <w:pStyle w:val="PargrafodaLista"/>
+        <w:ind w:left="2160"/>
+        <w:jc w:val="both"/>
+      </w:pPr>
+      <w:r>
+        <w:t>Entre aproximadamente as épocas 10 e 30, ocorre um platô claro</w:t>
+      </w:r>
+      <w:r>
+        <w:t xml:space="preserve">, no qual a </w:t>
+      </w:r>
+      <w:r>
+        <w:t>val_accuracy fica praticamente fixa em ~45.5%</w:t>
+      </w:r>
+      <w:r>
+        <w:t xml:space="preserve">, a </w:t>
+      </w:r>
+      <w:r>
+        <w:t>loss de validação continua caindo lentamente, mas sem reflexo em acurácia</w:t>
+      </w:r>
+      <w:r>
+        <w:t xml:space="preserve"> e a acurácia de treino </w:t>
+      </w:r>
+      <w:r>
+        <w:t>oscila levemente entre 43% e 45%.</w:t>
+      </w:r>
+    </w:p>
+    <w:p>
+      <w:pPr>
+        <w:pStyle w:val="PargrafodaLista"/>
+        <w:ind w:left="2160"/>
+        <w:jc w:val="both"/>
+      </w:pPr>
+    </w:p>
+    <w:p>
+      <w:pPr>
+        <w:pStyle w:val="PargrafodaLista"/>
+        <w:ind w:left="1440"/>
+        <w:jc w:val="center"/>
+      </w:pPr>
+      <w:r>
+        <w:rPr>
+          <w:sz w:val="18"/>
+          <w:szCs w:val="18"/>
+        </w:rPr>
+        <w:t>Figura</w:t>
+      </w:r>
+      <w:r>
+        <w:rPr>
+          <w:sz w:val="18"/>
+          <w:szCs w:val="18"/>
+        </w:rPr>
+        <w:t xml:space="preserve"> 3</w:t>
+      </w:r>
+      <w:r>
+        <w:rPr>
+          <w:sz w:val="18"/>
+          <w:szCs w:val="18"/>
+        </w:rPr>
+        <w:t>6</w:t>
+      </w:r>
+      <w:r>
+        <w:rPr>
+          <w:sz w:val="18"/>
+          <w:szCs w:val="18"/>
+        </w:rPr>
+        <w:t>: Resultado das épocas in</w:t>
+      </w:r>
+      <w:r>
+        <w:rPr>
+          <w:sz w:val="18"/>
+          <w:szCs w:val="18"/>
+        </w:rPr>
+        <w:t>termediárias</w:t>
+      </w:r>
+      <w:r>
+        <w:rPr>
+          <w:sz w:val="18"/>
+          <w:szCs w:val="18"/>
+        </w:rPr>
+        <w:t xml:space="preserve"> de treinamento</w:t>
+      </w:r>
+    </w:p>
+    <w:p>
+      <w:pPr>
+        <w:pStyle w:val="PargrafodaLista"/>
+        <w:ind w:left="2160"/>
+        <w:jc w:val="both"/>
+      </w:pPr>
+      <w:r>
+        <w:drawing>
+          <wp:inline distT="0" distB="0" distL="0" distR="0" wp14:anchorId="4DA81560" wp14:editId="51891236">
+            <wp:extent cx="4024999" cy="3093058"/>
+            <wp:effectExtent l="0" t="0" r="0" b="0"/>
+            <wp:docPr id="1151217460" name="Imagem 1"/>
+            <wp:cNvGraphicFramePr>
+              <a:graphicFrameLocks xmlns:a="http://schemas.openxmlformats.org/drawingml/2006/main" noChangeAspect="1"/>
+            </wp:cNvGraphicFramePr>
+            <a:graphic xmlns:a="http://schemas.openxmlformats.org/drawingml/2006/main">
+              <a:graphicData uri="http://schemas.openxmlformats.org/drawingml/2006/picture">
+                <pic:pic xmlns:pic="http://schemas.openxmlformats.org/drawingml/2006/picture">
+                  <pic:nvPicPr>
+                    <pic:cNvPr id="1151217460" name=""/>
+                    <pic:cNvPicPr/>
+                  </pic:nvPicPr>
+                  <pic:blipFill>
+                    <a:blip r:embed="rId42"/>
+                    <a:stretch>
+                      <a:fillRect/>
+                    </a:stretch>
+                  </pic:blipFill>
+                  <pic:spPr>
+                    <a:xfrm>
+                      <a:off x="0" y="0"/>
+                      <a:ext cx="4035493" cy="3101123"/>
+                    </a:xfrm>
+                    <a:prstGeom prst="rect">
+                      <a:avLst/>
+                    </a:prstGeom>
+                  </pic:spPr>
+                </pic:pic>
+              </a:graphicData>
+            </a:graphic>
+          </wp:inline>
+        </w:drawing>
+      </w:r>
+    </w:p>
+    <w:p>
+      <w:pPr>
+        <w:pStyle w:val="PargrafodaLista"/>
+        <w:ind w:left="2160"/>
+        <w:jc w:val="both"/>
+      </w:pPr>
+      <w:r>
+        <w:lastRenderedPageBreak/>
+        <w:t xml:space="preserve">O padrão apresentado é típico quando o </w:t>
+      </w:r>
+      <w:r>
+        <w:t>modelo já extraiu praticamente toda a informação discriminativa disponível no dataset.</w:t>
+      </w:r>
+      <w:r>
+        <w:t xml:space="preserve"> </w:t>
+      </w:r>
+      <w:r>
+        <w:t>A capacidade da rede é muito maior que a complexidade do problema (ResNet-50 para ~11 k imagens).</w:t>
+      </w:r>
+    </w:p>
+    <w:p>
+      <w:pPr>
+        <w:pStyle w:val="PargrafodaLista"/>
+        <w:ind w:left="2160"/>
+        <w:jc w:val="both"/>
+      </w:pPr>
+    </w:p>
+    <w:p>
+      <w:pPr>
+        <w:pStyle w:val="PargrafodaLista"/>
+        <w:numPr>
+          <w:ilvl w:val="1"/>
+          <w:numId w:val="16"/>
+        </w:numPr>
+        <w:jc w:val="both"/>
+      </w:pPr>
+      <w:r>
+        <w:rPr>
+          <w:b/>
+          <w:bCs/>
+        </w:rPr>
+        <w:t>OBSERVAÇÃO:</w:t>
+      </w:r>
+      <w:r>
+        <w:t xml:space="preserve"> </w:t>
+      </w:r>
+      <w:r>
+        <w:t>A regularização implícita (augmentations + batch norm) impede overfitting severo, mas não cria novos sinais supervisionados.</w:t>
+      </w:r>
+      <w:r>
+        <w:t xml:space="preserve"> É seguro afirmar que </w:t>
+      </w:r>
+      <w:r>
+        <w:t>não há indício de bug</w:t>
+      </w:r>
+      <w:r>
+        <w:t xml:space="preserve">, mas sim, uma </w:t>
+      </w:r>
+      <w:r>
+        <w:t>limitação estatística do conjunto de dados.</w:t>
+      </w:r>
+    </w:p>
+    <w:p>
+      <w:pPr>
+        <w:pStyle w:val="PargrafodaLista"/>
+        <w:ind w:left="2880"/>
+        <w:jc w:val="both"/>
+      </w:pPr>
+    </w:p>
+    <w:p>
+      <w:pPr>
+        <w:pStyle w:val="PargrafodaLista"/>
+        <w:numPr>
+          <w:ilvl w:val="0"/>
+          <w:numId w:val="16"/>
+        </w:numPr>
+        <w:jc w:val="both"/>
+        <w:rPr>
+          <w:b/>
+          <w:bCs/>
+        </w:rPr>
+      </w:pPr>
+      <w:r>
+        <w:rPr>
+          <w:b/>
+          <w:bCs/>
+        </w:rPr>
+        <w:t>Mudança de regime em época 31</w:t>
+      </w:r>
+      <w:r>
+        <w:rPr>
+          <w:b/>
+          <w:bCs/>
+        </w:rPr>
+        <w:t>:</w:t>
+      </w:r>
+    </w:p>
+    <w:p>
+      <w:pPr>
+        <w:pStyle w:val="PargrafodaLista"/>
+        <w:ind w:left="2160"/>
+        <w:jc w:val="both"/>
+      </w:pPr>
+      <w:r>
+        <w:t xml:space="preserve">Na época 31, o learning rate cai de 0.1 → 0.01, exatamente como definido no scheduler inspirado no </w:t>
+      </w:r>
+      <w:r>
+        <w:t>artigo original, resultando no seguinte comportamento:</w:t>
+      </w:r>
+    </w:p>
+    <w:p>
+      <w:pPr>
+        <w:pStyle w:val="PargrafodaLista"/>
+        <w:ind w:left="2160"/>
+        <w:jc w:val="both"/>
+      </w:pPr>
+    </w:p>
+    <w:p>
+      <w:pPr>
+        <w:pStyle w:val="PargrafodaLista"/>
+        <w:numPr>
+          <w:ilvl w:val="1"/>
+          <w:numId w:val="16"/>
+        </w:numPr>
+        <w:jc w:val="both"/>
+      </w:pPr>
+      <w:r>
+        <w:t>A loss de treino continua diminuindo, agora mais lentamente.</w:t>
+      </w:r>
+    </w:p>
+    <w:p>
+      <w:pPr>
+        <w:pStyle w:val="PargrafodaLista"/>
+        <w:numPr>
+          <w:ilvl w:val="1"/>
+          <w:numId w:val="16"/>
+        </w:numPr>
+        <w:jc w:val="both"/>
+      </w:pPr>
+      <w:r>
+        <w:t>A acurácia de treino sobe marginalmente, atingindo o pico de ~45.6% (época 40).</w:t>
+      </w:r>
+    </w:p>
+    <w:p>
+      <w:pPr>
+        <w:pStyle w:val="PargrafodaLista"/>
+        <w:numPr>
+          <w:ilvl w:val="1"/>
+          <w:numId w:val="16"/>
+        </w:numPr>
+        <w:jc w:val="both"/>
+      </w:pPr>
+      <w:r>
+        <w:t>A val_accuracy permanece estável, sem degradação.</w:t>
+      </w:r>
+    </w:p>
+    <w:p>
+      <w:pPr>
+        <w:pStyle w:val="PargrafodaLista"/>
+        <w:ind w:left="2880"/>
+        <w:jc w:val="both"/>
+      </w:pPr>
+    </w:p>
+    <w:p>
+      <w:pPr>
+        <w:pStyle w:val="PargrafodaLista"/>
+        <w:ind w:left="1440"/>
+        <w:jc w:val="center"/>
+      </w:pPr>
+      <w:r>
+        <w:rPr>
+          <w:sz w:val="18"/>
+          <w:szCs w:val="18"/>
+        </w:rPr>
+        <w:t>Figura</w:t>
+      </w:r>
+      <w:r>
+        <w:rPr>
+          <w:sz w:val="18"/>
+          <w:szCs w:val="18"/>
+        </w:rPr>
+        <w:t xml:space="preserve"> 3</w:t>
+      </w:r>
+      <w:r>
+        <w:rPr>
+          <w:sz w:val="18"/>
+          <w:szCs w:val="18"/>
+        </w:rPr>
+        <w:t>7</w:t>
+      </w:r>
+      <w:r>
+        <w:rPr>
+          <w:sz w:val="18"/>
+          <w:szCs w:val="18"/>
+        </w:rPr>
+        <w:t xml:space="preserve">: Resultado das épocas </w:t>
+      </w:r>
+      <w:r>
+        <w:rPr>
+          <w:sz w:val="18"/>
+          <w:szCs w:val="18"/>
+        </w:rPr>
+        <w:t>finais</w:t>
+      </w:r>
+      <w:r>
+        <w:rPr>
+          <w:sz w:val="18"/>
+          <w:szCs w:val="18"/>
+        </w:rPr>
+        <w:t xml:space="preserve"> de treinamento</w:t>
+      </w:r>
+    </w:p>
+    <w:p>
+      <w:pPr>
+        <w:pStyle w:val="PargrafodaLista"/>
+        <w:ind w:left="2124"/>
+        <w:jc w:val="both"/>
+      </w:pPr>
+      <w:r>
+        <w:drawing>
+          <wp:inline distT="0" distB="0" distL="0" distR="0" wp14:anchorId="13D448C1" wp14:editId="7EEF16C9">
+            <wp:extent cx="4033216" cy="3077409"/>
+            <wp:effectExtent l="0" t="0" r="5715" b="8890"/>
+            <wp:docPr id="94837619" name="Imagem 1"/>
+            <wp:cNvGraphicFramePr>
+              <a:graphicFrameLocks xmlns:a="http://schemas.openxmlformats.org/drawingml/2006/main" noChangeAspect="1"/>
+            </wp:cNvGraphicFramePr>
+            <a:graphic xmlns:a="http://schemas.openxmlformats.org/drawingml/2006/main">
+              <a:graphicData uri="http://schemas.openxmlformats.org/drawingml/2006/picture">
+                <pic:pic xmlns:pic="http://schemas.openxmlformats.org/drawingml/2006/picture">
+                  <pic:nvPicPr>
+                    <pic:cNvPr id="94837619" name=""/>
+                    <pic:cNvPicPr/>
+                  </pic:nvPicPr>
+                  <pic:blipFill>
+                    <a:blip r:embed="rId43"/>
+                    <a:stretch>
+                      <a:fillRect/>
+                    </a:stretch>
+                  </pic:blipFill>
+                  <pic:spPr>
+                    <a:xfrm>
+                      <a:off x="0" y="0"/>
+                      <a:ext cx="4042984" cy="3084862"/>
+                    </a:xfrm>
+                    <a:prstGeom prst="rect">
+                      <a:avLst/>
+                    </a:prstGeom>
+                  </pic:spPr>
+                </pic:pic>
+              </a:graphicData>
+            </a:graphic>
+          </wp:inline>
+        </w:drawing>
+      </w:r>
+    </w:p>
+    <w:p>
+      <w:pPr>
+        <w:pStyle w:val="PargrafodaLista"/>
+        <w:ind w:left="2880"/>
+        <w:jc w:val="both"/>
+      </w:pPr>
+    </w:p>
+    <w:p>
+      <w:pPr>
+        <w:pStyle w:val="PargrafodaLista"/>
+        <w:ind w:left="2124"/>
+        <w:jc w:val="both"/>
+      </w:pPr>
+      <w:r>
+        <w:t xml:space="preserve">Esse comportamento confirma a atividade e atuação correta do scheduler, passando de um regime exploratório para um regime de refinamento. </w:t>
+      </w:r>
+      <w:r>
+        <w:t>Esse comportamento é canônico em treinamentos com SGD clássico.</w:t>
+      </w:r>
+    </w:p>
+    <w:p>
+      <w:pPr>
+        <w:pStyle w:val="PargrafodaLista"/>
+        <w:ind w:left="2124"/>
+        <w:jc w:val="both"/>
+      </w:pPr>
+    </w:p>
+    <w:p>
+      <w:pPr>
+        <w:pStyle w:val="PargrafodaLista"/>
+        <w:ind w:left="2124"/>
+        <w:jc w:val="both"/>
+      </w:pPr>
+    </w:p>
+    <w:p>
+      <w:pPr>
+        <w:pStyle w:val="PargrafodaLista"/>
+        <w:ind w:left="2124"/>
+        <w:jc w:val="both"/>
+      </w:pPr>
+    </w:p>
+    <w:p>
+      <w:pPr>
+        <w:pStyle w:val="PargrafodaLista"/>
+        <w:ind w:left="2124"/>
+        <w:jc w:val="both"/>
+      </w:pPr>
+    </w:p>
+    <w:p>
+      <w:pPr>
+        <w:pStyle w:val="PargrafodaLista"/>
+        <w:ind w:left="2124"/>
+        <w:jc w:val="both"/>
+      </w:pPr>
+    </w:p>
+    <w:p>
+      <w:pPr>
+        <w:pStyle w:val="PargrafodaLista"/>
+        <w:numPr>
+          <w:ilvl w:val="0"/>
+          <w:numId w:val="16"/>
+        </w:numPr>
+        <w:jc w:val="both"/>
+      </w:pPr>
+      <w:r>
+        <w:rPr>
+          <w:b/>
+          <w:bCs/>
+        </w:rPr>
+        <w:lastRenderedPageBreak/>
+        <w:t xml:space="preserve">Possível explicação para o </w:t>
+      </w:r>
+      <w:r>
+        <w:rPr>
+          <w:b/>
+          <w:bCs/>
+        </w:rPr>
+        <w:t>platô</w:t>
+      </w:r>
+      <w:r>
+        <w:rPr>
+          <w:b/>
+          <w:bCs/>
+        </w:rPr>
+        <w:t xml:space="preserve"> observado:</w:t>
+      </w:r>
+    </w:p>
+    <w:p>
+      <w:pPr>
+        <w:ind w:left="2124" w:firstLine="36"/>
+        <w:jc w:val="both"/>
+      </w:pPr>
+      <w:r>
+        <w:t>Com 3 classes, a chance aleatória seria ~33%</w:t>
+      </w:r>
+      <w:r>
+        <w:t xml:space="preserve">, e o </w:t>
+      </w:r>
+      <w:r>
+        <w:t xml:space="preserve">modelo </w:t>
+      </w:r>
+      <w:r>
+        <w:t>apresenta</w:t>
+      </w:r>
+      <w:r>
+        <w:t xml:space="preserve"> um ganho real </w:t>
+      </w:r>
+      <w:r>
+        <w:t xml:space="preserve">positivo de aproximadamente </w:t>
+      </w:r>
+      <w:r>
+        <w:t>12%.</w:t>
+      </w:r>
+      <w:r>
+        <w:t xml:space="preserve"> Porém</w:t>
+      </w:r>
+      <w:r>
+        <w:t>,</w:t>
+      </w:r>
+      <w:r>
+        <w:t xml:space="preserve"> a arquitetura ResNet-50 acaba sendo </w:t>
+      </w:r>
+      <w:r>
+        <w:t>excessivamente profunda para esse volume de dados</w:t>
+      </w:r>
+      <w:r>
+        <w:t xml:space="preserve">, de modo que, mesmo que </w:t>
+      </w:r>
+      <w:r>
+        <w:t xml:space="preserve">o modelo </w:t>
+      </w:r>
+      <w:r>
+        <w:t>esteja bem implementado</w:t>
+      </w:r>
+      <w:r>
+        <w:t xml:space="preserve">, </w:t>
+      </w:r>
+      <w:r>
+        <w:t>ele é</w:t>
+      </w:r>
+      <w:r>
+        <w:t xml:space="preserve"> mal condicionado </w:t>
+      </w:r>
+      <w:r>
+        <w:t>ao</w:t>
+      </w:r>
+      <w:r>
+        <w:t xml:space="preserve"> problema.</w:t>
+      </w:r>
+      <w:r>
+        <w:t xml:space="preserve"> Possíveis gargalos incluem:</w:t>
+      </w:r>
+    </w:p>
+    <w:p>
+      <w:pPr>
+        <w:pStyle w:val="PargrafodaLista"/>
+        <w:numPr>
+          <w:ilvl w:val="1"/>
+          <w:numId w:val="16"/>
+        </w:numPr>
+        <w:jc w:val="both"/>
+      </w:pPr>
+      <w:r>
+        <w:t>Quantidade limitada de dados.</w:t>
+      </w:r>
+    </w:p>
+    <w:p>
+      <w:pPr>
+        <w:pStyle w:val="PargrafodaLista"/>
+        <w:numPr>
+          <w:ilvl w:val="1"/>
+          <w:numId w:val="16"/>
+        </w:numPr>
+        <w:jc w:val="both"/>
+      </w:pPr>
+      <w:r>
+        <w:t xml:space="preserve">Ruído intraclasse (especialmente em classes </w:t>
+      </w:r>
+      <w:r>
+        <w:t>próximas</w:t>
+      </w:r>
+      <w:r>
+        <w:t xml:space="preserve"> como “Pouca dor” </w:t>
+      </w:r>
+      <w:r>
+        <w:t>e</w:t>
+      </w:r>
+      <w:r>
+        <w:t xml:space="preserve"> “Muita dor”).</w:t>
+      </w:r>
+    </w:p>
+    <w:p>
+      <w:pPr>
+        <w:pStyle w:val="PargrafodaLista"/>
+        <w:ind w:left="2880"/>
+        <w:jc w:val="both"/>
+      </w:pPr>
+    </w:p>
+    <w:p>
+      <w:pPr>
+        <w:pStyle w:val="PargrafodaLista"/>
+        <w:numPr>
+          <w:ilvl w:val="0"/>
+          <w:numId w:val="16"/>
+        </w:numPr>
+        <w:jc w:val="both"/>
+      </w:pPr>
+      <w:r>
+        <w:rPr>
+          <w:b/>
+          <w:bCs/>
+        </w:rPr>
+        <w:t>Conclusões</w:t>
+      </w:r>
+      <w:r>
+        <w:t xml:space="preserve">: o </w:t>
+      </w:r>
+      <w:r>
+        <w:t xml:space="preserve">pipeline </w:t>
+      </w:r>
+      <w:r>
+        <w:t>apresenta comportamento</w:t>
+      </w:r>
+      <w:r>
+        <w:t xml:space="preserve"> correto</w:t>
+      </w:r>
+      <w:r>
+        <w:t xml:space="preserve"> e</w:t>
+      </w:r>
+      <w:r>
+        <w:t xml:space="preserve"> estável. O </w:t>
+      </w:r>
+      <w:r>
+        <w:t>resultado</w:t>
+      </w:r>
+      <w:r>
+        <w:t xml:space="preserve"> observado no treino de 50 épocas é totalmente consistente com a teoria, com o </w:t>
+      </w:r>
+      <w:r>
+        <w:t xml:space="preserve">artigo original, </w:t>
+      </w:r>
+      <w:r>
+        <w:t>e com as limitações práticas do dataset utilizado. O teto de ~45% não indica falha — indica que o modelo já está operando próximo ao máximo informativo disponível nos dados atuais.</w:t>
+      </w:r>
+      <w:r>
+        <w:t xml:space="preserve"> Os próximos passos recomendados para a experimentação são:</w:t>
+      </w:r>
+    </w:p>
+    <w:p>
+      <w:pPr>
+        <w:pStyle w:val="PargrafodaLista"/>
+        <w:ind w:left="2160"/>
+        <w:jc w:val="both"/>
+      </w:pPr>
+    </w:p>
+    <w:p>
+      <w:pPr>
+        <w:pStyle w:val="PargrafodaLista"/>
+        <w:numPr>
+          <w:ilvl w:val="1"/>
+          <w:numId w:val="16"/>
+        </w:numPr>
+        <w:jc w:val="both"/>
+      </w:pPr>
+      <w:r>
+        <w:t xml:space="preserve">Usar ResNet-50 pré-treinada no ImageNet e </w:t>
+      </w:r>
+      <w:r>
+        <w:t xml:space="preserve">aplicar um </w:t>
+      </w:r>
+      <w:r>
+        <w:t>fine-tun</w:t>
+      </w:r>
+      <w:r>
+        <w:t>ning</w:t>
+      </w:r>
+      <w:r>
+        <w:t>.</w:t>
+      </w:r>
+    </w:p>
+    <w:p>
+      <w:pPr>
+        <w:pStyle w:val="PargrafodaLista"/>
+        <w:numPr>
+          <w:ilvl w:val="1"/>
+          <w:numId w:val="16"/>
+        </w:numPr>
+        <w:jc w:val="both"/>
+      </w:pPr>
+      <w:r>
+        <w:t xml:space="preserve">Testar </w:t>
+      </w:r>
+      <w:r>
+        <w:t xml:space="preserve">variações mais rasas como a </w:t>
+      </w:r>
+      <w:r>
+        <w:t xml:space="preserve">ResNet-18 ou ResNet-34, </w:t>
+      </w:r>
+      <w:r>
+        <w:t xml:space="preserve">que são </w:t>
+      </w:r>
+      <w:r>
+        <w:t xml:space="preserve">mais adequadas </w:t>
+      </w:r>
+      <w:r>
+        <w:t xml:space="preserve">para </w:t>
+      </w:r>
+      <w:r>
+        <w:t>10 k imagens.</w:t>
+      </w:r>
+    </w:p>
+    <w:p>
+      <w:pPr>
+        <w:pStyle w:val="PargrafodaLista"/>
+        <w:numPr>
+          <w:ilvl w:val="1"/>
+          <w:numId w:val="16"/>
+        </w:numPr>
+        <w:jc w:val="both"/>
+      </w:pPr>
+      <w:r>
+        <w:t>Eventualmente testar cross-validation se o dataset permitir.</w:t>
+      </w:r>
+    </w:p>
+    <w:p>
+      <w:pPr>
+        <w:pStyle w:val="PargrafodaLista"/>
+        <w:ind w:left="2160"/>
+        <w:jc w:val="both"/>
+      </w:pPr>
+    </w:p>
+    <w:p>
+      <w:pPr>
+        <w:pStyle w:val="PargrafodaLista"/>
+        <w:numPr>
+          <w:ilvl w:val="1"/>
+          <w:numId w:val="1"/>
+        </w:numPr>
+        <w:jc w:val="both"/>
+        <w:rPr>
+          <w:b/>
+          <w:bCs/>
+        </w:rPr>
+      </w:pPr>
+      <w:r>
+        <w:rPr>
+          <w:b/>
+          <w:bCs/>
+        </w:rPr>
+        <w:t xml:space="preserve">EXPERIMENTO </w:t>
+      </w:r>
+      <w:r>
+        <w:rPr>
+          <w:b/>
+          <w:bCs/>
+        </w:rPr>
+        <w:t>5</w:t>
+      </w:r>
+      <w:r>
+        <w:rPr>
+          <w:b/>
+          <w:bCs/>
+        </w:rPr>
+        <w:t xml:space="preserve"> (RESNET) – </w:t>
+      </w:r>
+      <w:r>
+        <w:rPr>
+          <w:b/>
+          <w:bCs/>
+        </w:rPr>
+        <w:t xml:space="preserve">TREINO COM 500 ÉPOCAS PARA VERIFICAR </w:t>
+      </w:r>
+      <w:r>
+        <w:rPr>
+          <w:b/>
+          <w:bCs/>
+        </w:rPr>
+        <w:t>O COMPORTAMENTO GERAL</w:t>
+      </w:r>
+      <w:r>
+        <w:rPr>
+          <w:b/>
+          <w:bCs/>
+        </w:rPr>
+        <w:t>:</w:t>
+      </w:r>
     </w:p>
     <w:sectPr>
       <w:pgSz w:w="11906" w:h="16838"/>
@@ -9890,6 +11074,32 @@
 
 <file path=word/numbering.xml><?xml version="1.0" encoding="utf-8"?>
 <w:numbering xmlns:wpc="http://schemas.microsoft.com/office/word/2010/wordprocessingCanvas" xmlns:cx="http://schemas.microsoft.com/office/drawing/2014/chartex" xmlns:cx1="http://schemas.microsoft.com/office/drawing/2015/9/8/chartex" xmlns:cx2="http://schemas.microsoft.com/office/drawing/2015/10/21/chartex" xmlns:cx3="http://schemas.microsoft.com/office/drawing/2016/5/9/chartex" xmlns:cx4="http://schemas.microsoft.com/office/drawing/2016/5/10/chartex" xmlns:cx5="http://schemas.microsoft.com/office/drawing/2016/5/11/chartex" xmlns:cx6="http://schemas.microsoft.com/office/drawing/2016/5/12/chartex" xmlns:cx7="http://schemas.microsoft.com/office/drawing/2016/5/13/chartex" xmlns:cx8="http://schemas.microsoft.com/office/drawing/2016/5/14/chartex" xmlns:mc="http://schemas.openxmlformats.org/markup-compatibility/2006" xmlns:aink="http://schemas.microsoft.com/office/drawing/2016/ink" xmlns:am3d="http://schemas.microsoft.com/office/drawing/2017/model3d" xmlns:o="urn:schemas-microsoft-com:office:office" xmlns:oel="http://schemas.microsoft.com/office/2019/extlst" xmlns:r="http://schemas.openxmlformats.org/officeDocument/2006/relationships" xmlns:m="http://schemas.openxmlformats.org/officeDocument/2006/math" xmlns:v="urn:schemas-microsoft-com:vml" xmlns:wp14="http://schemas.microsoft.com/office/word/2010/wordprocessingDrawing" xmlns:wp="http://schemas.openxmlformats.org/drawingml/2006/wordprocessingDrawing" xmlns:w10="urn:schemas-microsoft-com:office:word" xmlns:w="http://schemas.openxmlformats.org/wordprocessingml/2006/main" xmlns:w14="http://schemas.microsoft.com/office/word/2010/wordml" xmlns:w15="http://schemas.microsoft.com/office/word/2012/wordml" xmlns:w16cex="http://schemas.microsoft.com/office/word/2018/wordml/cex" xmlns:w16cid="http://schemas.microsoft.com/office/word/2016/wordml/cid" xmlns:w16="http://schemas.microsoft.com/office/word/2018/wordml" xmlns:w16du="http://schemas.microsoft.com/office/word/2023/wordml/word16du" xmlns:w16sdtdh="http://schemas.microsoft.com/office/word/2020/wordml/sdtdatahash" xmlns:w16sdtfl="http://schemas.microsoft.com/office/word/2024/wordml/sdtformatlock" xmlns:w16se="http://schemas.microsoft.com/office/word/2015/wordml/symex" xmlns:wpg="http://schemas.microsoft.com/office/word/2010/wordprocessingGroup" xmlns:wpi="http://schemas.microsoft.com/office/word/2010/wordprocessingInk" xmlns:wne="http://schemas.microsoft.com/office/word/2006/wordml" xmlns:wps="http://schemas.microsoft.com/office/word/2010/wordprocessingShape" mc:Ignorable="w14 w15 w16se w16cid w16 w16cex w16sdtdh w16sdtfl w16du wp14">
+  <w:numPicBullet w:numPicBulletId="0">
+    <w:pict>
+      <v:shapetype id="_x0000_t75" coordsize="21600,21600" o:spt="75" o:preferrelative="t" path="m@4@5l@4@11@9@11@9@5xe" filled="f" stroked="f">
+        <v:stroke joinstyle="miter"/>
+        <v:formulas>
+          <v:f eqn="if lineDrawn pixelLineWidth 0"/>
+          <v:f eqn="sum @0 1 0"/>
+          <v:f eqn="sum 0 0 @1"/>
+          <v:f eqn="prod @2 1 2"/>
+          <v:f eqn="prod @3 21600 pixelWidth"/>
+          <v:f eqn="prod @3 21600 pixelHeight"/>
+          <v:f eqn="sum @0 0 1"/>
+          <v:f eqn="prod @6 1 2"/>
+          <v:f eqn="prod @7 21600 pixelWidth"/>
+          <v:f eqn="sum @8 21600 0"/>
+          <v:f eqn="prod @7 21600 pixelHeight"/>
+          <v:f eqn="sum @10 21600 0"/>
+        </v:formulas>
+        <v:path o:extrusionok="f" gradientshapeok="t" o:connecttype="rect"/>
+        <o:lock v:ext="edit" aspectratio="t"/>
+      </v:shapetype>
+      <v:shape id="_x0000_i1041" type="#_x0000_t75" style="width:693.1pt;height:487.7pt;visibility:visible;mso-wrap-style:square" o:bullet="t">
+        <v:imagedata r:id="rId1" o:title="" croptop="19686f" cropbottom="43833f" cropleft="8606f" cropright="55951f"/>
+      </v:shape>
+    </w:pict>
+  </w:numPicBullet>
   <w:abstractNum w:abstractNumId="0" w15:restartNumberingAfterBreak="0">
     <w:nsid w:val="00893BC9"/>
     <w:multiLevelType w:val="hybridMultilevel"/>
@@ -10456,6 +11666,232 @@
     </w:lvl>
   </w:abstractNum>
   <w:abstractNum w:abstractNumId="5" w15:restartNumberingAfterBreak="0">
+    <w:nsid w:val="199E656B"/>
+    <w:multiLevelType w:val="hybridMultilevel"/>
+    <w:tmpl w:val="1478BA84"/>
+    <w:lvl w:ilvl="0" w:tplc="04160001">
+      <w:start w:val="1"/>
+      <w:numFmt w:val="bullet"/>
+      <w:lvlText w:val=""/>
+      <w:lvlJc w:val="left"/>
+      <w:pPr>
+        <w:ind w:left="2160" w:hanging="360"/>
+      </w:pPr>
+      <w:rPr>
+        <w:rFonts w:ascii="Symbol" w:hAnsi="Symbol" w:hint="default"/>
+      </w:rPr>
+    </w:lvl>
+    <w:lvl w:ilvl="1" w:tplc="04160003">
+      <w:start w:val="1"/>
+      <w:numFmt w:val="bullet"/>
+      <w:lvlText w:val="o"/>
+      <w:lvlJc w:val="left"/>
+      <w:pPr>
+        <w:ind w:left="2880" w:hanging="360"/>
+      </w:pPr>
+      <w:rPr>
+        <w:rFonts w:ascii="Courier New" w:hAnsi="Courier New" w:cs="Courier New" w:hint="default"/>
+      </w:rPr>
+    </w:lvl>
+    <w:lvl w:ilvl="2" w:tplc="04160005" w:tentative="1">
+      <w:start w:val="1"/>
+      <w:numFmt w:val="bullet"/>
+      <w:lvlText w:val=""/>
+      <w:lvlJc w:val="left"/>
+      <w:pPr>
+        <w:ind w:left="3600" w:hanging="360"/>
+      </w:pPr>
+      <w:rPr>
+        <w:rFonts w:ascii="Wingdings" w:hAnsi="Wingdings" w:hint="default"/>
+      </w:rPr>
+    </w:lvl>
+    <w:lvl w:ilvl="3" w:tplc="04160001" w:tentative="1">
+      <w:start w:val="1"/>
+      <w:numFmt w:val="bullet"/>
+      <w:lvlText w:val=""/>
+      <w:lvlJc w:val="left"/>
+      <w:pPr>
+        <w:ind w:left="4320" w:hanging="360"/>
+      </w:pPr>
+      <w:rPr>
+        <w:rFonts w:ascii="Symbol" w:hAnsi="Symbol" w:hint="default"/>
+      </w:rPr>
+    </w:lvl>
+    <w:lvl w:ilvl="4" w:tplc="04160003" w:tentative="1">
+      <w:start w:val="1"/>
+      <w:numFmt w:val="bullet"/>
+      <w:lvlText w:val="o"/>
+      <w:lvlJc w:val="left"/>
+      <w:pPr>
+        <w:ind w:left="5040" w:hanging="360"/>
+      </w:pPr>
+      <w:rPr>
+        <w:rFonts w:ascii="Courier New" w:hAnsi="Courier New" w:cs="Courier New" w:hint="default"/>
+      </w:rPr>
+    </w:lvl>
+    <w:lvl w:ilvl="5" w:tplc="04160005" w:tentative="1">
+      <w:start w:val="1"/>
+      <w:numFmt w:val="bullet"/>
+      <w:lvlText w:val=""/>
+      <w:lvlJc w:val="left"/>
+      <w:pPr>
+        <w:ind w:left="5760" w:hanging="360"/>
+      </w:pPr>
+      <w:rPr>
+        <w:rFonts w:ascii="Wingdings" w:hAnsi="Wingdings" w:hint="default"/>
+      </w:rPr>
+    </w:lvl>
+    <w:lvl w:ilvl="6" w:tplc="04160001" w:tentative="1">
+      <w:start w:val="1"/>
+      <w:numFmt w:val="bullet"/>
+      <w:lvlText w:val=""/>
+      <w:lvlJc w:val="left"/>
+      <w:pPr>
+        <w:ind w:left="6480" w:hanging="360"/>
+      </w:pPr>
+      <w:rPr>
+        <w:rFonts w:ascii="Symbol" w:hAnsi="Symbol" w:hint="default"/>
+      </w:rPr>
+    </w:lvl>
+    <w:lvl w:ilvl="7" w:tplc="04160003" w:tentative="1">
+      <w:start w:val="1"/>
+      <w:numFmt w:val="bullet"/>
+      <w:lvlText w:val="o"/>
+      <w:lvlJc w:val="left"/>
+      <w:pPr>
+        <w:ind w:left="7200" w:hanging="360"/>
+      </w:pPr>
+      <w:rPr>
+        <w:rFonts w:ascii="Courier New" w:hAnsi="Courier New" w:cs="Courier New" w:hint="default"/>
+      </w:rPr>
+    </w:lvl>
+    <w:lvl w:ilvl="8" w:tplc="04160005" w:tentative="1">
+      <w:start w:val="1"/>
+      <w:numFmt w:val="bullet"/>
+      <w:lvlText w:val=""/>
+      <w:lvlJc w:val="left"/>
+      <w:pPr>
+        <w:ind w:left="7920" w:hanging="360"/>
+      </w:pPr>
+      <w:rPr>
+        <w:rFonts w:ascii="Wingdings" w:hAnsi="Wingdings" w:hint="default"/>
+      </w:rPr>
+    </w:lvl>
+  </w:abstractNum>
+  <w:abstractNum w:abstractNumId="6" w15:restartNumberingAfterBreak="0">
+    <w:nsid w:val="1BE3798F"/>
+    <w:multiLevelType w:val="hybridMultilevel"/>
+    <w:tmpl w:val="498C011C"/>
+    <w:lvl w:ilvl="0" w:tplc="04160001">
+      <w:start w:val="1"/>
+      <w:numFmt w:val="bullet"/>
+      <w:lvlText w:val=""/>
+      <w:lvlJc w:val="left"/>
+      <w:pPr>
+        <w:ind w:left="2160" w:hanging="360"/>
+      </w:pPr>
+      <w:rPr>
+        <w:rFonts w:ascii="Symbol" w:hAnsi="Symbol" w:hint="default"/>
+      </w:rPr>
+    </w:lvl>
+    <w:lvl w:ilvl="1" w:tplc="04160003" w:tentative="1">
+      <w:start w:val="1"/>
+      <w:numFmt w:val="bullet"/>
+      <w:lvlText w:val="o"/>
+      <w:lvlJc w:val="left"/>
+      <w:pPr>
+        <w:ind w:left="2880" w:hanging="360"/>
+      </w:pPr>
+      <w:rPr>
+        <w:rFonts w:ascii="Courier New" w:hAnsi="Courier New" w:cs="Courier New" w:hint="default"/>
+      </w:rPr>
+    </w:lvl>
+    <w:lvl w:ilvl="2" w:tplc="04160005" w:tentative="1">
+      <w:start w:val="1"/>
+      <w:numFmt w:val="bullet"/>
+      <w:lvlText w:val=""/>
+      <w:lvlJc w:val="left"/>
+      <w:pPr>
+        <w:ind w:left="3600" w:hanging="360"/>
+      </w:pPr>
+      <w:rPr>
+        <w:rFonts w:ascii="Wingdings" w:hAnsi="Wingdings" w:hint="default"/>
+      </w:rPr>
+    </w:lvl>
+    <w:lvl w:ilvl="3" w:tplc="04160001" w:tentative="1">
+      <w:start w:val="1"/>
+      <w:numFmt w:val="bullet"/>
+      <w:lvlText w:val=""/>
+      <w:lvlJc w:val="left"/>
+      <w:pPr>
+        <w:ind w:left="4320" w:hanging="360"/>
+      </w:pPr>
+      <w:rPr>
+        <w:rFonts w:ascii="Symbol" w:hAnsi="Symbol" w:hint="default"/>
+      </w:rPr>
+    </w:lvl>
+    <w:lvl w:ilvl="4" w:tplc="04160003" w:tentative="1">
+      <w:start w:val="1"/>
+      <w:numFmt w:val="bullet"/>
+      <w:lvlText w:val="o"/>
+      <w:lvlJc w:val="left"/>
+      <w:pPr>
+        <w:ind w:left="5040" w:hanging="360"/>
+      </w:pPr>
+      <w:rPr>
+        <w:rFonts w:ascii="Courier New" w:hAnsi="Courier New" w:cs="Courier New" w:hint="default"/>
+      </w:rPr>
+    </w:lvl>
+    <w:lvl w:ilvl="5" w:tplc="04160005" w:tentative="1">
+      <w:start w:val="1"/>
+      <w:numFmt w:val="bullet"/>
+      <w:lvlText w:val=""/>
+      <w:lvlJc w:val="left"/>
+      <w:pPr>
+        <w:ind w:left="5760" w:hanging="360"/>
+      </w:pPr>
+      <w:rPr>
+        <w:rFonts w:ascii="Wingdings" w:hAnsi="Wingdings" w:hint="default"/>
+      </w:rPr>
+    </w:lvl>
+    <w:lvl w:ilvl="6" w:tplc="04160001" w:tentative="1">
+      <w:start w:val="1"/>
+      <w:numFmt w:val="bullet"/>
+      <w:lvlText w:val=""/>
+      <w:lvlJc w:val="left"/>
+      <w:pPr>
+        <w:ind w:left="6480" w:hanging="360"/>
+      </w:pPr>
+      <w:rPr>
+        <w:rFonts w:ascii="Symbol" w:hAnsi="Symbol" w:hint="default"/>
+      </w:rPr>
+    </w:lvl>
+    <w:lvl w:ilvl="7" w:tplc="04160003" w:tentative="1">
+      <w:start w:val="1"/>
+      <w:numFmt w:val="bullet"/>
+      <w:lvlText w:val="o"/>
+      <w:lvlJc w:val="left"/>
+      <w:pPr>
+        <w:ind w:left="7200" w:hanging="360"/>
+      </w:pPr>
+      <w:rPr>
+        <w:rFonts w:ascii="Courier New" w:hAnsi="Courier New" w:cs="Courier New" w:hint="default"/>
+      </w:rPr>
+    </w:lvl>
+    <w:lvl w:ilvl="8" w:tplc="04160005" w:tentative="1">
+      <w:start w:val="1"/>
+      <w:numFmt w:val="bullet"/>
+      <w:lvlText w:val=""/>
+      <w:lvlJc w:val="left"/>
+      <w:pPr>
+        <w:ind w:left="7920" w:hanging="360"/>
+      </w:pPr>
+      <w:rPr>
+        <w:rFonts w:ascii="Wingdings" w:hAnsi="Wingdings" w:hint="default"/>
+      </w:rPr>
+    </w:lvl>
+  </w:abstractNum>
+  <w:abstractNum w:abstractNumId="7" w15:restartNumberingAfterBreak="0">
     <w:nsid w:val="257F3AFD"/>
     <w:multiLevelType w:val="hybridMultilevel"/>
     <w:tmpl w:val="1EC031A0"/>
@@ -10568,7 +12004,7 @@
       </w:rPr>
     </w:lvl>
   </w:abstractNum>
-  <w:abstractNum w:abstractNumId="6" w15:restartNumberingAfterBreak="0">
+  <w:abstractNum w:abstractNumId="8" w15:restartNumberingAfterBreak="0">
     <w:nsid w:val="266A6226"/>
     <w:multiLevelType w:val="hybridMultilevel"/>
     <w:tmpl w:val="56660C70"/>
@@ -10681,7 +12117,7 @@
       </w:rPr>
     </w:lvl>
   </w:abstractNum>
-  <w:abstractNum w:abstractNumId="7" w15:restartNumberingAfterBreak="0">
+  <w:abstractNum w:abstractNumId="9" w15:restartNumberingAfterBreak="0">
     <w:nsid w:val="29B241C9"/>
     <w:multiLevelType w:val="hybridMultilevel"/>
     <w:tmpl w:val="0968580C"/>
@@ -10794,7 +12230,7 @@
       </w:rPr>
     </w:lvl>
   </w:abstractNum>
-  <w:abstractNum w:abstractNumId="8" w15:restartNumberingAfterBreak="0">
+  <w:abstractNum w:abstractNumId="10" w15:restartNumberingAfterBreak="0">
     <w:nsid w:val="306B2EE5"/>
     <w:multiLevelType w:val="hybridMultilevel"/>
     <w:tmpl w:val="C4568E5A"/>
@@ -10907,10 +12343,10 @@
       </w:rPr>
     </w:lvl>
   </w:abstractNum>
-  <w:abstractNum w:abstractNumId="9" w15:restartNumberingAfterBreak="0">
+  <w:abstractNum w:abstractNumId="11" w15:restartNumberingAfterBreak="0">
     <w:nsid w:val="435C54D2"/>
     <w:multiLevelType w:val="hybridMultilevel"/>
-    <w:tmpl w:val="5CA0F73A"/>
+    <w:tmpl w:val="AC84C2FE"/>
     <w:lvl w:ilvl="0" w:tplc="0416000F">
       <w:start w:val="1"/>
       <w:numFmt w:val="decimal"/>
@@ -10995,7 +12431,7 @@
       </w:pPr>
     </w:lvl>
   </w:abstractNum>
-  <w:abstractNum w:abstractNumId="10" w15:restartNumberingAfterBreak="0">
+  <w:abstractNum w:abstractNumId="12" w15:restartNumberingAfterBreak="0">
     <w:nsid w:val="572156B3"/>
     <w:multiLevelType w:val="hybridMultilevel"/>
     <w:tmpl w:val="BA2471CE"/>
@@ -11108,7 +12544,120 @@
       </w:rPr>
     </w:lvl>
   </w:abstractNum>
-  <w:abstractNum w:abstractNumId="11" w15:restartNumberingAfterBreak="0">
+  <w:abstractNum w:abstractNumId="13" w15:restartNumberingAfterBreak="0">
+    <w:nsid w:val="5C1E465F"/>
+    <w:multiLevelType w:val="hybridMultilevel"/>
+    <w:tmpl w:val="CC70734E"/>
+    <w:lvl w:ilvl="0" w:tplc="04160001">
+      <w:start w:val="1"/>
+      <w:numFmt w:val="bullet"/>
+      <w:lvlText w:val=""/>
+      <w:lvlJc w:val="left"/>
+      <w:pPr>
+        <w:ind w:left="2484" w:hanging="360"/>
+      </w:pPr>
+      <w:rPr>
+        <w:rFonts w:ascii="Symbol" w:hAnsi="Symbol" w:hint="default"/>
+      </w:rPr>
+    </w:lvl>
+    <w:lvl w:ilvl="1" w:tplc="04160003" w:tentative="1">
+      <w:start w:val="1"/>
+      <w:numFmt w:val="bullet"/>
+      <w:lvlText w:val="o"/>
+      <w:lvlJc w:val="left"/>
+      <w:pPr>
+        <w:ind w:left="3204" w:hanging="360"/>
+      </w:pPr>
+      <w:rPr>
+        <w:rFonts w:ascii="Courier New" w:hAnsi="Courier New" w:cs="Courier New" w:hint="default"/>
+      </w:rPr>
+    </w:lvl>
+    <w:lvl w:ilvl="2" w:tplc="04160005" w:tentative="1">
+      <w:start w:val="1"/>
+      <w:numFmt w:val="bullet"/>
+      <w:lvlText w:val=""/>
+      <w:lvlJc w:val="left"/>
+      <w:pPr>
+        <w:ind w:left="3924" w:hanging="360"/>
+      </w:pPr>
+      <w:rPr>
+        <w:rFonts w:ascii="Wingdings" w:hAnsi="Wingdings" w:hint="default"/>
+      </w:rPr>
+    </w:lvl>
+    <w:lvl w:ilvl="3" w:tplc="04160001" w:tentative="1">
+      <w:start w:val="1"/>
+      <w:numFmt w:val="bullet"/>
+      <w:lvlText w:val=""/>
+      <w:lvlJc w:val="left"/>
+      <w:pPr>
+        <w:ind w:left="4644" w:hanging="360"/>
+      </w:pPr>
+      <w:rPr>
+        <w:rFonts w:ascii="Symbol" w:hAnsi="Symbol" w:hint="default"/>
+      </w:rPr>
+    </w:lvl>
+    <w:lvl w:ilvl="4" w:tplc="04160003" w:tentative="1">
+      <w:start w:val="1"/>
+      <w:numFmt w:val="bullet"/>
+      <w:lvlText w:val="o"/>
+      <w:lvlJc w:val="left"/>
+      <w:pPr>
+        <w:ind w:left="5364" w:hanging="360"/>
+      </w:pPr>
+      <w:rPr>
+        <w:rFonts w:ascii="Courier New" w:hAnsi="Courier New" w:cs="Courier New" w:hint="default"/>
+      </w:rPr>
+    </w:lvl>
+    <w:lvl w:ilvl="5" w:tplc="04160005" w:tentative="1">
+      <w:start w:val="1"/>
+      <w:numFmt w:val="bullet"/>
+      <w:lvlText w:val=""/>
+      <w:lvlJc w:val="left"/>
+      <w:pPr>
+        <w:ind w:left="6084" w:hanging="360"/>
+      </w:pPr>
+      <w:rPr>
+        <w:rFonts w:ascii="Wingdings" w:hAnsi="Wingdings" w:hint="default"/>
+      </w:rPr>
+    </w:lvl>
+    <w:lvl w:ilvl="6" w:tplc="04160001" w:tentative="1">
+      <w:start w:val="1"/>
+      <w:numFmt w:val="bullet"/>
+      <w:lvlText w:val=""/>
+      <w:lvlJc w:val="left"/>
+      <w:pPr>
+        <w:ind w:left="6804" w:hanging="360"/>
+      </w:pPr>
+      <w:rPr>
+        <w:rFonts w:ascii="Symbol" w:hAnsi="Symbol" w:hint="default"/>
+      </w:rPr>
+    </w:lvl>
+    <w:lvl w:ilvl="7" w:tplc="04160003" w:tentative="1">
+      <w:start w:val="1"/>
+      <w:numFmt w:val="bullet"/>
+      <w:lvlText w:val="o"/>
+      <w:lvlJc w:val="left"/>
+      <w:pPr>
+        <w:ind w:left="7524" w:hanging="360"/>
+      </w:pPr>
+      <w:rPr>
+        <w:rFonts w:ascii="Courier New" w:hAnsi="Courier New" w:cs="Courier New" w:hint="default"/>
+      </w:rPr>
+    </w:lvl>
+    <w:lvl w:ilvl="8" w:tplc="04160005" w:tentative="1">
+      <w:start w:val="1"/>
+      <w:numFmt w:val="bullet"/>
+      <w:lvlText w:val=""/>
+      <w:lvlJc w:val="left"/>
+      <w:pPr>
+        <w:ind w:left="8244" w:hanging="360"/>
+      </w:pPr>
+      <w:rPr>
+        <w:rFonts w:ascii="Wingdings" w:hAnsi="Wingdings" w:hint="default"/>
+      </w:rPr>
+    </w:lvl>
+  </w:abstractNum>
+  <w:abstractNum w:abstractNumId="14" w15:restartNumberingAfterBreak="0">
     <w:nsid w:val="613B7216"/>
     <w:multiLevelType w:val="hybridMultilevel"/>
     <w:tmpl w:val="6C2069C4"/>
@@ -11200,7 +12749,7 @@
       </w:pPr>
     </w:lvl>
   </w:abstractNum>
-  <w:abstractNum w:abstractNumId="12" w15:restartNumberingAfterBreak="0">
+  <w:abstractNum w:abstractNumId="15" w15:restartNumberingAfterBreak="0">
     <w:nsid w:val="66301293"/>
     <w:multiLevelType w:val="hybridMultilevel"/>
     <w:tmpl w:val="2A7C4AA2"/>
@@ -11313,7 +12862,7 @@
       </w:rPr>
     </w:lvl>
   </w:abstractNum>
-  <w:abstractNum w:abstractNumId="13" w15:restartNumberingAfterBreak="0">
+  <w:abstractNum w:abstractNumId="16" w15:restartNumberingAfterBreak="0">
     <w:nsid w:val="785D5530"/>
     <w:multiLevelType w:val="hybridMultilevel"/>
     <w:tmpl w:val="B5BC727C"/>
@@ -11426,7 +12975,7 @@
       </w:rPr>
     </w:lvl>
   </w:abstractNum>
-  <w:abstractNum w:abstractNumId="14" w15:restartNumberingAfterBreak="0">
+  <w:abstractNum w:abstractNumId="17" w15:restartNumberingAfterBreak="0">
     <w:nsid w:val="7D075251"/>
     <w:multiLevelType w:val="hybridMultilevel"/>
     <w:tmpl w:val="DE3E8316"/>
@@ -11540,49 +13089,58 @@
     </w:lvl>
   </w:abstractNum>
   <w:num w:numId="1" w16cid:durableId="231621070">
-    <w:abstractNumId w:val="9"/>
+    <w:abstractNumId w:val="11"/>
   </w:num>
   <w:num w:numId="2" w16cid:durableId="494537868">
     <w:abstractNumId w:val="4"/>
   </w:num>
   <w:num w:numId="3" w16cid:durableId="555967944">
-    <w:abstractNumId w:val="13"/>
+    <w:abstractNumId w:val="16"/>
   </w:num>
   <w:num w:numId="4" w16cid:durableId="975720977">
-    <w:abstractNumId w:val="6"/>
+    <w:abstractNumId w:val="8"/>
   </w:num>
   <w:num w:numId="5" w16cid:durableId="1419063285">
     <w:abstractNumId w:val="1"/>
   </w:num>
   <w:num w:numId="6" w16cid:durableId="1947691180">
-    <w:abstractNumId w:val="11"/>
+    <w:abstractNumId w:val="14"/>
   </w:num>
   <w:num w:numId="7" w16cid:durableId="543980649">
-    <w:abstractNumId w:val="5"/>
+    <w:abstractNumId w:val="7"/>
   </w:num>
   <w:num w:numId="8" w16cid:durableId="523710046">
     <w:abstractNumId w:val="0"/>
   </w:num>
   <w:num w:numId="9" w16cid:durableId="736512136">
-    <w:abstractNumId w:val="10"/>
+    <w:abstractNumId w:val="12"/>
   </w:num>
   <w:num w:numId="10" w16cid:durableId="1832524834">
-    <w:abstractNumId w:val="14"/>
+    <w:abstractNumId w:val="17"/>
   </w:num>
   <w:num w:numId="11" w16cid:durableId="1122117184">
-    <w:abstractNumId w:val="8"/>
+    <w:abstractNumId w:val="10"/>
   </w:num>
   <w:num w:numId="12" w16cid:durableId="2133136465">
     <w:abstractNumId w:val="3"/>
   </w:num>
   <w:num w:numId="13" w16cid:durableId="1067458539">
-    <w:abstractNumId w:val="7"/>
+    <w:abstractNumId w:val="9"/>
   </w:num>
   <w:num w:numId="14" w16cid:durableId="1593928561">
     <w:abstractNumId w:val="2"/>
   </w:num>
   <w:num w:numId="15" w16cid:durableId="1046374455">
-    <w:abstractNumId w:val="12"/>
+    <w:abstractNumId w:val="15"/>
+  </w:num>
+  <w:num w:numId="16" w16cid:durableId="1399130606">
+    <w:abstractNumId w:val="5"/>
+  </w:num>
+  <w:num w:numId="17" w16cid:durableId="279843836">
+    <w:abstractNumId w:val="13"/>
+  </w:num>
+  <w:num w:numId="18" w16cid:durableId="1173257668">
+    <w:abstractNumId w:val="6"/>
   </w:num>
 </w:numbering>
 </file>
@@ -12190,7 +13748,6 @@
   <w:style w:type="character" w:default="1" w:styleId="Fontepargpadro">
     <w:name w:val="Default Paragraph Font"/>
     <w:uiPriority w:val="1"/>
-    <w:semiHidden/>
     <w:unhideWhenUsed/>
   </w:style>
   <w:style w:type="table" w:default="1" w:styleId="Tabelanormal">
@@ -12527,6 +14084,19 @@
       <w:shd w:val="clear" w:color="auto" w:fill="E1DFDD"/>
     </w:rPr>
   </w:style>
+  <w:style w:type="paragraph" w:styleId="NormalWeb">
+    <w:name w:val="Normal (Web)"/>
+    <w:basedOn w:val="Normal"/>
+    <w:uiPriority w:val="99"/>
+    <w:semiHidden/>
+    <w:unhideWhenUsed/>
+    <w:rsid w:val="002B6DC0"/>
+    <w:rPr>
+      <w:rFonts w:ascii="Times New Roman" w:hAnsi="Times New Roman" w:cs="Times New Roman"/>
+      <w:sz w:val="24"/>
+      <w:szCs w:val="24"/>
+    </w:rPr>
+  </w:style>
 </w:styles>
 </file>
 

</xml_diff>

<commit_message>
Experimento 6 com ResNet-18
</commit_message>
<xml_diff>
--- a/Documentation/Documentacao Unificada de Experimentos.docx
+++ b/Documentation/Documentacao Unificada de Experimentos.docx
@@ -602,6 +602,9 @@
           <w:numId w:val="2"/>
         </w:numPr>
         <w:jc w:val="both"/>
+        <w:rPr>
+          <w:lang w:val="en-US"/>
+        </w:rPr>
       </w:pPr>
       <w:proofErr w:type="spellStart"/>
       <w:r>
@@ -668,47 +671,41 @@
       </w:r>
       <w:proofErr w:type="spellEnd"/>
       <w:r>
-        <w:t xml:space="preserve">. O artigo usa um </w:t>
-      </w:r>
-      <w:proofErr w:type="spellStart"/>
-      <w:r>
-        <w:t>learnable</w:t>
-      </w:r>
-      <w:proofErr w:type="spellEnd"/>
-      <w:r>
+        <w:t xml:space="preserve">. </w:t>
+      </w:r>
+      <w:r>
+        <w:rPr>
+          <w:lang w:val="en-US"/>
+        </w:rPr>
+        <w:t xml:space="preserve">O </w:t>
+      </w:r>
+      <w:proofErr w:type="spellStart"/>
+      <w:r>
+        <w:rPr>
+          <w:lang w:val="en-US"/>
+        </w:rPr>
+        <w:t>artigo</w:t>
+      </w:r>
+      <w:proofErr w:type="spellEnd"/>
+      <w:r>
+        <w:rPr>
+          <w:lang w:val="en-US"/>
+        </w:rPr>
         <w:t xml:space="preserve"> </w:t>
       </w:r>
       <w:proofErr w:type="spellStart"/>
       <w:r>
-        <w:t>class</w:t>
-      </w:r>
-      <w:proofErr w:type="spellEnd"/>
-      <w:r>
-        <w:t xml:space="preserve"> token e </w:t>
-      </w:r>
-      <w:proofErr w:type="spellStart"/>
-      <w:r>
-        <w:t>learnable</w:t>
-      </w:r>
-      <w:proofErr w:type="spellEnd"/>
-      <w:r>
-        <w:t xml:space="preserve"> </w:t>
-      </w:r>
-      <w:proofErr w:type="spellStart"/>
-      <w:r>
-        <w:t>positional</w:t>
-      </w:r>
-      <w:proofErr w:type="spellEnd"/>
-      <w:r>
-        <w:t xml:space="preserve"> </w:t>
-      </w:r>
-      <w:proofErr w:type="spellStart"/>
-      <w:r>
-        <w:t>embeddings</w:t>
-      </w:r>
-      <w:proofErr w:type="spellEnd"/>
-      <w:r>
-        <w:t>;</w:t>
+        <w:rPr>
+          <w:lang w:val="en-US"/>
+        </w:rPr>
+        <w:t>usa</w:t>
+      </w:r>
+      <w:proofErr w:type="spellEnd"/>
+      <w:r>
+        <w:rPr>
+          <w:lang w:val="en-US"/>
+        </w:rPr>
+        <w:t xml:space="preserve"> um learnable class token e learnable positional embeddings;</w:t>
       </w:r>
     </w:p>
     <w:p>
@@ -716,6 +713,9 @@
         <w:pStyle w:val="PargrafodaLista"/>
         <w:ind w:left="2880"/>
         <w:jc w:val="both"/>
+        <w:rPr>
+          <w:lang w:val="en-US"/>
+        </w:rPr>
       </w:pPr>
     </w:p>
     <w:p>
@@ -5018,18 +5018,15 @@
         <w:pStyle w:val="PargrafodaLista"/>
         <w:ind w:left="2832"/>
         <w:jc w:val="both"/>
-      </w:pPr>
-      <w:r>
-        <w:t>→</w:t>
-      </w:r>
-      <w:r>
-        <w:t xml:space="preserve"> </w:t>
-      </w:r>
-      <w:r>
-        <w:t xml:space="preserve">STEP_PER_EPOCH = </w:t>
-      </w:r>
-      <w:r>
-        <w:t>347 e EPOCHS = 5</w:t>
+        <w:rPr>
+          <w:lang w:val="en-US"/>
+        </w:rPr>
+      </w:pPr>
+      <w:r>
+        <w:rPr>
+          <w:lang w:val="en-US"/>
+        </w:rPr>
+        <w:t>→ STEP_PER_EPOCH = 347 e EPOCHS = 5</w:t>
       </w:r>
     </w:p>
     <w:p>
@@ -6713,20 +6710,43 @@
       <w:pPr>
         <w:pStyle w:val="PargrafodaLista"/>
         <w:ind w:left="2124"/>
-      </w:pPr>
-      <w:r>
-        <w:t>STEP</w:t>
-      </w:r>
-      <w:r>
-        <w:t>_PER_EPOCH = 100 (limitado)</w:t>
+        <w:rPr>
+          <w:lang w:val="en-US"/>
+        </w:rPr>
+      </w:pPr>
+      <w:r>
+        <w:rPr>
+          <w:lang w:val="en-US"/>
+        </w:rPr>
+        <w:t>STEP_PER_EPOCH = 100 (</w:t>
+      </w:r>
+      <w:proofErr w:type="spellStart"/>
+      <w:r>
+        <w:rPr>
+          <w:lang w:val="en-US"/>
+        </w:rPr>
+        <w:t>limitado</w:t>
+      </w:r>
+      <w:proofErr w:type="spellEnd"/>
+      <w:r>
+        <w:rPr>
+          <w:lang w:val="en-US"/>
+        </w:rPr>
+        <w:t>)</w:t>
       </w:r>
     </w:p>
     <w:p>
       <w:pPr>
         <w:pStyle w:val="PargrafodaLista"/>
         <w:ind w:left="2124"/>
-      </w:pPr>
-      <w:r>
+        <w:rPr>
+          <w:lang w:val="en-US"/>
+        </w:rPr>
+      </w:pPr>
+      <w:r>
+        <w:rPr>
+          <w:lang w:val="en-US"/>
+        </w:rPr>
         <w:t>EPOCHS = 2~5</w:t>
       </w:r>
     </w:p>
@@ -6734,8 +6754,14 @@
       <w:pPr>
         <w:pStyle w:val="PargrafodaLista"/>
         <w:ind w:left="2124"/>
-      </w:pPr>
-      <w:r>
+        <w:rPr>
+          <w:lang w:val="en-US"/>
+        </w:rPr>
+      </w:pPr>
+      <w:r>
+        <w:rPr>
+          <w:lang w:val="en-US"/>
+        </w:rPr>
         <w:t>TOTAL_STEPS = 200~500</w:t>
       </w:r>
     </w:p>
@@ -6744,6 +6770,9 @@
         <w:pStyle w:val="PargrafodaLista"/>
         <w:ind w:left="2160"/>
         <w:jc w:val="both"/>
+        <w:rPr>
+          <w:lang w:val="en-US"/>
+        </w:rPr>
       </w:pPr>
     </w:p>
     <w:p>
@@ -6997,20 +7026,29 @@
       <w:pPr>
         <w:pStyle w:val="PargrafodaLista"/>
         <w:ind w:left="2124"/>
-      </w:pPr>
-      <w:r>
-        <w:t>STEP</w:t>
-      </w:r>
-      <w:r>
-        <w:t>_PER_EPOCH = total</w:t>
+        <w:rPr>
+          <w:lang w:val="en-US"/>
+        </w:rPr>
+      </w:pPr>
+      <w:r>
+        <w:rPr>
+          <w:lang w:val="en-US"/>
+        </w:rPr>
+        <w:t>STEP_PER_EPOCH = total</w:t>
       </w:r>
     </w:p>
     <w:p>
       <w:pPr>
         <w:pStyle w:val="PargrafodaLista"/>
         <w:ind w:left="2124"/>
-      </w:pPr>
-      <w:r>
+        <w:rPr>
+          <w:lang w:val="en-US"/>
+        </w:rPr>
+      </w:pPr>
+      <w:r>
+        <w:rPr>
+          <w:lang w:val="en-US"/>
+        </w:rPr>
         <w:t>EPOCHS = 200~500</w:t>
       </w:r>
     </w:p>
@@ -7018,15 +7056,15 @@
       <w:pPr>
         <w:pStyle w:val="PargrafodaLista"/>
         <w:ind w:left="2124"/>
-      </w:pPr>
-      <w:r>
-        <w:t xml:space="preserve">TOTAL_STEPS = EPOCHS * </w:t>
-      </w:r>
-      <w:r>
-        <w:t>STEP</w:t>
-      </w:r>
-      <w:r>
-        <w:t>_PER_EPOCH</w:t>
+        <w:rPr>
+          <w:lang w:val="en-US"/>
+        </w:rPr>
+      </w:pPr>
+      <w:r>
+        <w:rPr>
+          <w:lang w:val="en-US"/>
+        </w:rPr>
+        <w:t>TOTAL_STEPS = EPOCHS * STEP_PER_EPOCH</w:t>
       </w:r>
     </w:p>
     <w:bookmarkEnd w:id="1"/>
@@ -7038,6 +7076,7 @@
         <w:rPr>
           <w:b/>
           <w:bCs/>
+          <w:lang w:val="en-US"/>
         </w:rPr>
       </w:pPr>
     </w:p>
@@ -13701,28 +13740,7 @@
           <w:sz w:val="18"/>
           <w:szCs w:val="18"/>
         </w:rPr>
-        <w:t xml:space="preserve"> 3</w:t>
-      </w:r>
-      <w:r>
-        <w:rPr>
-          <w:sz w:val="18"/>
-          <w:szCs w:val="18"/>
-        </w:rPr>
-        <w:t>8</w:t>
-      </w:r>
-      <w:r>
-        <w:rPr>
-          <w:sz w:val="18"/>
-          <w:szCs w:val="18"/>
-        </w:rPr>
-        <w:t xml:space="preserve">: </w:t>
-      </w:r>
-      <w:r>
-        <w:rPr>
-          <w:sz w:val="18"/>
-          <w:szCs w:val="18"/>
-        </w:rPr>
-        <w:t>Gráfico da perda de treino</w:t>
+        <w:t xml:space="preserve"> 38: Gráfico da perda de treino</w:t>
       </w:r>
     </w:p>
     <w:p>
@@ -13732,6 +13750,9 @@
         <w:jc w:val="both"/>
       </w:pPr>
       <w:r>
+        <w:rPr>
+          <w:noProof/>
+        </w:rPr>
         <w:drawing>
           <wp:inline distT="0" distB="0" distL="0" distR="0" wp14:anchorId="244D92E9" wp14:editId="78DAF112">
             <wp:extent cx="5400040" cy="1753235"/>
@@ -13794,28 +13815,7 @@
           <w:sz w:val="18"/>
           <w:szCs w:val="18"/>
         </w:rPr>
-        <w:t xml:space="preserve"> 3</w:t>
-      </w:r>
-      <w:r>
-        <w:rPr>
-          <w:sz w:val="18"/>
-          <w:szCs w:val="18"/>
-        </w:rPr>
-        <w:t>9</w:t>
-      </w:r>
-      <w:r>
-        <w:rPr>
-          <w:sz w:val="18"/>
-          <w:szCs w:val="18"/>
-        </w:rPr>
-        <w:t xml:space="preserve">: Gráfico da perda de </w:t>
-      </w:r>
-      <w:r>
-        <w:rPr>
-          <w:sz w:val="18"/>
-          <w:szCs w:val="18"/>
-        </w:rPr>
-        <w:t>validação</w:t>
+        <w:t xml:space="preserve"> 39: Gráfico da perda de validação</w:t>
       </w:r>
     </w:p>
     <w:p>
@@ -13825,6 +13825,9 @@
         <w:jc w:val="both"/>
       </w:pPr>
       <w:r>
+        <w:rPr>
+          <w:noProof/>
+        </w:rPr>
         <w:drawing>
           <wp:inline distT="0" distB="0" distL="0" distR="0" wp14:anchorId="482404E5" wp14:editId="3ADBAA3E">
             <wp:extent cx="5400040" cy="2026920"/>
@@ -13923,14 +13926,7 @@
           <w:b/>
           <w:bCs/>
         </w:rPr>
-        <w:t xml:space="preserve">Análise da </w:t>
-      </w:r>
-      <w:r>
-        <w:rPr>
-          <w:b/>
-          <w:bCs/>
-        </w:rPr>
-        <w:t>acurácia</w:t>
+        <w:t>Análise da acurácia</w:t>
       </w:r>
     </w:p>
     <w:p>
@@ -14017,28 +14013,7 @@
           <w:sz w:val="18"/>
           <w:szCs w:val="18"/>
         </w:rPr>
-        <w:t xml:space="preserve"> </w:t>
-      </w:r>
-      <w:r>
-        <w:rPr>
-          <w:sz w:val="18"/>
-          <w:szCs w:val="18"/>
-        </w:rPr>
-        <w:t>40</w:t>
-      </w:r>
-      <w:r>
-        <w:rPr>
-          <w:sz w:val="18"/>
-          <w:szCs w:val="18"/>
-        </w:rPr>
-        <w:t xml:space="preserve">: Gráfico da </w:t>
-      </w:r>
-      <w:r>
-        <w:rPr>
-          <w:sz w:val="18"/>
-          <w:szCs w:val="18"/>
-        </w:rPr>
-        <w:t>acurácia de treino</w:t>
+        <w:t xml:space="preserve"> 40: Gráfico da acurácia de treino</w:t>
       </w:r>
     </w:p>
     <w:p>
@@ -14048,6 +14023,9 @@
         <w:jc w:val="both"/>
       </w:pPr>
       <w:r>
+        <w:rPr>
+          <w:noProof/>
+        </w:rPr>
         <w:drawing>
           <wp:inline distT="0" distB="0" distL="0" distR="0" wp14:anchorId="45C6CFC5" wp14:editId="455F9D42">
             <wp:extent cx="5400040" cy="1430020"/>
@@ -14107,28 +14085,7 @@
           <w:sz w:val="18"/>
           <w:szCs w:val="18"/>
         </w:rPr>
-        <w:t xml:space="preserve"> 4</w:t>
-      </w:r>
-      <w:r>
-        <w:rPr>
-          <w:sz w:val="18"/>
-          <w:szCs w:val="18"/>
-        </w:rPr>
-        <w:t>1</w:t>
-      </w:r>
-      <w:r>
-        <w:rPr>
-          <w:sz w:val="18"/>
-          <w:szCs w:val="18"/>
-        </w:rPr>
-        <w:t xml:space="preserve">: Gráfico da acurácia de </w:t>
-      </w:r>
-      <w:r>
-        <w:rPr>
-          <w:sz w:val="18"/>
-          <w:szCs w:val="18"/>
-        </w:rPr>
-        <w:t>validação</w:t>
+        <w:t xml:space="preserve"> 41: Gráfico da acurácia de validação</w:t>
       </w:r>
     </w:p>
     <w:p>
@@ -14138,6 +14095,9 @@
         <w:jc w:val="center"/>
       </w:pPr>
       <w:r>
+        <w:rPr>
+          <w:noProof/>
+        </w:rPr>
         <w:drawing>
           <wp:inline distT="0" distB="0" distL="0" distR="0" wp14:anchorId="5119814E" wp14:editId="724543B9">
             <wp:extent cx="5400040" cy="2023110"/>
@@ -14274,10 +14234,7 @@
         <w:t>ainda há gradientes úteis sendo explorados e que o treinamento</w:t>
       </w:r>
       <w:r>
-        <w:t xml:space="preserve"> não foi interrompido prematuramente.</w:t>
-      </w:r>
-      <w:r>
-        <w:t xml:space="preserve"> </w:t>
+        <w:t xml:space="preserve"> não foi interrompido prematuramente. </w:t>
       </w:r>
       <w:r>
         <w:sym w:font="Wingdings" w:char="F0E0"/>
@@ -14366,14 +14323,7 @@
           <w:sz w:val="18"/>
           <w:szCs w:val="18"/>
         </w:rPr>
-        <w:t xml:space="preserve"> 41: Gráfico d</w:t>
-      </w:r>
-      <w:r>
-        <w:rPr>
-          <w:sz w:val="18"/>
-          <w:szCs w:val="18"/>
-        </w:rPr>
-        <w:t>o learning rate</w:t>
+        <w:t xml:space="preserve"> 41: Gráfico do learning rate</w:t>
       </w:r>
     </w:p>
     <w:p>
@@ -14383,6 +14333,9 @@
         <w:jc w:val="both"/>
       </w:pPr>
       <w:r>
+        <w:rPr>
+          <w:noProof/>
+        </w:rPr>
         <w:drawing>
           <wp:inline distT="0" distB="0" distL="0" distR="0" wp14:anchorId="1EA4985F" wp14:editId="3B99D402">
             <wp:extent cx="4071068" cy="1488832"/>
@@ -14732,28 +14685,7 @@
           <w:b/>
           <w:bCs/>
         </w:rPr>
-        <w:t xml:space="preserve">TREINO COM </w:t>
-      </w:r>
-      <w:r>
-        <w:rPr>
-          <w:b/>
-          <w:bCs/>
-        </w:rPr>
-        <w:t>200</w:t>
-      </w:r>
-      <w:r>
-        <w:rPr>
-          <w:b/>
-          <w:bCs/>
-        </w:rPr>
-        <w:t xml:space="preserve"> </w:t>
-      </w:r>
-      <w:r>
-        <w:rPr>
-          <w:b/>
-          <w:bCs/>
-        </w:rPr>
-        <w:t>EM VARIAÇÃO RASA DA RESNET</w:t>
+        <w:t>TREINO COM 200 EM VARIAÇÃO RASA DA RESNET</w:t>
       </w:r>
     </w:p>
     <w:p>
@@ -14762,10 +14694,7 @@
         <w:jc w:val="both"/>
       </w:pPr>
       <w:r>
-        <w:t xml:space="preserve">Este experimento </w:t>
-      </w:r>
-      <w:r>
-        <w:t xml:space="preserve">busca adequar a profundidade da rede com o tamanho do </w:t>
+        <w:t xml:space="preserve">Este experimento busca adequar a profundidade da rede com o tamanho do </w:t>
       </w:r>
       <w:proofErr w:type="spellStart"/>
       <w:r>
@@ -15067,8 +14996,880 @@
           <w:b/>
           <w:bCs/>
         </w:rPr>
-        <w:t>Avaliação geral dos resultados</w:t>
-      </w:r>
+        <w:t>Erro do experimento no retorno das métricas:</w:t>
+      </w:r>
+    </w:p>
+    <w:p>
+      <w:pPr>
+        <w:pStyle w:val="PargrafodaLista"/>
+        <w:ind w:left="2160"/>
+        <w:jc w:val="both"/>
+      </w:pPr>
+      <w:r>
+        <w:t>A</w:t>
+      </w:r>
+      <w:r>
+        <w:t xml:space="preserve"> </w:t>
+      </w:r>
+      <w:proofErr w:type="spellStart"/>
+      <w:r>
+        <w:t>loss</w:t>
+      </w:r>
+      <w:proofErr w:type="spellEnd"/>
+      <w:r>
+        <w:t xml:space="preserve"> já aparece como </w:t>
+      </w:r>
+      <w:proofErr w:type="spellStart"/>
+      <w:r>
+        <w:t>nan</w:t>
+      </w:r>
+      <w:proofErr w:type="spellEnd"/>
+      <w:r>
+        <w:t xml:space="preserve"> no primeiro batch da </w:t>
+      </w:r>
+      <w:proofErr w:type="spellStart"/>
+      <w:r>
+        <w:t>Epoch</w:t>
+      </w:r>
+      <w:proofErr w:type="spellEnd"/>
+      <w:r>
+        <w:t xml:space="preserve"> 1, tanto no treino quanto na validação. Quando o N</w:t>
+      </w:r>
+      <w:proofErr w:type="spellStart"/>
+      <w:r>
+        <w:t>aN</w:t>
+      </w:r>
+      <w:proofErr w:type="spellEnd"/>
+      <w:r>
+        <w:t xml:space="preserve"> surge imediatamente, quase sempre a causa está em instabilidade numérica</w:t>
+      </w:r>
+      <w:r>
+        <w:t>.</w:t>
+      </w:r>
+      <w:r>
+        <w:t xml:space="preserve"> </w:t>
+      </w:r>
+      <w:r>
+        <w:t>Possíveis fatores do erro incluem:</w:t>
+      </w:r>
+    </w:p>
+    <w:p>
+      <w:pPr>
+        <w:pStyle w:val="PargrafodaLista"/>
+        <w:ind w:left="2160"/>
+        <w:jc w:val="both"/>
+      </w:pPr>
+    </w:p>
+    <w:p>
+      <w:pPr>
+        <w:pStyle w:val="PargrafodaLista"/>
+        <w:numPr>
+          <w:ilvl w:val="1"/>
+          <w:numId w:val="19"/>
+        </w:numPr>
+        <w:jc w:val="both"/>
+      </w:pPr>
+      <w:r>
+        <w:t xml:space="preserve">learning rate canônico (0.1) aplicado fora do regime do </w:t>
+      </w:r>
+      <w:r>
+        <w:t xml:space="preserve">artigo. Como o experimento tem uma quantidade menor para Batch, </w:t>
+      </w:r>
+      <w:proofErr w:type="spellStart"/>
+      <w:r>
+        <w:t>Dataset</w:t>
+      </w:r>
+      <w:proofErr w:type="spellEnd"/>
+      <w:r>
+        <w:t xml:space="preserve"> e Classes, é provável que LR seja </w:t>
+      </w:r>
+      <w:r>
+        <w:t>alt</w:t>
+      </w:r>
+      <w:r>
+        <w:t>a</w:t>
+      </w:r>
+      <w:r>
+        <w:t xml:space="preserve"> demais e causa explosão imediata dos gradientes</w:t>
+      </w:r>
+      <w:r>
+        <w:t xml:space="preserve"> (Adicionalmente a</w:t>
+      </w:r>
+      <w:r>
+        <w:t xml:space="preserve"> ResNet-18 tem menos amortecimento interno que a ResNet-50</w:t>
+      </w:r>
+      <w:r>
+        <w:t>)</w:t>
+      </w:r>
+      <w:r>
+        <w:t>.</w:t>
+      </w:r>
+      <w:r>
+        <w:t xml:space="preserve"> </w:t>
+      </w:r>
+    </w:p>
+    <w:p>
+      <w:pPr>
+        <w:pStyle w:val="PargrafodaLista"/>
+        <w:numPr>
+          <w:ilvl w:val="1"/>
+          <w:numId w:val="19"/>
+        </w:numPr>
+        <w:jc w:val="both"/>
+        <w:rPr>
+          <w:b/>
+          <w:bCs/>
+        </w:rPr>
+      </w:pPr>
+      <w:r>
+        <w:t xml:space="preserve">A </w:t>
+      </w:r>
+      <w:proofErr w:type="spellStart"/>
+      <w:r>
+        <w:t>BatchNorm</w:t>
+      </w:r>
+      <w:proofErr w:type="spellEnd"/>
+      <w:r>
+        <w:t xml:space="preserve"> </w:t>
+      </w:r>
+      <w:r>
+        <w:t>em conjunto com</w:t>
+      </w:r>
+      <w:r>
+        <w:t xml:space="preserve"> </w:t>
+      </w:r>
+      <w:proofErr w:type="spellStart"/>
+      <w:r>
+        <w:t>dataset</w:t>
+      </w:r>
+      <w:proofErr w:type="spellEnd"/>
+      <w:r>
+        <w:t xml:space="preserve"> pequeno agrava a instabilidade</w:t>
+      </w:r>
+      <w:r>
+        <w:t xml:space="preserve">, de modo que </w:t>
+      </w:r>
+      <w:r>
+        <w:t>as estatísticas de média e variância por batch ficam muito ruidosas</w:t>
+      </w:r>
+      <w:r>
+        <w:t>. Este aspecto é amplificado quando unido com alto LR e rede rasa.</w:t>
+      </w:r>
+    </w:p>
+    <w:p>
+      <w:pPr>
+        <w:pStyle w:val="PargrafodaLista"/>
+        <w:rPr>
+          <w:b/>
+          <w:bCs/>
+        </w:rPr>
+      </w:pPr>
+    </w:p>
+    <w:p>
+      <w:pPr>
+        <w:pStyle w:val="PargrafodaLista"/>
+        <w:numPr>
+          <w:ilvl w:val="0"/>
+          <w:numId w:val="19"/>
+        </w:numPr>
+        <w:jc w:val="both"/>
+        <w:rPr>
+          <w:b/>
+          <w:bCs/>
+        </w:rPr>
+      </w:pPr>
+      <w:r>
+        <w:rPr>
+          <w:b/>
+          <w:bCs/>
+        </w:rPr>
+        <w:t>Correções Aplicadas:</w:t>
+      </w:r>
+    </w:p>
+    <w:p>
+      <w:pPr>
+        <w:pStyle w:val="PargrafodaLista"/>
+        <w:spacing w:after="0"/>
+        <w:ind w:left="2160"/>
+        <w:jc w:val="both"/>
+        <w:rPr>
+          <w:b/>
+          <w:bCs/>
+        </w:rPr>
+      </w:pPr>
+    </w:p>
+    <w:p>
+      <w:pPr>
+        <w:pStyle w:val="PargrafodaLista"/>
+        <w:numPr>
+          <w:ilvl w:val="1"/>
+          <w:numId w:val="19"/>
+        </w:numPr>
+        <w:spacing w:after="0"/>
+        <w:jc w:val="both"/>
+      </w:pPr>
+      <w:r>
+        <w:t>Alter</w:t>
+      </w:r>
+      <w:r>
+        <w:t xml:space="preserve">ação do LR inicial para 0.01 e dos valores do </w:t>
+      </w:r>
+      <w:proofErr w:type="spellStart"/>
+      <w:r>
+        <w:t>Scheduler</w:t>
+      </w:r>
+      <w:proofErr w:type="spellEnd"/>
+    </w:p>
+    <w:p>
+      <w:pPr>
+        <w:spacing w:after="0"/>
+        <w:ind w:left="1800"/>
+        <w:jc w:val="center"/>
+        <w:rPr>
+          <w:sz w:val="18"/>
+          <w:szCs w:val="18"/>
+        </w:rPr>
+      </w:pPr>
+      <w:r>
+        <w:rPr>
+          <w:sz w:val="18"/>
+          <w:szCs w:val="18"/>
+        </w:rPr>
+        <w:t xml:space="preserve">Figura 42: Alteração em código do LR e </w:t>
+      </w:r>
+      <w:proofErr w:type="spellStart"/>
+      <w:r>
+        <w:rPr>
+          <w:sz w:val="18"/>
+          <w:szCs w:val="18"/>
+        </w:rPr>
+        <w:t>Scheduler</w:t>
+      </w:r>
+      <w:proofErr w:type="spellEnd"/>
+    </w:p>
+    <w:p>
+      <w:pPr>
+        <w:spacing w:after="0"/>
+        <w:ind w:left="1800"/>
+        <w:jc w:val="center"/>
+      </w:pPr>
+      <w:r>
+        <w:drawing>
+          <wp:inline distT="0" distB="0" distL="0" distR="0" wp14:anchorId="77813629" wp14:editId="3C2F7430">
+            <wp:extent cx="1958941" cy="1280160"/>
+            <wp:effectExtent l="0" t="0" r="3810" b="0"/>
+            <wp:docPr id="381059097" name="Imagem 1"/>
+            <wp:cNvGraphicFramePr>
+              <a:graphicFrameLocks xmlns:a="http://schemas.openxmlformats.org/drawingml/2006/main" noChangeAspect="1"/>
+            </wp:cNvGraphicFramePr>
+            <a:graphic xmlns:a="http://schemas.openxmlformats.org/drawingml/2006/main">
+              <a:graphicData uri="http://schemas.openxmlformats.org/drawingml/2006/picture">
+                <pic:pic xmlns:pic="http://schemas.openxmlformats.org/drawingml/2006/picture">
+                  <pic:nvPicPr>
+                    <pic:cNvPr id="381059097" name=""/>
+                    <pic:cNvPicPr/>
+                  </pic:nvPicPr>
+                  <pic:blipFill>
+                    <a:blip r:embed="rId49"/>
+                    <a:stretch>
+                      <a:fillRect/>
+                    </a:stretch>
+                  </pic:blipFill>
+                  <pic:spPr>
+                    <a:xfrm>
+                      <a:off x="0" y="0"/>
+                      <a:ext cx="1969043" cy="1286762"/>
+                    </a:xfrm>
+                    <a:prstGeom prst="rect">
+                      <a:avLst/>
+                    </a:prstGeom>
+                  </pic:spPr>
+                </pic:pic>
+              </a:graphicData>
+            </a:graphic>
+          </wp:inline>
+        </w:drawing>
+      </w:r>
+    </w:p>
+    <w:p>
+      <w:pPr>
+        <w:pStyle w:val="PargrafodaLista"/>
+        <w:spacing w:after="0"/>
+        <w:ind w:left="2880"/>
+        <w:jc w:val="both"/>
+      </w:pPr>
+    </w:p>
+    <w:p>
+      <w:pPr>
+        <w:pStyle w:val="PargrafodaLista"/>
+        <w:numPr>
+          <w:ilvl w:val="1"/>
+          <w:numId w:val="19"/>
+        </w:numPr>
+        <w:spacing w:after="0"/>
+        <w:jc w:val="both"/>
+      </w:pPr>
+      <w:r>
+        <w:t>Clip de gradiente para blindar contra explosões residuais</w:t>
+      </w:r>
+    </w:p>
+    <w:p>
+      <w:pPr>
+        <w:spacing w:after="0"/>
+        <w:ind w:left="1800"/>
+        <w:jc w:val="center"/>
+        <w:rPr>
+          <w:sz w:val="18"/>
+          <w:szCs w:val="18"/>
+        </w:rPr>
+      </w:pPr>
+      <w:r>
+        <w:rPr>
+          <w:sz w:val="18"/>
+          <w:szCs w:val="18"/>
+        </w:rPr>
+        <w:t>Figura 4</w:t>
+      </w:r>
+      <w:r>
+        <w:rPr>
+          <w:sz w:val="18"/>
+          <w:szCs w:val="18"/>
+        </w:rPr>
+        <w:t>3</w:t>
+      </w:r>
+      <w:r>
+        <w:rPr>
+          <w:sz w:val="18"/>
+          <w:szCs w:val="18"/>
+        </w:rPr>
+        <w:t xml:space="preserve">: </w:t>
+      </w:r>
+      <w:r>
+        <w:rPr>
+          <w:sz w:val="18"/>
+          <w:szCs w:val="18"/>
+        </w:rPr>
+        <w:t xml:space="preserve">adição do </w:t>
+      </w:r>
+      <w:proofErr w:type="spellStart"/>
+      <w:r>
+        <w:rPr>
+          <w:sz w:val="18"/>
+          <w:szCs w:val="18"/>
+        </w:rPr>
+        <w:t>Clipnorm</w:t>
+      </w:r>
+      <w:proofErr w:type="spellEnd"/>
+      <w:r>
+        <w:rPr>
+          <w:sz w:val="18"/>
+          <w:szCs w:val="18"/>
+        </w:rPr>
+        <w:t xml:space="preserve"> = 1.0</w:t>
+      </w:r>
+    </w:p>
+    <w:p>
+      <w:pPr>
+        <w:pStyle w:val="PargrafodaLista"/>
+        <w:spacing w:after="0"/>
+        <w:ind w:left="3540"/>
+        <w:jc w:val="both"/>
+      </w:pPr>
+      <w:r>
+        <w:drawing>
+          <wp:inline distT="0" distB="0" distL="0" distR="0" wp14:anchorId="612E4DEC" wp14:editId="3811E122">
+            <wp:extent cx="2504661" cy="921659"/>
+            <wp:effectExtent l="0" t="0" r="0" b="0"/>
+            <wp:docPr id="1711721780" name="Imagem 1"/>
+            <wp:cNvGraphicFramePr>
+              <a:graphicFrameLocks xmlns:a="http://schemas.openxmlformats.org/drawingml/2006/main" noChangeAspect="1"/>
+            </wp:cNvGraphicFramePr>
+            <a:graphic xmlns:a="http://schemas.openxmlformats.org/drawingml/2006/main">
+              <a:graphicData uri="http://schemas.openxmlformats.org/drawingml/2006/picture">
+                <pic:pic xmlns:pic="http://schemas.openxmlformats.org/drawingml/2006/picture">
+                  <pic:nvPicPr>
+                    <pic:cNvPr id="1711721780" name=""/>
+                    <pic:cNvPicPr/>
+                  </pic:nvPicPr>
+                  <pic:blipFill>
+                    <a:blip r:embed="rId50"/>
+                    <a:stretch>
+                      <a:fillRect/>
+                    </a:stretch>
+                  </pic:blipFill>
+                  <pic:spPr>
+                    <a:xfrm>
+                      <a:off x="0" y="0"/>
+                      <a:ext cx="2515227" cy="925547"/>
+                    </a:xfrm>
+                    <a:prstGeom prst="rect">
+                      <a:avLst/>
+                    </a:prstGeom>
+                  </pic:spPr>
+                </pic:pic>
+              </a:graphicData>
+            </a:graphic>
+          </wp:inline>
+        </w:drawing>
+      </w:r>
+    </w:p>
+    <w:p>
+      <w:pPr>
+        <w:pStyle w:val="PargrafodaLista"/>
+        <w:spacing w:after="0"/>
+        <w:ind w:left="3540"/>
+        <w:jc w:val="both"/>
+      </w:pPr>
+    </w:p>
+    <w:p>
+      <w:pPr>
+        <w:pStyle w:val="PargrafodaLista"/>
+        <w:spacing w:after="0"/>
+        <w:ind w:left="2832"/>
+        <w:jc w:val="both"/>
+      </w:pPr>
+      <w:r>
+        <w:rPr>
+          <w:b/>
+          <w:bCs/>
+        </w:rPr>
+        <w:lastRenderedPageBreak/>
+        <w:t>OBS:</w:t>
+      </w:r>
+      <w:r>
+        <w:rPr>
+          <w:b/>
+          <w:bCs/>
+        </w:rPr>
+        <w:t xml:space="preserve"> </w:t>
+      </w:r>
+      <w:r>
+        <w:t xml:space="preserve">O parâmetro </w:t>
+      </w:r>
+      <w:proofErr w:type="spellStart"/>
+      <w:r>
+        <w:t>clipnorm</w:t>
+      </w:r>
+      <w:proofErr w:type="spellEnd"/>
+      <w:r>
+        <w:t xml:space="preserve"> </w:t>
+      </w:r>
+      <w:r>
+        <w:t>busca</w:t>
+      </w:r>
+      <w:r>
+        <w:t xml:space="preserve"> evitar o problema </w:t>
+      </w:r>
+      <w:r>
+        <w:t>de</w:t>
+      </w:r>
+      <w:r>
+        <w:t xml:space="preserve"> </w:t>
+      </w:r>
+      <w:proofErr w:type="spellStart"/>
+      <w:r>
+        <w:rPr>
+          <w:i/>
+          <w:iCs/>
+        </w:rPr>
+        <w:t>exploding</w:t>
+      </w:r>
+      <w:proofErr w:type="spellEnd"/>
+      <w:r>
+        <w:rPr>
+          <w:i/>
+          <w:iCs/>
+        </w:rPr>
+        <w:t xml:space="preserve"> </w:t>
+      </w:r>
+      <w:proofErr w:type="spellStart"/>
+      <w:r>
+        <w:rPr>
+          <w:i/>
+          <w:iCs/>
+        </w:rPr>
+        <w:t>gradients</w:t>
+      </w:r>
+      <w:proofErr w:type="spellEnd"/>
+      <w:r>
+        <w:t>. Durante o treinamento, os gradientes da função de perda em relação aos pesos podem, em determinadas situações, assumir valores muito elevados. Quando isso ocorre, as atualizações dos pesos tornam-se excessivamente grandes, levando a instabilidades numéricas</w:t>
+      </w:r>
+      <w:r>
+        <w:t>.</w:t>
+      </w:r>
+    </w:p>
+    <w:p>
+      <w:pPr>
+        <w:pStyle w:val="PargrafodaLista"/>
+        <w:spacing w:after="0"/>
+        <w:ind w:left="2832"/>
+        <w:jc w:val="both"/>
+      </w:pPr>
+    </w:p>
+    <w:p>
+      <w:pPr>
+        <w:pStyle w:val="PargrafodaLista"/>
+        <w:spacing w:after="0"/>
+        <w:ind w:left="2832"/>
+        <w:jc w:val="both"/>
+      </w:pPr>
+      <w:r>
+        <w:t>O</w:t>
+      </w:r>
+      <w:r>
+        <w:t xml:space="preserve"> </w:t>
+      </w:r>
+      <w:proofErr w:type="spellStart"/>
+      <w:r>
+        <w:t>clipnorm</w:t>
+      </w:r>
+      <w:proofErr w:type="spellEnd"/>
+      <w:r>
+        <w:t xml:space="preserve"> atua limitando a </w:t>
+      </w:r>
+      <w:r>
+        <w:rPr>
+          <w:b/>
+          <w:bCs/>
+        </w:rPr>
+        <w:t>norma L2 do vetor de gradientes</w:t>
+      </w:r>
+      <w:r>
+        <w:t>. Após o cálculo dos gradientes, o otimizador verifica se a norma global desses gradientes ultrapassa um valor máximo predefinido. Caso isso aconteça, todos os gradientes são reescalados proporcionalmente para que a norma total seja igual ao limite estabelecido. Esse procedimento preserva a direção do gradiente, alterando apenas sua magnitude, o que garante atualizações mais controladas e numericamente estáveis.</w:t>
+      </w:r>
+    </w:p>
+    <w:p>
+      <w:pPr>
+        <w:spacing w:after="0"/>
+        <w:ind w:left="2832"/>
+        <w:jc w:val="center"/>
+        <w:rPr>
+          <w:sz w:val="18"/>
+          <w:szCs w:val="18"/>
+        </w:rPr>
+      </w:pPr>
+      <w:r>
+        <w:rPr>
+          <w:sz w:val="18"/>
+          <w:szCs w:val="18"/>
+        </w:rPr>
+        <w:t>Figura 4</w:t>
+      </w:r>
+      <w:r>
+        <w:rPr>
+          <w:sz w:val="18"/>
+          <w:szCs w:val="18"/>
+        </w:rPr>
+        <w:t>4</w:t>
+      </w:r>
+      <w:r>
+        <w:rPr>
+          <w:sz w:val="18"/>
+          <w:szCs w:val="18"/>
+        </w:rPr>
+        <w:t xml:space="preserve">: </w:t>
+      </w:r>
+      <w:r>
+        <w:rPr>
+          <w:sz w:val="18"/>
+          <w:szCs w:val="18"/>
+        </w:rPr>
+        <w:t>Definição de valores para o</w:t>
+      </w:r>
+      <w:r>
+        <w:rPr>
+          <w:sz w:val="18"/>
+          <w:szCs w:val="18"/>
+        </w:rPr>
+        <w:t xml:space="preserve"> </w:t>
+      </w:r>
+      <w:proofErr w:type="spellStart"/>
+      <w:r>
+        <w:rPr>
+          <w:sz w:val="18"/>
+          <w:szCs w:val="18"/>
+        </w:rPr>
+        <w:t>Clipnorm</w:t>
+      </w:r>
+      <w:proofErr w:type="spellEnd"/>
+      <w:r>
+        <w:rPr>
+          <w:sz w:val="18"/>
+          <w:szCs w:val="18"/>
+        </w:rPr>
+        <w:t xml:space="preserve"> = 1.0</w:t>
+      </w:r>
+    </w:p>
+    <w:p>
+      <w:pPr>
+        <w:pStyle w:val="PargrafodaLista"/>
+        <w:ind w:left="2832"/>
+        <w:jc w:val="center"/>
+      </w:pPr>
+      <w:r>
+        <w:drawing>
+          <wp:inline distT="0" distB="0" distL="0" distR="0" wp14:anchorId="0C0EFDC7" wp14:editId="59001969">
+            <wp:extent cx="1906158" cy="947160"/>
+            <wp:effectExtent l="0" t="0" r="0" b="5715"/>
+            <wp:docPr id="1743905479" name="Imagem 1"/>
+            <wp:cNvGraphicFramePr>
+              <a:graphicFrameLocks xmlns:a="http://schemas.openxmlformats.org/drawingml/2006/main" noChangeAspect="1"/>
+            </wp:cNvGraphicFramePr>
+            <a:graphic xmlns:a="http://schemas.openxmlformats.org/drawingml/2006/main">
+              <a:graphicData uri="http://schemas.openxmlformats.org/drawingml/2006/picture">
+                <pic:pic xmlns:pic="http://schemas.openxmlformats.org/drawingml/2006/picture">
+                  <pic:nvPicPr>
+                    <pic:cNvPr id="1743905479" name=""/>
+                    <pic:cNvPicPr/>
+                  </pic:nvPicPr>
+                  <pic:blipFill>
+                    <a:blip r:embed="rId51"/>
+                    <a:stretch>
+                      <a:fillRect/>
+                    </a:stretch>
+                  </pic:blipFill>
+                  <pic:spPr>
+                    <a:xfrm>
+                      <a:off x="0" y="0"/>
+                      <a:ext cx="1910293" cy="949215"/>
+                    </a:xfrm>
+                    <a:prstGeom prst="rect">
+                      <a:avLst/>
+                    </a:prstGeom>
+                  </pic:spPr>
+                </pic:pic>
+              </a:graphicData>
+            </a:graphic>
+          </wp:inline>
+        </w:drawing>
+      </w:r>
+    </w:p>
+    <w:p>
+      <w:pPr>
+        <w:pStyle w:val="PargrafodaLista"/>
+        <w:ind w:left="2832"/>
+        <w:jc w:val="both"/>
+      </w:pPr>
+    </w:p>
+    <w:p>
+      <w:pPr>
+        <w:pStyle w:val="PargrafodaLista"/>
+        <w:ind w:left="2832"/>
+        <w:jc w:val="both"/>
+      </w:pPr>
+      <w:r>
+        <w:rPr>
+          <w:b/>
+          <w:bCs/>
+        </w:rPr>
+        <w:t>OBS 2:</w:t>
+      </w:r>
+      <w:r>
+        <w:t xml:space="preserve"> O uso deste parâmetro é</w:t>
+      </w:r>
+      <w:r>
+        <w:t xml:space="preserve"> prática comum em código de produção e em pesquisas modernas — só não aparece explicitamente no </w:t>
+      </w:r>
+      <w:r>
+        <w:t>artigo</w:t>
+      </w:r>
+      <w:r>
+        <w:t xml:space="preserve"> porque </w:t>
+      </w:r>
+      <w:r>
+        <w:t>ele</w:t>
+      </w:r>
+      <w:r>
+        <w:t xml:space="preserve"> assume um regime ideal (</w:t>
+      </w:r>
+      <w:proofErr w:type="spellStart"/>
+      <w:r>
+        <w:t>ImageNet</w:t>
+      </w:r>
+      <w:proofErr w:type="spellEnd"/>
+      <w:r>
+        <w:t xml:space="preserve"> completo).</w:t>
+      </w:r>
+      <w:r>
+        <w:t xml:space="preserve"> Mas sua inclusão NÃO afeta a validade da arquitetura para o experimento.</w:t>
+      </w:r>
+    </w:p>
+    <w:p>
+      <w:pPr>
+        <w:pStyle w:val="PargrafodaLista"/>
+        <w:ind w:left="2832"/>
+        <w:jc w:val="both"/>
+      </w:pPr>
+    </w:p>
+    <w:p>
+      <w:pPr>
+        <w:pStyle w:val="PargrafodaLista"/>
+        <w:numPr>
+          <w:ilvl w:val="0"/>
+          <w:numId w:val="19"/>
+        </w:numPr>
+        <w:jc w:val="both"/>
+        <w:rPr>
+          <w:b/>
+          <w:bCs/>
+        </w:rPr>
+      </w:pPr>
+      <w:r>
+        <w:rPr>
+          <w:b/>
+          <w:bCs/>
+        </w:rPr>
+        <w:t>Parâmetros do experimento:</w:t>
+      </w:r>
+    </w:p>
+    <w:p>
+      <w:pPr>
+        <w:spacing w:after="0"/>
+        <w:ind w:left="1800"/>
+        <w:jc w:val="center"/>
+        <w:rPr>
+          <w:sz w:val="18"/>
+          <w:szCs w:val="18"/>
+        </w:rPr>
+      </w:pPr>
+      <w:r>
+        <w:rPr>
+          <w:sz w:val="18"/>
+          <w:szCs w:val="18"/>
+        </w:rPr>
+        <w:t>Figura 4</w:t>
+      </w:r>
+      <w:r>
+        <w:rPr>
+          <w:sz w:val="18"/>
+          <w:szCs w:val="18"/>
+        </w:rPr>
+        <w:t>5</w:t>
+      </w:r>
+      <w:r>
+        <w:rPr>
+          <w:sz w:val="18"/>
+          <w:szCs w:val="18"/>
+        </w:rPr>
+        <w:t>: Definição de</w:t>
+      </w:r>
+      <w:r>
+        <w:rPr>
+          <w:sz w:val="18"/>
+          <w:szCs w:val="18"/>
+        </w:rPr>
+        <w:t xml:space="preserve"> parâmetros utilizados para o teste</w:t>
+      </w:r>
+    </w:p>
+    <w:p>
+      <w:pPr>
+        <w:pStyle w:val="PargrafodaLista"/>
+        <w:ind w:left="2160"/>
+        <w:jc w:val="center"/>
+        <w:rPr>
+          <w:b/>
+          <w:bCs/>
+        </w:rPr>
+      </w:pPr>
+      <w:r>
+        <w:rPr>
+          <w:b/>
+          <w:bCs/>
+          <w:noProof/>
+        </w:rPr>
+        <w:drawing>
+          <wp:inline distT="0" distB="0" distL="0" distR="0" wp14:anchorId="16168F79" wp14:editId="39FDADD3">
+            <wp:extent cx="1918000" cy="1240403"/>
+            <wp:effectExtent l="0" t="0" r="6350" b="0"/>
+            <wp:docPr id="1620717835" name="Imagem 6"/>
+            <wp:cNvGraphicFramePr>
+              <a:graphicFrameLocks xmlns:a="http://schemas.openxmlformats.org/drawingml/2006/main" noChangeAspect="1"/>
+            </wp:cNvGraphicFramePr>
+            <a:graphic xmlns:a="http://schemas.openxmlformats.org/drawingml/2006/main">
+              <a:graphicData uri="http://schemas.openxmlformats.org/drawingml/2006/picture">
+                <pic:pic xmlns:pic="http://schemas.openxmlformats.org/drawingml/2006/picture">
+                  <pic:nvPicPr>
+                    <pic:cNvPr id="0" name="Picture 3"/>
+                    <pic:cNvPicPr>
+                      <a:picLocks noChangeAspect="1" noChangeArrowheads="1"/>
+                    </pic:cNvPicPr>
+                  </pic:nvPicPr>
+                  <pic:blipFill>
+                    <a:blip r:embed="rId52">
+                      <a:extLst>
+                        <a:ext uri="{28A0092B-C50C-407E-A947-70E740481C1C}">
+                          <a14:useLocalDpi xmlns:a14="http://schemas.microsoft.com/office/drawing/2010/main" val="0"/>
+                        </a:ext>
+                      </a:extLst>
+                    </a:blip>
+                    <a:srcRect/>
+                    <a:stretch>
+                      <a:fillRect/>
+                    </a:stretch>
+                  </pic:blipFill>
+                  <pic:spPr bwMode="auto">
+                    <a:xfrm>
+                      <a:off x="0" y="0"/>
+                      <a:ext cx="1925168" cy="1245039"/>
+                    </a:xfrm>
+                    <a:prstGeom prst="rect">
+                      <a:avLst/>
+                    </a:prstGeom>
+                    <a:noFill/>
+                    <a:ln>
+                      <a:noFill/>
+                    </a:ln>
+                  </pic:spPr>
+                </pic:pic>
+              </a:graphicData>
+            </a:graphic>
+          </wp:inline>
+        </w:drawing>
+      </w:r>
+    </w:p>
+    <w:p>
+      <w:pPr>
+        <w:pStyle w:val="PargrafodaLista"/>
+        <w:ind w:left="2160"/>
+        <w:jc w:val="center"/>
+        <w:rPr>
+          <w:b/>
+          <w:bCs/>
+        </w:rPr>
+      </w:pPr>
+    </w:p>
+    <w:p>
+      <w:pPr>
+        <w:pStyle w:val="PargrafodaLista"/>
+        <w:numPr>
+          <w:ilvl w:val="0"/>
+          <w:numId w:val="19"/>
+        </w:numPr>
+        <w:jc w:val="both"/>
+        <w:rPr>
+          <w:b/>
+          <w:bCs/>
+        </w:rPr>
+      </w:pPr>
+      <w:r>
+        <w:rPr>
+          <w:b/>
+          <w:bCs/>
+        </w:rPr>
+        <w:t>Resultados pós correções</w:t>
+      </w:r>
+      <w:r>
+        <w:rPr>
+          <w:b/>
+          <w:bCs/>
+        </w:rPr>
+        <w:t>:</w:t>
+      </w:r>
+    </w:p>
+    <w:p>
+      <w:pPr>
+        <w:jc w:val="both"/>
+      </w:pPr>
     </w:p>
     <w:sectPr>
       <w:pgSz w:w="11906" w:h="16838"/>
@@ -15103,7 +15904,7 @@
         <v:path o:extrusionok="f" gradientshapeok="t" o:connecttype="rect"/>
         <o:lock v:ext="edit" aspectratio="t"/>
       </v:shapetype>
-      <v:shape id="_x0000_i1128" type="#_x0000_t75" style="width:693.1pt;height:487.7pt;visibility:visible;mso-wrap-style:square" o:bullet="t">
+      <v:shape id="_x0000_i1110" type="#_x0000_t75" style="width:693.1pt;height:487.7pt;visibility:visible;mso-wrap-style:square" o:bullet="t">
         <v:imagedata r:id="rId1" o:title="" croptop="19686f" cropbottom="43833f" cropleft="8606f" cropright="55951f"/>
       </v:shape>
     </w:pict>
@@ -16666,9 +17467,235 @@
     </w:lvl>
   </w:abstractNum>
   <w:abstractNum w:abstractNumId="14" w15:restartNumberingAfterBreak="0">
+    <w:nsid w:val="467A7958"/>
+    <w:multiLevelType w:val="hybridMultilevel"/>
+    <w:tmpl w:val="F98C2DB2"/>
+    <w:lvl w:ilvl="0" w:tplc="04160001">
+      <w:start w:val="1"/>
+      <w:numFmt w:val="bullet"/>
+      <w:lvlText w:val=""/>
+      <w:lvlJc w:val="left"/>
+      <w:pPr>
+        <w:ind w:left="1776" w:hanging="360"/>
+      </w:pPr>
+      <w:rPr>
+        <w:rFonts w:ascii="Symbol" w:hAnsi="Symbol" w:hint="default"/>
+      </w:rPr>
+    </w:lvl>
+    <w:lvl w:ilvl="1" w:tplc="04160003" w:tentative="1">
+      <w:start w:val="1"/>
+      <w:numFmt w:val="bullet"/>
+      <w:lvlText w:val="o"/>
+      <w:lvlJc w:val="left"/>
+      <w:pPr>
+        <w:ind w:left="2496" w:hanging="360"/>
+      </w:pPr>
+      <w:rPr>
+        <w:rFonts w:ascii="Courier New" w:hAnsi="Courier New" w:cs="Courier New" w:hint="default"/>
+      </w:rPr>
+    </w:lvl>
+    <w:lvl w:ilvl="2" w:tplc="04160005" w:tentative="1">
+      <w:start w:val="1"/>
+      <w:numFmt w:val="bullet"/>
+      <w:lvlText w:val=""/>
+      <w:lvlJc w:val="left"/>
+      <w:pPr>
+        <w:ind w:left="3216" w:hanging="360"/>
+      </w:pPr>
+      <w:rPr>
+        <w:rFonts w:ascii="Wingdings" w:hAnsi="Wingdings" w:hint="default"/>
+      </w:rPr>
+    </w:lvl>
+    <w:lvl w:ilvl="3" w:tplc="04160001" w:tentative="1">
+      <w:start w:val="1"/>
+      <w:numFmt w:val="bullet"/>
+      <w:lvlText w:val=""/>
+      <w:lvlJc w:val="left"/>
+      <w:pPr>
+        <w:ind w:left="3936" w:hanging="360"/>
+      </w:pPr>
+      <w:rPr>
+        <w:rFonts w:ascii="Symbol" w:hAnsi="Symbol" w:hint="default"/>
+      </w:rPr>
+    </w:lvl>
+    <w:lvl w:ilvl="4" w:tplc="04160003" w:tentative="1">
+      <w:start w:val="1"/>
+      <w:numFmt w:val="bullet"/>
+      <w:lvlText w:val="o"/>
+      <w:lvlJc w:val="left"/>
+      <w:pPr>
+        <w:ind w:left="4656" w:hanging="360"/>
+      </w:pPr>
+      <w:rPr>
+        <w:rFonts w:ascii="Courier New" w:hAnsi="Courier New" w:cs="Courier New" w:hint="default"/>
+      </w:rPr>
+    </w:lvl>
+    <w:lvl w:ilvl="5" w:tplc="04160005" w:tentative="1">
+      <w:start w:val="1"/>
+      <w:numFmt w:val="bullet"/>
+      <w:lvlText w:val=""/>
+      <w:lvlJc w:val="left"/>
+      <w:pPr>
+        <w:ind w:left="5376" w:hanging="360"/>
+      </w:pPr>
+      <w:rPr>
+        <w:rFonts w:ascii="Wingdings" w:hAnsi="Wingdings" w:hint="default"/>
+      </w:rPr>
+    </w:lvl>
+    <w:lvl w:ilvl="6" w:tplc="04160001" w:tentative="1">
+      <w:start w:val="1"/>
+      <w:numFmt w:val="bullet"/>
+      <w:lvlText w:val=""/>
+      <w:lvlJc w:val="left"/>
+      <w:pPr>
+        <w:ind w:left="6096" w:hanging="360"/>
+      </w:pPr>
+      <w:rPr>
+        <w:rFonts w:ascii="Symbol" w:hAnsi="Symbol" w:hint="default"/>
+      </w:rPr>
+    </w:lvl>
+    <w:lvl w:ilvl="7" w:tplc="04160003" w:tentative="1">
+      <w:start w:val="1"/>
+      <w:numFmt w:val="bullet"/>
+      <w:lvlText w:val="o"/>
+      <w:lvlJc w:val="left"/>
+      <w:pPr>
+        <w:ind w:left="6816" w:hanging="360"/>
+      </w:pPr>
+      <w:rPr>
+        <w:rFonts w:ascii="Courier New" w:hAnsi="Courier New" w:cs="Courier New" w:hint="default"/>
+      </w:rPr>
+    </w:lvl>
+    <w:lvl w:ilvl="8" w:tplc="04160005" w:tentative="1">
+      <w:start w:val="1"/>
+      <w:numFmt w:val="bullet"/>
+      <w:lvlText w:val=""/>
+      <w:lvlJc w:val="left"/>
+      <w:pPr>
+        <w:ind w:left="7536" w:hanging="360"/>
+      </w:pPr>
+      <w:rPr>
+        <w:rFonts w:ascii="Wingdings" w:hAnsi="Wingdings" w:hint="default"/>
+      </w:rPr>
+    </w:lvl>
+  </w:abstractNum>
+  <w:abstractNum w:abstractNumId="15" w15:restartNumberingAfterBreak="0">
+    <w:nsid w:val="4B8D2BA5"/>
+    <w:multiLevelType w:val="hybridMultilevel"/>
+    <w:tmpl w:val="33A0FD20"/>
+    <w:lvl w:ilvl="0" w:tplc="04160001">
+      <w:start w:val="1"/>
+      <w:numFmt w:val="bullet"/>
+      <w:lvlText w:val=""/>
+      <w:lvlJc w:val="left"/>
+      <w:pPr>
+        <w:ind w:left="3192" w:hanging="360"/>
+      </w:pPr>
+      <w:rPr>
+        <w:rFonts w:ascii="Symbol" w:hAnsi="Symbol" w:hint="default"/>
+      </w:rPr>
+    </w:lvl>
+    <w:lvl w:ilvl="1" w:tplc="04160003" w:tentative="1">
+      <w:start w:val="1"/>
+      <w:numFmt w:val="bullet"/>
+      <w:lvlText w:val="o"/>
+      <w:lvlJc w:val="left"/>
+      <w:pPr>
+        <w:ind w:left="3912" w:hanging="360"/>
+      </w:pPr>
+      <w:rPr>
+        <w:rFonts w:ascii="Courier New" w:hAnsi="Courier New" w:cs="Courier New" w:hint="default"/>
+      </w:rPr>
+    </w:lvl>
+    <w:lvl w:ilvl="2" w:tplc="04160005" w:tentative="1">
+      <w:start w:val="1"/>
+      <w:numFmt w:val="bullet"/>
+      <w:lvlText w:val=""/>
+      <w:lvlJc w:val="left"/>
+      <w:pPr>
+        <w:ind w:left="4632" w:hanging="360"/>
+      </w:pPr>
+      <w:rPr>
+        <w:rFonts w:ascii="Wingdings" w:hAnsi="Wingdings" w:hint="default"/>
+      </w:rPr>
+    </w:lvl>
+    <w:lvl w:ilvl="3" w:tplc="04160001" w:tentative="1">
+      <w:start w:val="1"/>
+      <w:numFmt w:val="bullet"/>
+      <w:lvlText w:val=""/>
+      <w:lvlJc w:val="left"/>
+      <w:pPr>
+        <w:ind w:left="5352" w:hanging="360"/>
+      </w:pPr>
+      <w:rPr>
+        <w:rFonts w:ascii="Symbol" w:hAnsi="Symbol" w:hint="default"/>
+      </w:rPr>
+    </w:lvl>
+    <w:lvl w:ilvl="4" w:tplc="04160003" w:tentative="1">
+      <w:start w:val="1"/>
+      <w:numFmt w:val="bullet"/>
+      <w:lvlText w:val="o"/>
+      <w:lvlJc w:val="left"/>
+      <w:pPr>
+        <w:ind w:left="6072" w:hanging="360"/>
+      </w:pPr>
+      <w:rPr>
+        <w:rFonts w:ascii="Courier New" w:hAnsi="Courier New" w:cs="Courier New" w:hint="default"/>
+      </w:rPr>
+    </w:lvl>
+    <w:lvl w:ilvl="5" w:tplc="04160005" w:tentative="1">
+      <w:start w:val="1"/>
+      <w:numFmt w:val="bullet"/>
+      <w:lvlText w:val=""/>
+      <w:lvlJc w:val="left"/>
+      <w:pPr>
+        <w:ind w:left="6792" w:hanging="360"/>
+      </w:pPr>
+      <w:rPr>
+        <w:rFonts w:ascii="Wingdings" w:hAnsi="Wingdings" w:hint="default"/>
+      </w:rPr>
+    </w:lvl>
+    <w:lvl w:ilvl="6" w:tplc="04160001" w:tentative="1">
+      <w:start w:val="1"/>
+      <w:numFmt w:val="bullet"/>
+      <w:lvlText w:val=""/>
+      <w:lvlJc w:val="left"/>
+      <w:pPr>
+        <w:ind w:left="7512" w:hanging="360"/>
+      </w:pPr>
+      <w:rPr>
+        <w:rFonts w:ascii="Symbol" w:hAnsi="Symbol" w:hint="default"/>
+      </w:rPr>
+    </w:lvl>
+    <w:lvl w:ilvl="7" w:tplc="04160003" w:tentative="1">
+      <w:start w:val="1"/>
+      <w:numFmt w:val="bullet"/>
+      <w:lvlText w:val="o"/>
+      <w:lvlJc w:val="left"/>
+      <w:pPr>
+        <w:ind w:left="8232" w:hanging="360"/>
+      </w:pPr>
+      <w:rPr>
+        <w:rFonts w:ascii="Courier New" w:hAnsi="Courier New" w:cs="Courier New" w:hint="default"/>
+      </w:rPr>
+    </w:lvl>
+    <w:lvl w:ilvl="8" w:tplc="04160005" w:tentative="1">
+      <w:start w:val="1"/>
+      <w:numFmt w:val="bullet"/>
+      <w:lvlText w:val=""/>
+      <w:lvlJc w:val="left"/>
+      <w:pPr>
+        <w:ind w:left="8952" w:hanging="360"/>
+      </w:pPr>
+      <w:rPr>
+        <w:rFonts w:ascii="Wingdings" w:hAnsi="Wingdings" w:hint="default"/>
+      </w:rPr>
+    </w:lvl>
+  </w:abstractNum>
+  <w:abstractNum w:abstractNumId="16" w15:restartNumberingAfterBreak="0">
     <w:nsid w:val="4E491E67"/>
     <w:multiLevelType w:val="hybridMultilevel"/>
-    <w:tmpl w:val="D5907D9A"/>
+    <w:tmpl w:val="BBCC0B20"/>
     <w:lvl w:ilvl="0" w:tplc="04160001">
       <w:start w:val="1"/>
       <w:numFmt w:val="bullet"/>
@@ -16778,7 +17805,7 @@
       </w:rPr>
     </w:lvl>
   </w:abstractNum>
-  <w:abstractNum w:abstractNumId="15" w15:restartNumberingAfterBreak="0">
+  <w:abstractNum w:abstractNumId="17" w15:restartNumberingAfterBreak="0">
     <w:nsid w:val="572156B3"/>
     <w:multiLevelType w:val="hybridMultilevel"/>
     <w:tmpl w:val="BA2471CE"/>
@@ -16891,7 +17918,7 @@
       </w:rPr>
     </w:lvl>
   </w:abstractNum>
-  <w:abstractNum w:abstractNumId="16" w15:restartNumberingAfterBreak="0">
+  <w:abstractNum w:abstractNumId="18" w15:restartNumberingAfterBreak="0">
     <w:nsid w:val="5C1E465F"/>
     <w:multiLevelType w:val="hybridMultilevel"/>
     <w:tmpl w:val="CC70734E"/>
@@ -17004,7 +18031,7 @@
       </w:rPr>
     </w:lvl>
   </w:abstractNum>
-  <w:abstractNum w:abstractNumId="17" w15:restartNumberingAfterBreak="0">
+  <w:abstractNum w:abstractNumId="19" w15:restartNumberingAfterBreak="0">
     <w:nsid w:val="613B7216"/>
     <w:multiLevelType w:val="hybridMultilevel"/>
     <w:tmpl w:val="6C2069C4"/>
@@ -17096,7 +18123,7 @@
       </w:pPr>
     </w:lvl>
   </w:abstractNum>
-  <w:abstractNum w:abstractNumId="18" w15:restartNumberingAfterBreak="0">
+  <w:abstractNum w:abstractNumId="20" w15:restartNumberingAfterBreak="0">
     <w:nsid w:val="66301293"/>
     <w:multiLevelType w:val="hybridMultilevel"/>
     <w:tmpl w:val="2A7C4AA2"/>
@@ -17209,7 +18236,120 @@
       </w:rPr>
     </w:lvl>
   </w:abstractNum>
-  <w:abstractNum w:abstractNumId="19" w15:restartNumberingAfterBreak="0">
+  <w:abstractNum w:abstractNumId="21" w15:restartNumberingAfterBreak="0">
+    <w:nsid w:val="739B653B"/>
+    <w:multiLevelType w:val="hybridMultilevel"/>
+    <w:tmpl w:val="86004430"/>
+    <w:lvl w:ilvl="0" w:tplc="04160001">
+      <w:start w:val="1"/>
+      <w:numFmt w:val="bullet"/>
+      <w:lvlText w:val=""/>
+      <w:lvlJc w:val="left"/>
+      <w:pPr>
+        <w:ind w:left="3552" w:hanging="360"/>
+      </w:pPr>
+      <w:rPr>
+        <w:rFonts w:ascii="Symbol" w:hAnsi="Symbol" w:hint="default"/>
+      </w:rPr>
+    </w:lvl>
+    <w:lvl w:ilvl="1" w:tplc="04160003" w:tentative="1">
+      <w:start w:val="1"/>
+      <w:numFmt w:val="bullet"/>
+      <w:lvlText w:val="o"/>
+      <w:lvlJc w:val="left"/>
+      <w:pPr>
+        <w:ind w:left="4272" w:hanging="360"/>
+      </w:pPr>
+      <w:rPr>
+        <w:rFonts w:ascii="Courier New" w:hAnsi="Courier New" w:cs="Courier New" w:hint="default"/>
+      </w:rPr>
+    </w:lvl>
+    <w:lvl w:ilvl="2" w:tplc="04160005" w:tentative="1">
+      <w:start w:val="1"/>
+      <w:numFmt w:val="bullet"/>
+      <w:lvlText w:val=""/>
+      <w:lvlJc w:val="left"/>
+      <w:pPr>
+        <w:ind w:left="4992" w:hanging="360"/>
+      </w:pPr>
+      <w:rPr>
+        <w:rFonts w:ascii="Wingdings" w:hAnsi="Wingdings" w:hint="default"/>
+      </w:rPr>
+    </w:lvl>
+    <w:lvl w:ilvl="3" w:tplc="04160001" w:tentative="1">
+      <w:start w:val="1"/>
+      <w:numFmt w:val="bullet"/>
+      <w:lvlText w:val=""/>
+      <w:lvlJc w:val="left"/>
+      <w:pPr>
+        <w:ind w:left="5712" w:hanging="360"/>
+      </w:pPr>
+      <w:rPr>
+        <w:rFonts w:ascii="Symbol" w:hAnsi="Symbol" w:hint="default"/>
+      </w:rPr>
+    </w:lvl>
+    <w:lvl w:ilvl="4" w:tplc="04160003" w:tentative="1">
+      <w:start w:val="1"/>
+      <w:numFmt w:val="bullet"/>
+      <w:lvlText w:val="o"/>
+      <w:lvlJc w:val="left"/>
+      <w:pPr>
+        <w:ind w:left="6432" w:hanging="360"/>
+      </w:pPr>
+      <w:rPr>
+        <w:rFonts w:ascii="Courier New" w:hAnsi="Courier New" w:cs="Courier New" w:hint="default"/>
+      </w:rPr>
+    </w:lvl>
+    <w:lvl w:ilvl="5" w:tplc="04160005" w:tentative="1">
+      <w:start w:val="1"/>
+      <w:numFmt w:val="bullet"/>
+      <w:lvlText w:val=""/>
+      <w:lvlJc w:val="left"/>
+      <w:pPr>
+        <w:ind w:left="7152" w:hanging="360"/>
+      </w:pPr>
+      <w:rPr>
+        <w:rFonts w:ascii="Wingdings" w:hAnsi="Wingdings" w:hint="default"/>
+      </w:rPr>
+    </w:lvl>
+    <w:lvl w:ilvl="6" w:tplc="04160001" w:tentative="1">
+      <w:start w:val="1"/>
+      <w:numFmt w:val="bullet"/>
+      <w:lvlText w:val=""/>
+      <w:lvlJc w:val="left"/>
+      <w:pPr>
+        <w:ind w:left="7872" w:hanging="360"/>
+      </w:pPr>
+      <w:rPr>
+        <w:rFonts w:ascii="Symbol" w:hAnsi="Symbol" w:hint="default"/>
+      </w:rPr>
+    </w:lvl>
+    <w:lvl w:ilvl="7" w:tplc="04160003" w:tentative="1">
+      <w:start w:val="1"/>
+      <w:numFmt w:val="bullet"/>
+      <w:lvlText w:val="o"/>
+      <w:lvlJc w:val="left"/>
+      <w:pPr>
+        <w:ind w:left="8592" w:hanging="360"/>
+      </w:pPr>
+      <w:rPr>
+        <w:rFonts w:ascii="Courier New" w:hAnsi="Courier New" w:cs="Courier New" w:hint="default"/>
+      </w:rPr>
+    </w:lvl>
+    <w:lvl w:ilvl="8" w:tplc="04160005" w:tentative="1">
+      <w:start w:val="1"/>
+      <w:numFmt w:val="bullet"/>
+      <w:lvlText w:val=""/>
+      <w:lvlJc w:val="left"/>
+      <w:pPr>
+        <w:ind w:left="9312" w:hanging="360"/>
+      </w:pPr>
+      <w:rPr>
+        <w:rFonts w:ascii="Wingdings" w:hAnsi="Wingdings" w:hint="default"/>
+      </w:rPr>
+    </w:lvl>
+  </w:abstractNum>
+  <w:abstractNum w:abstractNumId="22" w15:restartNumberingAfterBreak="0">
     <w:nsid w:val="785D5530"/>
     <w:multiLevelType w:val="hybridMultilevel"/>
     <w:tmpl w:val="B5BC727C"/>
@@ -17322,7 +18462,120 @@
       </w:rPr>
     </w:lvl>
   </w:abstractNum>
-  <w:abstractNum w:abstractNumId="20" w15:restartNumberingAfterBreak="0">
+  <w:abstractNum w:abstractNumId="23" w15:restartNumberingAfterBreak="0">
+    <w:nsid w:val="7C4F3572"/>
+    <w:multiLevelType w:val="hybridMultilevel"/>
+    <w:tmpl w:val="10F02A50"/>
+    <w:lvl w:ilvl="0" w:tplc="04160001">
+      <w:start w:val="1"/>
+      <w:numFmt w:val="bullet"/>
+      <w:lvlText w:val=""/>
+      <w:lvlJc w:val="left"/>
+      <w:pPr>
+        <w:ind w:left="5316" w:hanging="360"/>
+      </w:pPr>
+      <w:rPr>
+        <w:rFonts w:ascii="Symbol" w:hAnsi="Symbol" w:hint="default"/>
+      </w:rPr>
+    </w:lvl>
+    <w:lvl w:ilvl="1" w:tplc="04160003" w:tentative="1">
+      <w:start w:val="1"/>
+      <w:numFmt w:val="bullet"/>
+      <w:lvlText w:val="o"/>
+      <w:lvlJc w:val="left"/>
+      <w:pPr>
+        <w:ind w:left="6036" w:hanging="360"/>
+      </w:pPr>
+      <w:rPr>
+        <w:rFonts w:ascii="Courier New" w:hAnsi="Courier New" w:cs="Courier New" w:hint="default"/>
+      </w:rPr>
+    </w:lvl>
+    <w:lvl w:ilvl="2" w:tplc="04160005" w:tentative="1">
+      <w:start w:val="1"/>
+      <w:numFmt w:val="bullet"/>
+      <w:lvlText w:val=""/>
+      <w:lvlJc w:val="left"/>
+      <w:pPr>
+        <w:ind w:left="6756" w:hanging="360"/>
+      </w:pPr>
+      <w:rPr>
+        <w:rFonts w:ascii="Wingdings" w:hAnsi="Wingdings" w:hint="default"/>
+      </w:rPr>
+    </w:lvl>
+    <w:lvl w:ilvl="3" w:tplc="04160001" w:tentative="1">
+      <w:start w:val="1"/>
+      <w:numFmt w:val="bullet"/>
+      <w:lvlText w:val=""/>
+      <w:lvlJc w:val="left"/>
+      <w:pPr>
+        <w:ind w:left="7476" w:hanging="360"/>
+      </w:pPr>
+      <w:rPr>
+        <w:rFonts w:ascii="Symbol" w:hAnsi="Symbol" w:hint="default"/>
+      </w:rPr>
+    </w:lvl>
+    <w:lvl w:ilvl="4" w:tplc="04160003" w:tentative="1">
+      <w:start w:val="1"/>
+      <w:numFmt w:val="bullet"/>
+      <w:lvlText w:val="o"/>
+      <w:lvlJc w:val="left"/>
+      <w:pPr>
+        <w:ind w:left="8196" w:hanging="360"/>
+      </w:pPr>
+      <w:rPr>
+        <w:rFonts w:ascii="Courier New" w:hAnsi="Courier New" w:cs="Courier New" w:hint="default"/>
+      </w:rPr>
+    </w:lvl>
+    <w:lvl w:ilvl="5" w:tplc="04160005" w:tentative="1">
+      <w:start w:val="1"/>
+      <w:numFmt w:val="bullet"/>
+      <w:lvlText w:val=""/>
+      <w:lvlJc w:val="left"/>
+      <w:pPr>
+        <w:ind w:left="8916" w:hanging="360"/>
+      </w:pPr>
+      <w:rPr>
+        <w:rFonts w:ascii="Wingdings" w:hAnsi="Wingdings" w:hint="default"/>
+      </w:rPr>
+    </w:lvl>
+    <w:lvl w:ilvl="6" w:tplc="04160001" w:tentative="1">
+      <w:start w:val="1"/>
+      <w:numFmt w:val="bullet"/>
+      <w:lvlText w:val=""/>
+      <w:lvlJc w:val="left"/>
+      <w:pPr>
+        <w:ind w:left="9636" w:hanging="360"/>
+      </w:pPr>
+      <w:rPr>
+        <w:rFonts w:ascii="Symbol" w:hAnsi="Symbol" w:hint="default"/>
+      </w:rPr>
+    </w:lvl>
+    <w:lvl w:ilvl="7" w:tplc="04160003" w:tentative="1">
+      <w:start w:val="1"/>
+      <w:numFmt w:val="bullet"/>
+      <w:lvlText w:val="o"/>
+      <w:lvlJc w:val="left"/>
+      <w:pPr>
+        <w:ind w:left="10356" w:hanging="360"/>
+      </w:pPr>
+      <w:rPr>
+        <w:rFonts w:ascii="Courier New" w:hAnsi="Courier New" w:cs="Courier New" w:hint="default"/>
+      </w:rPr>
+    </w:lvl>
+    <w:lvl w:ilvl="8" w:tplc="04160005" w:tentative="1">
+      <w:start w:val="1"/>
+      <w:numFmt w:val="bullet"/>
+      <w:lvlText w:val=""/>
+      <w:lvlJc w:val="left"/>
+      <w:pPr>
+        <w:ind w:left="11076" w:hanging="360"/>
+      </w:pPr>
+      <w:rPr>
+        <w:rFonts w:ascii="Wingdings" w:hAnsi="Wingdings" w:hint="default"/>
+      </w:rPr>
+    </w:lvl>
+  </w:abstractNum>
+  <w:abstractNum w:abstractNumId="24" w15:restartNumberingAfterBreak="0">
     <w:nsid w:val="7D075251"/>
     <w:multiLevelType w:val="hybridMultilevel"/>
     <w:tmpl w:val="DE3E8316"/>
@@ -17435,7 +18688,7 @@
       </w:rPr>
     </w:lvl>
   </w:abstractNum>
-  <w:abstractNum w:abstractNumId="21" w15:restartNumberingAfterBreak="0">
+  <w:abstractNum w:abstractNumId="25" w15:restartNumberingAfterBreak="0">
     <w:nsid w:val="7FD31BE5"/>
     <w:multiLevelType w:val="hybridMultilevel"/>
     <w:tmpl w:val="A54CCE82"/>
@@ -17555,7 +18808,7 @@
     <w:abstractNumId w:val="6"/>
   </w:num>
   <w:num w:numId="3" w16cid:durableId="555967944">
-    <w:abstractNumId w:val="19"/>
+    <w:abstractNumId w:val="22"/>
   </w:num>
   <w:num w:numId="4" w16cid:durableId="975720977">
     <w:abstractNumId w:val="10"/>
@@ -17564,7 +18817,7 @@
     <w:abstractNumId w:val="2"/>
   </w:num>
   <w:num w:numId="6" w16cid:durableId="1947691180">
-    <w:abstractNumId w:val="17"/>
+    <w:abstractNumId w:val="19"/>
   </w:num>
   <w:num w:numId="7" w16cid:durableId="543980649">
     <w:abstractNumId w:val="9"/>
@@ -17573,10 +18826,10 @@
     <w:abstractNumId w:val="0"/>
   </w:num>
   <w:num w:numId="9" w16cid:durableId="736512136">
-    <w:abstractNumId w:val="15"/>
+    <w:abstractNumId w:val="17"/>
   </w:num>
   <w:num w:numId="10" w16cid:durableId="1832524834">
-    <w:abstractNumId w:val="20"/>
+    <w:abstractNumId w:val="24"/>
   </w:num>
   <w:num w:numId="11" w16cid:durableId="1122117184">
     <w:abstractNumId w:val="12"/>
@@ -17591,28 +18844,40 @@
     <w:abstractNumId w:val="3"/>
   </w:num>
   <w:num w:numId="15" w16cid:durableId="1046374455">
-    <w:abstractNumId w:val="18"/>
+    <w:abstractNumId w:val="20"/>
   </w:num>
   <w:num w:numId="16" w16cid:durableId="1399130606">
     <w:abstractNumId w:val="7"/>
   </w:num>
   <w:num w:numId="17" w16cid:durableId="279843836">
-    <w:abstractNumId w:val="16"/>
+    <w:abstractNumId w:val="18"/>
   </w:num>
   <w:num w:numId="18" w16cid:durableId="1173257668">
     <w:abstractNumId w:val="8"/>
   </w:num>
   <w:num w:numId="19" w16cid:durableId="1573469366">
-    <w:abstractNumId w:val="14"/>
+    <w:abstractNumId w:val="16"/>
   </w:num>
   <w:num w:numId="20" w16cid:durableId="1306812659">
     <w:abstractNumId w:val="4"/>
   </w:num>
   <w:num w:numId="21" w16cid:durableId="655647183">
-    <w:abstractNumId w:val="21"/>
+    <w:abstractNumId w:val="25"/>
   </w:num>
   <w:num w:numId="22" w16cid:durableId="915549673">
     <w:abstractNumId w:val="1"/>
+  </w:num>
+  <w:num w:numId="23" w16cid:durableId="1525512738">
+    <w:abstractNumId w:val="14"/>
+  </w:num>
+  <w:num w:numId="24" w16cid:durableId="2027976820">
+    <w:abstractNumId w:val="15"/>
+  </w:num>
+  <w:num w:numId="25" w16cid:durableId="115225939">
+    <w:abstractNumId w:val="23"/>
+  </w:num>
+  <w:num w:numId="26" w16cid:durableId="1462114911">
+    <w:abstractNumId w:val="21"/>
   </w:num>
 </w:numbering>
 </file>

</xml_diff>

<commit_message>
Documentação dos experimentos 7 e 8 da ResNet
</commit_message>
<xml_diff>
--- a/Documentation/Documentacao Unificada de Experimentos.docx
+++ b/Documentation/Documentacao Unificada de Experimentos.docx
@@ -16737,6 +16737,7 @@
         <w:rPr>
           <w:b/>
           <w:bCs/>
+          <w:noProof/>
         </w:rPr>
         <w:drawing>
           <wp:inline distT="0" distB="0" distL="0" distR="0" wp14:anchorId="750B3128" wp14:editId="67454205">
@@ -16865,13 +16866,7 @@
       </w:r>
       <w:proofErr w:type="spellEnd"/>
       <w:r>
-        <w:t>. O ganho absoluto de acurácia é pequeno, mas consistente: a validação oscila entre 83% e 84%, atingindo picos próximos de 84.5%.</w:t>
-      </w:r>
-      <w:r>
-        <w:t xml:space="preserve"> </w:t>
-      </w:r>
-      <w:r>
-        <w:t xml:space="preserve">Isso indica que o modelo já extraiu praticamente tudo o que o </w:t>
+        <w:t xml:space="preserve">. O ganho absoluto de acurácia é pequeno, mas consistente: a validação oscila entre 83% e 84%, atingindo picos próximos de 84.5%. Isso indica que o modelo já extraiu praticamente tudo o que o </w:t>
       </w:r>
       <w:proofErr w:type="spellStart"/>
       <w:r>
@@ -17300,21 +17295,7 @@
           <w:b/>
           <w:bCs/>
         </w:rPr>
-        <w:t>A</w:t>
-      </w:r>
-      <w:r>
-        <w:rPr>
-          <w:b/>
-          <w:bCs/>
-        </w:rPr>
-        <w:t xml:space="preserve"> ResNet-18 tem capacidade compatível com o problema</w:t>
-      </w:r>
-      <w:r>
-        <w:rPr>
-          <w:b/>
-          <w:bCs/>
-        </w:rPr>
-        <w:t>:</w:t>
+        <w:t>A ResNet-18 tem capacidade compatível com o problema:</w:t>
       </w:r>
       <w:r>
         <w:t xml:space="preserve"> </w:t>
@@ -17340,14 +17321,7 @@
           <w:b/>
           <w:bCs/>
         </w:rPr>
-        <w:t xml:space="preserve">O </w:t>
-      </w:r>
-      <w:r>
-        <w:rPr>
-          <w:b/>
-          <w:bCs/>
-        </w:rPr>
-        <w:t>pipeline está bem configurado:</w:t>
+        <w:t>O pipeline está bem configurado:</w:t>
       </w:r>
       <w:r>
         <w:t xml:space="preserve"> normalização correta, </w:t>
@@ -17432,6 +17406,9 @@
         <w:jc w:val="center"/>
       </w:pPr>
       <w:r>
+        <w:rPr>
+          <w:noProof/>
+        </w:rPr>
         <w:drawing>
           <wp:inline distT="0" distB="0" distL="0" distR="0" wp14:anchorId="3FCFF9C0" wp14:editId="304608A2">
             <wp:extent cx="3919689" cy="1770404"/>
@@ -17615,7 +17592,8 @@
     </w:p>
     <w:p>
       <w:pPr>
-        <w:jc w:val="both"/>
+        <w:pStyle w:val="PargrafodaLista"/>
+        <w:ind w:left="3240"/>
       </w:pPr>
     </w:p>
     <w:p>
@@ -17656,10 +17634,976 @@
         <w:rPr>
           <w:b/>
           <w:bCs/>
-          <w:color w:val="C00000"/>
-        </w:rPr>
-        <w:t>A DEFINIR</w:t>
-      </w:r>
+        </w:rPr>
+        <w:t xml:space="preserve">TREINO COM </w:t>
+      </w:r>
+      <w:r>
+        <w:rPr>
+          <w:b/>
+          <w:bCs/>
+        </w:rPr>
+        <w:t>500</w:t>
+      </w:r>
+      <w:r>
+        <w:rPr>
+          <w:b/>
+          <w:bCs/>
+        </w:rPr>
+        <w:t xml:space="preserve"> EM VARIAÇÃO RASA DA RESNET</w:t>
+      </w:r>
+    </w:p>
+    <w:p>
+      <w:pPr>
+        <w:pStyle w:val="PargrafodaLista"/>
+        <w:ind w:left="1440"/>
+        <w:jc w:val="both"/>
+      </w:pPr>
+    </w:p>
+    <w:p>
+      <w:pPr>
+        <w:pStyle w:val="PargrafodaLista"/>
+        <w:ind w:left="1440"/>
+        <w:jc w:val="both"/>
+      </w:pPr>
+      <w:r>
+        <w:t xml:space="preserve">Este experimento tem como objetivo repetir a configuração adotada no Experimento 6, mantendo </w:t>
+      </w:r>
+      <w:r>
+        <w:t>inalterados todos os parâmetros definidos</w:t>
+      </w:r>
+      <w:r>
+        <w:t xml:space="preserve">, porém ampliando significativamente o número total de épocas de treinamento. </w:t>
+      </w:r>
+    </w:p>
+    <w:p>
+      <w:pPr>
+        <w:pStyle w:val="PargrafodaLista"/>
+        <w:ind w:left="1440"/>
+        <w:jc w:val="both"/>
+      </w:pPr>
+    </w:p>
+    <w:p>
+      <w:pPr>
+        <w:pStyle w:val="PargrafodaLista"/>
+        <w:ind w:left="1440"/>
+        <w:jc w:val="both"/>
+      </w:pPr>
+      <w:r>
+        <w:t>A motivação dessa variação consiste em analisar de forma mais aprofundada o comportamento do processo de aprendizagem ao longo do tempo, bem como verificar se o modelo atinge efetivamente um platô de desempenho, indicando convergência estável dos parâmetros.</w:t>
+      </w:r>
+    </w:p>
+    <w:p>
+      <w:pPr>
+        <w:pStyle w:val="PargrafodaLista"/>
+        <w:ind w:left="1440"/>
+        <w:jc w:val="both"/>
+      </w:pPr>
+    </w:p>
+    <w:p>
+      <w:pPr>
+        <w:pStyle w:val="PargrafodaLista"/>
+        <w:numPr>
+          <w:ilvl w:val="0"/>
+          <w:numId w:val="27"/>
+        </w:numPr>
+        <w:jc w:val="both"/>
+        <w:rPr>
+          <w:b/>
+          <w:bCs/>
+        </w:rPr>
+      </w:pPr>
+      <w:r>
+        <w:rPr>
+          <w:b/>
+          <w:bCs/>
+        </w:rPr>
+        <w:t>Configurações do Treinamento:</w:t>
+      </w:r>
+    </w:p>
+    <w:p>
+      <w:pPr>
+        <w:spacing w:after="0"/>
+        <w:ind w:left="2160"/>
+        <w:jc w:val="center"/>
+        <w:rPr>
+          <w:sz w:val="18"/>
+          <w:szCs w:val="18"/>
+        </w:rPr>
+      </w:pPr>
+      <w:r>
+        <w:rPr>
+          <w:sz w:val="18"/>
+          <w:szCs w:val="18"/>
+        </w:rPr>
+        <w:t>Figura 4</w:t>
+      </w:r>
+      <w:r>
+        <w:rPr>
+          <w:sz w:val="18"/>
+          <w:szCs w:val="18"/>
+        </w:rPr>
+        <w:t>7</w:t>
+      </w:r>
+      <w:r>
+        <w:rPr>
+          <w:sz w:val="18"/>
+          <w:szCs w:val="18"/>
+        </w:rPr>
+        <w:t xml:space="preserve">: </w:t>
+      </w:r>
+      <w:r>
+        <w:rPr>
+          <w:sz w:val="18"/>
+          <w:szCs w:val="18"/>
+        </w:rPr>
+        <w:t>Parâmetros de treinamento</w:t>
+      </w:r>
+    </w:p>
+    <w:p>
+      <w:pPr>
+        <w:pStyle w:val="PargrafodaLista"/>
+        <w:ind w:left="2520"/>
+        <w:jc w:val="center"/>
+        <w:rPr>
+          <w:b/>
+          <w:bCs/>
+        </w:rPr>
+      </w:pPr>
+      <w:r>
+        <w:rPr>
+          <w:b/>
+          <w:bCs/>
+        </w:rPr>
+        <w:drawing>
+          <wp:inline distT="0" distB="0" distL="0" distR="0" wp14:anchorId="400753A3" wp14:editId="22F7E942">
+            <wp:extent cx="1574358" cy="1460891"/>
+            <wp:effectExtent l="0" t="0" r="6985" b="6350"/>
+            <wp:docPr id="1178592215" name="Imagem 1"/>
+            <wp:cNvGraphicFramePr>
+              <a:graphicFrameLocks xmlns:a="http://schemas.openxmlformats.org/drawingml/2006/main" noChangeAspect="1"/>
+            </wp:cNvGraphicFramePr>
+            <a:graphic xmlns:a="http://schemas.openxmlformats.org/drawingml/2006/main">
+              <a:graphicData uri="http://schemas.openxmlformats.org/drawingml/2006/picture">
+                <pic:pic xmlns:pic="http://schemas.openxmlformats.org/drawingml/2006/picture">
+                  <pic:nvPicPr>
+                    <pic:cNvPr id="1178592215" name=""/>
+                    <pic:cNvPicPr/>
+                  </pic:nvPicPr>
+                  <pic:blipFill>
+                    <a:blip r:embed="rId55"/>
+                    <a:stretch>
+                      <a:fillRect/>
+                    </a:stretch>
+                  </pic:blipFill>
+                  <pic:spPr>
+                    <a:xfrm>
+                      <a:off x="0" y="0"/>
+                      <a:ext cx="1578020" cy="1464289"/>
+                    </a:xfrm>
+                    <a:prstGeom prst="rect">
+                      <a:avLst/>
+                    </a:prstGeom>
+                  </pic:spPr>
+                </pic:pic>
+              </a:graphicData>
+            </a:graphic>
+          </wp:inline>
+        </w:drawing>
+      </w:r>
+    </w:p>
+    <w:p>
+      <w:pPr>
+        <w:pStyle w:val="PargrafodaLista"/>
+        <w:ind w:left="2520"/>
+        <w:jc w:val="center"/>
+        <w:rPr>
+          <w:b/>
+          <w:bCs/>
+        </w:rPr>
+      </w:pPr>
+    </w:p>
+    <w:p>
+      <w:pPr>
+        <w:pStyle w:val="PargrafodaLista"/>
+        <w:numPr>
+          <w:ilvl w:val="0"/>
+          <w:numId w:val="27"/>
+        </w:numPr>
+        <w:jc w:val="both"/>
+        <w:rPr>
+          <w:b/>
+          <w:bCs/>
+        </w:rPr>
+      </w:pPr>
+      <w:r>
+        <w:rPr>
+          <w:b/>
+          <w:bCs/>
+        </w:rPr>
+        <w:t>Avaliação do comportamento do aprendizado:</w:t>
+      </w:r>
+    </w:p>
+    <w:p>
+      <w:pPr>
+        <w:pStyle w:val="PargrafodaLista"/>
+        <w:ind w:left="2520"/>
+        <w:jc w:val="both"/>
+      </w:pPr>
+    </w:p>
+    <w:p>
+      <w:pPr>
+        <w:pStyle w:val="PargrafodaLista"/>
+        <w:ind w:left="2520"/>
+        <w:jc w:val="both"/>
+      </w:pPr>
+      <w:r>
+        <w:t>Nos estágios iniciais do treinamento, observa-se uma redução consistente da função de perda, acompanhada por um aumento progressivo da acurácia tanto no conjunto de treinamento quanto no conjunto de validação. Esse comportamento evidencia que a rede é capaz de extrair padrões relevantes dos dados e que o processo de otimização ocorre de maneira adequada.</w:t>
+      </w:r>
+    </w:p>
+    <w:p>
+      <w:pPr>
+        <w:pStyle w:val="PargrafodaLista"/>
+        <w:ind w:left="3240"/>
+        <w:jc w:val="both"/>
+      </w:pPr>
+    </w:p>
+    <w:p>
+      <w:pPr>
+        <w:pStyle w:val="PargrafodaLista"/>
+        <w:numPr>
+          <w:ilvl w:val="1"/>
+          <w:numId w:val="27"/>
+        </w:numPr>
+        <w:jc w:val="both"/>
+      </w:pPr>
+      <w:r>
+        <w:t>O</w:t>
+      </w:r>
+      <w:r>
+        <w:t xml:space="preserve"> comportamento</w:t>
+      </w:r>
+      <w:r>
+        <w:t xml:space="preserve"> observado nos estágios iniciais </w:t>
+      </w:r>
+      <w:r>
+        <w:t>evidencia</w:t>
+      </w:r>
+      <w:r>
+        <w:t xml:space="preserve"> que a rede é capaz de extrair padrões relevantes dos dados e que o processo de otimização ocorre de maneira adequada.</w:t>
+      </w:r>
+    </w:p>
+    <w:p>
+      <w:pPr>
+        <w:pStyle w:val="PargrafodaLista"/>
+        <w:ind w:left="3240"/>
+        <w:jc w:val="both"/>
+      </w:pPr>
+    </w:p>
+    <w:p>
+      <w:pPr>
+        <w:pStyle w:val="PargrafodaLista"/>
+        <w:numPr>
+          <w:ilvl w:val="1"/>
+          <w:numId w:val="27"/>
+        </w:numPr>
+        <w:jc w:val="both"/>
+      </w:pPr>
+      <w:r>
+        <w:lastRenderedPageBreak/>
+        <w:t xml:space="preserve">Adicionalmente, </w:t>
+      </w:r>
+      <w:r>
+        <w:t xml:space="preserve">o fato de as métricas de validação acompanharem de as métricas de treinamento sugere a presença de um bom equilíbrio </w:t>
+      </w:r>
+      <w:r>
+        <w:t>de generalização</w:t>
+      </w:r>
+    </w:p>
+    <w:p>
+      <w:pPr>
+        <w:pStyle w:val="PargrafodaLista"/>
+        <w:ind w:left="2520"/>
+        <w:jc w:val="both"/>
+      </w:pPr>
+    </w:p>
+    <w:p>
+      <w:pPr>
+        <w:pStyle w:val="PargrafodaLista"/>
+        <w:ind w:left="2520"/>
+        <w:jc w:val="both"/>
+      </w:pPr>
+      <w:r>
+        <w:t xml:space="preserve">À medida que o número de épocas aumenta, o ganho de desempenho passa a ocorrer de forma mais gradual. Ainda assim, em comparação com o experimento anterior, observa-se um incremento acumulado </w:t>
+      </w:r>
+      <w:r>
+        <w:t>médio de</w:t>
+      </w:r>
+      <w:r>
+        <w:t xml:space="preserve"> 5 pontos percentuais na acurácia final</w:t>
+      </w:r>
+      <w:r>
+        <w:t xml:space="preserve"> (tanto para validação quanto para treino)</w:t>
+      </w:r>
+      <w:r>
+        <w:t>, o que indica que o prolongamento do treinamento contribuiu para um refinamento adicional dos pesos da rede.</w:t>
+      </w:r>
+    </w:p>
+    <w:p>
+      <w:pPr>
+        <w:pStyle w:val="PargrafodaLista"/>
+        <w:ind w:left="2520"/>
+        <w:jc w:val="both"/>
+      </w:pPr>
+    </w:p>
+    <w:p>
+      <w:pPr>
+        <w:pStyle w:val="PargrafodaLista"/>
+        <w:numPr>
+          <w:ilvl w:val="1"/>
+          <w:numId w:val="27"/>
+        </w:numPr>
+        <w:jc w:val="both"/>
+      </w:pPr>
+      <w:r>
+        <w:t>Entretanto, torna-se evidente</w:t>
+      </w:r>
+      <w:r>
+        <w:t xml:space="preserve"> </w:t>
+      </w:r>
+      <w:r>
+        <w:t>a formação de um platô</w:t>
+      </w:r>
+      <w:r>
+        <w:t xml:space="preserve"> nas épocas finais</w:t>
+      </w:r>
+      <w:r>
+        <w:t>, caracterizado por pequenas oscilações nas métricas de desempenho e pela ausência de melhorias expressivas na acurácia de validação.</w:t>
+      </w:r>
+    </w:p>
+    <w:p>
+      <w:pPr>
+        <w:pStyle w:val="PargrafodaLista"/>
+        <w:ind w:left="2520"/>
+        <w:jc w:val="both"/>
+      </w:pPr>
+    </w:p>
+    <w:p>
+      <w:pPr>
+        <w:pStyle w:val="PargrafodaLista"/>
+        <w:ind w:left="2520"/>
+        <w:jc w:val="both"/>
+      </w:pPr>
+    </w:p>
+    <w:p>
+      <w:pPr>
+        <w:pStyle w:val="PargrafodaLista"/>
+        <w:ind w:left="2520"/>
+        <w:jc w:val="both"/>
+      </w:pPr>
+    </w:p>
+    <w:p>
+      <w:pPr>
+        <w:spacing w:after="0"/>
+        <w:ind w:left="2160"/>
+        <w:jc w:val="center"/>
+        <w:rPr>
+          <w:sz w:val="18"/>
+          <w:szCs w:val="18"/>
+        </w:rPr>
+      </w:pPr>
+      <w:r>
+        <w:rPr>
+          <w:sz w:val="18"/>
+          <w:szCs w:val="18"/>
+        </w:rPr>
+        <w:t>Figura 4</w:t>
+      </w:r>
+      <w:r>
+        <w:rPr>
+          <w:sz w:val="18"/>
+          <w:szCs w:val="18"/>
+        </w:rPr>
+        <w:t>8</w:t>
+      </w:r>
+      <w:r>
+        <w:rPr>
+          <w:sz w:val="18"/>
+          <w:szCs w:val="18"/>
+        </w:rPr>
+        <w:t xml:space="preserve">: </w:t>
+      </w:r>
+      <w:r>
+        <w:rPr>
+          <w:sz w:val="18"/>
+          <w:szCs w:val="18"/>
+        </w:rPr>
+        <w:t xml:space="preserve">Gráfico dos resultados de </w:t>
+      </w:r>
+      <w:proofErr w:type="spellStart"/>
+      <w:r>
+        <w:rPr>
+          <w:sz w:val="18"/>
+          <w:szCs w:val="18"/>
+        </w:rPr>
+        <w:t>loss</w:t>
+      </w:r>
+      <w:proofErr w:type="spellEnd"/>
+      <w:r>
+        <w:rPr>
+          <w:sz w:val="18"/>
+          <w:szCs w:val="18"/>
+        </w:rPr>
+        <w:t xml:space="preserve"> e </w:t>
+      </w:r>
+      <w:proofErr w:type="spellStart"/>
+      <w:r>
+        <w:rPr>
+          <w:sz w:val="18"/>
+          <w:szCs w:val="18"/>
+        </w:rPr>
+        <w:t>accuracy</w:t>
+      </w:r>
+      <w:proofErr w:type="spellEnd"/>
+    </w:p>
+    <w:p>
+      <w:pPr>
+        <w:pStyle w:val="PargrafodaLista"/>
+        <w:ind w:left="708"/>
+        <w:jc w:val="center"/>
+      </w:pPr>
+      <w:r>
+        <w:drawing>
+          <wp:inline distT="0" distB="0" distL="0" distR="0" wp14:anchorId="6D689857" wp14:editId="01859F23">
+            <wp:extent cx="5263764" cy="3163582"/>
+            <wp:effectExtent l="0" t="0" r="0" b="0"/>
+            <wp:docPr id="568260546" name="Imagem 1"/>
+            <wp:cNvGraphicFramePr>
+              <a:graphicFrameLocks xmlns:a="http://schemas.openxmlformats.org/drawingml/2006/main" noChangeAspect="1"/>
+            </wp:cNvGraphicFramePr>
+            <a:graphic xmlns:a="http://schemas.openxmlformats.org/drawingml/2006/main">
+              <a:graphicData uri="http://schemas.openxmlformats.org/drawingml/2006/picture">
+                <pic:pic xmlns:pic="http://schemas.openxmlformats.org/drawingml/2006/picture">
+                  <pic:nvPicPr>
+                    <pic:cNvPr id="568260546" name=""/>
+                    <pic:cNvPicPr/>
+                  </pic:nvPicPr>
+                  <pic:blipFill>
+                    <a:blip r:embed="rId56"/>
+                    <a:stretch>
+                      <a:fillRect/>
+                    </a:stretch>
+                  </pic:blipFill>
+                  <pic:spPr>
+                    <a:xfrm>
+                      <a:off x="0" y="0"/>
+                      <a:ext cx="5296331" cy="3183155"/>
+                    </a:xfrm>
+                    <a:prstGeom prst="rect">
+                      <a:avLst/>
+                    </a:prstGeom>
+                  </pic:spPr>
+                </pic:pic>
+              </a:graphicData>
+            </a:graphic>
+          </wp:inline>
+        </w:drawing>
+      </w:r>
+    </w:p>
+    <w:p>
+      <w:pPr>
+        <w:pStyle w:val="PargrafodaLista"/>
+        <w:ind w:left="2520"/>
+        <w:jc w:val="both"/>
+      </w:pPr>
+    </w:p>
+    <w:p>
+      <w:pPr>
+        <w:pStyle w:val="PargrafodaLista"/>
+        <w:numPr>
+          <w:ilvl w:val="0"/>
+          <w:numId w:val="27"/>
+        </w:numPr>
+        <w:jc w:val="both"/>
+        <w:rPr>
+          <w:b/>
+          <w:bCs/>
+        </w:rPr>
+      </w:pPr>
+      <w:r>
+        <w:rPr>
+          <w:b/>
+          <w:bCs/>
+        </w:rPr>
+        <w:t>Conclusões:</w:t>
+      </w:r>
+    </w:p>
+    <w:p>
+      <w:pPr>
+        <w:pStyle w:val="PargrafodaLista"/>
+        <w:ind w:left="2520"/>
+        <w:jc w:val="both"/>
+        <w:rPr>
+          <w:b/>
+          <w:bCs/>
+        </w:rPr>
+      </w:pPr>
+    </w:p>
+    <w:p>
+      <w:pPr>
+        <w:pStyle w:val="PargrafodaLista"/>
+        <w:ind w:left="2520"/>
+        <w:jc w:val="both"/>
+        <w:rPr>
+          <w:b/>
+          <w:bCs/>
+        </w:rPr>
+      </w:pPr>
+      <w:r>
+        <w:t>De forma geral, os resultados obtidos confirmam que o aumento do número de épocas pode ser benéfico até certo ponto</w:t>
+      </w:r>
+      <w:r>
+        <w:t xml:space="preserve"> para ajuste fino</w:t>
+      </w:r>
+      <w:r>
+        <w:t xml:space="preserve">, </w:t>
+      </w:r>
+      <w:r>
+        <w:t>porém</w:t>
+      </w:r>
+      <w:r>
+        <w:t xml:space="preserve"> evidenciam </w:t>
+      </w:r>
+      <w:r>
+        <w:t>o limiar da</w:t>
+      </w:r>
+      <w:r>
+        <w:t xml:space="preserve"> </w:t>
+      </w:r>
+      <w:r>
+        <w:t>eficiên</w:t>
+      </w:r>
+      <w:r>
+        <w:t>cia máxima do modelo</w:t>
+      </w:r>
+      <w:r>
+        <w:t xml:space="preserve">, reforçando a importância de estratégias </w:t>
+      </w:r>
+      <w:r>
+        <w:t>para</w:t>
+      </w:r>
+      <w:r>
+        <w:t xml:space="preserve"> ajuste</w:t>
+      </w:r>
+      <w:r>
+        <w:t>s</w:t>
+      </w:r>
+      <w:r>
+        <w:t xml:space="preserve"> </w:t>
+      </w:r>
+      <w:r>
+        <w:t>de parâmetros</w:t>
+      </w:r>
+      <w:r>
+        <w:t>, ou até mesmo modificações arquiteturais para obtenção de ganhos adicionais.</w:t>
+      </w:r>
+    </w:p>
+    <w:p>
+      <w:pPr>
+        <w:pStyle w:val="PargrafodaLista"/>
+        <w:numPr>
+          <w:ilvl w:val="1"/>
+          <w:numId w:val="1"/>
+        </w:numPr>
+        <w:jc w:val="both"/>
+        <w:rPr>
+          <w:b/>
+          <w:bCs/>
+        </w:rPr>
+      </w:pPr>
+      <w:r>
+        <w:rPr>
+          <w:b/>
+          <w:bCs/>
+        </w:rPr>
+        <w:lastRenderedPageBreak/>
+        <w:t xml:space="preserve">EXPERIMENTO </w:t>
+      </w:r>
+      <w:r>
+        <w:rPr>
+          <w:b/>
+          <w:bCs/>
+        </w:rPr>
+        <w:t>8</w:t>
+      </w:r>
+      <w:r>
+        <w:rPr>
+          <w:b/>
+          <w:bCs/>
+        </w:rPr>
+        <w:t xml:space="preserve"> (RESNET) – </w:t>
+      </w:r>
+      <w:r>
+        <w:rPr>
+          <w:b/>
+          <w:bCs/>
+        </w:rPr>
+        <w:t xml:space="preserve">TREINO COM </w:t>
+      </w:r>
+      <w:r>
+        <w:rPr>
+          <w:b/>
+          <w:bCs/>
+        </w:rPr>
+        <w:t>200 ÉPOCAS E MAIOR BATCH SIZE</w:t>
+      </w:r>
+      <w:r>
+        <w:rPr>
+          <w:b/>
+          <w:bCs/>
+        </w:rPr>
+        <w:t xml:space="preserve"> EM VARIAÇÃO RASA DA RESNET</w:t>
+      </w:r>
+      <w:r>
+        <w:rPr>
+          <w:b/>
+          <w:bCs/>
+        </w:rPr>
+        <w:t>:</w:t>
+      </w:r>
+    </w:p>
+    <w:p>
+      <w:pPr>
+        <w:pStyle w:val="PargrafodaLista"/>
+        <w:ind w:left="1440"/>
+        <w:jc w:val="both"/>
+      </w:pPr>
+    </w:p>
+    <w:p>
+      <w:pPr>
+        <w:pStyle w:val="PargrafodaLista"/>
+        <w:ind w:left="1440"/>
+        <w:jc w:val="both"/>
+      </w:pPr>
+      <w:r>
+        <w:t>Este</w:t>
+      </w:r>
+      <w:r>
+        <w:t xml:space="preserve"> experimento busca aprofundar a análise conduzida no Experimento 6, mantendo-se a mesma variação rasa da arquitetura </w:t>
+      </w:r>
+      <w:proofErr w:type="spellStart"/>
+      <w:r>
+        <w:t>ResNet</w:t>
+      </w:r>
+      <w:proofErr w:type="spellEnd"/>
+      <w:r>
+        <w:t xml:space="preserve"> (ResNet-18), bem como o mesmo protocolo de treinamento e estratégia de otimização. A principal modificação introduzida consiste no aumento do tamanho do batch, que foi ampliado de 32 para 64 amostras por iteração.</w:t>
+      </w:r>
+    </w:p>
+    <w:p>
+      <w:pPr>
+        <w:pStyle w:val="PargrafodaLista"/>
+        <w:ind w:left="1440"/>
+        <w:jc w:val="both"/>
+      </w:pPr>
+    </w:p>
+    <w:p>
+      <w:pPr>
+        <w:pStyle w:val="PargrafodaLista"/>
+        <w:ind w:left="1440"/>
+        <w:jc w:val="both"/>
+      </w:pPr>
+      <w:r>
+        <w:t>O objetivo dessa alteração é avaliar o impacto de batches maiores no comportamento do processo de aprendizagem, especialmente no que diz respeito à estabilidade da função de perda, à velocidade de convergência e à capacidade de generalização do modelo. Em termos teóricos, espera-se que batches maiores proporcionem estimativas de gradiente menos ruidosas, porém potencialmente reduzam o efeito regularizador implícito presente em batches menores, o que pode influenciar diretamente a dinâmica de treinamento em bases de dados de tamanho limitado.</w:t>
+      </w:r>
+    </w:p>
+    <w:p>
+      <w:pPr>
+        <w:pStyle w:val="PargrafodaLista"/>
+        <w:ind w:left="1440"/>
+        <w:jc w:val="both"/>
+      </w:pPr>
+    </w:p>
+    <w:p>
+      <w:pPr>
+        <w:pStyle w:val="PargrafodaLista"/>
+        <w:numPr>
+          <w:ilvl w:val="0"/>
+          <w:numId w:val="27"/>
+        </w:numPr>
+        <w:jc w:val="both"/>
+        <w:rPr>
+          <w:b/>
+          <w:bCs/>
+        </w:rPr>
+      </w:pPr>
+      <w:r>
+        <w:rPr>
+          <w:b/>
+          <w:bCs/>
+        </w:rPr>
+        <w:t>Configurações do Treinamento:</w:t>
+      </w:r>
+    </w:p>
+    <w:p>
+      <w:pPr>
+        <w:spacing w:after="0"/>
+        <w:ind w:left="2160"/>
+        <w:jc w:val="center"/>
+        <w:rPr>
+          <w:sz w:val="18"/>
+          <w:szCs w:val="18"/>
+        </w:rPr>
+      </w:pPr>
+      <w:r>
+        <w:rPr>
+          <w:sz w:val="18"/>
+          <w:szCs w:val="18"/>
+        </w:rPr>
+        <w:t>Figura 4</w:t>
+      </w:r>
+      <w:r>
+        <w:rPr>
+          <w:sz w:val="18"/>
+          <w:szCs w:val="18"/>
+        </w:rPr>
+        <w:t>9</w:t>
+      </w:r>
+      <w:r>
+        <w:rPr>
+          <w:sz w:val="18"/>
+          <w:szCs w:val="18"/>
+        </w:rPr>
+        <w:t>: Parâmetros de treinamento</w:t>
+      </w:r>
+    </w:p>
+    <w:p>
+      <w:pPr>
+        <w:pStyle w:val="PargrafodaLista"/>
+        <w:ind w:left="2160"/>
+        <w:jc w:val="center"/>
+        <w:rPr>
+          <w:b/>
+          <w:bCs/>
+        </w:rPr>
+      </w:pPr>
+      <w:r>
+        <w:rPr>
+          <w:b/>
+          <w:bCs/>
+        </w:rPr>
+        <w:drawing>
+          <wp:inline distT="0" distB="0" distL="0" distR="0" wp14:anchorId="78065CFA" wp14:editId="2729D90F">
+            <wp:extent cx="1609950" cy="1971950"/>
+            <wp:effectExtent l="0" t="0" r="9525" b="0"/>
+            <wp:docPr id="805715739" name="Imagem 1"/>
+            <wp:cNvGraphicFramePr>
+              <a:graphicFrameLocks xmlns:a="http://schemas.openxmlformats.org/drawingml/2006/main" noChangeAspect="1"/>
+            </wp:cNvGraphicFramePr>
+            <a:graphic xmlns:a="http://schemas.openxmlformats.org/drawingml/2006/main">
+              <a:graphicData uri="http://schemas.openxmlformats.org/drawingml/2006/picture">
+                <pic:pic xmlns:pic="http://schemas.openxmlformats.org/drawingml/2006/picture">
+                  <pic:nvPicPr>
+                    <pic:cNvPr id="805715739" name=""/>
+                    <pic:cNvPicPr/>
+                  </pic:nvPicPr>
+                  <pic:blipFill>
+                    <a:blip r:embed="rId57"/>
+                    <a:stretch>
+                      <a:fillRect/>
+                    </a:stretch>
+                  </pic:blipFill>
+                  <pic:spPr>
+                    <a:xfrm>
+                      <a:off x="0" y="0"/>
+                      <a:ext cx="1609950" cy="1971950"/>
+                    </a:xfrm>
+                    <a:prstGeom prst="rect">
+                      <a:avLst/>
+                    </a:prstGeom>
+                  </pic:spPr>
+                </pic:pic>
+              </a:graphicData>
+            </a:graphic>
+          </wp:inline>
+        </w:drawing>
+      </w:r>
+    </w:p>
+    <w:p>
+      <w:pPr>
+        <w:pStyle w:val="PargrafodaLista"/>
+        <w:ind w:left="2160"/>
+        <w:jc w:val="center"/>
+        <w:rPr>
+          <w:b/>
+          <w:bCs/>
+        </w:rPr>
+      </w:pPr>
+    </w:p>
+    <w:p>
+      <w:pPr>
+        <w:pStyle w:val="PargrafodaLista"/>
+        <w:numPr>
+          <w:ilvl w:val="0"/>
+          <w:numId w:val="27"/>
+        </w:numPr>
+        <w:jc w:val="both"/>
+        <w:rPr>
+          <w:b/>
+          <w:bCs/>
+        </w:rPr>
+      </w:pPr>
+      <w:r>
+        <w:rPr>
+          <w:b/>
+          <w:bCs/>
+        </w:rPr>
+        <w:t>Avaliação do comportamento</w:t>
+      </w:r>
+      <w:r>
+        <w:rPr>
+          <w:b/>
+          <w:bCs/>
+        </w:rPr>
+        <w:t>:</w:t>
+      </w:r>
+    </w:p>
+    <w:p>
+      <w:pPr>
+        <w:pStyle w:val="PargrafodaLista"/>
+        <w:ind w:left="2520"/>
+        <w:jc w:val="both"/>
+      </w:pPr>
+      <w:r>
+        <w:t>Ao longo das primeiras épocas, observa-se uma fase de aprendizado progressivo estável, com aumento gradual da acurácia de treino e redução consistente da perda.</w:t>
+      </w:r>
+      <w:r>
+        <w:t xml:space="preserve"> </w:t>
+      </w:r>
+      <w:r>
+        <w:t xml:space="preserve">Esse comportamento indica que o </w:t>
+      </w:r>
+      <w:r>
+        <w:rPr>
+          <w:i/>
+          <w:iCs/>
+        </w:rPr>
+        <w:t xml:space="preserve">batch </w:t>
+      </w:r>
+      <w:proofErr w:type="spellStart"/>
+      <w:r>
+        <w:rPr>
+          <w:i/>
+          <w:iCs/>
+        </w:rPr>
+        <w:t>size</w:t>
+      </w:r>
+      <w:proofErr w:type="spellEnd"/>
+      <w:r>
+        <w:t xml:space="preserve"> maior não comprometeu a aprendizagem inicial nem introduziu instabilidades no processo de otimização.</w:t>
+      </w:r>
+    </w:p>
+    <w:p>
+      <w:pPr>
+        <w:pStyle w:val="PargrafodaLista"/>
+        <w:ind w:left="2520"/>
+        <w:jc w:val="both"/>
+      </w:pPr>
+    </w:p>
+    <w:p>
+      <w:pPr>
+        <w:pStyle w:val="PargrafodaLista"/>
+        <w:ind w:left="2520"/>
+        <w:jc w:val="both"/>
+      </w:pPr>
+      <w:r>
+        <w:t>Nas fases finais do treinamento, especialmente após a redução adicional do learning rate para 1e-4, o modelo entra claramente em um regime de platô. As métricas de validação passam a oscilar em torno de valores estáveis, com ganhos marginais e não monotônicos. Isso é um indicativo clássico de que o modelo atingiu o limite de aprendizado imposto pela combinação entre arquitetura, dados disponíveis e estratégia de regularização</w:t>
+      </w:r>
+    </w:p>
+    <w:p>
+      <w:pPr>
+        <w:pStyle w:val="PargrafodaLista"/>
+        <w:ind w:left="2520"/>
+        <w:jc w:val="both"/>
+      </w:pPr>
+    </w:p>
+    <w:p>
+      <w:pPr>
+        <w:pStyle w:val="PargrafodaLista"/>
+        <w:numPr>
+          <w:ilvl w:val="0"/>
+          <w:numId w:val="27"/>
+        </w:numPr>
+        <w:jc w:val="both"/>
+      </w:pPr>
+      <w:r>
+        <w:rPr>
+          <w:b/>
+          <w:bCs/>
+        </w:rPr>
+        <w:lastRenderedPageBreak/>
+        <w:t>Conclusões:</w:t>
+      </w:r>
+      <w:r>
+        <w:br/>
+      </w:r>
+      <w:r>
+        <w:t xml:space="preserve">Comparando este experimento com versões anteriores (batch menor), o aumento do </w:t>
+      </w:r>
+      <w:r>
+        <w:rPr>
+          <w:i/>
+          <w:iCs/>
+        </w:rPr>
+        <w:t xml:space="preserve">batch </w:t>
+      </w:r>
+      <w:proofErr w:type="spellStart"/>
+      <w:r>
+        <w:rPr>
+          <w:i/>
+          <w:iCs/>
+        </w:rPr>
+        <w:t>size</w:t>
+      </w:r>
+      <w:proofErr w:type="spellEnd"/>
+      <w:r>
+        <w:t xml:space="preserve"> resultou em um treinamento mais rápido por época e em curvas de aprendizado mais suaves, porém com ganhos finais relativamente modestos em desempenho absoluto.</w:t>
+      </w:r>
+    </w:p>
+    <w:p>
+      <w:pPr>
+        <w:pStyle w:val="PargrafodaLista"/>
+        <w:ind w:left="2160"/>
+        <w:jc w:val="center"/>
+        <w:rPr>
+          <w:b/>
+          <w:bCs/>
+        </w:rPr>
+      </w:pPr>
+    </w:p>
+    <w:p>
+      <w:pPr>
+        <w:pStyle w:val="PargrafodaLista"/>
+        <w:ind w:left="1440"/>
+        <w:jc w:val="both"/>
+        <w:rPr>
+          <w:b/>
+          <w:bCs/>
+        </w:rPr>
+      </w:pPr>
+    </w:p>
+    <w:p>
+      <w:pPr>
+        <w:pStyle w:val="PargrafodaLista"/>
+        <w:numPr>
+          <w:ilvl w:val="1"/>
+          <w:numId w:val="1"/>
+        </w:numPr>
+        <w:jc w:val="both"/>
+        <w:rPr>
+          <w:b/>
+          <w:bCs/>
+        </w:rPr>
+      </w:pPr>
     </w:p>
     <w:p>
       <w:pPr>
@@ -17699,7 +18643,7 @@
         <v:path o:extrusionok="f" gradientshapeok="t" o:connecttype="rect"/>
         <o:lock v:ext="edit" aspectratio="t"/>
       </v:shapetype>
-      <v:shape id="_x0000_i1095" type="#_x0000_t75" style="width:693.1pt;height:487.7pt;visibility:visible;mso-wrap-style:square" o:bullet="t">
+      <v:shape id="_x0000_i1056" type="#_x0000_t75" style="width:693.1pt;height:487.7pt;visibility:visible;mso-wrap-style:square" o:bullet="t">
         <v:imagedata r:id="rId1" o:title="" croptop="19686f" cropbottom="43833f" cropleft="8606f" cropright="55951f"/>
       </v:shape>
     </w:pict>
@@ -19289,7 +20233,7 @@
   <w:abstractNum w:abstractNumId="14" w15:restartNumberingAfterBreak="0">
     <w:nsid w:val="3A44790F"/>
     <w:multiLevelType w:val="hybridMultilevel"/>
-    <w:tmpl w:val="C228EAE4"/>
+    <w:tmpl w:val="A87C14B2"/>
     <w:lvl w:ilvl="0" w:tplc="04160001">
       <w:start w:val="1"/>
       <w:numFmt w:val="bullet"/>

</xml_diff>

<commit_message>
Atualização da documentação do experimento 9
</commit_message>
<xml_diff>
--- a/Documentation/Documentacao Unificada de Experimentos.docx
+++ b/Documentation/Documentacao Unificada de Experimentos.docx
@@ -17635,21 +17635,7 @@
           <w:b/>
           <w:bCs/>
         </w:rPr>
-        <w:t xml:space="preserve">TREINO COM </w:t>
-      </w:r>
-      <w:r>
-        <w:rPr>
-          <w:b/>
-          <w:bCs/>
-        </w:rPr>
-        <w:t>500</w:t>
-      </w:r>
-      <w:r>
-        <w:rPr>
-          <w:b/>
-          <w:bCs/>
-        </w:rPr>
-        <w:t xml:space="preserve"> EM VARIAÇÃO RASA DA RESNET</w:t>
+        <w:t>TREINO COM 500 EM VARIAÇÃO RASA DA RESNET</w:t>
       </w:r>
     </w:p>
     <w:p>
@@ -17773,6 +17759,7 @@
         <w:rPr>
           <w:b/>
           <w:bCs/>
+          <w:noProof/>
         </w:rPr>
         <w:drawing>
           <wp:inline distT="0" distB="0" distL="0" distR="0" wp14:anchorId="400753A3" wp14:editId="22F7E942">
@@ -17886,10 +17873,7 @@
         <w:t xml:space="preserve"> observado nos estágios iniciais </w:t>
       </w:r>
       <w:r>
-        <w:t>evidencia</w:t>
-      </w:r>
-      <w:r>
-        <w:t xml:space="preserve"> que a rede é capaz de extrair padrões relevantes dos dados e que o processo de otimização ocorre de maneira adequada.</w:t>
+        <w:t>evidencia que a rede é capaz de extrair padrões relevantes dos dados e que o processo de otimização ocorre de maneira adequada.</w:t>
       </w:r>
     </w:p>
     <w:p>
@@ -18072,6 +18056,9 @@
         <w:jc w:val="center"/>
       </w:pPr>
       <w:r>
+        <w:rPr>
+          <w:noProof/>
+        </w:rPr>
         <w:drawing>
           <wp:inline distT="0" distB="0" distL="0" distR="0" wp14:anchorId="6D689857" wp14:editId="01859F23">
             <wp:extent cx="5263764" cy="3163582"/>
@@ -18177,10 +18164,7 @@
         <w:t>o limiar da</w:t>
       </w:r>
       <w:r>
-        <w:t xml:space="preserve"> </w:t>
-      </w:r>
-      <w:r>
-        <w:t>eficiên</w:t>
+        <w:t xml:space="preserve"> eficiên</w:t>
       </w:r>
       <w:r>
         <w:t>cia máxima do modelo</w:t>
@@ -18247,28 +18231,7 @@
           <w:b/>
           <w:bCs/>
         </w:rPr>
-        <w:t xml:space="preserve">TREINO COM </w:t>
-      </w:r>
-      <w:r>
-        <w:rPr>
-          <w:b/>
-          <w:bCs/>
-        </w:rPr>
-        <w:t>200 ÉPOCAS E MAIOR BATCH SIZE</w:t>
-      </w:r>
-      <w:r>
-        <w:rPr>
-          <w:b/>
-          <w:bCs/>
-        </w:rPr>
-        <w:t xml:space="preserve"> EM VARIAÇÃO RASA DA RESNET</w:t>
-      </w:r>
-      <w:r>
-        <w:rPr>
-          <w:b/>
-          <w:bCs/>
-        </w:rPr>
-        <w:t>:</w:t>
+        <w:t>TREINO COM 200 ÉPOCAS E MAIOR BATCH SIZE EM VARIAÇÃO RASA DA RESNET:</w:t>
       </w:r>
     </w:p>
     <w:p>
@@ -18285,10 +18248,7 @@
         <w:jc w:val="both"/>
       </w:pPr>
       <w:r>
-        <w:t>Este</w:t>
-      </w:r>
-      <w:r>
-        <w:t xml:space="preserve"> experimento busca aprofundar a análise conduzida no Experimento 6, mantendo-se a mesma variação rasa da arquitetura </w:t>
+        <w:t xml:space="preserve">Este experimento busca aprofundar a análise conduzida no Experimento 6, mantendo-se a mesma variação rasa da arquitetura </w:t>
       </w:r>
       <w:proofErr w:type="spellStart"/>
       <w:r>
@@ -18390,6 +18350,7 @@
         <w:rPr>
           <w:b/>
           <w:bCs/>
+          <w:noProof/>
         </w:rPr>
         <w:drawing>
           <wp:inline distT="0" distB="0" distL="0" distR="0" wp14:anchorId="78065CFA" wp14:editId="2729D90F">
@@ -18457,14 +18418,7 @@
           <w:b/>
           <w:bCs/>
         </w:rPr>
-        <w:t>Avaliação do comportamento</w:t>
-      </w:r>
-      <w:r>
-        <w:rPr>
-          <w:b/>
-          <w:bCs/>
-        </w:rPr>
-        <w:t>:</w:t>
+        <w:t>Avaliação do comportamento:</w:t>
       </w:r>
     </w:p>
     <w:p>
@@ -18574,6 +18528,1311 @@
         <w:pStyle w:val="PargrafodaLista"/>
         <w:ind w:left="2160"/>
         <w:jc w:val="center"/>
+        <w:rPr>
+          <w:b/>
+          <w:bCs/>
+        </w:rPr>
+      </w:pPr>
+    </w:p>
+    <w:p>
+      <w:pPr>
+        <w:pStyle w:val="PargrafodaLista"/>
+        <w:ind w:left="1440"/>
+        <w:jc w:val="both"/>
+        <w:rPr>
+          <w:b/>
+          <w:bCs/>
+        </w:rPr>
+      </w:pPr>
+    </w:p>
+    <w:p>
+      <w:pPr>
+        <w:pStyle w:val="PargrafodaLista"/>
+        <w:numPr>
+          <w:ilvl w:val="1"/>
+          <w:numId w:val="1"/>
+        </w:numPr>
+        <w:jc w:val="both"/>
+        <w:rPr>
+          <w:b/>
+          <w:bCs/>
+        </w:rPr>
+      </w:pPr>
+      <w:r>
+        <w:rPr>
+          <w:b/>
+          <w:bCs/>
+        </w:rPr>
+        <w:t xml:space="preserve">EXPERIMENTO </w:t>
+      </w:r>
+      <w:r>
+        <w:rPr>
+          <w:b/>
+          <w:bCs/>
+        </w:rPr>
+        <w:t>9</w:t>
+      </w:r>
+      <w:r>
+        <w:rPr>
+          <w:b/>
+          <w:bCs/>
+        </w:rPr>
+        <w:t xml:space="preserve"> (RESNET) – </w:t>
+      </w:r>
+      <w:r>
+        <w:rPr>
+          <w:b/>
+          <w:bCs/>
+        </w:rPr>
+        <w:t xml:space="preserve">TREINO COM </w:t>
+      </w:r>
+      <w:r>
+        <w:rPr>
+          <w:b/>
+          <w:bCs/>
+        </w:rPr>
+        <w:t>5</w:t>
+      </w:r>
+      <w:r>
+        <w:rPr>
+          <w:b/>
+          <w:bCs/>
+        </w:rPr>
+        <w:t>00 ÉPOCAS E MAIOR BATCH SIZE</w:t>
+      </w:r>
+      <w:r>
+        <w:rPr>
+          <w:b/>
+          <w:bCs/>
+        </w:rPr>
+        <w:t>, UTILIZANDO A</w:t>
+      </w:r>
+      <w:r>
+        <w:rPr>
+          <w:b/>
+          <w:bCs/>
+        </w:rPr>
+        <w:t xml:space="preserve"> RESNET</w:t>
+      </w:r>
+      <w:r>
+        <w:rPr>
+          <w:b/>
+          <w:bCs/>
+        </w:rPr>
+        <w:t>-34</w:t>
+      </w:r>
+      <w:r>
+        <w:rPr>
+          <w:b/>
+          <w:bCs/>
+        </w:rPr>
+        <w:t>:</w:t>
+      </w:r>
+    </w:p>
+    <w:p>
+      <w:pPr>
+        <w:pStyle w:val="PargrafodaLista"/>
+        <w:ind w:left="1440"/>
+        <w:jc w:val="both"/>
+      </w:pPr>
+      <w:r>
+        <w:t xml:space="preserve">Este experimento busca </w:t>
+      </w:r>
+      <w:r>
+        <w:t>avaliar o comportamento</w:t>
+      </w:r>
+      <w:r>
+        <w:t xml:space="preserve"> </w:t>
+      </w:r>
+      <w:r>
+        <w:t xml:space="preserve">do modelo ResNet-34. </w:t>
+      </w:r>
+      <w:r>
+        <w:t>Ela pertence ao grupo intermediári</w:t>
+      </w:r>
+      <w:r>
+        <w:t>o</w:t>
+      </w:r>
+      <w:r>
+        <w:t xml:space="preserve"> </w:t>
+      </w:r>
+      <w:r>
+        <w:t xml:space="preserve">da família </w:t>
+      </w:r>
+      <w:proofErr w:type="spellStart"/>
+      <w:r>
+        <w:rPr>
+          <w:i/>
+          <w:iCs/>
+        </w:rPr>
+        <w:t>ResNet</w:t>
+      </w:r>
+      <w:proofErr w:type="spellEnd"/>
+      <w:r>
+        <w:t xml:space="preserve">, </w:t>
+      </w:r>
+      <w:r>
+        <w:t>situando-se entre a ResNet-18 (mais simples) e as versões mais profundas como ResNet-50, 101 e 152.</w:t>
+      </w:r>
+      <w:r>
+        <w:t xml:space="preserve"> Tal qual a ResNet-18, a variante 34 também </w:t>
+      </w:r>
+      <w:r>
+        <w:t xml:space="preserve">utiliza o chamado </w:t>
+      </w:r>
+      <w:proofErr w:type="spellStart"/>
+      <w:r>
+        <w:rPr>
+          <w:i/>
+          <w:iCs/>
+        </w:rPr>
+        <w:t>BasicBlock</w:t>
+      </w:r>
+      <w:proofErr w:type="spellEnd"/>
+      <w:r>
+        <w:t xml:space="preserve">, que é composto por dois blocos convolucionais 3×3 consecutivos, cada um seguido por Batch </w:t>
+      </w:r>
+      <w:proofErr w:type="spellStart"/>
+      <w:r>
+        <w:rPr>
+          <w:i/>
+          <w:iCs/>
+        </w:rPr>
+        <w:t>Normalization</w:t>
+      </w:r>
+      <w:proofErr w:type="spellEnd"/>
+      <w:r>
+        <w:t xml:space="preserve"> e </w:t>
+      </w:r>
+      <w:proofErr w:type="spellStart"/>
+      <w:r>
+        <w:rPr>
+          <w:i/>
+          <w:iCs/>
+        </w:rPr>
+        <w:t>ReLU</w:t>
+      </w:r>
+      <w:proofErr w:type="spellEnd"/>
+      <w:r>
+        <w:t>.</w:t>
+      </w:r>
+    </w:p>
+    <w:p>
+      <w:pPr>
+        <w:pStyle w:val="PargrafodaLista"/>
+        <w:ind w:left="2520"/>
+        <w:jc w:val="both"/>
+      </w:pPr>
+    </w:p>
+    <w:p>
+      <w:pPr>
+        <w:pStyle w:val="PargrafodaLista"/>
+        <w:numPr>
+          <w:ilvl w:val="0"/>
+          <w:numId w:val="27"/>
+        </w:numPr>
+        <w:jc w:val="both"/>
+      </w:pPr>
+      <w:r>
+        <w:rPr>
+          <w:b/>
+          <w:bCs/>
+        </w:rPr>
+        <w:t>OBS:</w:t>
+      </w:r>
+      <w:r>
+        <w:t xml:space="preserve"> </w:t>
+      </w:r>
+      <w:r>
+        <w:t xml:space="preserve">Diferentemente das ResNet-50 e superiores, ela não utiliza o bloco </w:t>
+      </w:r>
+      <w:proofErr w:type="spellStart"/>
+      <w:r>
+        <w:rPr>
+          <w:i/>
+          <w:iCs/>
+        </w:rPr>
+        <w:t>bottleneck</w:t>
+      </w:r>
+      <w:proofErr w:type="spellEnd"/>
+      <w:r>
+        <w:t xml:space="preserve"> (1×1 → 3×3 → 1×1). Isso significa que não há expansão interna de canais, e cada bloco mantém a dimensionalidade de forma mais direta.</w:t>
+      </w:r>
+    </w:p>
+    <w:p>
+      <w:pPr>
+        <w:pStyle w:val="PargrafodaLista"/>
+        <w:ind w:left="1440"/>
+        <w:jc w:val="both"/>
+      </w:pPr>
+    </w:p>
+    <w:p>
+      <w:pPr>
+        <w:pStyle w:val="PargrafodaLista"/>
+        <w:ind w:left="1440"/>
+        <w:jc w:val="both"/>
+      </w:pPr>
+      <w:r>
+        <w:t>Em relação à ResNet-18, espera-se que a ResNet-34</w:t>
+      </w:r>
+      <w:r>
+        <w:t xml:space="preserve"> T</w:t>
+      </w:r>
+      <w:r>
+        <w:t>enha maior capacidade representacional</w:t>
+      </w:r>
+      <w:r>
+        <w:t xml:space="preserve"> e seja capaz de modelar padrões mais complexos e refinados, contudo, existe um risco mais elevado de </w:t>
+      </w:r>
+      <w:proofErr w:type="spellStart"/>
+      <w:r>
+        <w:rPr>
+          <w:i/>
+          <w:iCs/>
+        </w:rPr>
+        <w:t>overfitting</w:t>
+      </w:r>
+      <w:proofErr w:type="spellEnd"/>
+      <w:r>
+        <w:t xml:space="preserve"> em </w:t>
+      </w:r>
+      <w:proofErr w:type="spellStart"/>
+      <w:r>
+        <w:rPr>
+          <w:i/>
+          <w:iCs/>
+        </w:rPr>
+        <w:t>datasets</w:t>
+      </w:r>
+      <w:proofErr w:type="spellEnd"/>
+      <w:r>
+        <w:t xml:space="preserve"> pequenos</w:t>
+      </w:r>
+      <w:r>
+        <w:t>.</w:t>
+      </w:r>
+      <w:r>
+        <w:t xml:space="preserve"> Quando comparada à ResNet-50, além da diferença de profundidade, existe também a diferença do tipo de bloco utilizado.</w:t>
+      </w:r>
+      <w:r>
+        <w:t xml:space="preserve"> </w:t>
+      </w:r>
+      <w:r>
+        <w:t>Em bases pequenas ou médias, a ResNet-34 muitas vezes apresenta desempenho semelhante à ResNet-50, pois a capacidade extra da ResNet-50 pode não ser plenamente explorada.</w:t>
+      </w:r>
+    </w:p>
+    <w:p>
+      <w:pPr>
+        <w:pStyle w:val="PargrafodaLista"/>
+        <w:ind w:left="1440"/>
+        <w:jc w:val="both"/>
+      </w:pPr>
+    </w:p>
+    <w:p>
+      <w:pPr>
+        <w:pStyle w:val="PargrafodaLista"/>
+        <w:numPr>
+          <w:ilvl w:val="0"/>
+          <w:numId w:val="27"/>
+        </w:numPr>
+        <w:jc w:val="both"/>
+        <w:rPr>
+          <w:b/>
+          <w:bCs/>
+        </w:rPr>
+      </w:pPr>
+      <w:r>
+        <w:rPr>
+          <w:b/>
+          <w:bCs/>
+        </w:rPr>
+        <w:t>Configurações do Treinamento:</w:t>
+      </w:r>
+    </w:p>
+    <w:p>
+      <w:pPr>
+        <w:spacing w:after="0"/>
+        <w:ind w:left="1440"/>
+        <w:jc w:val="center"/>
+        <w:rPr>
+          <w:sz w:val="18"/>
+          <w:szCs w:val="18"/>
+        </w:rPr>
+      </w:pPr>
+      <w:r>
+        <w:rPr>
+          <w:sz w:val="18"/>
+          <w:szCs w:val="18"/>
+        </w:rPr>
+        <w:t xml:space="preserve">Figura </w:t>
+      </w:r>
+      <w:r>
+        <w:rPr>
+          <w:sz w:val="18"/>
+          <w:szCs w:val="18"/>
+        </w:rPr>
+        <w:t>50</w:t>
+      </w:r>
+      <w:r>
+        <w:rPr>
+          <w:sz w:val="18"/>
+          <w:szCs w:val="18"/>
+        </w:rPr>
+        <w:t>: Parâmetros de treinamento</w:t>
+      </w:r>
+    </w:p>
+    <w:p>
+      <w:pPr>
+        <w:pStyle w:val="PargrafodaLista"/>
+        <w:ind w:left="1440"/>
+        <w:jc w:val="center"/>
+        <w:rPr>
+          <w:b/>
+          <w:bCs/>
+        </w:rPr>
+      </w:pPr>
+      <w:r>
+        <w:rPr>
+          <w:b/>
+          <w:bCs/>
+        </w:rPr>
+        <w:drawing>
+          <wp:inline distT="0" distB="0" distL="0" distR="0" wp14:anchorId="266992BF" wp14:editId="3B2F7BF5">
+            <wp:extent cx="1981477" cy="1971950"/>
+            <wp:effectExtent l="0" t="0" r="0" b="0"/>
+            <wp:docPr id="873227361" name="Imagem 1"/>
+            <wp:cNvGraphicFramePr>
+              <a:graphicFrameLocks xmlns:a="http://schemas.openxmlformats.org/drawingml/2006/main" noChangeAspect="1"/>
+            </wp:cNvGraphicFramePr>
+            <a:graphic xmlns:a="http://schemas.openxmlformats.org/drawingml/2006/main">
+              <a:graphicData uri="http://schemas.openxmlformats.org/drawingml/2006/picture">
+                <pic:pic xmlns:pic="http://schemas.openxmlformats.org/drawingml/2006/picture">
+                  <pic:nvPicPr>
+                    <pic:cNvPr id="873227361" name=""/>
+                    <pic:cNvPicPr/>
+                  </pic:nvPicPr>
+                  <pic:blipFill>
+                    <a:blip r:embed="rId58"/>
+                    <a:stretch>
+                      <a:fillRect/>
+                    </a:stretch>
+                  </pic:blipFill>
+                  <pic:spPr>
+                    <a:xfrm>
+                      <a:off x="0" y="0"/>
+                      <a:ext cx="1981477" cy="1971950"/>
+                    </a:xfrm>
+                    <a:prstGeom prst="rect">
+                      <a:avLst/>
+                    </a:prstGeom>
+                  </pic:spPr>
+                </pic:pic>
+              </a:graphicData>
+            </a:graphic>
+          </wp:inline>
+        </w:drawing>
+      </w:r>
+    </w:p>
+    <w:p>
+      <w:pPr>
+        <w:pStyle w:val="PargrafodaLista"/>
+        <w:ind w:left="1440"/>
+        <w:jc w:val="center"/>
+        <w:rPr>
+          <w:b/>
+          <w:bCs/>
+        </w:rPr>
+      </w:pPr>
+    </w:p>
+    <w:p>
+      <w:pPr>
+        <w:pStyle w:val="PargrafodaLista"/>
+        <w:numPr>
+          <w:ilvl w:val="0"/>
+          <w:numId w:val="27"/>
+        </w:numPr>
+        <w:jc w:val="both"/>
+        <w:rPr>
+          <w:b/>
+          <w:bCs/>
+        </w:rPr>
+      </w:pPr>
+      <w:r>
+        <w:rPr>
+          <w:b/>
+          <w:bCs/>
+        </w:rPr>
+        <w:t xml:space="preserve">Avaliação </w:t>
+      </w:r>
+      <w:r>
+        <w:rPr>
+          <w:b/>
+          <w:bCs/>
+        </w:rPr>
+        <w:t xml:space="preserve">geral </w:t>
+      </w:r>
+      <w:r>
+        <w:rPr>
+          <w:b/>
+          <w:bCs/>
+        </w:rPr>
+        <w:t>do comportamento:</w:t>
+      </w:r>
+    </w:p>
+    <w:p>
+      <w:pPr>
+        <w:pStyle w:val="PargrafodaLista"/>
+        <w:ind w:left="2160"/>
+        <w:jc w:val="both"/>
+      </w:pPr>
+      <w:r>
+        <w:t>No decorrer das</w:t>
+      </w:r>
+      <w:r>
+        <w:t xml:space="preserve"> épocas, observa-se</w:t>
+      </w:r>
+      <w:r>
+        <w:t xml:space="preserve"> um comportamento semelhante aos dois últimos experimentos.</w:t>
+      </w:r>
+      <w:r>
+        <w:t xml:space="preserve"> </w:t>
+      </w:r>
+      <w:r>
+        <w:t>Fica evidente a</w:t>
+      </w:r>
+      <w:r>
+        <w:t xml:space="preserve"> redução consistente da função de perda acompanhada por aumento progressivo da acurácia </w:t>
+      </w:r>
+      <w:r>
+        <w:lastRenderedPageBreak/>
+        <w:t>tanto no conjunto de treinamento quanto no de validação.</w:t>
+      </w:r>
+      <w:r>
+        <w:t xml:space="preserve"> A conclusão geral é que </w:t>
+      </w:r>
+      <w:r>
+        <w:t>a</w:t>
+      </w:r>
+      <w:r>
+        <w:t xml:space="preserve"> convergência estável, a presença de </w:t>
+      </w:r>
+      <w:proofErr w:type="spellStart"/>
+      <w:r>
+        <w:t>plateau</w:t>
+      </w:r>
+      <w:proofErr w:type="spellEnd"/>
+      <w:r>
+        <w:t xml:space="preserve"> bem definido e a ausência de sinais fortes de </w:t>
+      </w:r>
+      <w:proofErr w:type="spellStart"/>
+      <w:r>
+        <w:rPr>
+          <w:i/>
+          <w:iCs/>
+        </w:rPr>
+        <w:t>overfitting</w:t>
+      </w:r>
+      <w:proofErr w:type="spellEnd"/>
+      <w:r>
+        <w:t xml:space="preserve"> reforçam que o treinamento foi conduzido corretamente e que os resultados obtidos são consistentes e confiáveis.</w:t>
+      </w:r>
+    </w:p>
+    <w:p>
+      <w:pPr>
+        <w:spacing w:after="0"/>
+        <w:ind w:left="1440"/>
+        <w:jc w:val="center"/>
+        <w:rPr>
+          <w:sz w:val="18"/>
+          <w:szCs w:val="18"/>
+        </w:rPr>
+      </w:pPr>
+      <w:r>
+        <w:rPr>
+          <w:sz w:val="18"/>
+          <w:szCs w:val="18"/>
+        </w:rPr>
+        <w:t xml:space="preserve">Figura </w:t>
+      </w:r>
+      <w:r>
+        <w:rPr>
+          <w:sz w:val="18"/>
+          <w:szCs w:val="18"/>
+        </w:rPr>
+        <w:t>5</w:t>
+      </w:r>
+      <w:r>
+        <w:rPr>
+          <w:sz w:val="18"/>
+          <w:szCs w:val="18"/>
+        </w:rPr>
+        <w:t>1</w:t>
+      </w:r>
+      <w:r>
+        <w:rPr>
+          <w:sz w:val="18"/>
+          <w:szCs w:val="18"/>
+        </w:rPr>
+        <w:t xml:space="preserve">: </w:t>
+      </w:r>
+      <w:r>
+        <w:rPr>
+          <w:sz w:val="18"/>
+          <w:szCs w:val="18"/>
+        </w:rPr>
+        <w:t>Gráfico de resultados do experimento 9</w:t>
+      </w:r>
+    </w:p>
+    <w:p>
+      <w:pPr>
+        <w:pStyle w:val="PargrafodaLista"/>
+        <w:ind w:left="708"/>
+        <w:jc w:val="both"/>
+      </w:pPr>
+      <w:r>
+        <w:drawing>
+          <wp:inline distT="0" distB="0" distL="0" distR="0" wp14:anchorId="1F170C16" wp14:editId="4DB3CB54">
+            <wp:extent cx="5400040" cy="3258820"/>
+            <wp:effectExtent l="0" t="0" r="0" b="0"/>
+            <wp:docPr id="1690114872" name="Imagem 1"/>
+            <wp:cNvGraphicFramePr>
+              <a:graphicFrameLocks xmlns:a="http://schemas.openxmlformats.org/drawingml/2006/main" noChangeAspect="1"/>
+            </wp:cNvGraphicFramePr>
+            <a:graphic xmlns:a="http://schemas.openxmlformats.org/drawingml/2006/main">
+              <a:graphicData uri="http://schemas.openxmlformats.org/drawingml/2006/picture">
+                <pic:pic xmlns:pic="http://schemas.openxmlformats.org/drawingml/2006/picture">
+                  <pic:nvPicPr>
+                    <pic:cNvPr id="1690114872" name=""/>
+                    <pic:cNvPicPr/>
+                  </pic:nvPicPr>
+                  <pic:blipFill>
+                    <a:blip r:embed="rId59"/>
+                    <a:stretch>
+                      <a:fillRect/>
+                    </a:stretch>
+                  </pic:blipFill>
+                  <pic:spPr>
+                    <a:xfrm>
+                      <a:off x="0" y="0"/>
+                      <a:ext cx="5400040" cy="3258820"/>
+                    </a:xfrm>
+                    <a:prstGeom prst="rect">
+                      <a:avLst/>
+                    </a:prstGeom>
+                  </pic:spPr>
+                </pic:pic>
+              </a:graphicData>
+            </a:graphic>
+          </wp:inline>
+        </w:drawing>
+      </w:r>
+    </w:p>
+    <w:p>
+      <w:pPr>
+        <w:pStyle w:val="PargrafodaLista"/>
+        <w:ind w:left="2160"/>
+        <w:jc w:val="both"/>
+      </w:pPr>
+    </w:p>
+    <w:p>
+      <w:pPr>
+        <w:pStyle w:val="PargrafodaLista"/>
+        <w:numPr>
+          <w:ilvl w:val="0"/>
+          <w:numId w:val="27"/>
+        </w:numPr>
+        <w:jc w:val="both"/>
+        <w:rPr>
+          <w:b/>
+          <w:bCs/>
+        </w:rPr>
+      </w:pPr>
+      <w:r>
+        <w:rPr>
+          <w:b/>
+          <w:bCs/>
+        </w:rPr>
+        <w:t>Comparação com as demais variantes:</w:t>
+      </w:r>
+    </w:p>
+    <w:p>
+      <w:pPr>
+        <w:ind w:left="2160"/>
+        <w:jc w:val="both"/>
+      </w:pPr>
+      <w:r>
+        <w:t xml:space="preserve">Os resultados entre as variantes 18 (Experimento 7) e 34 são bem similares, porém fica evidente o aumento da função de perda na variante 34 durante as últimas épocas. </w:t>
+      </w:r>
+    </w:p>
+    <w:p>
+      <w:pPr>
+        <w:pStyle w:val="PargrafodaLista"/>
+        <w:numPr>
+          <w:ilvl w:val="1"/>
+          <w:numId w:val="27"/>
+        </w:numPr>
+        <w:jc w:val="both"/>
+        <w:rPr>
+          <w:color w:val="EE0000"/>
+        </w:rPr>
+      </w:pPr>
+      <w:r>
+        <w:rPr>
+          <w:color w:val="EE0000"/>
+        </w:rPr>
+        <w:t>Pesquisar o porque e conduzir um treino com a variante 18, seguindo os mesmos parâmetros utilizados aqui no experimento 9</w:t>
+      </w:r>
+      <w:r>
+        <w:rPr>
+          <w:color w:val="EE0000"/>
+        </w:rPr>
+        <w:t xml:space="preserve">. Buscar responder se essa diferença na função perda vem da mudança do </w:t>
+      </w:r>
+      <w:proofErr w:type="spellStart"/>
+      <w:r>
+        <w:rPr>
+          <w:i/>
+          <w:iCs/>
+          <w:color w:val="EE0000"/>
+        </w:rPr>
+        <w:t>Batch_Size</w:t>
+      </w:r>
+      <w:proofErr w:type="spellEnd"/>
+      <w:r>
+        <w:rPr>
+          <w:i/>
+          <w:iCs/>
+          <w:color w:val="EE0000"/>
+        </w:rPr>
+        <w:t xml:space="preserve"> </w:t>
+      </w:r>
+      <w:r>
+        <w:rPr>
+          <w:color w:val="EE0000"/>
+        </w:rPr>
+        <w:t>ou da própria arquitetura e, se esse for o caso, explicar o porquê</w:t>
+      </w:r>
+    </w:p>
+    <w:p>
+      <w:pPr>
+        <w:pStyle w:val="PargrafodaLista"/>
+        <w:ind w:left="3240"/>
+        <w:jc w:val="both"/>
+      </w:pPr>
+    </w:p>
+    <w:p>
+      <w:pPr>
+        <w:pStyle w:val="PargrafodaLista"/>
+        <w:numPr>
+          <w:ilvl w:val="0"/>
+          <w:numId w:val="27"/>
+        </w:numPr>
+        <w:jc w:val="both"/>
+      </w:pPr>
+      <w:r>
+        <w:t>OBS – Disposição das colunas referentes às imagens 51,52,53</w:t>
+      </w:r>
+      <w:r>
+        <w:t xml:space="preserve"> (Da esquerda para a direita)</w:t>
+      </w:r>
+      <w:r>
+        <w:t>:</w:t>
+      </w:r>
+    </w:p>
+    <w:p>
+      <w:pPr>
+        <w:pStyle w:val="PargrafodaLista"/>
+        <w:numPr>
+          <w:ilvl w:val="1"/>
+          <w:numId w:val="27"/>
+        </w:numPr>
+        <w:jc w:val="both"/>
+      </w:pPr>
+      <w:r>
+        <w:t>EPOCH</w:t>
+      </w:r>
+    </w:p>
+    <w:p>
+      <w:pPr>
+        <w:pStyle w:val="PargrafodaLista"/>
+        <w:numPr>
+          <w:ilvl w:val="1"/>
+          <w:numId w:val="27"/>
+        </w:numPr>
+        <w:jc w:val="both"/>
+      </w:pPr>
+      <w:r>
+        <w:t>TRAIN ACC</w:t>
+      </w:r>
+    </w:p>
+    <w:p>
+      <w:pPr>
+        <w:pStyle w:val="PargrafodaLista"/>
+        <w:numPr>
+          <w:ilvl w:val="1"/>
+          <w:numId w:val="27"/>
+        </w:numPr>
+        <w:jc w:val="both"/>
+      </w:pPr>
+      <w:r>
+        <w:t>TRAIN LOSS</w:t>
+      </w:r>
+    </w:p>
+    <w:p>
+      <w:pPr>
+        <w:pStyle w:val="PargrafodaLista"/>
+        <w:numPr>
+          <w:ilvl w:val="1"/>
+          <w:numId w:val="27"/>
+        </w:numPr>
+        <w:jc w:val="both"/>
+      </w:pPr>
+      <w:r>
+        <w:t>LR</w:t>
+      </w:r>
+    </w:p>
+    <w:p>
+      <w:pPr>
+        <w:pStyle w:val="PargrafodaLista"/>
+        <w:numPr>
+          <w:ilvl w:val="1"/>
+          <w:numId w:val="27"/>
+        </w:numPr>
+        <w:jc w:val="both"/>
+      </w:pPr>
+      <w:r>
+        <w:t>VAL ACC</w:t>
+      </w:r>
+    </w:p>
+    <w:p>
+      <w:pPr>
+        <w:pStyle w:val="PargrafodaLista"/>
+        <w:numPr>
+          <w:ilvl w:val="1"/>
+          <w:numId w:val="27"/>
+        </w:numPr>
+        <w:jc w:val="both"/>
+      </w:pPr>
+      <w:r>
+        <w:t>VAL LOSS</w:t>
+      </w:r>
+    </w:p>
+    <w:p>
+      <w:pPr>
+        <w:pStyle w:val="PargrafodaLista"/>
+        <w:ind w:left="3240"/>
+        <w:jc w:val="both"/>
+      </w:pPr>
+    </w:p>
+    <w:p>
+      <w:pPr>
+        <w:jc w:val="both"/>
+        <w:rPr>
+          <w:color w:val="EE0000"/>
+        </w:rPr>
+      </w:pPr>
+    </w:p>
+    <w:p>
+      <w:pPr>
+        <w:jc w:val="both"/>
+        <w:rPr>
+          <w:color w:val="EE0000"/>
+        </w:rPr>
+      </w:pPr>
+    </w:p>
+    <w:p>
+      <w:pPr>
+        <w:spacing w:after="0"/>
+        <w:ind w:left="1440"/>
+        <w:jc w:val="center"/>
+        <w:rPr>
+          <w:sz w:val="18"/>
+          <w:szCs w:val="18"/>
+        </w:rPr>
+      </w:pPr>
+      <w:r>
+        <w:rPr>
+          <w:sz w:val="18"/>
+          <w:szCs w:val="18"/>
+        </w:rPr>
+        <w:t xml:space="preserve">Figura </w:t>
+      </w:r>
+      <w:r>
+        <w:rPr>
+          <w:sz w:val="18"/>
+          <w:szCs w:val="18"/>
+        </w:rPr>
+        <w:t>5</w:t>
+      </w:r>
+      <w:r>
+        <w:rPr>
+          <w:sz w:val="18"/>
+          <w:szCs w:val="18"/>
+        </w:rPr>
+        <w:t>1</w:t>
+      </w:r>
+      <w:r>
+        <w:rPr>
+          <w:sz w:val="18"/>
+          <w:szCs w:val="18"/>
+        </w:rPr>
+        <w:t xml:space="preserve">: </w:t>
+      </w:r>
+      <w:r>
+        <w:rPr>
+          <w:sz w:val="18"/>
+          <w:szCs w:val="18"/>
+        </w:rPr>
+        <w:t xml:space="preserve">Ultimas épocas do treino do experimento 9 </w:t>
+      </w:r>
+      <w:r>
+        <w:rPr>
+          <w:sz w:val="18"/>
+          <w:szCs w:val="18"/>
+        </w:rPr>
+        <w:t xml:space="preserve">– </w:t>
+      </w:r>
+      <w:proofErr w:type="spellStart"/>
+      <w:r>
+        <w:rPr>
+          <w:sz w:val="18"/>
+          <w:szCs w:val="18"/>
+        </w:rPr>
+        <w:t>ResNet</w:t>
+      </w:r>
+      <w:proofErr w:type="spellEnd"/>
+      <w:r>
+        <w:rPr>
+          <w:sz w:val="18"/>
+          <w:szCs w:val="18"/>
+        </w:rPr>
+        <w:t xml:space="preserve"> </w:t>
+      </w:r>
+      <w:r>
+        <w:rPr>
+          <w:sz w:val="18"/>
+          <w:szCs w:val="18"/>
+        </w:rPr>
+        <w:t>34</w:t>
+      </w:r>
+    </w:p>
+    <w:p>
+      <w:pPr>
+        <w:pStyle w:val="PargrafodaLista"/>
+        <w:ind w:left="2520"/>
+        <w:jc w:val="both"/>
+      </w:pPr>
+      <w:r>
+        <w:drawing>
+          <wp:inline distT="0" distB="0" distL="0" distR="0" wp14:anchorId="5FDDA1B1" wp14:editId="14DF22B5">
+            <wp:extent cx="4163066" cy="3037398"/>
+            <wp:effectExtent l="0" t="0" r="8890" b="0"/>
+            <wp:docPr id="1913002756" name="Imagem 1"/>
+            <wp:cNvGraphicFramePr>
+              <a:graphicFrameLocks xmlns:a="http://schemas.openxmlformats.org/drawingml/2006/main" noChangeAspect="1"/>
+            </wp:cNvGraphicFramePr>
+            <a:graphic xmlns:a="http://schemas.openxmlformats.org/drawingml/2006/main">
+              <a:graphicData uri="http://schemas.openxmlformats.org/drawingml/2006/picture">
+                <pic:pic xmlns:pic="http://schemas.openxmlformats.org/drawingml/2006/picture">
+                  <pic:nvPicPr>
+                    <pic:cNvPr id="1913002756" name=""/>
+                    <pic:cNvPicPr/>
+                  </pic:nvPicPr>
+                  <pic:blipFill rotWithShape="1">
+                    <a:blip r:embed="rId60"/>
+                    <a:srcRect l="3160" r="3844"/>
+                    <a:stretch>
+                      <a:fillRect/>
+                    </a:stretch>
+                  </pic:blipFill>
+                  <pic:spPr bwMode="auto">
+                    <a:xfrm>
+                      <a:off x="0" y="0"/>
+                      <a:ext cx="4197762" cy="3062713"/>
+                    </a:xfrm>
+                    <a:prstGeom prst="rect">
+                      <a:avLst/>
+                    </a:prstGeom>
+                    <a:ln>
+                      <a:noFill/>
+                    </a:ln>
+                    <a:extLst>
+                      <a:ext uri="{53640926-AAD7-44D8-BBD7-CCE9431645EC}">
+                        <a14:shadowObscured xmlns:a14="http://schemas.microsoft.com/office/drawing/2010/main"/>
+                      </a:ext>
+                    </a:extLst>
+                  </pic:spPr>
+                </pic:pic>
+              </a:graphicData>
+            </a:graphic>
+          </wp:inline>
+        </w:drawing>
+      </w:r>
+    </w:p>
+    <w:p>
+      <w:pPr>
+        <w:spacing w:after="0"/>
+        <w:ind w:left="1440"/>
+        <w:jc w:val="center"/>
+        <w:rPr>
+          <w:sz w:val="18"/>
+          <w:szCs w:val="18"/>
+        </w:rPr>
+      </w:pPr>
+      <w:r>
+        <w:rPr>
+          <w:sz w:val="18"/>
+          <w:szCs w:val="18"/>
+        </w:rPr>
+        <w:t xml:space="preserve">Figura </w:t>
+      </w:r>
+      <w:r>
+        <w:rPr>
+          <w:sz w:val="18"/>
+          <w:szCs w:val="18"/>
+        </w:rPr>
+        <w:t>5</w:t>
+      </w:r>
+      <w:r>
+        <w:rPr>
+          <w:sz w:val="18"/>
+          <w:szCs w:val="18"/>
+        </w:rPr>
+        <w:t>2</w:t>
+      </w:r>
+      <w:r>
+        <w:rPr>
+          <w:sz w:val="18"/>
+          <w:szCs w:val="18"/>
+        </w:rPr>
+        <w:t xml:space="preserve">: </w:t>
+      </w:r>
+      <w:r>
+        <w:rPr>
+          <w:sz w:val="18"/>
+          <w:szCs w:val="18"/>
+        </w:rPr>
+        <w:t xml:space="preserve">Ultimas épocas do treino do experimento </w:t>
+      </w:r>
+      <w:r>
+        <w:rPr>
+          <w:sz w:val="18"/>
+          <w:szCs w:val="18"/>
+        </w:rPr>
+        <w:t xml:space="preserve">7 </w:t>
+      </w:r>
+      <w:r>
+        <w:rPr>
+          <w:sz w:val="18"/>
+          <w:szCs w:val="18"/>
+        </w:rPr>
+        <w:t xml:space="preserve">– </w:t>
+      </w:r>
+      <w:proofErr w:type="spellStart"/>
+      <w:r>
+        <w:rPr>
+          <w:sz w:val="18"/>
+          <w:szCs w:val="18"/>
+        </w:rPr>
+        <w:t>ResNet</w:t>
+      </w:r>
+      <w:proofErr w:type="spellEnd"/>
+      <w:r>
+        <w:rPr>
+          <w:sz w:val="18"/>
+          <w:szCs w:val="18"/>
+        </w:rPr>
+        <w:t xml:space="preserve"> </w:t>
+      </w:r>
+      <w:r>
+        <w:rPr>
+          <w:sz w:val="18"/>
+          <w:szCs w:val="18"/>
+        </w:rPr>
+        <w:t>18</w:t>
+      </w:r>
+    </w:p>
+    <w:p>
+      <w:pPr>
+        <w:pStyle w:val="PargrafodaLista"/>
+        <w:ind w:left="2520"/>
+        <w:jc w:val="both"/>
+      </w:pPr>
+      <w:r>
+        <w:drawing>
+          <wp:inline distT="0" distB="0" distL="0" distR="0" wp14:anchorId="0BC632A3" wp14:editId="138C39C2">
+            <wp:extent cx="4187000" cy="3085106"/>
+            <wp:effectExtent l="0" t="0" r="4445" b="1270"/>
+            <wp:docPr id="1789090918" name="Imagem 1"/>
+            <wp:cNvGraphicFramePr>
+              <a:graphicFrameLocks xmlns:a="http://schemas.openxmlformats.org/drawingml/2006/main" noChangeAspect="1"/>
+            </wp:cNvGraphicFramePr>
+            <a:graphic xmlns:a="http://schemas.openxmlformats.org/drawingml/2006/main">
+              <a:graphicData uri="http://schemas.openxmlformats.org/drawingml/2006/picture">
+                <pic:pic xmlns:pic="http://schemas.openxmlformats.org/drawingml/2006/picture">
+                  <pic:nvPicPr>
+                    <pic:cNvPr id="1789090918" name=""/>
+                    <pic:cNvPicPr/>
+                  </pic:nvPicPr>
+                  <pic:blipFill>
+                    <a:blip r:embed="rId61"/>
+                    <a:stretch>
+                      <a:fillRect/>
+                    </a:stretch>
+                  </pic:blipFill>
+                  <pic:spPr>
+                    <a:xfrm>
+                      <a:off x="0" y="0"/>
+                      <a:ext cx="4217617" cy="3107666"/>
+                    </a:xfrm>
+                    <a:prstGeom prst="rect">
+                      <a:avLst/>
+                    </a:prstGeom>
+                  </pic:spPr>
+                </pic:pic>
+              </a:graphicData>
+            </a:graphic>
+          </wp:inline>
+        </w:drawing>
+      </w:r>
+    </w:p>
+    <w:p>
+      <w:pPr>
+        <w:ind w:left="2124"/>
+        <w:jc w:val="both"/>
+      </w:pPr>
+      <w:r>
+        <w:t xml:space="preserve">Quando comparado com a </w:t>
+      </w:r>
+      <w:proofErr w:type="spellStart"/>
+      <w:r>
+        <w:t>ResNet</w:t>
+      </w:r>
+      <w:proofErr w:type="spellEnd"/>
+      <w:r>
+        <w:t xml:space="preserve"> 50, a variante 34 ainda apresenta forte vantagem, destacando ainda mais a incompatibilidade da variante 50 com o tamanho e complexidade da base atual. </w:t>
+      </w:r>
+    </w:p>
+    <w:p>
+      <w:pPr>
+        <w:ind w:left="2124"/>
+        <w:jc w:val="both"/>
+      </w:pPr>
+    </w:p>
+    <w:p>
+      <w:pPr>
+        <w:ind w:left="2124"/>
+        <w:jc w:val="both"/>
+      </w:pPr>
+    </w:p>
+    <w:p>
+      <w:pPr>
+        <w:jc w:val="both"/>
+      </w:pPr>
+    </w:p>
+    <w:p>
+      <w:pPr>
+        <w:jc w:val="both"/>
+      </w:pPr>
+    </w:p>
+    <w:p>
+      <w:pPr>
+        <w:jc w:val="both"/>
+      </w:pPr>
+    </w:p>
+    <w:p>
+      <w:pPr>
+        <w:spacing w:after="0"/>
+        <w:ind w:left="1440"/>
+        <w:jc w:val="center"/>
+        <w:rPr>
+          <w:sz w:val="18"/>
+          <w:szCs w:val="18"/>
+        </w:rPr>
+      </w:pPr>
+      <w:r>
+        <w:rPr>
+          <w:sz w:val="18"/>
+          <w:szCs w:val="18"/>
+        </w:rPr>
+        <w:t xml:space="preserve">Figura </w:t>
+      </w:r>
+      <w:r>
+        <w:rPr>
+          <w:sz w:val="18"/>
+          <w:szCs w:val="18"/>
+        </w:rPr>
+        <w:t>5</w:t>
+      </w:r>
+      <w:r>
+        <w:rPr>
+          <w:sz w:val="18"/>
+          <w:szCs w:val="18"/>
+        </w:rPr>
+        <w:t>3</w:t>
+      </w:r>
+      <w:r>
+        <w:rPr>
+          <w:sz w:val="18"/>
+          <w:szCs w:val="18"/>
+        </w:rPr>
+        <w:t xml:space="preserve">: </w:t>
+      </w:r>
+      <w:r>
+        <w:rPr>
+          <w:sz w:val="18"/>
+          <w:szCs w:val="18"/>
+        </w:rPr>
+        <w:t xml:space="preserve">Ultimas épocas do treino do experimento </w:t>
+      </w:r>
+      <w:r>
+        <w:rPr>
+          <w:sz w:val="18"/>
+          <w:szCs w:val="18"/>
+        </w:rPr>
+        <w:t xml:space="preserve">5 – </w:t>
+      </w:r>
+      <w:proofErr w:type="spellStart"/>
+      <w:r>
+        <w:rPr>
+          <w:sz w:val="18"/>
+          <w:szCs w:val="18"/>
+        </w:rPr>
+        <w:t>ResNet</w:t>
+      </w:r>
+      <w:proofErr w:type="spellEnd"/>
+      <w:r>
+        <w:rPr>
+          <w:sz w:val="18"/>
+          <w:szCs w:val="18"/>
+        </w:rPr>
+        <w:t xml:space="preserve"> 50</w:t>
+      </w:r>
+    </w:p>
+    <w:p>
+      <w:pPr>
+        <w:pStyle w:val="PargrafodaLista"/>
+        <w:ind w:left="2160"/>
+        <w:jc w:val="both"/>
+      </w:pPr>
+      <w:r>
+        <w:drawing>
+          <wp:inline distT="0" distB="0" distL="0" distR="0" wp14:anchorId="5CC735F0" wp14:editId="294A6445">
+            <wp:extent cx="4438886" cy="3172571"/>
+            <wp:effectExtent l="0" t="0" r="0" b="8890"/>
+            <wp:docPr id="618462217" name="Imagem 1"/>
+            <wp:cNvGraphicFramePr>
+              <a:graphicFrameLocks xmlns:a="http://schemas.openxmlformats.org/drawingml/2006/main" noChangeAspect="1"/>
+            </wp:cNvGraphicFramePr>
+            <a:graphic xmlns:a="http://schemas.openxmlformats.org/drawingml/2006/main">
+              <a:graphicData uri="http://schemas.openxmlformats.org/drawingml/2006/picture">
+                <pic:pic xmlns:pic="http://schemas.openxmlformats.org/drawingml/2006/picture">
+                  <pic:nvPicPr>
+                    <pic:cNvPr id="618462217" name=""/>
+                    <pic:cNvPicPr/>
+                  </pic:nvPicPr>
+                  <pic:blipFill>
+                    <a:blip r:embed="rId62"/>
+                    <a:stretch>
+                      <a:fillRect/>
+                    </a:stretch>
+                  </pic:blipFill>
+                  <pic:spPr>
+                    <a:xfrm>
+                      <a:off x="0" y="0"/>
+                      <a:ext cx="4451896" cy="3181869"/>
+                    </a:xfrm>
+                    <a:prstGeom prst="rect">
+                      <a:avLst/>
+                    </a:prstGeom>
+                  </pic:spPr>
+                </pic:pic>
+              </a:graphicData>
+            </a:graphic>
+          </wp:inline>
+        </w:drawing>
+      </w:r>
+    </w:p>
+    <w:p>
+      <w:pPr>
+        <w:pStyle w:val="PargrafodaLista"/>
+        <w:ind w:left="2160"/>
+        <w:jc w:val="both"/>
+        <w:rPr>
+          <w:b/>
+          <w:bCs/>
+        </w:rPr>
+      </w:pPr>
+    </w:p>
+    <w:p>
+      <w:pPr>
+        <w:pStyle w:val="PargrafodaLista"/>
+        <w:ind w:left="2160"/>
+        <w:jc w:val="both"/>
+        <w:rPr>
+          <w:b/>
+          <w:bCs/>
+        </w:rPr>
+      </w:pPr>
+    </w:p>
+    <w:p>
+      <w:pPr>
+        <w:pStyle w:val="PargrafodaLista"/>
+        <w:numPr>
+          <w:ilvl w:val="1"/>
+          <w:numId w:val="1"/>
+        </w:numPr>
+        <w:jc w:val="both"/>
+        <w:rPr>
+          <w:b/>
+          <w:bCs/>
+        </w:rPr>
+      </w:pPr>
+      <w:r>
+        <w:rPr>
+          <w:b/>
+          <w:bCs/>
+        </w:rPr>
+        <w:t xml:space="preserve">EXPERIMENTO </w:t>
+      </w:r>
+      <w:r>
+        <w:rPr>
+          <w:b/>
+          <w:bCs/>
+        </w:rPr>
+        <w:t>9</w:t>
+      </w:r>
+      <w:r>
+        <w:rPr>
+          <w:b/>
+          <w:bCs/>
+        </w:rPr>
+        <w:t xml:space="preserve"> (RESNET) – </w:t>
+      </w:r>
+      <w:r>
+        <w:rPr>
+          <w:b/>
+          <w:bCs/>
+        </w:rPr>
+        <w:t>VERIFICAR INFLUENCIA DO BATCH_SIZE NA VARIANTE RESNET-18:</w:t>
+      </w:r>
+    </w:p>
+    <w:p>
+      <w:pPr>
+        <w:pStyle w:val="PargrafodaLista"/>
+        <w:ind w:left="1440"/>
+        <w:jc w:val="both"/>
+        <w:rPr>
+          <w:b/>
+          <w:bCs/>
+        </w:rPr>
+      </w:pPr>
+    </w:p>
+    <w:p>
+      <w:pPr>
+        <w:pStyle w:val="PargrafodaLista"/>
+        <w:ind w:left="1440"/>
+        <w:jc w:val="both"/>
         <w:rPr>
           <w:b/>
           <w:bCs/>
@@ -18643,7 +19902,7 @@
         <v:path o:extrusionok="f" gradientshapeok="t" o:connecttype="rect"/>
         <o:lock v:ext="edit" aspectratio="t"/>
       </v:shapetype>
-      <v:shape id="_x0000_i1056" type="#_x0000_t75" style="width:693.1pt;height:487.7pt;visibility:visible;mso-wrap-style:square" o:bullet="t">
+      <v:shape id="_x0000_i1070" type="#_x0000_t75" style="width:693.1pt;height:487.7pt;visibility:visible;mso-wrap-style:square" o:bullet="t">
         <v:imagedata r:id="rId1" o:title="" croptop="19686f" cropbottom="43833f" cropleft="8606f" cropright="55951f"/>
       </v:shape>
     </w:pict>
@@ -20233,7 +21492,7 @@
   <w:abstractNum w:abstractNumId="14" w15:restartNumberingAfterBreak="0">
     <w:nsid w:val="3A44790F"/>
     <w:multiLevelType w:val="hybridMultilevel"/>
-    <w:tmpl w:val="A87C14B2"/>
+    <w:tmpl w:val="377CF7FA"/>
     <w:lvl w:ilvl="0" w:tplc="04160001">
       <w:start w:val="1"/>
       <w:numFmt w:val="bullet"/>

</xml_diff>

<commit_message>
Atualização da documentação do EXP10(ResNet)
</commit_message>
<xml_diff>
--- a/Documentation/Documentacao Unificada de Experimentos.docx
+++ b/Documentation/Documentacao Unificada de Experimentos.docx
@@ -541,12 +541,10 @@
         <w:t xml:space="preserve"> devem ser iguais ao tamanho dos patches (implementado como um </w:t>
       </w:r>
       <w:proofErr w:type="spellStart"/>
-      <w:proofErr w:type="gramStart"/>
       <w:r>
         <w:t>nn.Conv</w:t>
       </w:r>
       <w:proofErr w:type="spellEnd"/>
-      <w:proofErr w:type="gramEnd"/>
       <w:r>
         <w:t xml:space="preserve"> com </w:t>
       </w:r>
@@ -559,12 +557,10 @@
         <w:t xml:space="preserve"> = </w:t>
       </w:r>
       <w:proofErr w:type="spellStart"/>
-      <w:proofErr w:type="gramStart"/>
       <w:r>
         <w:t>patches.size</w:t>
       </w:r>
       <w:proofErr w:type="spellEnd"/>
-      <w:proofErr w:type="gramEnd"/>
       <w:r>
         <w:t xml:space="preserve"> e </w:t>
       </w:r>
@@ -577,12 +573,10 @@
         <w:t xml:space="preserve"> = </w:t>
       </w:r>
       <w:proofErr w:type="spellStart"/>
-      <w:proofErr w:type="gramStart"/>
       <w:r>
         <w:t>patches.size</w:t>
       </w:r>
       <w:proofErr w:type="spellEnd"/>
-      <w:proofErr w:type="gramEnd"/>
       <w:r>
         <w:t xml:space="preserve"> em código);</w:t>
       </w:r>
@@ -1005,15 +999,7 @@
         </w:numPr>
       </w:pPr>
       <w:r>
-        <w:t>Base learning rate: 10</w:t>
-      </w:r>
-      <w:proofErr w:type="gramStart"/>
-      <w:r>
-        <w:t>^(</w:t>
-      </w:r>
-      <w:proofErr w:type="gramEnd"/>
-      <w:r>
-        <w:t>-3).</w:t>
+        <w:t>Base learning rate: 10^(-3).</w:t>
       </w:r>
     </w:p>
     <w:p>
@@ -1673,7 +1659,6 @@
         <w:t xml:space="preserve">O objetivo deste experimento foi tentar replicar os resultados obtidos pelo artigo utilizado como </w:t>
       </w:r>
       <w:proofErr w:type="spellStart"/>
-      <w:proofErr w:type="gramStart"/>
       <w:r>
         <w:t>base</w:t>
       </w:r>
@@ -1684,7 +1669,6 @@
         <w:t>Para</w:t>
       </w:r>
       <w:proofErr w:type="spellEnd"/>
-      <w:proofErr w:type="gramEnd"/>
       <w:r>
         <w:t xml:space="preserve"> isso, a construção do experimento busca seguir fielmente o que foi originalmente descrito pelos autores.</w:t>
       </w:r>
@@ -5562,15 +5546,7 @@
       </w:r>
       <w:proofErr w:type="spellEnd"/>
       <w:r>
-        <w:t xml:space="preserve"> apresenta valor aproximado de 6.99, estabilizando em torno de 6.87 nas épocas seguintes. Para um problema de classificação com 1000 classes, a perda teórica associada a uma predição aleatória é dada por </w:t>
-      </w:r>
-      <w:proofErr w:type="gramStart"/>
-      <w:r>
-        <w:t>log(</w:t>
-      </w:r>
-      <w:proofErr w:type="gramEnd"/>
-      <w:r>
-        <w:t>1000) ≈ 6.907. Portanto, os valores observados estão extremamente próximos do comportamento esperado para um modelo inicialmente não treinado, com uma leve redução ao longo das épocas.</w:t>
+        <w:t xml:space="preserve"> apresenta valor aproximado de 6.99, estabilizando em torno de 6.87 nas épocas seguintes. Para um problema de classificação com 1000 classes, a perda teórica associada a uma predição aleatória é dada por log(1000) ≈ 6.907. Portanto, os valores observados estão extremamente próximos do comportamento esperado para um modelo inicialmente não treinado, com uma leve redução ao longo das épocas.</w:t>
       </w:r>
     </w:p>
     <w:p>
@@ -9925,18 +9901,9 @@
           <w:i/>
           <w:iCs/>
         </w:rPr>
-        <w:t>tf.</w:t>
-      </w:r>
-      <w:proofErr w:type="gramStart"/>
-      <w:r>
-        <w:rPr>
-          <w:i/>
-          <w:iCs/>
-        </w:rPr>
-        <w:t>data.Dataset</w:t>
-      </w:r>
-      <w:proofErr w:type="spellEnd"/>
-      <w:proofErr w:type="gramEnd"/>
+        <w:t>tf.data.Dataset</w:t>
+      </w:r>
+      <w:proofErr w:type="spellEnd"/>
       <w:r>
         <w:t xml:space="preserve"> válidos</w:t>
       </w:r>
@@ -11365,30 +11332,14 @@
           <w:i/>
           <w:iCs/>
         </w:rPr>
-        <w:t xml:space="preserve"> </w:t>
-      </w:r>
-      <w:proofErr w:type="gramStart"/>
-      <w:r>
-        <w:rPr>
-          <w:i/>
-          <w:iCs/>
-        </w:rPr>
-        <w:t>1</w:t>
-      </w:r>
-      <w:r>
-        <w:rPr>
-          <w:i/>
-          <w:iCs/>
-        </w:rPr>
-        <w:t>)\</w:t>
-      </w:r>
-      <w:proofErr w:type="gramEnd"/>
-      <w:r>
-        <w:rPr>
-          <w:i/>
-          <w:iCs/>
-        </w:rPr>
-        <w:t>Experimento 4 -</w:t>
+        <w:t xml:space="preserve"> 1</w:t>
+      </w:r>
+      <w:r>
+        <w:rPr>
+          <w:i/>
+          <w:iCs/>
+        </w:rPr>
+        <w:t>)\Experimento 4 -</w:t>
       </w:r>
       <w:proofErr w:type="spellStart"/>
       <w:r>
@@ -18584,49 +18535,7 @@
           <w:b/>
           <w:bCs/>
         </w:rPr>
-        <w:t xml:space="preserve">TREINO COM </w:t>
-      </w:r>
-      <w:r>
-        <w:rPr>
-          <w:b/>
-          <w:bCs/>
-        </w:rPr>
-        <w:t>5</w:t>
-      </w:r>
-      <w:r>
-        <w:rPr>
-          <w:b/>
-          <w:bCs/>
-        </w:rPr>
-        <w:t>00 ÉPOCAS E MAIOR BATCH SIZE</w:t>
-      </w:r>
-      <w:r>
-        <w:rPr>
-          <w:b/>
-          <w:bCs/>
-        </w:rPr>
-        <w:t>, UTILIZANDO A</w:t>
-      </w:r>
-      <w:r>
-        <w:rPr>
-          <w:b/>
-          <w:bCs/>
-        </w:rPr>
-        <w:t xml:space="preserve"> RESNET</w:t>
-      </w:r>
-      <w:r>
-        <w:rPr>
-          <w:b/>
-          <w:bCs/>
-        </w:rPr>
-        <w:t>-34</w:t>
-      </w:r>
-      <w:r>
-        <w:rPr>
-          <w:b/>
-          <w:bCs/>
-        </w:rPr>
-        <w:t>:</w:t>
+        <w:t>TREINO COM 500 ÉPOCAS E MAIOR BATCH SIZE, UTILIZANDO A RESNET-34:</w:t>
       </w:r>
     </w:p>
     <w:p>
@@ -18815,10 +18724,7 @@
         <w:t xml:space="preserve"> Quando comparada à ResNet-50, além da diferença de profundidade, existe também a diferença do tipo de bloco utilizado.</w:t>
       </w:r>
       <w:r>
-        <w:t xml:space="preserve"> </w:t>
-      </w:r>
-      <w:r>
-        <w:t>Em bases pequenas ou médias, a ResNet-34 muitas vezes apresenta desempenho semelhante à ResNet-50, pois a capacidade extra da ResNet-50 pode não ser plenamente explorada.</w:t>
+        <w:t xml:space="preserve"> Em bases pequenas ou médias, a ResNet-34 muitas vezes apresenta desempenho semelhante à ResNet-50, pois a capacidade extra da ResNet-50 pode não ser plenamente explorada.</w:t>
       </w:r>
     </w:p>
     <w:p>
@@ -18895,6 +18801,7 @@
         <w:rPr>
           <w:b/>
           <w:bCs/>
+          <w:noProof/>
         </w:rPr>
         <w:drawing>
           <wp:inline distT="0" distB="0" distL="0" distR="0" wp14:anchorId="266992BF" wp14:editId="3B2F7BF5">
@@ -18962,21 +18869,7 @@
           <w:b/>
           <w:bCs/>
         </w:rPr>
-        <w:t xml:space="preserve">Avaliação </w:t>
-      </w:r>
-      <w:r>
-        <w:rPr>
-          <w:b/>
-          <w:bCs/>
-        </w:rPr>
-        <w:t xml:space="preserve">geral </w:t>
-      </w:r>
-      <w:r>
-        <w:rPr>
-          <w:b/>
-          <w:bCs/>
-        </w:rPr>
-        <w:t>do comportamento:</w:t>
+        <w:t>Avaliação geral do comportamento:</w:t>
       </w:r>
     </w:p>
     <w:p>
@@ -19059,14 +18952,7 @@
           <w:sz w:val="18"/>
           <w:szCs w:val="18"/>
         </w:rPr>
-        <w:t>5</w:t>
-      </w:r>
-      <w:r>
-        <w:rPr>
-          <w:sz w:val="18"/>
-          <w:szCs w:val="18"/>
-        </w:rPr>
-        <w:t>1</w:t>
+        <w:t>51</w:t>
       </w:r>
       <w:r>
         <w:rPr>
@@ -19090,6 +18976,9 @@
         <w:jc w:val="both"/>
       </w:pPr>
       <w:r>
+        <w:rPr>
+          <w:noProof/>
+        </w:rPr>
         <w:drawing>
           <wp:inline distT="0" distB="0" distL="0" distR="0" wp14:anchorId="1F170C16" wp14:editId="4DB3CB54">
             <wp:extent cx="5400040" cy="3258820"/>
@@ -19172,28 +19061,15 @@
           <w:numId w:val="27"/>
         </w:numPr>
         <w:jc w:val="both"/>
-        <w:rPr>
-          <w:color w:val="EE0000"/>
-        </w:rPr>
-      </w:pPr>
-      <w:r>
-        <w:rPr>
-          <w:color w:val="EE0000"/>
-        </w:rPr>
-        <w:t>Pesquisar o porque e conduzir um treino com a variante 18, seguindo os mesmos parâmetros utilizados aqui no experimento 9</w:t>
-      </w:r>
-      <w:r>
-        <w:rPr>
-          <w:color w:val="EE0000"/>
-        </w:rPr>
-        <w:t xml:space="preserve">. Buscar responder se essa diferença na função perda vem da mudança do </w:t>
-      </w:r>
-      <w:proofErr w:type="spellStart"/>
-      <w:r>
-        <w:rPr>
-          <w:i/>
-          <w:iCs/>
-          <w:color w:val="EE0000"/>
+      </w:pPr>
+      <w:r>
+        <w:t xml:space="preserve">Pesquisar o porque e conduzir um treino com a variante 18, seguindo os mesmos parâmetros utilizados aqui no experimento 9. Buscar responder se essa diferença na função perda vem da mudança do </w:t>
+      </w:r>
+      <w:proofErr w:type="spellStart"/>
+      <w:r>
+        <w:rPr>
+          <w:i/>
+          <w:iCs/>
         </w:rPr>
         <w:t>Batch_Size</w:t>
       </w:r>
@@ -19202,14 +19078,10 @@
         <w:rPr>
           <w:i/>
           <w:iCs/>
-          <w:color w:val="EE0000"/>
         </w:rPr>
         <w:t xml:space="preserve"> </w:t>
       </w:r>
       <w:r>
-        <w:rPr>
-          <w:color w:val="EE0000"/>
-        </w:rPr>
         <w:t>ou da própria arquitetura e, se esse for o caso, explicar o porquê</w:t>
       </w:r>
     </w:p>
@@ -19218,6 +19090,12 @@
         <w:pStyle w:val="PargrafodaLista"/>
         <w:ind w:left="3240"/>
         <w:jc w:val="both"/>
+        <w:rPr>
+          <w:b/>
+          <w:bCs/>
+          <w:i/>
+          <w:iCs/>
+        </w:rPr>
       </w:pPr>
     </w:p>
     <w:p>
@@ -19228,15 +19106,39 @@
           <w:numId w:val="27"/>
         </w:numPr>
         <w:jc w:val="both"/>
-      </w:pPr>
-      <w:r>
+        <w:rPr>
+          <w:b/>
+          <w:bCs/>
+          <w:i/>
+          <w:iCs/>
+        </w:rPr>
+      </w:pPr>
+      <w:r>
+        <w:rPr>
+          <w:b/>
+          <w:bCs/>
+          <w:i/>
+          <w:iCs/>
+        </w:rPr>
         <w:t>OBS – Disposição das colunas referentes às imagens 51,52,53</w:t>
       </w:r>
       <w:r>
-        <w:t xml:space="preserve"> (Da esquerda para a direita)</w:t>
-      </w:r>
-      <w:r>
-        <w:t>:</w:t>
+        <w:rPr>
+          <w:b/>
+          <w:bCs/>
+          <w:i/>
+          <w:iCs/>
+        </w:rPr>
+        <w:t>, 54 e 55</w:t>
+      </w:r>
+      <w:r>
+        <w:rPr>
+          <w:b/>
+          <w:bCs/>
+          <w:i/>
+          <w:iCs/>
+        </w:rPr>
+        <w:t xml:space="preserve"> (Da esquerda para a direita):</w:t>
       </w:r>
     </w:p>
     <w:p>
@@ -19247,8 +19149,20 @@
           <w:numId w:val="27"/>
         </w:numPr>
         <w:jc w:val="both"/>
-      </w:pPr>
-      <w:r>
+        <w:rPr>
+          <w:b/>
+          <w:bCs/>
+          <w:i/>
+          <w:iCs/>
+        </w:rPr>
+      </w:pPr>
+      <w:r>
+        <w:rPr>
+          <w:b/>
+          <w:bCs/>
+          <w:i/>
+          <w:iCs/>
+        </w:rPr>
         <w:t>EPOCH</w:t>
       </w:r>
     </w:p>
@@ -19260,8 +19174,20 @@
           <w:numId w:val="27"/>
         </w:numPr>
         <w:jc w:val="both"/>
-      </w:pPr>
-      <w:r>
+        <w:rPr>
+          <w:b/>
+          <w:bCs/>
+          <w:i/>
+          <w:iCs/>
+        </w:rPr>
+      </w:pPr>
+      <w:r>
+        <w:rPr>
+          <w:b/>
+          <w:bCs/>
+          <w:i/>
+          <w:iCs/>
+        </w:rPr>
         <w:t>TRAIN ACC</w:t>
       </w:r>
     </w:p>
@@ -19273,8 +19199,20 @@
           <w:numId w:val="27"/>
         </w:numPr>
         <w:jc w:val="both"/>
-      </w:pPr>
-      <w:r>
+        <w:rPr>
+          <w:b/>
+          <w:bCs/>
+          <w:i/>
+          <w:iCs/>
+        </w:rPr>
+      </w:pPr>
+      <w:r>
+        <w:rPr>
+          <w:b/>
+          <w:bCs/>
+          <w:i/>
+          <w:iCs/>
+        </w:rPr>
         <w:t>TRAIN LOSS</w:t>
       </w:r>
     </w:p>
@@ -19286,8 +19224,20 @@
           <w:numId w:val="27"/>
         </w:numPr>
         <w:jc w:val="both"/>
-      </w:pPr>
-      <w:r>
+        <w:rPr>
+          <w:b/>
+          <w:bCs/>
+          <w:i/>
+          <w:iCs/>
+        </w:rPr>
+      </w:pPr>
+      <w:r>
+        <w:rPr>
+          <w:b/>
+          <w:bCs/>
+          <w:i/>
+          <w:iCs/>
+        </w:rPr>
         <w:t>LR</w:t>
       </w:r>
     </w:p>
@@ -19299,8 +19249,20 @@
           <w:numId w:val="27"/>
         </w:numPr>
         <w:jc w:val="both"/>
-      </w:pPr>
-      <w:r>
+        <w:rPr>
+          <w:b/>
+          <w:bCs/>
+          <w:i/>
+          <w:iCs/>
+        </w:rPr>
+      </w:pPr>
+      <w:r>
+        <w:rPr>
+          <w:b/>
+          <w:bCs/>
+          <w:i/>
+          <w:iCs/>
+        </w:rPr>
         <w:t>VAL ACC</w:t>
       </w:r>
     </w:p>
@@ -19312,8 +19274,20 @@
           <w:numId w:val="27"/>
         </w:numPr>
         <w:jc w:val="both"/>
-      </w:pPr>
-      <w:r>
+        <w:rPr>
+          <w:b/>
+          <w:bCs/>
+          <w:i/>
+          <w:iCs/>
+        </w:rPr>
+      </w:pPr>
+      <w:r>
+        <w:rPr>
+          <w:b/>
+          <w:bCs/>
+          <w:i/>
+          <w:iCs/>
+        </w:rPr>
         <w:t>VAL LOSS</w:t>
       </w:r>
     </w:p>
@@ -19362,14 +19336,7 @@
           <w:sz w:val="18"/>
           <w:szCs w:val="18"/>
         </w:rPr>
-        <w:t>5</w:t>
-      </w:r>
-      <w:r>
-        <w:rPr>
-          <w:sz w:val="18"/>
-          <w:szCs w:val="18"/>
-        </w:rPr>
-        <w:t>1</w:t>
+        <w:t>51</w:t>
       </w:r>
       <w:r>
         <w:rPr>
@@ -19383,14 +19350,7 @@
           <w:sz w:val="18"/>
           <w:szCs w:val="18"/>
         </w:rPr>
-        <w:t xml:space="preserve">Ultimas épocas do treino do experimento 9 </w:t>
-      </w:r>
-      <w:r>
-        <w:rPr>
-          <w:sz w:val="18"/>
-          <w:szCs w:val="18"/>
-        </w:rPr>
-        <w:t xml:space="preserve">– </w:t>
+        <w:t xml:space="preserve">Ultimas épocas do treino do experimento 9 – </w:t>
       </w:r>
       <w:proofErr w:type="spellStart"/>
       <w:r>
@@ -19406,27 +19366,29 @@
           <w:sz w:val="18"/>
           <w:szCs w:val="18"/>
         </w:rPr>
-        <w:t xml:space="preserve"> </w:t>
-      </w:r>
-      <w:r>
-        <w:rPr>
-          <w:sz w:val="18"/>
-          <w:szCs w:val="18"/>
-        </w:rPr>
-        <w:t>34</w:t>
-      </w:r>
-    </w:p>
-    <w:p>
-      <w:pPr>
-        <w:pStyle w:val="PargrafodaLista"/>
-        <w:ind w:left="2520"/>
-        <w:jc w:val="both"/>
-      </w:pPr>
-      <w:r>
+        <w:t xml:space="preserve"> 34</w:t>
+      </w:r>
+      <w:r>
+        <w:rPr>
+          <w:sz w:val="18"/>
+          <w:szCs w:val="18"/>
+        </w:rPr>
+        <w:t xml:space="preserve"> com BS = 64</w:t>
+      </w:r>
+    </w:p>
+    <w:p>
+      <w:pPr>
+        <w:pStyle w:val="PargrafodaLista"/>
+        <w:ind w:left="2124"/>
+      </w:pPr>
+      <w:r>
+        <w:rPr>
+          <w:noProof/>
+        </w:rPr>
         <w:drawing>
-          <wp:inline distT="0" distB="0" distL="0" distR="0" wp14:anchorId="5FDDA1B1" wp14:editId="14DF22B5">
-            <wp:extent cx="4163066" cy="3037398"/>
-            <wp:effectExtent l="0" t="0" r="8890" b="0"/>
+          <wp:inline distT="0" distB="0" distL="0" distR="0" wp14:anchorId="5FDDA1B1" wp14:editId="32E85B64">
+            <wp:extent cx="4162801" cy="1438993"/>
+            <wp:effectExtent l="0" t="0" r="9525" b="8890"/>
             <wp:docPr id="1913002756" name="Imagem 1"/>
             <wp:cNvGraphicFramePr>
               <a:graphicFrameLocks xmlns:a="http://schemas.openxmlformats.org/drawingml/2006/main" noChangeAspect="1"/>
@@ -19440,7 +19402,7 @@
                   </pic:nvPicPr>
                   <pic:blipFill rotWithShape="1">
                     <a:blip r:embed="rId60"/>
-                    <a:srcRect l="3160" r="3844"/>
+                    <a:srcRect l="3160" t="52621" r="3844"/>
                     <a:stretch>
                       <a:fillRect/>
                     </a:stretch>
@@ -19448,7 +19410,7 @@
                   <pic:spPr bwMode="auto">
                     <a:xfrm>
                       <a:off x="0" y="0"/>
-                      <a:ext cx="4197762" cy="3062713"/>
+                      <a:ext cx="4197762" cy="1451078"/>
                     </a:xfrm>
                     <a:prstGeom prst="rect">
                       <a:avLst/>
@@ -19472,8 +19434,7 @@
     <w:p>
       <w:pPr>
         <w:spacing w:after="0"/>
-        <w:ind w:left="1440"/>
-        <w:jc w:val="center"/>
+        <w:ind w:left="2124"/>
         <w:rPr>
           <w:sz w:val="18"/>
           <w:szCs w:val="18"/>
@@ -19491,14 +19452,7 @@
           <w:sz w:val="18"/>
           <w:szCs w:val="18"/>
         </w:rPr>
-        <w:t>5</w:t>
-      </w:r>
-      <w:r>
-        <w:rPr>
-          <w:sz w:val="18"/>
-          <w:szCs w:val="18"/>
-        </w:rPr>
-        <w:t>2</w:t>
+        <w:t>52</w:t>
       </w:r>
       <w:r>
         <w:rPr>
@@ -19512,21 +19466,7 @@
           <w:sz w:val="18"/>
           <w:szCs w:val="18"/>
         </w:rPr>
-        <w:t xml:space="preserve">Ultimas épocas do treino do experimento </w:t>
-      </w:r>
-      <w:r>
-        <w:rPr>
-          <w:sz w:val="18"/>
-          <w:szCs w:val="18"/>
-        </w:rPr>
-        <w:t xml:space="preserve">7 </w:t>
-      </w:r>
-      <w:r>
-        <w:rPr>
-          <w:sz w:val="18"/>
-          <w:szCs w:val="18"/>
-        </w:rPr>
-        <w:t xml:space="preserve">– </w:t>
+        <w:t xml:space="preserve">Ultimas épocas do treino do experimento 7 – </w:t>
       </w:r>
       <w:proofErr w:type="spellStart"/>
       <w:r>
@@ -19542,6 +19482,13 @@
           <w:sz w:val="18"/>
           <w:szCs w:val="18"/>
         </w:rPr>
+        <w:t xml:space="preserve"> 18</w:t>
+      </w:r>
+      <w:r>
+        <w:rPr>
+          <w:sz w:val="18"/>
+          <w:szCs w:val="18"/>
+        </w:rPr>
         <w:t xml:space="preserve"> </w:t>
       </w:r>
       <w:r>
@@ -19549,20 +19496,29 @@
           <w:sz w:val="18"/>
           <w:szCs w:val="18"/>
         </w:rPr>
-        <w:t>18</w:t>
-      </w:r>
-    </w:p>
-    <w:p>
-      <w:pPr>
-        <w:pStyle w:val="PargrafodaLista"/>
-        <w:ind w:left="2520"/>
-        <w:jc w:val="both"/>
-      </w:pPr>
-      <w:r>
+        <w:t xml:space="preserve">BS = </w:t>
+      </w:r>
+      <w:r>
+        <w:rPr>
+          <w:sz w:val="18"/>
+          <w:szCs w:val="18"/>
+        </w:rPr>
+        <w:t>32</w:t>
+      </w:r>
+    </w:p>
+    <w:p>
+      <w:pPr>
+        <w:pStyle w:val="PargrafodaLista"/>
+        <w:ind w:left="2124"/>
+      </w:pPr>
+      <w:r>
+        <w:rPr>
+          <w:noProof/>
+        </w:rPr>
         <w:drawing>
-          <wp:inline distT="0" distB="0" distL="0" distR="0" wp14:anchorId="0BC632A3" wp14:editId="138C39C2">
-            <wp:extent cx="4187000" cy="3085106"/>
-            <wp:effectExtent l="0" t="0" r="4445" b="1270"/>
+          <wp:inline distT="0" distB="0" distL="0" distR="0" wp14:anchorId="0BC632A3" wp14:editId="31ADBF20">
+            <wp:extent cx="4186555" cy="1621739"/>
+            <wp:effectExtent l="0" t="0" r="4445" b="0"/>
             <wp:docPr id="1789090918" name="Imagem 1"/>
             <wp:cNvGraphicFramePr>
               <a:graphicFrameLocks xmlns:a="http://schemas.openxmlformats.org/drawingml/2006/main" noChangeAspect="1"/>
@@ -19574,20 +19530,29 @@
                     <pic:cNvPr id="1789090918" name=""/>
                     <pic:cNvPicPr/>
                   </pic:nvPicPr>
-                  <pic:blipFill>
+                  <pic:blipFill rotWithShape="1">
                     <a:blip r:embed="rId61"/>
+                    <a:srcRect t="47428"/>
                     <a:stretch>
                       <a:fillRect/>
                     </a:stretch>
                   </pic:blipFill>
-                  <pic:spPr>
+                  <pic:spPr bwMode="auto">
                     <a:xfrm>
                       <a:off x="0" y="0"/>
-                      <a:ext cx="4217617" cy="3107666"/>
+                      <a:ext cx="4217617" cy="1633771"/>
                     </a:xfrm>
                     <a:prstGeom prst="rect">
                       <a:avLst/>
                     </a:prstGeom>
+                    <a:ln>
+                      <a:noFill/>
+                    </a:ln>
+                    <a:extLst>
+                      <a:ext uri="{53640926-AAD7-44D8-BBD7-CCE9431645EC}">
+                        <a14:shadowObscured xmlns:a14="http://schemas.microsoft.com/office/drawing/2010/main"/>
+                      </a:ext>
+                    </a:extLst>
                   </pic:spPr>
                 </pic:pic>
               </a:graphicData>
@@ -19615,33 +19580,6 @@
     </w:p>
     <w:p>
       <w:pPr>
-        <w:ind w:left="2124"/>
-        <w:jc w:val="both"/>
-      </w:pPr>
-    </w:p>
-    <w:p>
-      <w:pPr>
-        <w:ind w:left="2124"/>
-        <w:jc w:val="both"/>
-      </w:pPr>
-    </w:p>
-    <w:p>
-      <w:pPr>
-        <w:jc w:val="both"/>
-      </w:pPr>
-    </w:p>
-    <w:p>
-      <w:pPr>
-        <w:jc w:val="both"/>
-      </w:pPr>
-    </w:p>
-    <w:p>
-      <w:pPr>
-        <w:jc w:val="both"/>
-      </w:pPr>
-    </w:p>
-    <w:p>
-      <w:pPr>
         <w:spacing w:after="0"/>
         <w:ind w:left="1440"/>
         <w:jc w:val="center"/>
@@ -19662,14 +19600,7 @@
           <w:sz w:val="18"/>
           <w:szCs w:val="18"/>
         </w:rPr>
-        <w:t>5</w:t>
-      </w:r>
-      <w:r>
-        <w:rPr>
-          <w:sz w:val="18"/>
-          <w:szCs w:val="18"/>
-        </w:rPr>
-        <w:t>3</w:t>
+        <w:t>53</w:t>
       </w:r>
       <w:r>
         <w:rPr>
@@ -19683,14 +19614,7 @@
           <w:sz w:val="18"/>
           <w:szCs w:val="18"/>
         </w:rPr>
-        <w:t xml:space="preserve">Ultimas épocas do treino do experimento </w:t>
-      </w:r>
-      <w:r>
-        <w:rPr>
-          <w:sz w:val="18"/>
-          <w:szCs w:val="18"/>
-        </w:rPr>
-        <w:t xml:space="preserve">5 – </w:t>
+        <w:t xml:space="preserve">Ultimas épocas do treino do experimento 5 – </w:t>
       </w:r>
       <w:proofErr w:type="spellStart"/>
       <w:r>
@@ -19708,6 +19632,27 @@
         </w:rPr>
         <w:t xml:space="preserve"> 50</w:t>
       </w:r>
+      <w:r>
+        <w:rPr>
+          <w:sz w:val="18"/>
+          <w:szCs w:val="18"/>
+        </w:rPr>
+        <w:t xml:space="preserve"> </w:t>
+      </w:r>
+      <w:r>
+        <w:rPr>
+          <w:sz w:val="18"/>
+          <w:szCs w:val="18"/>
+        </w:rPr>
+        <w:t xml:space="preserve">BS = </w:t>
+      </w:r>
+      <w:r>
+        <w:rPr>
+          <w:sz w:val="18"/>
+          <w:szCs w:val="18"/>
+        </w:rPr>
+        <w:t>32</w:t>
+      </w:r>
     </w:p>
     <w:p>
       <w:pPr>
@@ -19716,10 +19661,13 @@
         <w:jc w:val="both"/>
       </w:pPr>
       <w:r>
+        <w:rPr>
+          <w:noProof/>
+        </w:rPr>
         <w:drawing>
-          <wp:inline distT="0" distB="0" distL="0" distR="0" wp14:anchorId="5CC735F0" wp14:editId="294A6445">
-            <wp:extent cx="4438886" cy="3172571"/>
-            <wp:effectExtent l="0" t="0" r="0" b="8890"/>
+          <wp:inline distT="0" distB="0" distL="0" distR="0" wp14:anchorId="5CC735F0" wp14:editId="2D488EBA">
+            <wp:extent cx="4438650" cy="1661654"/>
+            <wp:effectExtent l="0" t="0" r="0" b="0"/>
             <wp:docPr id="618462217" name="Imagem 1"/>
             <wp:cNvGraphicFramePr>
               <a:graphicFrameLocks xmlns:a="http://schemas.openxmlformats.org/drawingml/2006/main" noChangeAspect="1"/>
@@ -19731,8 +19679,259 @@
                     <pic:cNvPr id="618462217" name=""/>
                     <pic:cNvPicPr/>
                   </pic:nvPicPr>
+                  <pic:blipFill rotWithShape="1">
+                    <a:blip r:embed="rId62"/>
+                    <a:srcRect t="47621"/>
+                    <a:stretch>
+                      <a:fillRect/>
+                    </a:stretch>
+                  </pic:blipFill>
+                  <pic:spPr bwMode="auto">
+                    <a:xfrm>
+                      <a:off x="0" y="0"/>
+                      <a:ext cx="4451896" cy="1666613"/>
+                    </a:xfrm>
+                    <a:prstGeom prst="rect">
+                      <a:avLst/>
+                    </a:prstGeom>
+                    <a:ln>
+                      <a:noFill/>
+                    </a:ln>
+                    <a:extLst>
+                      <a:ext uri="{53640926-AAD7-44D8-BBD7-CCE9431645EC}">
+                        <a14:shadowObscured xmlns:a14="http://schemas.microsoft.com/office/drawing/2010/main"/>
+                      </a:ext>
+                    </a:extLst>
+                  </pic:spPr>
+                </pic:pic>
+              </a:graphicData>
+            </a:graphic>
+          </wp:inline>
+        </w:drawing>
+      </w:r>
+    </w:p>
+    <w:p>
+      <w:pPr>
+        <w:pStyle w:val="PargrafodaLista"/>
+        <w:ind w:left="2160"/>
+        <w:jc w:val="both"/>
+        <w:rPr>
+          <w:b/>
+          <w:bCs/>
+        </w:rPr>
+      </w:pPr>
+    </w:p>
+    <w:p>
+      <w:pPr>
+        <w:pStyle w:val="PargrafodaLista"/>
+        <w:ind w:left="2160"/>
+        <w:jc w:val="both"/>
+        <w:rPr>
+          <w:b/>
+          <w:bCs/>
+        </w:rPr>
+      </w:pPr>
+    </w:p>
+    <w:p>
+      <w:pPr>
+        <w:pStyle w:val="PargrafodaLista"/>
+        <w:numPr>
+          <w:ilvl w:val="1"/>
+          <w:numId w:val="1"/>
+        </w:numPr>
+        <w:jc w:val="both"/>
+        <w:rPr>
+          <w:b/>
+          <w:bCs/>
+        </w:rPr>
+      </w:pPr>
+      <w:r>
+        <w:rPr>
+          <w:b/>
+          <w:bCs/>
+        </w:rPr>
+        <w:t xml:space="preserve">EXPERIMENTO </w:t>
+      </w:r>
+      <w:r>
+        <w:rPr>
+          <w:b/>
+          <w:bCs/>
+        </w:rPr>
+        <w:t>10</w:t>
+      </w:r>
+      <w:r>
+        <w:rPr>
+          <w:b/>
+          <w:bCs/>
+        </w:rPr>
+        <w:t xml:space="preserve"> (RESNET) – </w:t>
+      </w:r>
+      <w:r>
+        <w:rPr>
+          <w:b/>
+          <w:bCs/>
+        </w:rPr>
+        <w:t>VERIFICAR INFLUENCIA DO BATCH_SIZE NA VARIANTE RESNET-18:</w:t>
+      </w:r>
+    </w:p>
+    <w:p>
+      <w:pPr>
+        <w:pStyle w:val="PargrafodaLista"/>
+        <w:ind w:left="1440"/>
+        <w:jc w:val="both"/>
+        <w:rPr>
+          <w:b/>
+          <w:bCs/>
+        </w:rPr>
+      </w:pPr>
+    </w:p>
+    <w:p>
+      <w:pPr>
+        <w:pStyle w:val="PargrafodaLista"/>
+        <w:ind w:left="1440"/>
+        <w:jc w:val="both"/>
+      </w:pPr>
+      <w:r>
+        <w:t>Comparando com a ResNet-34 (Experimento 9), a ResNet-18 apresenta comportamento muito competitivo</w:t>
+      </w:r>
+      <w:r>
+        <w:t>, com resultados marginalmente melhores</w:t>
+      </w:r>
+      <w:r>
+        <w:t xml:space="preserve">. Em </w:t>
+      </w:r>
+      <w:proofErr w:type="spellStart"/>
+      <w:r>
+        <w:t>datasets</w:t>
+      </w:r>
+      <w:proofErr w:type="spellEnd"/>
+      <w:r>
+        <w:t xml:space="preserve"> relativamente pequenos (≈11k imagens, 3 classes), a ResNet-18 costuma ser mais estável e menos propensa a </w:t>
+      </w:r>
+      <w:proofErr w:type="spellStart"/>
+      <w:r>
+        <w:t>overfitting</w:t>
+      </w:r>
+      <w:proofErr w:type="spellEnd"/>
+      <w:r>
+        <w:t xml:space="preserve"> do que a ResNet-34. A ResNet-34 possui maior capacidade representacional, mas essa capacidade extra só se traduz em ganho real quando há volume de dados suficiente.</w:t>
+      </w:r>
+    </w:p>
+    <w:p>
+      <w:pPr>
+        <w:pStyle w:val="PargrafodaLista"/>
+        <w:ind w:left="1440"/>
+        <w:jc w:val="both"/>
+      </w:pPr>
+    </w:p>
+    <w:p>
+      <w:pPr>
+        <w:pStyle w:val="PargrafodaLista"/>
+        <w:ind w:left="1440"/>
+        <w:jc w:val="both"/>
+      </w:pPr>
+    </w:p>
+    <w:p>
+      <w:pPr>
+        <w:spacing w:after="0"/>
+        <w:ind w:left="1440"/>
+        <w:jc w:val="center"/>
+        <w:rPr>
+          <w:sz w:val="18"/>
+          <w:szCs w:val="18"/>
+        </w:rPr>
+      </w:pPr>
+      <w:r>
+        <w:rPr>
+          <w:sz w:val="18"/>
+          <w:szCs w:val="18"/>
+        </w:rPr>
+        <w:lastRenderedPageBreak/>
+        <w:t xml:space="preserve">Figura </w:t>
+      </w:r>
+      <w:r>
+        <w:rPr>
+          <w:sz w:val="18"/>
+          <w:szCs w:val="18"/>
+        </w:rPr>
+        <w:t>5</w:t>
+      </w:r>
+      <w:r>
+        <w:rPr>
+          <w:sz w:val="18"/>
+          <w:szCs w:val="18"/>
+        </w:rPr>
+        <w:t>4</w:t>
+      </w:r>
+      <w:r>
+        <w:rPr>
+          <w:sz w:val="18"/>
+          <w:szCs w:val="18"/>
+        </w:rPr>
+        <w:t xml:space="preserve">: </w:t>
+      </w:r>
+      <w:r>
+        <w:rPr>
+          <w:sz w:val="18"/>
+          <w:szCs w:val="18"/>
+        </w:rPr>
+        <w:t xml:space="preserve">Ultimas épocas do treino </w:t>
+      </w:r>
+      <w:r>
+        <w:rPr>
+          <w:sz w:val="18"/>
+          <w:szCs w:val="18"/>
+        </w:rPr>
+        <w:t xml:space="preserve">com a </w:t>
+      </w:r>
+      <w:proofErr w:type="spellStart"/>
+      <w:r>
+        <w:rPr>
+          <w:sz w:val="18"/>
+          <w:szCs w:val="18"/>
+        </w:rPr>
+        <w:t>ResNet</w:t>
+      </w:r>
+      <w:proofErr w:type="spellEnd"/>
+      <w:r>
+        <w:rPr>
+          <w:sz w:val="18"/>
+          <w:szCs w:val="18"/>
+        </w:rPr>
+        <w:t xml:space="preserve"> </w:t>
+      </w:r>
+      <w:r>
+        <w:rPr>
+          <w:sz w:val="18"/>
+          <w:szCs w:val="18"/>
+        </w:rPr>
+        <w:t>18 e BS = 64</w:t>
+      </w:r>
+    </w:p>
+    <w:p>
+      <w:pPr>
+        <w:pStyle w:val="PargrafodaLista"/>
+        <w:ind w:left="2124"/>
+        <w:jc w:val="both"/>
+      </w:pPr>
+      <w:r>
+        <w:drawing>
+          <wp:inline distT="0" distB="0" distL="0" distR="0" wp14:anchorId="4100A5D3" wp14:editId="283E9CB4">
+            <wp:extent cx="4165519" cy="1565926"/>
+            <wp:effectExtent l="0" t="0" r="6985" b="0"/>
+            <wp:docPr id="657825552" name="Imagem 1"/>
+            <wp:cNvGraphicFramePr>
+              <a:graphicFrameLocks xmlns:a="http://schemas.openxmlformats.org/drawingml/2006/main" noChangeAspect="1"/>
+            </wp:cNvGraphicFramePr>
+            <a:graphic xmlns:a="http://schemas.openxmlformats.org/drawingml/2006/main">
+              <a:graphicData uri="http://schemas.openxmlformats.org/drawingml/2006/picture">
+                <pic:pic xmlns:pic="http://schemas.openxmlformats.org/drawingml/2006/picture">
+                  <pic:nvPicPr>
+                    <pic:cNvPr id="657825552" name=""/>
+                    <pic:cNvPicPr/>
+                  </pic:nvPicPr>
                   <pic:blipFill>
-                    <a:blip r:embed="rId62"/>
+                    <a:blip r:embed="rId63"/>
                     <a:stretch>
                       <a:fillRect/>
                     </a:stretch>
@@ -19740,7 +19939,7 @@
                   <pic:spPr>
                     <a:xfrm>
                       <a:off x="0" y="0"/>
-                      <a:ext cx="4451896" cy="3181869"/>
+                      <a:ext cx="4190187" cy="1575199"/>
                     </a:xfrm>
                     <a:prstGeom prst="rect">
                       <a:avLst/>
@@ -19755,19 +19954,221 @@
     </w:p>
     <w:p>
       <w:pPr>
-        <w:pStyle w:val="PargrafodaLista"/>
-        <w:ind w:left="2160"/>
-        <w:jc w:val="both"/>
-        <w:rPr>
-          <w:b/>
-          <w:bCs/>
-        </w:rPr>
-      </w:pPr>
-    </w:p>
-    <w:p>
-      <w:pPr>
-        <w:pStyle w:val="PargrafodaLista"/>
-        <w:ind w:left="2160"/>
+        <w:spacing w:after="0"/>
+        <w:ind w:left="1440" w:firstLine="684"/>
+        <w:jc w:val="center"/>
+        <w:rPr>
+          <w:sz w:val="18"/>
+          <w:szCs w:val="18"/>
+        </w:rPr>
+      </w:pPr>
+      <w:r>
+        <w:rPr>
+          <w:sz w:val="18"/>
+          <w:szCs w:val="18"/>
+        </w:rPr>
+        <w:t xml:space="preserve">Figura </w:t>
+      </w:r>
+      <w:r>
+        <w:rPr>
+          <w:sz w:val="18"/>
+          <w:szCs w:val="18"/>
+        </w:rPr>
+        <w:t>5</w:t>
+      </w:r>
+      <w:r>
+        <w:rPr>
+          <w:sz w:val="18"/>
+          <w:szCs w:val="18"/>
+        </w:rPr>
+        <w:t>5</w:t>
+      </w:r>
+      <w:r>
+        <w:rPr>
+          <w:sz w:val="18"/>
+          <w:szCs w:val="18"/>
+        </w:rPr>
+        <w:t xml:space="preserve">: </w:t>
+      </w:r>
+      <w:r>
+        <w:rPr>
+          <w:sz w:val="18"/>
+          <w:szCs w:val="18"/>
+        </w:rPr>
+        <w:t xml:space="preserve">Ultimas épocas do treino do experimento 9 – </w:t>
+      </w:r>
+      <w:proofErr w:type="spellStart"/>
+      <w:r>
+        <w:rPr>
+          <w:sz w:val="18"/>
+          <w:szCs w:val="18"/>
+        </w:rPr>
+        <w:t>ResNet</w:t>
+      </w:r>
+      <w:proofErr w:type="spellEnd"/>
+      <w:r>
+        <w:rPr>
+          <w:sz w:val="18"/>
+          <w:szCs w:val="18"/>
+        </w:rPr>
+        <w:t xml:space="preserve"> 34 com BS = 64</w:t>
+      </w:r>
+    </w:p>
+    <w:p>
+      <w:pPr>
+        <w:pStyle w:val="PargrafodaLista"/>
+        <w:ind w:left="2124"/>
+        <w:jc w:val="center"/>
+      </w:pPr>
+      <w:r>
+        <w:rPr>
+          <w:noProof/>
+        </w:rPr>
+        <w:drawing>
+          <wp:inline distT="0" distB="0" distL="0" distR="0" wp14:anchorId="72D0021C" wp14:editId="30EDEA21">
+            <wp:extent cx="4162801" cy="1438993"/>
+            <wp:effectExtent l="0" t="0" r="9525" b="8890"/>
+            <wp:docPr id="514195407" name="Imagem 1"/>
+            <wp:cNvGraphicFramePr>
+              <a:graphicFrameLocks xmlns:a="http://schemas.openxmlformats.org/drawingml/2006/main" noChangeAspect="1"/>
+            </wp:cNvGraphicFramePr>
+            <a:graphic xmlns:a="http://schemas.openxmlformats.org/drawingml/2006/main">
+              <a:graphicData uri="http://schemas.openxmlformats.org/drawingml/2006/picture">
+                <pic:pic xmlns:pic="http://schemas.openxmlformats.org/drawingml/2006/picture">
+                  <pic:nvPicPr>
+                    <pic:cNvPr id="1913002756" name=""/>
+                    <pic:cNvPicPr/>
+                  </pic:nvPicPr>
+                  <pic:blipFill rotWithShape="1">
+                    <a:blip r:embed="rId60"/>
+                    <a:srcRect l="3160" t="52621" r="3844"/>
+                    <a:stretch>
+                      <a:fillRect/>
+                    </a:stretch>
+                  </pic:blipFill>
+                  <pic:spPr bwMode="auto">
+                    <a:xfrm>
+                      <a:off x="0" y="0"/>
+                      <a:ext cx="4197762" cy="1451078"/>
+                    </a:xfrm>
+                    <a:prstGeom prst="rect">
+                      <a:avLst/>
+                    </a:prstGeom>
+                    <a:ln>
+                      <a:noFill/>
+                    </a:ln>
+                    <a:extLst>
+                      <a:ext uri="{53640926-AAD7-44D8-BBD7-CCE9431645EC}">
+                        <a14:shadowObscured xmlns:a14="http://schemas.microsoft.com/office/drawing/2010/main"/>
+                      </a:ext>
+                    </a:extLst>
+                  </pic:spPr>
+                </pic:pic>
+              </a:graphicData>
+            </a:graphic>
+          </wp:inline>
+        </w:drawing>
+      </w:r>
+    </w:p>
+    <w:p>
+      <w:pPr>
+        <w:pStyle w:val="PargrafodaLista"/>
+        <w:ind w:left="2124"/>
+        <w:jc w:val="center"/>
+      </w:pPr>
+    </w:p>
+    <w:p>
+      <w:pPr>
+        <w:pStyle w:val="PargrafodaLista"/>
+        <w:ind w:left="2124"/>
+        <w:jc w:val="both"/>
+      </w:pPr>
+      <w:r>
+        <w:t xml:space="preserve">Quando comparamos diretamente ambas as variações (considerando as mesmas configurações de parâmetros) torna-se perceptível o valor mais reduzido da função </w:t>
+      </w:r>
+      <w:proofErr w:type="spellStart"/>
+      <w:r>
+        <w:t>loss</w:t>
+      </w:r>
+      <w:proofErr w:type="spellEnd"/>
+      <w:r>
+        <w:t xml:space="preserve"> para a variante 18. Isso se deve ao fato de que r</w:t>
+      </w:r>
+      <w:r>
+        <w:t xml:space="preserve">edes mais profundas são </w:t>
+      </w:r>
+      <w:r>
+        <w:rPr>
+          <w:b/>
+          <w:bCs/>
+        </w:rPr>
+        <w:t>mais difíceis de otimizar</w:t>
+      </w:r>
+      <w:r>
+        <w:t>, mesmo com conexões residuais.</w:t>
+      </w:r>
+    </w:p>
+    <w:p>
+      <w:pPr>
+        <w:pStyle w:val="PargrafodaLista"/>
+        <w:ind w:left="2124"/>
+        <w:jc w:val="both"/>
+      </w:pPr>
+    </w:p>
+    <w:p>
+      <w:pPr>
+        <w:pStyle w:val="PargrafodaLista"/>
+        <w:ind w:left="2124"/>
+        <w:jc w:val="both"/>
+      </w:pPr>
+      <w:r>
+        <w:rPr>
+          <w:b/>
+          <w:bCs/>
+        </w:rPr>
+        <w:t>Observação importante:</w:t>
+      </w:r>
+      <w:r>
+        <w:rPr>
+          <w:b/>
+          <w:bCs/>
+        </w:rPr>
+        <w:t xml:space="preserve"> </w:t>
+      </w:r>
+      <w:r>
+        <w:t>a</w:t>
+      </w:r>
+      <w:r>
+        <w:t>rquiteturas menores possuem algo chamado</w:t>
+      </w:r>
+      <w:r>
+        <w:t xml:space="preserve"> r</w:t>
+      </w:r>
+      <w:r>
+        <w:t>egularização implícita por capacidade limitada</w:t>
+      </w:r>
+      <w:r>
+        <w:t xml:space="preserve">. No caso da ResNet18 a rede tem menos liberdade e não consegue </w:t>
+      </w:r>
+      <w:r>
+        <w:t>“inventar” soluções muito complexas</w:t>
+      </w:r>
+      <w:r>
+        <w:t xml:space="preserve">, sendo obrigada a aprender representações mais compactas, o que pode resultar em melhor generalização e </w:t>
+      </w:r>
+      <w:proofErr w:type="spellStart"/>
+      <w:r>
+        <w:t>loss</w:t>
+      </w:r>
+      <w:proofErr w:type="spellEnd"/>
+      <w:r>
+        <w:t xml:space="preserve"> inferior (conforme observada nos resultados obtido)</w:t>
+      </w:r>
+    </w:p>
+    <w:p>
+      <w:pPr>
+        <w:pStyle w:val="PargrafodaLista"/>
+        <w:ind w:left="1440"/>
         <w:jc w:val="both"/>
         <w:rPr>
           <w:b/>
@@ -19782,25 +20183,31 @@
           <w:ilvl w:val="1"/>
           <w:numId w:val="1"/>
         </w:numPr>
-        <w:jc w:val="both"/>
-        <w:rPr>
-          <w:b/>
-          <w:bCs/>
-        </w:rPr>
-      </w:pPr>
-      <w:r>
-        <w:rPr>
-          <w:b/>
-          <w:bCs/>
-        </w:rPr>
-        <w:t xml:space="preserve">EXPERIMENTO </w:t>
-      </w:r>
-      <w:r>
-        <w:rPr>
-          <w:b/>
-          <w:bCs/>
-        </w:rPr>
-        <w:t>9</w:t>
+        <w:rPr>
+          <w:b/>
+          <w:bCs/>
+        </w:rPr>
+      </w:pPr>
+      <w:r>
+        <w:rPr>
+          <w:b/>
+          <w:bCs/>
+        </w:rPr>
+        <w:t>EXPERIME</w:t>
+      </w:r>
+      <w:r>
+        <w:rPr>
+          <w:b/>
+          <w:bCs/>
+        </w:rPr>
+        <w:t>NTO 1</w:t>
+      </w:r>
+      <w:r>
+        <w:rPr>
+          <w:b/>
+          <w:bCs/>
+        </w:rPr>
+        <w:t>1</w:t>
       </w:r>
       <w:r>
         <w:rPr>
@@ -19809,46 +20216,6 @@
         </w:rPr>
         <w:t xml:space="preserve"> (RESNET) – </w:t>
       </w:r>
-      <w:r>
-        <w:rPr>
-          <w:b/>
-          <w:bCs/>
-        </w:rPr>
-        <w:t>VERIFICAR INFLUENCIA DO BATCH_SIZE NA VARIANTE RESNET-18:</w:t>
-      </w:r>
-    </w:p>
-    <w:p>
-      <w:pPr>
-        <w:pStyle w:val="PargrafodaLista"/>
-        <w:ind w:left="1440"/>
-        <w:jc w:val="both"/>
-        <w:rPr>
-          <w:b/>
-          <w:bCs/>
-        </w:rPr>
-      </w:pPr>
-    </w:p>
-    <w:p>
-      <w:pPr>
-        <w:pStyle w:val="PargrafodaLista"/>
-        <w:ind w:left="1440"/>
-        <w:jc w:val="both"/>
-        <w:rPr>
-          <w:b/>
-          <w:bCs/>
-        </w:rPr>
-      </w:pPr>
-    </w:p>
-    <w:p>
-      <w:pPr>
-        <w:pStyle w:val="PargrafodaLista"/>
-        <w:ind w:left="1440"/>
-        <w:jc w:val="both"/>
-        <w:rPr>
-          <w:b/>
-          <w:bCs/>
-        </w:rPr>
-      </w:pPr>
     </w:p>
     <w:p>
       <w:pPr>
@@ -19902,7 +20269,7 @@
         <v:path o:extrusionok="f" gradientshapeok="t" o:connecttype="rect"/>
         <o:lock v:ext="edit" aspectratio="t"/>
       </v:shapetype>
-      <v:shape id="_x0000_i1070" type="#_x0000_t75" style="width:693.1pt;height:487.7pt;visibility:visible;mso-wrap-style:square" o:bullet="t">
+      <v:shape id="_x0000_i1045" type="#_x0000_t75" style="width:693.1pt;height:487.7pt;visibility:visible;mso-wrap-style:square" o:bullet="t">
         <v:imagedata r:id="rId1" o:title="" croptop="19686f" cropbottom="43833f" cropleft="8606f" cropright="55951f"/>
       </v:shape>
     </w:pict>
@@ -23563,7 +23930,6 @@
     <w:next w:val="Normal"/>
     <w:link w:val="Ttulo3Char"/>
     <w:uiPriority w:val="9"/>
-    <w:semiHidden/>
     <w:unhideWhenUsed/>
     <w:qFormat/>
     <w:rsid w:val="000A087D"/>
@@ -23770,7 +24136,6 @@
     <w:basedOn w:val="Fontepargpadro"/>
     <w:link w:val="Ttulo3"/>
     <w:uiPriority w:val="9"/>
-    <w:semiHidden/>
     <w:rsid w:val="000A087D"/>
     <w:rPr>
       <w:rFonts w:eastAsiaTheme="majorEastAsia" w:cstheme="majorBidi"/>

</xml_diff>

<commit_message>
Experimento 12 e Documentação
</commit_message>
<xml_diff>
--- a/Documentation/Documentacao Unificada de Experimentos.docx
+++ b/Documentation/Documentacao Unificada de Experimentos.docx
@@ -556,10 +556,12 @@
         <w:t xml:space="preserve"> devem ser iguais ao tamanho dos patches (implementado como um </w:t>
       </w:r>
       <w:proofErr w:type="spellStart"/>
+      <w:proofErr w:type="gramStart"/>
       <w:r>
         <w:t>nn.Conv</w:t>
       </w:r>
       <w:proofErr w:type="spellEnd"/>
+      <w:proofErr w:type="gramEnd"/>
       <w:r>
         <w:t xml:space="preserve"> com </w:t>
       </w:r>
@@ -572,10 +574,12 @@
         <w:t xml:space="preserve"> = </w:t>
       </w:r>
       <w:proofErr w:type="spellStart"/>
+      <w:proofErr w:type="gramStart"/>
       <w:r>
         <w:t>patches.size</w:t>
       </w:r>
       <w:proofErr w:type="spellEnd"/>
+      <w:proofErr w:type="gramEnd"/>
       <w:r>
         <w:t xml:space="preserve"> e </w:t>
       </w:r>
@@ -588,10 +592,12 @@
         <w:t xml:space="preserve"> = </w:t>
       </w:r>
       <w:proofErr w:type="spellStart"/>
+      <w:proofErr w:type="gramStart"/>
       <w:r>
         <w:t>patches.size</w:t>
       </w:r>
       <w:proofErr w:type="spellEnd"/>
+      <w:proofErr w:type="gramEnd"/>
       <w:r>
         <w:t xml:space="preserve"> em código);</w:t>
       </w:r>
@@ -1010,7 +1016,15 @@
         </w:numPr>
       </w:pPr>
       <w:r>
-        <w:t>Base learning rate: 10^(-3).</w:t>
+        <w:t>Base learning rate: 10</w:t>
+      </w:r>
+      <w:proofErr w:type="gramStart"/>
+      <w:r>
+        <w:t>^(</w:t>
+      </w:r>
+      <w:proofErr w:type="gramEnd"/>
+      <w:r>
+        <w:t>-3).</w:t>
       </w:r>
     </w:p>
     <w:p>
@@ -1414,7 +1428,13 @@
         <w:t>R</w:t>
       </w:r>
       <w:r>
-        <w:t>esultados obtidos no artigo original, cuja descrição se encontra na nota inferior das imagens.</w:t>
+        <w:t xml:space="preserve">esultados obtidos no artigo original, cuja descrição se encontra na nota inferior das </w:t>
+      </w:r>
+      <w:r>
+        <w:t>Figuras 1 e 2</w:t>
+      </w:r>
+      <w:r>
+        <w:t>.</w:t>
       </w:r>
     </w:p>
     <w:p>
@@ -2038,7 +2058,13 @@
         <w:t xml:space="preserve">Otimização 3: </w:t>
       </w:r>
       <w:r>
-        <w:t>learning rate alterada de 0.01 para 2e-4, justificado pela Figura 5. É importante destacar que o “</w:t>
+        <w:t xml:space="preserve">learning rate alterada de 0.01 para 2e-4, justificado pela Figura </w:t>
+      </w:r>
+      <w:r>
+        <w:t>4</w:t>
+      </w:r>
+      <w:r>
+        <w:t>. É importante destacar que o “</w:t>
       </w:r>
       <w:proofErr w:type="spellStart"/>
       <w:r>
@@ -2107,7 +2133,7 @@
           <w:sz w:val="18"/>
           <w:szCs w:val="18"/>
         </w:rPr>
-        <w:t>5</w:t>
+        <w:t>4</w:t>
       </w:r>
       <w:r>
         <w:rPr>
@@ -2203,7 +2229,13 @@
         <w:t>):</w:t>
       </w:r>
       <w:r>
-        <w:t xml:space="preserve"> Os valores dos parâmetros utilizados para o treinamento do modelo estão descritos pela Figura 7, seguindo estritamente as definições do artigo</w:t>
+        <w:t xml:space="preserve"> Os valores dos parâmetros utilizados para o treinamento do modelo estão descritos pela Figura </w:t>
+      </w:r>
+      <w:r>
+        <w:t>5</w:t>
+      </w:r>
+      <w:r>
+        <w:t>, seguindo estritamente as definições do artigo</w:t>
       </w:r>
     </w:p>
     <w:p>
@@ -2227,7 +2259,7 @@
           <w:sz w:val="18"/>
           <w:szCs w:val="18"/>
         </w:rPr>
-        <w:t>7</w:t>
+        <w:t>5</w:t>
       </w:r>
       <w:r>
         <w:rPr>
@@ -2452,7 +2484,7 @@
           <w:sz w:val="18"/>
           <w:szCs w:val="18"/>
         </w:rPr>
-        <w:t>8</w:t>
+        <w:t>6</w:t>
       </w:r>
       <w:r>
         <w:rPr>
@@ -3017,7 +3049,14 @@
           <w:sz w:val="18"/>
           <w:szCs w:val="18"/>
         </w:rPr>
-        <w:t xml:space="preserve"> 9</w:t>
+        <w:t xml:space="preserve"> </w:t>
+      </w:r>
+      <w:r>
+        <w:rPr>
+          <w:sz w:val="18"/>
+          <w:szCs w:val="18"/>
+        </w:rPr>
+        <w:t>7</w:t>
       </w:r>
     </w:p>
     <w:p>
@@ -3208,16 +3247,16 @@
       </w:r>
       <w:proofErr w:type="spellEnd"/>
       <w:r>
-        <w:t>, a qual é descrita nas Figuras 1</w:t>
-      </w:r>
-      <w:r>
-        <w:t>0</w:t>
+        <w:t xml:space="preserve">, a qual é descrita nas Figuras </w:t>
+      </w:r>
+      <w:r>
+        <w:t>8</w:t>
       </w:r>
       <w:r>
         <w:t xml:space="preserve"> e </w:t>
       </w:r>
       <w:r>
-        <w:t>11</w:t>
+        <w:t>9</w:t>
       </w:r>
       <w:r>
         <w:t xml:space="preserve"> exibidas a seguir:</w:t>
@@ -3245,14 +3284,14 @@
           <w:sz w:val="18"/>
           <w:szCs w:val="18"/>
         </w:rPr>
-        <w:t>Figura 1</w:t>
-      </w:r>
-      <w:r>
-        <w:rPr>
-          <w:sz w:val="18"/>
-          <w:szCs w:val="18"/>
-        </w:rPr>
-        <w:t>0</w:t>
+        <w:t xml:space="preserve">Figura </w:t>
+      </w:r>
+      <w:r>
+        <w:rPr>
+          <w:sz w:val="18"/>
+          <w:szCs w:val="18"/>
+        </w:rPr>
+        <w:t>8</w:t>
       </w:r>
       <w:r>
         <w:rPr>
@@ -3383,7 +3422,7 @@
           <w:sz w:val="18"/>
           <w:szCs w:val="18"/>
         </w:rPr>
-        <w:t>11</w:t>
+        <w:t>9</w:t>
       </w:r>
       <w:r>
         <w:rPr>
@@ -3530,7 +3569,7 @@
         <w:t xml:space="preserve">As definições estruturais da arquitetura ResNet-50 seguem fielmente às especificações descritas pelos autores, conforme é exibido pela figura </w:t>
       </w:r>
       <w:r>
-        <w:t>12</w:t>
+        <w:t>10</w:t>
       </w:r>
       <w:r>
         <w:t>:</w:t>
@@ -3565,7 +3604,7 @@
           <w:sz w:val="18"/>
           <w:szCs w:val="18"/>
         </w:rPr>
-        <w:t>12</w:t>
+        <w:t>10</w:t>
       </w:r>
       <w:r>
         <w:rPr>
@@ -3851,7 +3890,7 @@
         <w:t xml:space="preserve"> o artigo deixa explicito que o treinamento foi aplicado para 600K interações, a Figuras </w:t>
       </w:r>
       <w:r>
-        <w:t>13</w:t>
+        <w:t>11</w:t>
       </w:r>
       <w:r>
         <w:t xml:space="preserve"> a seguir explicam como é feita a conversão das iterações em épocas.</w:t>
@@ -3924,7 +3963,7 @@
           <w:sz w:val="18"/>
           <w:szCs w:val="18"/>
         </w:rPr>
-        <w:t>13</w:t>
+        <w:t>11</w:t>
       </w:r>
       <w:r>
         <w:rPr>
@@ -4051,7 +4090,7 @@
           <w:sz w:val="18"/>
           <w:szCs w:val="18"/>
         </w:rPr>
-        <w:t>15</w:t>
+        <w:t>12</w:t>
       </w:r>
       <w:r>
         <w:rPr>
@@ -4393,7 +4432,14 @@
           <w:sz w:val="18"/>
           <w:szCs w:val="18"/>
         </w:rPr>
-        <w:t xml:space="preserve"> 16</w:t>
+        <w:t xml:space="preserve"> </w:t>
+      </w:r>
+      <w:r>
+        <w:rPr>
+          <w:sz w:val="18"/>
+          <w:szCs w:val="18"/>
+        </w:rPr>
+        <w:t>13</w:t>
       </w:r>
       <w:r>
         <w:rPr>
@@ -4634,7 +4680,14 @@
           <w:sz w:val="18"/>
           <w:szCs w:val="18"/>
         </w:rPr>
-        <w:t xml:space="preserve"> 17</w:t>
+        <w:t xml:space="preserve"> </w:t>
+      </w:r>
+      <w:r>
+        <w:rPr>
+          <w:sz w:val="18"/>
+          <w:szCs w:val="18"/>
+        </w:rPr>
+        <w:t>14</w:t>
       </w:r>
       <w:r>
         <w:rPr>
@@ -4857,7 +4910,14 @@
           <w:sz w:val="18"/>
           <w:szCs w:val="18"/>
         </w:rPr>
-        <w:t xml:space="preserve"> 18</w:t>
+        <w:t xml:space="preserve"> </w:t>
+      </w:r>
+      <w:r>
+        <w:rPr>
+          <w:sz w:val="18"/>
+          <w:szCs w:val="18"/>
+        </w:rPr>
+        <w:t>15</w:t>
       </w:r>
       <w:r>
         <w:rPr>
@@ -5278,7 +5338,7 @@
         <w:t xml:space="preserve"> é basicamente uma lista de exemplos serializados, onde cada exemplo contém features, descritas pela Figura </w:t>
       </w:r>
       <w:r>
-        <w:t>19</w:t>
+        <w:t>16</w:t>
       </w:r>
       <w:r>
         <w:t>:</w:t>
@@ -5306,7 +5366,14 @@
           <w:sz w:val="18"/>
           <w:szCs w:val="18"/>
         </w:rPr>
-        <w:t xml:space="preserve"> 19</w:t>
+        <w:t xml:space="preserve"> </w:t>
+      </w:r>
+      <w:r>
+        <w:rPr>
+          <w:sz w:val="18"/>
+          <w:szCs w:val="18"/>
+        </w:rPr>
+        <w:t>16</w:t>
       </w:r>
       <w:r>
         <w:rPr>
@@ -5468,7 +5535,13 @@
         <w:jc w:val="both"/>
       </w:pPr>
       <w:r>
-        <w:t xml:space="preserve">A figura 20 apresenta uma tabela com uma relação estimada entre o tamanho e complexidade da base de dados com a conversão prévia para </w:t>
+        <w:t xml:space="preserve">A figura </w:t>
+      </w:r>
+      <w:r>
+        <w:t>17</w:t>
+      </w:r>
+      <w:r>
+        <w:t xml:space="preserve"> apresenta uma tabela com uma relação estimada entre o tamanho e complexidade da base de dados com a conversão prévia para </w:t>
       </w:r>
       <w:proofErr w:type="spellStart"/>
       <w:r>
@@ -5518,7 +5591,14 @@
           <w:sz w:val="18"/>
           <w:szCs w:val="18"/>
         </w:rPr>
-        <w:t xml:space="preserve"> 20</w:t>
+        <w:t xml:space="preserve"> </w:t>
+      </w:r>
+      <w:r>
+        <w:rPr>
+          <w:sz w:val="18"/>
+          <w:szCs w:val="18"/>
+        </w:rPr>
+        <w:t>17</w:t>
       </w:r>
       <w:r>
         <w:rPr>
@@ -7059,7 +7139,7 @@
         <w:t xml:space="preserve">Parâmetros utilizados: Tanto as configurações voltadas para o carregamento dos dados, quanto as configurações exigidas pela arquitetura Vision Transformers estão descritas na Figura </w:t>
       </w:r>
       <w:r>
-        <w:t>21</w:t>
+        <w:t>18</w:t>
       </w:r>
       <w:r>
         <w:t>.</w:t>
@@ -7097,7 +7177,7 @@
           <w:sz w:val="18"/>
           <w:szCs w:val="18"/>
         </w:rPr>
-        <w:t>21</w:t>
+        <w:t>18</w:t>
       </w:r>
       <w:r>
         <w:rPr>
@@ -7366,7 +7446,23 @@
           <w:sz w:val="18"/>
           <w:szCs w:val="18"/>
         </w:rPr>
-        <w:t>Figura 22: Analise da perda para a primeira época</w:t>
+        <w:t xml:space="preserve">Figura </w:t>
+      </w:r>
+      <w:r>
+        <w:rPr>
+          <w:color w:val="538135" w:themeColor="accent6" w:themeShade="BF"/>
+          <w:sz w:val="18"/>
+          <w:szCs w:val="18"/>
+        </w:rPr>
+        <w:t>19</w:t>
+      </w:r>
+      <w:r>
+        <w:rPr>
+          <w:color w:val="538135" w:themeColor="accent6" w:themeShade="BF"/>
+          <w:sz w:val="18"/>
+          <w:szCs w:val="18"/>
+        </w:rPr>
+        <w:t>: Analise da perda para a primeira época</w:t>
       </w:r>
     </w:p>
     <w:p>
@@ -7508,7 +7604,7 @@
         <w:t xml:space="preserve">A evolução apresentada pela Figura </w:t>
       </w:r>
       <w:r>
-        <w:t>23</w:t>
+        <w:t>20</w:t>
       </w:r>
       <w:r>
         <w:t xml:space="preserve"> </w:t>
@@ -7552,7 +7648,14 @@
           <w:sz w:val="18"/>
           <w:szCs w:val="18"/>
         </w:rPr>
-        <w:t xml:space="preserve"> 23</w:t>
+        <w:t xml:space="preserve"> </w:t>
+      </w:r>
+      <w:r>
+        <w:rPr>
+          <w:sz w:val="18"/>
+          <w:szCs w:val="18"/>
+        </w:rPr>
+        <w:t>20</w:t>
       </w:r>
       <w:r>
         <w:rPr>
@@ -7729,7 +7832,14 @@
           <w:sz w:val="18"/>
           <w:szCs w:val="18"/>
         </w:rPr>
-        <w:t xml:space="preserve"> 24</w:t>
+        <w:t xml:space="preserve"> </w:t>
+      </w:r>
+      <w:r>
+        <w:rPr>
+          <w:sz w:val="18"/>
+          <w:szCs w:val="18"/>
+        </w:rPr>
+        <w:t>21</w:t>
       </w:r>
       <w:r>
         <w:rPr>
@@ -7966,7 +8076,7 @@
           <w:sz w:val="18"/>
           <w:szCs w:val="18"/>
         </w:rPr>
-        <w:t>25</w:t>
+        <w:t>22</w:t>
       </w:r>
       <w:r>
         <w:rPr>
@@ -8469,7 +8579,7 @@
           <w:sz w:val="18"/>
           <w:szCs w:val="18"/>
         </w:rPr>
-        <w:t>26</w:t>
+        <w:t>23</w:t>
       </w:r>
       <w:r>
         <w:rPr>
@@ -8679,7 +8789,7 @@
           <w:sz w:val="18"/>
           <w:szCs w:val="18"/>
         </w:rPr>
-        <w:t>27</w:t>
+        <w:t>24</w:t>
       </w:r>
       <w:r>
         <w:rPr>
@@ -8950,9 +9060,18 @@
           <w:i/>
           <w:iCs/>
         </w:rPr>
-        <w:t>tf.data.Dataset</w:t>
-      </w:r>
-      <w:proofErr w:type="spellEnd"/>
+        <w:t>tf.</w:t>
+      </w:r>
+      <w:proofErr w:type="gramStart"/>
+      <w:r>
+        <w:rPr>
+          <w:i/>
+          <w:iCs/>
+        </w:rPr>
+        <w:t>data.Dataset</w:t>
+      </w:r>
+      <w:proofErr w:type="spellEnd"/>
+      <w:proofErr w:type="gramEnd"/>
       <w:r>
         <w:t xml:space="preserve"> válidos</w:t>
       </w:r>
@@ -9311,7 +9430,13 @@
       </w:r>
       <w:proofErr w:type="spellEnd"/>
       <w:r>
-        <w:t xml:space="preserve"> específico da arquitetura. Agora, a estrutura esperada segue conforme ilustrado pela figura 28.</w:t>
+        <w:t xml:space="preserve"> específico da arquitetura. Agora, a estrutura esperada segue conforme ilustrado pela figura </w:t>
+      </w:r>
+      <w:r>
+        <w:t>25</w:t>
+      </w:r>
+      <w:r>
+        <w:t>.</w:t>
       </w:r>
     </w:p>
     <w:p>
@@ -9346,7 +9471,7 @@
           <w:sz w:val="18"/>
           <w:szCs w:val="18"/>
         </w:rPr>
-        <w:t>28</w:t>
+        <w:t>25</w:t>
       </w:r>
       <w:r>
         <w:rPr>
@@ -9587,7 +9712,7 @@
         <w:t xml:space="preserve"> de treino diminui progressivamente de aproximadamente 2.72 para 1.99 ao longo das cinco épocas (Figura </w:t>
       </w:r>
       <w:r>
-        <w:t>29</w:t>
+        <w:t>26</w:t>
       </w:r>
       <w:r>
         <w:t xml:space="preserve">), enquanto o </w:t>
@@ -9601,7 +9726,7 @@
         <w:t xml:space="preserve"> de validação segue uma trajetória semelhante, caindo de cerca de 2.62 para 1.93 (Figura </w:t>
       </w:r>
       <w:r>
-        <w:t>30</w:t>
+        <w:t>27</w:t>
       </w:r>
       <w:r>
         <w:t>). Essa proximidade entre as curvas é um sinal claro de que o modelo está aprendendo padrões reais dos dados.</w:t>
@@ -9642,7 +9767,7 @@
           <w:sz w:val="18"/>
           <w:szCs w:val="18"/>
         </w:rPr>
-        <w:t>29</w:t>
+        <w:t>26</w:t>
       </w:r>
       <w:r>
         <w:rPr>
@@ -9801,7 +9926,7 @@
           <w:sz w:val="18"/>
           <w:szCs w:val="18"/>
         </w:rPr>
-        <w:t>30</w:t>
+        <w:t>27</w:t>
       </w:r>
       <w:r>
         <w:rPr>
@@ -10121,7 +10246,13 @@
       </w:r>
       <w:proofErr w:type="spellEnd"/>
       <w:r>
-        <w:t xml:space="preserve"> específico da arquitetura. Agora, a estrutura esperada segue conforme ilustrado pela figura 28.</w:t>
+        <w:t xml:space="preserve"> específico da arquitetura. Agora, a estrutura esperada segue conforme ilustrado pela figura </w:t>
+      </w:r>
+      <w:r>
+        <w:t>25</w:t>
+      </w:r>
+      <w:r>
+        <w:t>.</w:t>
       </w:r>
       <w:bookmarkEnd w:id="2"/>
     </w:p>
@@ -10285,14 +10416,30 @@
           <w:i/>
           <w:iCs/>
         </w:rPr>
-        <w:t xml:space="preserve"> 1</w:t>
-      </w:r>
-      <w:r>
-        <w:rPr>
-          <w:i/>
-          <w:iCs/>
-        </w:rPr>
-        <w:t>)\Experimento 4 -</w:t>
+        <w:t xml:space="preserve"> </w:t>
+      </w:r>
+      <w:proofErr w:type="gramStart"/>
+      <w:r>
+        <w:rPr>
+          <w:i/>
+          <w:iCs/>
+        </w:rPr>
+        <w:t>1</w:t>
+      </w:r>
+      <w:r>
+        <w:rPr>
+          <w:i/>
+          <w:iCs/>
+        </w:rPr>
+        <w:t>)\</w:t>
+      </w:r>
+      <w:proofErr w:type="gramEnd"/>
+      <w:r>
+        <w:rPr>
+          <w:i/>
+          <w:iCs/>
+        </w:rPr>
+        <w:t>Experimento 4 -</w:t>
       </w:r>
       <w:proofErr w:type="spellStart"/>
       <w:r>
@@ -10609,7 +10756,14 @@
           <w:sz w:val="18"/>
           <w:szCs w:val="18"/>
         </w:rPr>
-        <w:t xml:space="preserve"> 31</w:t>
+        <w:t xml:space="preserve"> </w:t>
+      </w:r>
+      <w:r>
+        <w:rPr>
+          <w:sz w:val="18"/>
+          <w:szCs w:val="18"/>
+        </w:rPr>
+        <w:t>28</w:t>
       </w:r>
       <w:r>
         <w:rPr>
@@ -10788,7 +10942,7 @@
         <w:t xml:space="preserve">média das acurácias por batch e não da acurácia global. A figura </w:t>
       </w:r>
       <w:r>
-        <w:t>32</w:t>
+        <w:t>29</w:t>
       </w:r>
       <w:r>
         <w:t xml:space="preserve"> demonstra a correção aplicada, de modo que a acurácia seja calculada como (acertos totais) / (amostras totais)</w:t>
@@ -10831,7 +10985,14 @@
           <w:sz w:val="18"/>
           <w:szCs w:val="18"/>
         </w:rPr>
-        <w:t xml:space="preserve"> 32</w:t>
+        <w:t xml:space="preserve"> </w:t>
+      </w:r>
+      <w:r>
+        <w:rPr>
+          <w:sz w:val="18"/>
+          <w:szCs w:val="18"/>
+        </w:rPr>
+        <w:t>29</w:t>
       </w:r>
       <w:r>
         <w:rPr>
@@ -10918,7 +11079,13 @@
         <w:t xml:space="preserve">O resultado de validação de um novo teste de sanidade </w:t>
       </w:r>
       <w:r>
-        <w:t xml:space="preserve">é demonstrado a seguir pela figura 33. </w:t>
+        <w:t xml:space="preserve">é demonstrado a seguir pela figura </w:t>
+      </w:r>
+      <w:r>
+        <w:t>30</w:t>
+      </w:r>
+      <w:r>
+        <w:t xml:space="preserve">. </w:t>
       </w:r>
     </w:p>
     <w:p>
@@ -10946,7 +11113,14 @@
           <w:sz w:val="18"/>
           <w:szCs w:val="18"/>
         </w:rPr>
-        <w:t xml:space="preserve"> 33</w:t>
+        <w:t xml:space="preserve"> </w:t>
+      </w:r>
+      <w:r>
+        <w:rPr>
+          <w:sz w:val="18"/>
+          <w:szCs w:val="18"/>
+        </w:rPr>
+        <w:t>30</w:t>
       </w:r>
       <w:r>
         <w:rPr>
@@ -11470,7 +11644,21 @@
           <w:sz w:val="18"/>
           <w:szCs w:val="18"/>
         </w:rPr>
-        <w:t xml:space="preserve"> 34: Resultado das épocas iniciais de treinamento</w:t>
+        <w:t xml:space="preserve"> </w:t>
+      </w:r>
+      <w:r>
+        <w:rPr>
+          <w:sz w:val="18"/>
+          <w:szCs w:val="18"/>
+        </w:rPr>
+        <w:t>31</w:t>
+      </w:r>
+      <w:r>
+        <w:rPr>
+          <w:sz w:val="18"/>
+          <w:szCs w:val="18"/>
+        </w:rPr>
+        <w:t>: Resultado das épocas iniciais de treinamento</w:t>
       </w:r>
     </w:p>
     <w:p>
@@ -11795,14 +11983,14 @@
           <w:sz w:val="18"/>
           <w:szCs w:val="18"/>
         </w:rPr>
-        <w:t xml:space="preserve"> 3</w:t>
-      </w:r>
-      <w:r>
-        <w:rPr>
-          <w:sz w:val="18"/>
-          <w:szCs w:val="18"/>
-        </w:rPr>
-        <w:t>5</w:t>
+        <w:t xml:space="preserve"> </w:t>
+      </w:r>
+      <w:r>
+        <w:rPr>
+          <w:sz w:val="18"/>
+          <w:szCs w:val="18"/>
+        </w:rPr>
+        <w:t>32</w:t>
       </w:r>
       <w:r>
         <w:rPr>
@@ -12015,14 +12203,14 @@
           <w:sz w:val="18"/>
           <w:szCs w:val="18"/>
         </w:rPr>
-        <w:t xml:space="preserve"> 3</w:t>
-      </w:r>
-      <w:r>
-        <w:rPr>
-          <w:sz w:val="18"/>
-          <w:szCs w:val="18"/>
-        </w:rPr>
-        <w:t>6</w:t>
+        <w:t xml:space="preserve"> </w:t>
+      </w:r>
+      <w:r>
+        <w:rPr>
+          <w:sz w:val="18"/>
+          <w:szCs w:val="18"/>
+        </w:rPr>
+        <w:t>33</w:t>
       </w:r>
       <w:r>
         <w:rPr>
@@ -12149,7 +12337,13 @@
         <w:jc w:val="both"/>
       </w:pPr>
       <w:r>
-        <w:t xml:space="preserve">Na época 31, o learning rate cai de 0.1 → 0.01, exatamente como definido no </w:t>
+        <w:t xml:space="preserve">Na época </w:t>
+      </w:r>
+      <w:r>
+        <w:t>34</w:t>
+      </w:r>
+      <w:r>
+        <w:t xml:space="preserve">, o learning rate cai de 0.1 → 0.01, exatamente como definido no </w:t>
       </w:r>
       <w:proofErr w:type="spellStart"/>
       <w:r>
@@ -12262,14 +12456,14 @@
           <w:sz w:val="18"/>
           <w:szCs w:val="18"/>
         </w:rPr>
-        <w:t xml:space="preserve"> 3</w:t>
-      </w:r>
-      <w:r>
-        <w:rPr>
-          <w:sz w:val="18"/>
-          <w:szCs w:val="18"/>
-        </w:rPr>
-        <w:t>7</w:t>
+        <w:t xml:space="preserve"> </w:t>
+      </w:r>
+      <w:r>
+        <w:rPr>
+          <w:sz w:val="18"/>
+          <w:szCs w:val="18"/>
+        </w:rPr>
+        <w:t>34</w:t>
       </w:r>
       <w:r>
         <w:rPr>
@@ -12733,7 +12927,21 @@
           <w:sz w:val="18"/>
           <w:szCs w:val="18"/>
         </w:rPr>
-        <w:t xml:space="preserve"> 38: Gráfico da perda de treino</w:t>
+        <w:t xml:space="preserve"> </w:t>
+      </w:r>
+      <w:r>
+        <w:rPr>
+          <w:sz w:val="18"/>
+          <w:szCs w:val="18"/>
+        </w:rPr>
+        <w:t>35</w:t>
+      </w:r>
+      <w:r>
+        <w:rPr>
+          <w:sz w:val="18"/>
+          <w:szCs w:val="18"/>
+        </w:rPr>
+        <w:t>: Gráfico da perda de treino</w:t>
       </w:r>
     </w:p>
     <w:p>
@@ -12743,6 +12951,9 @@
         <w:jc w:val="center"/>
       </w:pPr>
       <w:r>
+        <w:rPr>
+          <w:noProof/>
+        </w:rPr>
         <w:drawing>
           <wp:inline distT="0" distB="0" distL="0" distR="0" wp14:anchorId="7FD2A8F8" wp14:editId="4882399E">
             <wp:extent cx="4001595" cy="2798859"/>
@@ -12848,7 +13059,21 @@
           <w:sz w:val="18"/>
           <w:szCs w:val="18"/>
         </w:rPr>
-        <w:t xml:space="preserve"> 40: Gráfico da acurácia de treino</w:t>
+        <w:t xml:space="preserve"> </w:t>
+      </w:r>
+      <w:r>
+        <w:rPr>
+          <w:sz w:val="18"/>
+          <w:szCs w:val="18"/>
+        </w:rPr>
+        <w:t>36:</w:t>
+      </w:r>
+      <w:r>
+        <w:rPr>
+          <w:sz w:val="18"/>
+          <w:szCs w:val="18"/>
+        </w:rPr>
+        <w:t xml:space="preserve"> Gráfico da acurácia de treino</w:t>
       </w:r>
     </w:p>
     <w:p>
@@ -12858,6 +13083,9 @@
         <w:jc w:val="center"/>
       </w:pPr>
       <w:r>
+        <w:rPr>
+          <w:noProof/>
+        </w:rPr>
         <w:drawing>
           <wp:inline distT="0" distB="0" distL="0" distR="0" wp14:anchorId="0DAC78BC" wp14:editId="62E0D5A5">
             <wp:extent cx="3609893" cy="2305849"/>
@@ -13648,7 +13876,21 @@
           <w:sz w:val="18"/>
           <w:szCs w:val="18"/>
         </w:rPr>
-        <w:t xml:space="preserve">Figura 42: Alteração em código do LR e </w:t>
+        <w:t xml:space="preserve">Figura </w:t>
+      </w:r>
+      <w:r>
+        <w:rPr>
+          <w:sz w:val="18"/>
+          <w:szCs w:val="18"/>
+        </w:rPr>
+        <w:t>37</w:t>
+      </w:r>
+      <w:r>
+        <w:rPr>
+          <w:sz w:val="18"/>
+          <w:szCs w:val="18"/>
+        </w:rPr>
+        <w:t xml:space="preserve">: Alteração em código do LR e </w:t>
       </w:r>
       <w:proofErr w:type="spellStart"/>
       <w:r>
@@ -13730,14 +13972,14 @@
           <w:sz w:val="18"/>
           <w:szCs w:val="18"/>
         </w:rPr>
-        <w:t>Figura 4</w:t>
-      </w:r>
-      <w:r>
-        <w:rPr>
-          <w:sz w:val="18"/>
-          <w:szCs w:val="18"/>
-        </w:rPr>
-        <w:t>3</w:t>
+        <w:t xml:space="preserve">Figura </w:t>
+      </w:r>
+      <w:r>
+        <w:rPr>
+          <w:sz w:val="18"/>
+          <w:szCs w:val="18"/>
+        </w:rPr>
+        <w:t>38</w:t>
       </w:r>
       <w:r>
         <w:rPr>
@@ -14000,14 +14242,14 @@
           <w:sz w:val="18"/>
           <w:szCs w:val="18"/>
         </w:rPr>
-        <w:t>Figura 4</w:t>
-      </w:r>
-      <w:r>
-        <w:rPr>
-          <w:sz w:val="18"/>
-          <w:szCs w:val="18"/>
-        </w:rPr>
-        <w:t>4</w:t>
+        <w:t xml:space="preserve">Figura </w:t>
+      </w:r>
+      <w:r>
+        <w:rPr>
+          <w:sz w:val="18"/>
+          <w:szCs w:val="18"/>
+        </w:rPr>
+        <w:t>39</w:t>
       </w:r>
       <w:r>
         <w:rPr>
@@ -14130,14 +14372,14 @@
           <w:sz w:val="18"/>
           <w:szCs w:val="18"/>
         </w:rPr>
-        <w:t>Figura 4</w:t>
-      </w:r>
-      <w:r>
-        <w:rPr>
-          <w:sz w:val="18"/>
-          <w:szCs w:val="18"/>
-        </w:rPr>
-        <w:t>5</w:t>
+        <w:t xml:space="preserve">Figura </w:t>
+      </w:r>
+      <w:r>
+        <w:rPr>
+          <w:sz w:val="18"/>
+          <w:szCs w:val="18"/>
+        </w:rPr>
+        <w:t>40</w:t>
       </w:r>
       <w:r>
         <w:rPr>
@@ -14455,14 +14697,14 @@
           <w:szCs w:val="18"/>
         </w:rPr>
         <w:lastRenderedPageBreak/>
-        <w:t>Figura 4</w:t>
-      </w:r>
-      <w:r>
-        <w:rPr>
-          <w:sz w:val="18"/>
-          <w:szCs w:val="18"/>
-        </w:rPr>
-        <w:t>5</w:t>
+        <w:t xml:space="preserve">Figura </w:t>
+      </w:r>
+      <w:r>
+        <w:rPr>
+          <w:sz w:val="18"/>
+          <w:szCs w:val="18"/>
+        </w:rPr>
+        <w:t>41</w:t>
       </w:r>
       <w:r>
         <w:rPr>
@@ -15164,14 +15406,14 @@
           <w:sz w:val="18"/>
           <w:szCs w:val="18"/>
         </w:rPr>
-        <w:t>Figura 4</w:t>
-      </w:r>
-      <w:r>
-        <w:rPr>
-          <w:sz w:val="18"/>
-          <w:szCs w:val="18"/>
-        </w:rPr>
-        <w:t>7</w:t>
+        <w:t xml:space="preserve">Figura </w:t>
+      </w:r>
+      <w:r>
+        <w:rPr>
+          <w:sz w:val="18"/>
+          <w:szCs w:val="18"/>
+        </w:rPr>
+        <w:t>42</w:t>
       </w:r>
       <w:r>
         <w:rPr>
@@ -15380,14 +15622,14 @@
           <w:sz w:val="18"/>
           <w:szCs w:val="18"/>
         </w:rPr>
-        <w:t>Figura 4</w:t>
-      </w:r>
-      <w:r>
-        <w:rPr>
-          <w:sz w:val="18"/>
-          <w:szCs w:val="18"/>
-        </w:rPr>
-        <w:t>8</w:t>
+        <w:t xml:space="preserve">Figura </w:t>
+      </w:r>
+      <w:r>
+        <w:rPr>
+          <w:sz w:val="18"/>
+          <w:szCs w:val="18"/>
+        </w:rPr>
+        <w:t>43</w:t>
       </w:r>
       <w:r>
         <w:rPr>
@@ -15688,14 +15930,14 @@
           <w:sz w:val="18"/>
           <w:szCs w:val="18"/>
         </w:rPr>
-        <w:t>Figura 4</w:t>
-      </w:r>
-      <w:r>
-        <w:rPr>
-          <w:sz w:val="18"/>
-          <w:szCs w:val="18"/>
-        </w:rPr>
-        <w:t>9</w:t>
+        <w:t xml:space="preserve">Figura </w:t>
+      </w:r>
+      <w:r>
+        <w:rPr>
+          <w:sz w:val="18"/>
+          <w:szCs w:val="18"/>
+        </w:rPr>
+        <w:t>44</w:t>
       </w:r>
       <w:r>
         <w:rPr>
@@ -16172,7 +16414,7 @@
           <w:sz w:val="18"/>
           <w:szCs w:val="18"/>
         </w:rPr>
-        <w:t>50</w:t>
+        <w:t>45</w:t>
       </w:r>
       <w:r>
         <w:rPr>
@@ -16317,7 +16559,7 @@
           <w:sz w:val="18"/>
           <w:szCs w:val="18"/>
         </w:rPr>
-        <w:t>51</w:t>
+        <w:t>46</w:t>
       </w:r>
       <w:r>
         <w:rPr>
@@ -16414,7 +16656,52 @@
           <w:i/>
           <w:iCs/>
         </w:rPr>
-        <w:t>OBS – Disposição das colunas referentes às imagens 51,52,53</w:t>
+        <w:t xml:space="preserve">OBS – Disposição das colunas referentes às imagens </w:t>
+      </w:r>
+      <w:r>
+        <w:rPr>
+          <w:b/>
+          <w:bCs/>
+          <w:i/>
+          <w:iCs/>
+        </w:rPr>
+        <w:t>47</w:t>
+      </w:r>
+      <w:r>
+        <w:rPr>
+          <w:b/>
+          <w:bCs/>
+          <w:i/>
+          <w:iCs/>
+        </w:rPr>
+        <w:t>,</w:t>
+      </w:r>
+      <w:r>
+        <w:rPr>
+          <w:b/>
+          <w:bCs/>
+          <w:i/>
+          <w:iCs/>
+        </w:rPr>
+        <w:t>48</w:t>
+      </w:r>
+      <w:r>
+        <w:rPr>
+          <w:b/>
+          <w:bCs/>
+          <w:i/>
+          <w:iCs/>
+        </w:rPr>
+        <w:t>,</w:t>
+      </w:r>
+      <w:r>
+        <w:rPr>
+          <w:b/>
+          <w:bCs/>
+          <w:i/>
+          <w:iCs/>
+        </w:rPr>
+        <w:t>49</w:t>
       </w:r>
     </w:p>
     <w:tbl>
@@ -16576,7 +16863,7 @@
           <w:sz w:val="18"/>
           <w:szCs w:val="18"/>
         </w:rPr>
-        <w:t>51</w:t>
+        <w:t>47</w:t>
       </w:r>
       <w:r>
         <w:rPr>
@@ -16692,7 +16979,7 @@
           <w:sz w:val="18"/>
           <w:szCs w:val="18"/>
         </w:rPr>
-        <w:t>52</w:t>
+        <w:t>48</w:t>
       </w:r>
       <w:r>
         <w:rPr>
@@ -16856,7 +17143,7 @@
           <w:sz w:val="18"/>
           <w:szCs w:val="18"/>
         </w:rPr>
-        <w:t>53</w:t>
+        <w:t>49</w:t>
       </w:r>
       <w:r>
         <w:rPr>
@@ -17103,16 +17390,16 @@
           <w:iCs/>
         </w:rPr>
         <w:lastRenderedPageBreak/>
-        <w:t>OBS – Disposição das colunas referentes às imagens 5</w:t>
-      </w:r>
-      <w:r>
-        <w:rPr>
-          <w:b/>
-          <w:bCs/>
-          <w:i/>
-          <w:iCs/>
-        </w:rPr>
-        <w:t>4,55</w:t>
+        <w:t xml:space="preserve">OBS – Disposição das colunas referentes às imagens </w:t>
+      </w:r>
+      <w:r>
+        <w:rPr>
+          <w:b/>
+          <w:bCs/>
+          <w:i/>
+          <w:iCs/>
+        </w:rPr>
+        <w:t>50, 51</w:t>
       </w:r>
     </w:p>
     <w:tbl>
@@ -17243,7 +17530,7 @@
           <w:sz w:val="18"/>
           <w:szCs w:val="18"/>
         </w:rPr>
-        <w:t>54</w:t>
+        <w:t>50</w:t>
       </w:r>
       <w:r>
         <w:rPr>
@@ -17345,7 +17632,7 @@
           <w:sz w:val="18"/>
           <w:szCs w:val="18"/>
         </w:rPr>
-        <w:t>55</w:t>
+        <w:t>51</w:t>
       </w:r>
       <w:r>
         <w:rPr>
@@ -17592,35 +17879,7 @@
           <w:b/>
           <w:bCs/>
         </w:rPr>
-        <w:t xml:space="preserve">VERIFICAR INFLUENCIA </w:t>
-      </w:r>
-      <w:r>
-        <w:rPr>
-          <w:b/>
-          <w:bCs/>
-        </w:rPr>
-        <w:t>DE UMA</w:t>
-      </w:r>
-      <w:r>
-        <w:rPr>
-          <w:b/>
-          <w:bCs/>
-        </w:rPr>
-        <w:t xml:space="preserve"> VARIANTE</w:t>
-      </w:r>
-      <w:r>
-        <w:rPr>
-          <w:b/>
-          <w:bCs/>
-        </w:rPr>
-        <w:t xml:space="preserve"> AINDA MAIS RASA QUE A</w:t>
-      </w:r>
-      <w:r>
-        <w:rPr>
-          <w:b/>
-          <w:bCs/>
-        </w:rPr>
-        <w:t xml:space="preserve"> RESNET-18:</w:t>
+        <w:t>VERIFICAR INFLUENCIA DE UMA VARIANTE AINDA MAIS RASA QUE A RESNET-18:</w:t>
       </w:r>
     </w:p>
     <w:p>
@@ -17668,21 +17927,7 @@
           <w:b/>
           <w:bCs/>
         </w:rPr>
-        <w:t>Arquitetura ResNet-10</w:t>
-      </w:r>
-      <w:r>
-        <w:rPr>
-          <w:b/>
-          <w:bCs/>
-        </w:rPr>
-        <w:t>:</w:t>
-      </w:r>
-      <w:r>
-        <w:rPr>
-          <w:b/>
-          <w:bCs/>
-        </w:rPr>
-        <w:t xml:space="preserve"> </w:t>
+        <w:t xml:space="preserve">Arquitetura ResNet-10: </w:t>
       </w:r>
       <w:r>
         <w:t>ambas</w:t>
@@ -17760,15 +18005,7 @@
           <w:iCs/>
           <w:color w:val="538135" w:themeColor="accent6" w:themeShade="BF"/>
         </w:rPr>
-        <w:t xml:space="preserve"> </w:t>
-      </w:r>
-      <w:r>
-        <w:rPr>
-          <w:i/>
-          <w:iCs/>
-          <w:color w:val="538135" w:themeColor="accent6" w:themeShade="BF"/>
-        </w:rPr>
-        <w:t>a ResNet-18 possui aproximadamente 11,2 milhões de parâmetros treináveis, enquanto a ResNet-10 possui cerca de 4,9 milhões. Isso significa que a ResNet-18 apresenta mais que o dobro da capacidade representacional da ResNet-10.</w:t>
+        <w:t xml:space="preserve"> a ResNet-18 possui aproximadamente 11,2 milhões de parâmetros treináveis, enquanto a ResNet-10 possui cerca de 4,9 milhões. Isso significa que a ResNet-18 apresenta mais que o dobro da capacidade representacional da ResNet-10.</w:t>
       </w:r>
     </w:p>
     <w:p>
@@ -17814,14 +18051,14 @@
           <w:sz w:val="18"/>
           <w:szCs w:val="18"/>
         </w:rPr>
-        <w:t>Figura 4</w:t>
-      </w:r>
-      <w:r>
-        <w:rPr>
-          <w:sz w:val="18"/>
-          <w:szCs w:val="18"/>
-        </w:rPr>
-        <w:t>9</w:t>
+        <w:t xml:space="preserve">Figura </w:t>
+      </w:r>
+      <w:r>
+        <w:rPr>
+          <w:sz w:val="18"/>
+          <w:szCs w:val="18"/>
+        </w:rPr>
+        <w:t>52</w:t>
       </w:r>
       <w:r>
         <w:rPr>
@@ -17838,6 +18075,9 @@
         <w:jc w:val="center"/>
       </w:pPr>
       <w:r>
+        <w:rPr>
+          <w:noProof/>
+        </w:rPr>
         <w:drawing>
           <wp:inline distT="0" distB="0" distL="0" distR="0" wp14:anchorId="30CE4981" wp14:editId="60C0C697">
             <wp:extent cx="1733384" cy="1631880"/>
@@ -18063,11 +18303,39 @@
     </w:p>
     <w:p>
       <w:pPr>
+        <w:spacing w:after="0"/>
+        <w:ind w:left="2160"/>
+        <w:jc w:val="center"/>
+        <w:rPr>
+          <w:sz w:val="18"/>
+          <w:szCs w:val="18"/>
+        </w:rPr>
+      </w:pPr>
+      <w:r>
+        <w:rPr>
+          <w:sz w:val="18"/>
+          <w:szCs w:val="18"/>
+        </w:rPr>
+        <w:t xml:space="preserve">Figura </w:t>
+      </w:r>
+      <w:r>
+        <w:rPr>
+          <w:sz w:val="18"/>
+          <w:szCs w:val="18"/>
+        </w:rPr>
+        <w:t>53</w:t>
+      </w:r>
+    </w:p>
+    <w:p>
+      <w:pPr>
         <w:pStyle w:val="PargrafodaLista"/>
         <w:ind w:left="708"/>
         <w:jc w:val="both"/>
       </w:pPr>
       <w:r>
+        <w:rPr>
+          <w:noProof/>
+        </w:rPr>
         <w:drawing>
           <wp:inline distT="0" distB="0" distL="0" distR="0" wp14:anchorId="0FB1FB1B" wp14:editId="6B717A76">
             <wp:extent cx="5400040" cy="3253740"/>
@@ -18285,6 +18553,659 @@
           <w:bCs/>
         </w:rPr>
       </w:pPr>
+      <w:r>
+        <w:rPr>
+          <w:b/>
+          <w:bCs/>
+        </w:rPr>
+        <w:t>EXPERIMENTO 12 (RESNET) – TESTE COM VARIANTE 50 APÓS AS MODIFICAÇÕES DE CARREGAMENTO DE DADOS</w:t>
+      </w:r>
+    </w:p>
+    <w:p>
+      <w:pPr>
+        <w:pStyle w:val="PargrafodaLista"/>
+        <w:ind w:left="1440"/>
+        <w:jc w:val="both"/>
+        <w:rPr>
+          <w:b/>
+          <w:bCs/>
+        </w:rPr>
+      </w:pPr>
+    </w:p>
+    <w:p>
+      <w:pPr>
+        <w:pStyle w:val="PargrafodaLista"/>
+        <w:ind w:left="1440"/>
+        <w:jc w:val="both"/>
+      </w:pPr>
+      <w:r>
+        <w:t xml:space="preserve">A ideia deste experimento é </w:t>
+      </w:r>
+      <w:r>
+        <w:t>verificar se</w:t>
+      </w:r>
+      <w:r>
+        <w:t>, após a modificação da forma de carregamento dos dados de entrada (Após o experimento 3),</w:t>
+      </w:r>
+      <w:r>
+        <w:t xml:space="preserve"> a ResNet-</w:t>
+      </w:r>
+      <w:r>
+        <w:t>50</w:t>
+      </w:r>
+      <w:r>
+        <w:t xml:space="preserve"> </w:t>
+      </w:r>
+      <w:r>
+        <w:t>continuava apresentando os resultados incoerentes.</w:t>
+      </w:r>
+    </w:p>
+    <w:p>
+      <w:pPr>
+        <w:pStyle w:val="PargrafodaLista"/>
+        <w:ind w:left="1440"/>
+        <w:jc w:val="both"/>
+        <w:rPr>
+          <w:b/>
+          <w:bCs/>
+        </w:rPr>
+      </w:pPr>
+    </w:p>
+    <w:p>
+      <w:pPr>
+        <w:pStyle w:val="PargrafodaLista"/>
+        <w:numPr>
+          <w:ilvl w:val="0"/>
+          <w:numId w:val="27"/>
+        </w:numPr>
+        <w:jc w:val="both"/>
+        <w:rPr>
+          <w:b/>
+          <w:bCs/>
+        </w:rPr>
+      </w:pPr>
+      <w:r>
+        <w:rPr>
+          <w:b/>
+          <w:bCs/>
+        </w:rPr>
+        <w:t>Configurações do Treinamento:</w:t>
+      </w:r>
+    </w:p>
+    <w:p>
+      <w:pPr>
+        <w:spacing w:after="0"/>
+        <w:ind w:left="2160"/>
+        <w:jc w:val="center"/>
+        <w:rPr>
+          <w:sz w:val="18"/>
+          <w:szCs w:val="18"/>
+        </w:rPr>
+      </w:pPr>
+      <w:r>
+        <w:rPr>
+          <w:sz w:val="18"/>
+          <w:szCs w:val="18"/>
+        </w:rPr>
+        <w:t xml:space="preserve">Figura </w:t>
+      </w:r>
+      <w:r>
+        <w:rPr>
+          <w:sz w:val="18"/>
+          <w:szCs w:val="18"/>
+        </w:rPr>
+        <w:t>54</w:t>
+      </w:r>
+      <w:r>
+        <w:rPr>
+          <w:sz w:val="18"/>
+          <w:szCs w:val="18"/>
+        </w:rPr>
+        <w:t>: Parâmetros de treinamento</w:t>
+      </w:r>
+    </w:p>
+    <w:p>
+      <w:pPr>
+        <w:pStyle w:val="PargrafodaLista"/>
+        <w:ind w:left="2520"/>
+        <w:jc w:val="center"/>
+      </w:pPr>
+      <w:r>
+        <w:drawing>
+          <wp:inline distT="0" distB="0" distL="0" distR="0" wp14:anchorId="643526C1" wp14:editId="20A46A1C">
+            <wp:extent cx="1916264" cy="2003008"/>
+            <wp:effectExtent l="0" t="0" r="8255" b="0"/>
+            <wp:docPr id="278370812" name="Imagem 1"/>
+            <wp:cNvGraphicFramePr>
+              <a:graphicFrameLocks xmlns:a="http://schemas.openxmlformats.org/drawingml/2006/main" noChangeAspect="1"/>
+            </wp:cNvGraphicFramePr>
+            <a:graphic xmlns:a="http://schemas.openxmlformats.org/drawingml/2006/main">
+              <a:graphicData uri="http://schemas.openxmlformats.org/drawingml/2006/picture">
+                <pic:pic xmlns:pic="http://schemas.openxmlformats.org/drawingml/2006/picture">
+                  <pic:nvPicPr>
+                    <pic:cNvPr id="278370812" name=""/>
+                    <pic:cNvPicPr/>
+                  </pic:nvPicPr>
+                  <pic:blipFill>
+                    <a:blip r:embed="rId61"/>
+                    <a:stretch>
+                      <a:fillRect/>
+                    </a:stretch>
+                  </pic:blipFill>
+                  <pic:spPr>
+                    <a:xfrm>
+                      <a:off x="0" y="0"/>
+                      <a:ext cx="1929075" cy="2016399"/>
+                    </a:xfrm>
+                    <a:prstGeom prst="rect">
+                      <a:avLst/>
+                    </a:prstGeom>
+                  </pic:spPr>
+                </pic:pic>
+              </a:graphicData>
+            </a:graphic>
+          </wp:inline>
+        </w:drawing>
+      </w:r>
+    </w:p>
+    <w:p>
+      <w:pPr>
+        <w:pStyle w:val="PargrafodaLista"/>
+        <w:ind w:left="2520"/>
+        <w:jc w:val="both"/>
+      </w:pPr>
+    </w:p>
+    <w:p>
+      <w:pPr>
+        <w:pStyle w:val="PargrafodaLista"/>
+        <w:numPr>
+          <w:ilvl w:val="0"/>
+          <w:numId w:val="19"/>
+        </w:numPr>
+      </w:pPr>
+      <w:r>
+        <w:rPr>
+          <w:b/>
+          <w:bCs/>
+        </w:rPr>
+        <w:t>Resultados</w:t>
+      </w:r>
+      <w:r>
+        <w:rPr>
+          <w:b/>
+          <w:bCs/>
+        </w:rPr>
+        <w:t xml:space="preserve"> obtidos</w:t>
+      </w:r>
+      <w:r>
+        <w:rPr>
+          <w:b/>
+          <w:bCs/>
+        </w:rPr>
+        <w:t>:</w:t>
+      </w:r>
+      <w:r>
+        <w:rPr>
+          <w:b/>
+          <w:bCs/>
+        </w:rPr>
+        <w:t xml:space="preserve"> </w:t>
+      </w:r>
+      <w:r>
+        <w:rPr>
+          <w:i/>
+          <w:iCs/>
+        </w:rPr>
+        <w:t>Os</w:t>
+      </w:r>
+      <w:r>
+        <w:rPr>
+          <w:b/>
+          <w:bCs/>
+          <w:i/>
+          <w:iCs/>
+        </w:rPr>
+        <w:t xml:space="preserve"> </w:t>
+      </w:r>
+      <w:r>
+        <w:rPr>
+          <w:i/>
+          <w:iCs/>
+          <w:color w:val="000000" w:themeColor="text1"/>
+        </w:rPr>
+        <w:t xml:space="preserve">Logs do </w:t>
+      </w:r>
+      <w:proofErr w:type="spellStart"/>
+      <w:r>
+        <w:rPr>
+          <w:i/>
+          <w:iCs/>
+          <w:color w:val="000000" w:themeColor="text1"/>
+        </w:rPr>
+        <w:t>Pycharm</w:t>
+      </w:r>
+      <w:proofErr w:type="spellEnd"/>
+      <w:r>
+        <w:rPr>
+          <w:i/>
+          <w:iCs/>
+          <w:color w:val="000000" w:themeColor="text1"/>
+        </w:rPr>
+        <w:t xml:space="preserve"> estão localizados em </w:t>
+      </w:r>
+      <w:r>
+        <w:rPr>
+          <w:i/>
+          <w:iCs/>
+        </w:rPr>
+        <w:t>"</w:t>
+      </w:r>
+      <w:r>
+        <w:rPr>
+          <w:i/>
+          <w:iCs/>
+        </w:rPr>
+        <w:t xml:space="preserve">\Projeto-Classificadores\Main_Project\ResNet\Results\Experimento </w:t>
+      </w:r>
+      <w:r>
+        <w:rPr>
+          <w:i/>
+          <w:iCs/>
+        </w:rPr>
+        <w:t>1</w:t>
+      </w:r>
+      <w:r>
+        <w:rPr>
+          <w:i/>
+          <w:iCs/>
+        </w:rPr>
+        <w:t>2</w:t>
+      </w:r>
+      <w:r>
+        <w:rPr>
+          <w:i/>
+          <w:iCs/>
+        </w:rPr>
+        <w:t xml:space="preserve"> </w:t>
+      </w:r>
+      <w:r>
+        <w:rPr>
+          <w:i/>
+          <w:iCs/>
+        </w:rPr>
+        <w:t xml:space="preserve">- </w:t>
+      </w:r>
+      <w:proofErr w:type="spellStart"/>
+      <w:r>
+        <w:rPr>
+          <w:i/>
+          <w:iCs/>
+        </w:rPr>
+        <w:t>ResNet</w:t>
+      </w:r>
+      <w:proofErr w:type="spellEnd"/>
+      <w:r>
+        <w:rPr>
+          <w:i/>
+          <w:iCs/>
+        </w:rPr>
+        <w:t xml:space="preserve">\Experimento </w:t>
+      </w:r>
+      <w:r>
+        <w:rPr>
+          <w:i/>
+          <w:iCs/>
+        </w:rPr>
+        <w:t>1</w:t>
+      </w:r>
+      <w:r>
+        <w:rPr>
+          <w:i/>
+          <w:iCs/>
+        </w:rPr>
+        <w:t>2</w:t>
+      </w:r>
+      <w:r>
+        <w:rPr>
+          <w:i/>
+          <w:iCs/>
+        </w:rPr>
+        <w:t xml:space="preserve">- </w:t>
+      </w:r>
+      <w:proofErr w:type="spellStart"/>
+      <w:r>
+        <w:rPr>
+          <w:i/>
+          <w:iCs/>
+        </w:rPr>
+        <w:t>Pycharm</w:t>
+      </w:r>
+      <w:proofErr w:type="spellEnd"/>
+      <w:r>
+        <w:rPr>
+          <w:i/>
+          <w:iCs/>
+        </w:rPr>
+        <w:t xml:space="preserve"> LOG.txt"</w:t>
+      </w:r>
+    </w:p>
+    <w:p>
+      <w:pPr>
+        <w:pStyle w:val="PargrafodaLista"/>
+        <w:ind w:left="2160"/>
+      </w:pPr>
+    </w:p>
+    <w:p>
+      <w:pPr>
+        <w:pStyle w:val="PargrafodaLista"/>
+        <w:ind w:left="2160"/>
+      </w:pPr>
+    </w:p>
+    <w:p>
+      <w:pPr>
+        <w:pStyle w:val="PargrafodaLista"/>
+        <w:ind w:left="2160"/>
+      </w:pPr>
+    </w:p>
+    <w:p>
+      <w:pPr>
+        <w:pStyle w:val="PargrafodaLista"/>
+        <w:ind w:left="2160"/>
+      </w:pPr>
+    </w:p>
+    <w:p>
+      <w:pPr>
+        <w:pStyle w:val="PargrafodaLista"/>
+        <w:ind w:left="2160"/>
+      </w:pPr>
+    </w:p>
+    <w:p/>
+    <w:p>
+      <w:pPr>
+        <w:pStyle w:val="PargrafodaLista"/>
+        <w:numPr>
+          <w:ilvl w:val="0"/>
+          <w:numId w:val="19"/>
+        </w:numPr>
+        <w:rPr>
+          <w:b/>
+          <w:bCs/>
+        </w:rPr>
+      </w:pPr>
+      <w:r>
+        <w:rPr>
+          <w:b/>
+          <w:bCs/>
+        </w:rPr>
+        <w:lastRenderedPageBreak/>
+        <w:t>Analise dos resultados obtidos:</w:t>
+      </w:r>
+    </w:p>
+    <w:p>
+      <w:pPr>
+        <w:pStyle w:val="PargrafodaLista"/>
+        <w:ind w:left="2160"/>
+        <w:jc w:val="both"/>
+      </w:pPr>
+      <w:r>
+        <w:t>Em termos de desempenho, a ResNet-</w:t>
+      </w:r>
+      <w:r>
+        <w:t>5</w:t>
+      </w:r>
+      <w:r>
+        <w:t xml:space="preserve">0 atingiu aproximadamente </w:t>
+      </w:r>
+      <w:r>
+        <w:t>8</w:t>
+      </w:r>
+      <w:r>
+        <w:t>2</w:t>
+      </w:r>
+      <w:r>
+        <w:t xml:space="preserve">% em treino e validação. </w:t>
+      </w:r>
+      <w:r>
+        <w:t xml:space="preserve">Quando comparado </w:t>
+      </w:r>
+      <w:r>
+        <w:t>aos demais experimentos, esse resultado se aproxima das demais variantes e levanta suspeitas sobre o que pode ter ocorrido com a primeira versão, na qual os resultados foram de aproximadamente 45%</w:t>
+      </w:r>
+    </w:p>
+    <w:p>
+      <w:pPr>
+        <w:spacing w:after="0"/>
+        <w:ind w:left="2160"/>
+        <w:jc w:val="center"/>
+        <w:rPr>
+          <w:sz w:val="18"/>
+          <w:szCs w:val="18"/>
+        </w:rPr>
+      </w:pPr>
+      <w:r>
+        <w:rPr>
+          <w:sz w:val="18"/>
+          <w:szCs w:val="18"/>
+        </w:rPr>
+        <w:t xml:space="preserve">Figura </w:t>
+      </w:r>
+      <w:r>
+        <w:rPr>
+          <w:sz w:val="18"/>
+          <w:szCs w:val="18"/>
+        </w:rPr>
+        <w:t>5</w:t>
+      </w:r>
+      <w:r>
+        <w:rPr>
+          <w:sz w:val="18"/>
+          <w:szCs w:val="18"/>
+        </w:rPr>
+        <w:t>5</w:t>
+      </w:r>
+      <w:r>
+        <w:rPr>
+          <w:sz w:val="18"/>
+          <w:szCs w:val="18"/>
+        </w:rPr>
+        <w:t>: Parâmetros de treinamento</w:t>
+      </w:r>
+    </w:p>
+    <w:p>
+      <w:pPr>
+        <w:pStyle w:val="PargrafodaLista"/>
+        <w:ind w:left="2160"/>
+        <w:jc w:val="center"/>
+      </w:pPr>
+      <w:r>
+        <w:drawing>
+          <wp:inline distT="0" distB="0" distL="0" distR="0" wp14:anchorId="0C65EFC1" wp14:editId="1E86875E">
+            <wp:extent cx="3069203" cy="2559600"/>
+            <wp:effectExtent l="0" t="0" r="0" b="0"/>
+            <wp:docPr id="1779663976" name="Imagem 1"/>
+            <wp:cNvGraphicFramePr>
+              <a:graphicFrameLocks xmlns:a="http://schemas.openxmlformats.org/drawingml/2006/main" noChangeAspect="1"/>
+            </wp:cNvGraphicFramePr>
+            <a:graphic xmlns:a="http://schemas.openxmlformats.org/drawingml/2006/main">
+              <a:graphicData uri="http://schemas.openxmlformats.org/drawingml/2006/picture">
+                <pic:pic xmlns:pic="http://schemas.openxmlformats.org/drawingml/2006/picture">
+                  <pic:nvPicPr>
+                    <pic:cNvPr id="1779663976" name=""/>
+                    <pic:cNvPicPr/>
+                  </pic:nvPicPr>
+                  <pic:blipFill>
+                    <a:blip r:embed="rId62"/>
+                    <a:stretch>
+                      <a:fillRect/>
+                    </a:stretch>
+                  </pic:blipFill>
+                  <pic:spPr>
+                    <a:xfrm>
+                      <a:off x="0" y="0"/>
+                      <a:ext cx="3078118" cy="2567035"/>
+                    </a:xfrm>
+                    <a:prstGeom prst="rect">
+                      <a:avLst/>
+                    </a:prstGeom>
+                  </pic:spPr>
+                </pic:pic>
+              </a:graphicData>
+            </a:graphic>
+          </wp:inline>
+        </w:drawing>
+      </w:r>
+    </w:p>
+    <w:p>
+      <w:pPr>
+        <w:pStyle w:val="PargrafodaLista"/>
+        <w:ind w:left="2160"/>
+      </w:pPr>
+    </w:p>
+    <w:p>
+      <w:pPr>
+        <w:pStyle w:val="PargrafodaLista"/>
+        <w:ind w:left="2160"/>
+      </w:pPr>
+      <w:r>
+        <w:t>O que se percebe é o valor bem mais expressivo da função de perda</w:t>
+      </w:r>
+      <w:r>
+        <w:t xml:space="preserve"> neste experimento, quando comparado aos resultados obtidos com a ResNet-18 (</w:t>
+      </w:r>
+      <w:r>
+        <w:t>BS igual</w:t>
+      </w:r>
+      <w:r>
+        <w:t xml:space="preserve"> a 32), conforme ilustrado abaixo. </w:t>
+      </w:r>
+    </w:p>
+    <w:p>
+      <w:pPr>
+        <w:spacing w:after="0"/>
+        <w:ind w:left="2160"/>
+        <w:jc w:val="center"/>
+        <w:rPr>
+          <w:sz w:val="18"/>
+          <w:szCs w:val="18"/>
+        </w:rPr>
+      </w:pPr>
+      <w:r>
+        <w:rPr>
+          <w:sz w:val="18"/>
+          <w:szCs w:val="18"/>
+        </w:rPr>
+        <w:t xml:space="preserve">Figura </w:t>
+      </w:r>
+      <w:r>
+        <w:rPr>
+          <w:sz w:val="18"/>
+          <w:szCs w:val="18"/>
+        </w:rPr>
+        <w:t>52</w:t>
+      </w:r>
+      <w:r>
+        <w:rPr>
+          <w:sz w:val="18"/>
+          <w:szCs w:val="18"/>
+        </w:rPr>
+        <w:t>: Parâmetros de treinamento</w:t>
+      </w:r>
+    </w:p>
+    <w:p>
+      <w:pPr>
+        <w:pStyle w:val="PargrafodaLista"/>
+        <w:ind w:left="2160"/>
+        <w:jc w:val="center"/>
+      </w:pPr>
+      <w:r>
+        <w:drawing>
+          <wp:inline distT="0" distB="0" distL="0" distR="0" wp14:anchorId="0D81A9DD" wp14:editId="3EF71ED5">
+            <wp:extent cx="3090910" cy="2186608"/>
+            <wp:effectExtent l="0" t="0" r="0" b="4445"/>
+            <wp:docPr id="1735340501" name="Imagem 1"/>
+            <wp:cNvGraphicFramePr>
+              <a:graphicFrameLocks xmlns:a="http://schemas.openxmlformats.org/drawingml/2006/main" noChangeAspect="1"/>
+            </wp:cNvGraphicFramePr>
+            <a:graphic xmlns:a="http://schemas.openxmlformats.org/drawingml/2006/main">
+              <a:graphicData uri="http://schemas.openxmlformats.org/drawingml/2006/picture">
+                <pic:pic xmlns:pic="http://schemas.openxmlformats.org/drawingml/2006/picture">
+                  <pic:nvPicPr>
+                    <pic:cNvPr id="1735340501" name=""/>
+                    <pic:cNvPicPr/>
+                  </pic:nvPicPr>
+                  <pic:blipFill>
+                    <a:blip r:embed="rId63"/>
+                    <a:stretch>
+                      <a:fillRect/>
+                    </a:stretch>
+                  </pic:blipFill>
+                  <pic:spPr>
+                    <a:xfrm>
+                      <a:off x="0" y="0"/>
+                      <a:ext cx="3117043" cy="2205096"/>
+                    </a:xfrm>
+                    <a:prstGeom prst="rect">
+                      <a:avLst/>
+                    </a:prstGeom>
+                  </pic:spPr>
+                </pic:pic>
+              </a:graphicData>
+            </a:graphic>
+          </wp:inline>
+        </w:drawing>
+      </w:r>
+    </w:p>
+    <w:p>
+      <w:pPr>
+        <w:tabs>
+          <w:tab w:val="left" w:pos="4658"/>
+        </w:tabs>
+        <w:ind w:left="2124" w:firstLine="6"/>
+        <w:jc w:val="both"/>
+      </w:pPr>
+      <w:r>
+        <w:rPr>
+          <w:b/>
+          <w:bCs/>
+        </w:rPr>
+        <w:t>Conclusão:</w:t>
+      </w:r>
+      <w:r>
+        <w:t xml:space="preserve"> E</w:t>
+      </w:r>
+      <w:r>
+        <w:t>ste experimento ressalta a necessidade de compreender o que havia dado errado anteriormente e avaliar se o treinamento está sendo conduzido da melhor maneira possível. Adicionalmente é importante definir com clareza qual rede melhor se alinha ao problema proposto</w:t>
+      </w:r>
+    </w:p>
+    <w:p>
+      <w:pPr>
+        <w:tabs>
+          <w:tab w:val="left" w:pos="4658"/>
+        </w:tabs>
+        <w:ind w:left="2124" w:firstLine="6"/>
+        <w:jc w:val="both"/>
+      </w:pPr>
+    </w:p>
+    <w:p>
+      <w:pPr>
+        <w:pStyle w:val="PargrafodaLista"/>
+        <w:numPr>
+          <w:ilvl w:val="1"/>
+          <w:numId w:val="1"/>
+        </w:numPr>
+        <w:jc w:val="both"/>
+        <w:rPr>
+          <w:b/>
+          <w:bCs/>
+        </w:rPr>
+      </w:pPr>
+      <w:r>
+        <w:rPr>
+          <w:b/>
+          <w:bCs/>
+        </w:rPr>
+        <w:t>D</w:t>
+      </w:r>
     </w:p>
     <w:p>
       <w:pPr>
@@ -18374,7 +19295,7 @@
         <v:path o:extrusionok="f" gradientshapeok="t" o:connecttype="rect"/>
         <o:lock v:ext="edit" aspectratio="t"/>
       </v:shapetype>
-      <v:shape id="_x0000_i1167" type="#_x0000_t75" style="width:693.1pt;height:487.7pt;visibility:visible;mso-wrap-style:square" o:bullet="t">
+      <v:shape id="_x0000_i1035" type="#_x0000_t75" style="width:693.1pt;height:487.7pt;visibility:visible;mso-wrap-style:square" o:bullet="t">
         <v:imagedata r:id="rId1" o:title="" croptop="19686f" cropbottom="43833f" cropleft="8606f" cropright="55951f"/>
       </v:shape>
     </w:pict>
@@ -22650,6 +23571,7 @@
   <w:style w:type="character" w:default="1" w:styleId="Fontepargpadro">
     <w:name w:val="Default Paragraph Font"/>
     <w:uiPriority w:val="1"/>
+    <w:semiHidden/>
     <w:unhideWhenUsed/>
   </w:style>
   <w:style w:type="table" w:default="1" w:styleId="Tabelanormal">

</xml_diff>

<commit_message>
Atualização da documentação - Exp 14
</commit_message>
<xml_diff>
--- a/Documentation/Documentacao Unificada de Experimentos.docx
+++ b/Documentation/Documentacao Unificada de Experimentos.docx
@@ -18469,6 +18469,15 @@
     </w:p>
     <w:p>
       <w:pPr>
+        <w:tabs>
+          <w:tab w:val="left" w:pos="4658"/>
+        </w:tabs>
+        <w:ind w:left="2124" w:firstLine="6"/>
+        <w:jc w:val="both"/>
+      </w:pPr>
+    </w:p>
+    <w:p>
+      <w:pPr>
         <w:pStyle w:val="PargrafodaLista"/>
         <w:numPr>
           <w:ilvl w:val="1"/>
@@ -18485,37 +18494,7 @@
           <w:b/>
           <w:bCs/>
         </w:rPr>
-        <w:t>ESTUDO EXPLORATÓRIO 3</w:t>
-      </w:r>
-      <w:r>
-        <w:rPr>
-          <w:b/>
-          <w:bCs/>
-        </w:rPr>
-        <w:t xml:space="preserve"> – </w:t>
-      </w:r>
-      <w:r>
-        <w:rPr>
-          <w:b/>
-          <w:bCs/>
-        </w:rPr>
-        <w:t xml:space="preserve">Justificativa para o uso de variações mais rasas para a arquitetura </w:t>
-      </w:r>
-      <w:proofErr w:type="spellStart"/>
-      <w:r>
-        <w:rPr>
-          <w:b/>
-          <w:bCs/>
-        </w:rPr>
-        <w:t>ResNet</w:t>
-      </w:r>
-      <w:proofErr w:type="spellEnd"/>
-      <w:r>
-        <w:rPr>
-          <w:b/>
-          <w:bCs/>
-        </w:rPr>
-        <w:t>.</w:t>
+        <w:t>EXPERIMENTO 12 (RESNET) – TESTE COM VARIANTE 50 APÓS AS MODIFICAÇÕES DE CARREGAMENTO DE DADOS</w:t>
       </w:r>
     </w:p>
     <w:p>
@@ -18534,70 +18513,12 @@
         <w:pStyle w:val="PargrafodaLista"/>
         <w:ind w:left="1440"/>
         <w:jc w:val="both"/>
-        <w:rPr>
-          <w:b/>
-          <w:bCs/>
-        </w:rPr>
-      </w:pPr>
-    </w:p>
-    <w:p>
-      <w:pPr>
-        <w:pStyle w:val="PargrafodaLista"/>
-        <w:numPr>
-          <w:ilvl w:val="1"/>
-          <w:numId w:val="1"/>
-        </w:numPr>
-        <w:jc w:val="both"/>
-        <w:rPr>
-          <w:b/>
-          <w:bCs/>
-        </w:rPr>
-      </w:pPr>
-      <w:r>
-        <w:rPr>
-          <w:b/>
-          <w:bCs/>
-        </w:rPr>
-        <w:t>EXPERIMENTO 12 (RESNET) – TESTE COM VARIANTE 50 APÓS AS MODIFICAÇÕES DE CARREGAMENTO DE DADOS</w:t>
-      </w:r>
-    </w:p>
-    <w:p>
-      <w:pPr>
-        <w:pStyle w:val="PargrafodaLista"/>
-        <w:ind w:left="1440"/>
-        <w:jc w:val="both"/>
-        <w:rPr>
-          <w:b/>
-          <w:bCs/>
-        </w:rPr>
-      </w:pPr>
-    </w:p>
-    <w:p>
-      <w:pPr>
-        <w:pStyle w:val="PargrafodaLista"/>
-        <w:ind w:left="1440"/>
-        <w:jc w:val="both"/>
       </w:pPr>
       <w:r>
         <w:t xml:space="preserve">A ideia deste experimento é </w:t>
       </w:r>
       <w:r>
-        <w:t>verificar se</w:t>
-      </w:r>
-      <w:r>
-        <w:t>, após a modificação da forma de carregamento dos dados de entrada (Após o experimento 3),</w:t>
-      </w:r>
-      <w:r>
-        <w:t xml:space="preserve"> a ResNet-</w:t>
-      </w:r>
-      <w:r>
-        <w:t>50</w:t>
-      </w:r>
-      <w:r>
-        <w:t xml:space="preserve"> </w:t>
-      </w:r>
-      <w:r>
-        <w:t>continuava apresentando os resultados incoerentes.</w:t>
+        <w:t>verificar se, após a modificação da forma de carregamento dos dados de entrada (Após o experimento 3), a ResNet-50 continuava apresentando os resultados incoerentes.</w:t>
       </w:r>
     </w:p>
     <w:p>
@@ -18671,6 +18592,9 @@
         <w:jc w:val="center"/>
       </w:pPr>
       <w:r>
+        <w:rPr>
+          <w:noProof/>
+        </w:rPr>
         <w:drawing>
           <wp:inline distT="0" distB="0" distL="0" distR="0" wp14:anchorId="643526C1" wp14:editId="20A46A1C">
             <wp:extent cx="1916264" cy="2003008"/>
@@ -18812,21 +18736,7 @@
           <w:i/>
           <w:iCs/>
         </w:rPr>
-        <w:t>1</w:t>
-      </w:r>
-      <w:r>
-        <w:rPr>
-          <w:i/>
-          <w:iCs/>
-        </w:rPr>
-        <w:t>2</w:t>
-      </w:r>
-      <w:r>
-        <w:rPr>
-          <w:i/>
-          <w:iCs/>
-        </w:rPr>
-        <w:t xml:space="preserve"> </w:t>
+        <w:t xml:space="preserve">12 </w:t>
       </w:r>
       <w:r>
         <w:rPr>
@@ -18856,14 +18766,7 @@
           <w:i/>
           <w:iCs/>
         </w:rPr>
-        <w:t>1</w:t>
-      </w:r>
-      <w:r>
-        <w:rPr>
-          <w:i/>
-          <w:iCs/>
-        </w:rPr>
-        <w:t>2</w:t>
+        <w:t>12</w:t>
       </w:r>
       <w:r>
         <w:rPr>
@@ -18895,31 +18798,6 @@
         <w:ind w:left="2160"/>
       </w:pPr>
     </w:p>
-    <w:p>
-      <w:pPr>
-        <w:pStyle w:val="PargrafodaLista"/>
-        <w:ind w:left="2160"/>
-      </w:pPr>
-    </w:p>
-    <w:p>
-      <w:pPr>
-        <w:pStyle w:val="PargrafodaLista"/>
-        <w:ind w:left="2160"/>
-      </w:pPr>
-    </w:p>
-    <w:p>
-      <w:pPr>
-        <w:pStyle w:val="PargrafodaLista"/>
-        <w:ind w:left="2160"/>
-      </w:pPr>
-    </w:p>
-    <w:p>
-      <w:pPr>
-        <w:pStyle w:val="PargrafodaLista"/>
-        <w:ind w:left="2160"/>
-      </w:pPr>
-    </w:p>
-    <w:p/>
     <w:p>
       <w:pPr>
         <w:pStyle w:val="PargrafodaLista"/>
@@ -18937,7 +18815,6 @@
           <w:b/>
           <w:bCs/>
         </w:rPr>
-        <w:lastRenderedPageBreak/>
         <w:t>Analise dos resultados obtidos:</w:t>
       </w:r>
     </w:p>
@@ -18957,20 +18834,28 @@
         <w:t xml:space="preserve">0 atingiu aproximadamente </w:t>
       </w:r>
       <w:r>
-        <w:t>8</w:t>
-      </w:r>
-      <w:r>
-        <w:t>2</w:t>
+        <w:t>82</w:t>
       </w:r>
       <w:r>
         <w:t xml:space="preserve">% em treino e validação. </w:t>
       </w:r>
       <w:r>
-        <w:t xml:space="preserve">Quando comparado </w:t>
-      </w:r>
-      <w:r>
-        <w:t>aos demais experimentos, esse resultado se aproxima das demais variantes e levanta suspeitas sobre o que pode ter ocorrido com a primeira versão, na qual os resultados foram de aproximadamente 45%</w:t>
-      </w:r>
+        <w:t>Quando comparado aos demais experimentos, esse resultado se aproxima das demais variantes e levanta suspeitas sobre o que pode ter ocorrido com a primeira versão, na qual os resultados foram de aproximadamente 45%</w:t>
+      </w:r>
+    </w:p>
+    <w:p>
+      <w:pPr>
+        <w:pStyle w:val="PargrafodaLista"/>
+        <w:ind w:left="2160"/>
+        <w:jc w:val="both"/>
+      </w:pPr>
+    </w:p>
+    <w:p>
+      <w:pPr>
+        <w:pStyle w:val="PargrafodaLista"/>
+        <w:ind w:left="2160"/>
+        <w:jc w:val="both"/>
+      </w:pPr>
     </w:p>
     <w:p>
       <w:pPr>
@@ -18987,6 +18872,7 @@
           <w:sz w:val="18"/>
           <w:szCs w:val="18"/>
         </w:rPr>
+        <w:lastRenderedPageBreak/>
         <w:t xml:space="preserve">Figura </w:t>
       </w:r>
       <w:r>
@@ -18994,21 +18880,14 @@
           <w:sz w:val="18"/>
           <w:szCs w:val="18"/>
         </w:rPr>
-        <w:t>5</w:t>
-      </w:r>
-      <w:r>
-        <w:rPr>
-          <w:sz w:val="18"/>
-          <w:szCs w:val="18"/>
-        </w:rPr>
-        <w:t>5</w:t>
-      </w:r>
-      <w:r>
-        <w:rPr>
-          <w:sz w:val="18"/>
-          <w:szCs w:val="18"/>
-        </w:rPr>
-        <w:t>: Parâmetros de treinamento</w:t>
+        <w:t>55</w:t>
+      </w:r>
+      <w:r>
+        <w:rPr>
+          <w:sz w:val="18"/>
+          <w:szCs w:val="18"/>
+        </w:rPr>
+        <w:t xml:space="preserve">: </w:t>
       </w:r>
     </w:p>
     <w:p>
@@ -19018,6 +18897,9 @@
         <w:jc w:val="center"/>
       </w:pPr>
       <w:r>
+        <w:rPr>
+          <w:noProof/>
+        </w:rPr>
         <w:drawing>
           <wp:inline distT="0" distB="0" distL="0" distR="0" wp14:anchorId="0C65EFC1" wp14:editId="1E86875E">
             <wp:extent cx="3069203" cy="2559600"/>
@@ -19101,14 +18983,14 @@
           <w:sz w:val="18"/>
           <w:szCs w:val="18"/>
         </w:rPr>
-        <w:t>52</w:t>
-      </w:r>
-      <w:r>
-        <w:rPr>
-          <w:sz w:val="18"/>
-          <w:szCs w:val="18"/>
-        </w:rPr>
-        <w:t>: Parâmetros de treinamento</w:t>
+        <w:t>56</w:t>
+      </w:r>
+      <w:r>
+        <w:rPr>
+          <w:sz w:val="18"/>
+          <w:szCs w:val="18"/>
+        </w:rPr>
+        <w:t xml:space="preserve">: </w:t>
       </w:r>
     </w:p>
     <w:p>
@@ -19118,6 +19000,9 @@
         <w:jc w:val="center"/>
       </w:pPr>
       <w:r>
+        <w:rPr>
+          <w:noProof/>
+        </w:rPr>
         <w:drawing>
           <wp:inline distT="0" distB="0" distL="0" distR="0" wp14:anchorId="0D81A9DD" wp14:editId="3EF71ED5">
             <wp:extent cx="3090910" cy="2186608"/>
@@ -19171,10 +19056,7 @@
         <w:t>Conclusão:</w:t>
       </w:r>
       <w:r>
-        <w:t xml:space="preserve"> E</w:t>
-      </w:r>
-      <w:r>
-        <w:t>ste experimento ressalta a necessidade de compreender o que havia dado errado anteriormente e avaliar se o treinamento está sendo conduzido da melhor maneira possível. Adicionalmente é importante definir com clareza qual rede melhor se alinha ao problema proposto</w:t>
+        <w:t xml:space="preserve"> Este experimento ressalta a necessidade de compreender o que havia dado errado anteriormente e avaliar se o treinamento está sendo conduzido da melhor maneira possível. Adicionalmente é importante definir com clareza qual rede melhor se alinha ao problema proposto</w:t>
       </w:r>
     </w:p>
     <w:p>
@@ -19204,8 +19086,1187 @@
           <w:b/>
           <w:bCs/>
         </w:rPr>
-        <w:t>D</w:t>
-      </w:r>
+        <w:t>EXPERIMENTO 1</w:t>
+      </w:r>
+      <w:r>
+        <w:rPr>
+          <w:b/>
+          <w:bCs/>
+        </w:rPr>
+        <w:t>3</w:t>
+      </w:r>
+      <w:r>
+        <w:rPr>
+          <w:b/>
+          <w:bCs/>
+        </w:rPr>
+        <w:t xml:space="preserve"> (RESNET) – TESTE </w:t>
+      </w:r>
+      <w:r>
+        <w:rPr>
+          <w:b/>
+          <w:bCs/>
+        </w:rPr>
+        <w:t xml:space="preserve">DE </w:t>
+      </w:r>
+      <w:r>
+        <w:rPr>
+          <w:b/>
+          <w:bCs/>
+        </w:rPr>
+        <w:t xml:space="preserve">1000 ÉPOCAS COM RESNET18 E BS = 32 </w:t>
+      </w:r>
+    </w:p>
+    <w:p>
+      <w:pPr>
+        <w:ind w:left="1416"/>
+        <w:jc w:val="both"/>
+      </w:pPr>
+      <w:r>
+        <w:t xml:space="preserve">O objetivo </w:t>
+      </w:r>
+      <w:r>
+        <w:t xml:space="preserve">deste experimento é </w:t>
+      </w:r>
+      <w:r>
+        <w:t xml:space="preserve">tentar alcançar um platô nos resultados, utilizando a configuração que obteve a maior eficiência dentre os experimentos anteriores (Variante 18 com Batch </w:t>
+      </w:r>
+      <w:proofErr w:type="spellStart"/>
+      <w:r>
+        <w:t>Size</w:t>
+      </w:r>
+      <w:proofErr w:type="spellEnd"/>
+      <w:r>
+        <w:t xml:space="preserve"> = 32)</w:t>
+      </w:r>
+    </w:p>
+    <w:p>
+      <w:pPr>
+        <w:pStyle w:val="PargrafodaLista"/>
+        <w:ind w:left="2520"/>
+        <w:jc w:val="both"/>
+        <w:rPr>
+          <w:b/>
+          <w:bCs/>
+        </w:rPr>
+      </w:pPr>
+    </w:p>
+    <w:p>
+      <w:pPr>
+        <w:pStyle w:val="PargrafodaLista"/>
+        <w:ind w:left="2520"/>
+        <w:jc w:val="both"/>
+        <w:rPr>
+          <w:b/>
+          <w:bCs/>
+        </w:rPr>
+      </w:pPr>
+    </w:p>
+    <w:p>
+      <w:pPr>
+        <w:pStyle w:val="PargrafodaLista"/>
+        <w:ind w:left="2520"/>
+        <w:jc w:val="both"/>
+        <w:rPr>
+          <w:b/>
+          <w:bCs/>
+        </w:rPr>
+      </w:pPr>
+    </w:p>
+    <w:p>
+      <w:pPr>
+        <w:pStyle w:val="PargrafodaLista"/>
+        <w:numPr>
+          <w:ilvl w:val="0"/>
+          <w:numId w:val="27"/>
+        </w:numPr>
+        <w:jc w:val="both"/>
+        <w:rPr>
+          <w:b/>
+          <w:bCs/>
+        </w:rPr>
+      </w:pPr>
+      <w:r>
+        <w:rPr>
+          <w:b/>
+          <w:bCs/>
+        </w:rPr>
+        <w:lastRenderedPageBreak/>
+        <w:t>Configurações do Treinamento:</w:t>
+      </w:r>
+    </w:p>
+    <w:p>
+      <w:pPr>
+        <w:spacing w:after="0"/>
+        <w:ind w:left="2160"/>
+        <w:jc w:val="center"/>
+        <w:rPr>
+          <w:sz w:val="18"/>
+          <w:szCs w:val="18"/>
+        </w:rPr>
+      </w:pPr>
+      <w:r>
+        <w:rPr>
+          <w:sz w:val="18"/>
+          <w:szCs w:val="18"/>
+        </w:rPr>
+        <w:t xml:space="preserve">Figura </w:t>
+      </w:r>
+      <w:r>
+        <w:rPr>
+          <w:sz w:val="18"/>
+          <w:szCs w:val="18"/>
+        </w:rPr>
+        <w:t>57</w:t>
+      </w:r>
+      <w:r>
+        <w:rPr>
+          <w:sz w:val="18"/>
+          <w:szCs w:val="18"/>
+        </w:rPr>
+        <w:t>: Parâmetros de treinamento</w:t>
+      </w:r>
+    </w:p>
+    <w:p>
+      <w:pPr>
+        <w:pStyle w:val="PargrafodaLista"/>
+        <w:ind w:left="2520"/>
+        <w:jc w:val="center"/>
+      </w:pPr>
+      <w:r>
+        <w:drawing>
+          <wp:inline distT="0" distB="0" distL="0" distR="0" wp14:anchorId="3AB81ED3" wp14:editId="130AE787">
+            <wp:extent cx="1773141" cy="1930057"/>
+            <wp:effectExtent l="0" t="0" r="0" b="0"/>
+            <wp:docPr id="1917487644" name="Imagem 1"/>
+            <wp:cNvGraphicFramePr>
+              <a:graphicFrameLocks xmlns:a="http://schemas.openxmlformats.org/drawingml/2006/main" noChangeAspect="1"/>
+            </wp:cNvGraphicFramePr>
+            <a:graphic xmlns:a="http://schemas.openxmlformats.org/drawingml/2006/main">
+              <a:graphicData uri="http://schemas.openxmlformats.org/drawingml/2006/picture">
+                <pic:pic xmlns:pic="http://schemas.openxmlformats.org/drawingml/2006/picture">
+                  <pic:nvPicPr>
+                    <pic:cNvPr id="1917487644" name=""/>
+                    <pic:cNvPicPr/>
+                  </pic:nvPicPr>
+                  <pic:blipFill>
+                    <a:blip r:embed="rId64"/>
+                    <a:stretch>
+                      <a:fillRect/>
+                    </a:stretch>
+                  </pic:blipFill>
+                  <pic:spPr>
+                    <a:xfrm>
+                      <a:off x="0" y="0"/>
+                      <a:ext cx="1777156" cy="1934428"/>
+                    </a:xfrm>
+                    <a:prstGeom prst="rect">
+                      <a:avLst/>
+                    </a:prstGeom>
+                  </pic:spPr>
+                </pic:pic>
+              </a:graphicData>
+            </a:graphic>
+          </wp:inline>
+        </w:drawing>
+      </w:r>
+    </w:p>
+    <w:p>
+      <w:pPr>
+        <w:pStyle w:val="PargrafodaLista"/>
+        <w:ind w:left="2520"/>
+        <w:jc w:val="both"/>
+      </w:pPr>
+    </w:p>
+    <w:p>
+      <w:pPr>
+        <w:pStyle w:val="PargrafodaLista"/>
+        <w:numPr>
+          <w:ilvl w:val="0"/>
+          <w:numId w:val="19"/>
+        </w:numPr>
+      </w:pPr>
+      <w:r>
+        <w:rPr>
+          <w:b/>
+          <w:bCs/>
+        </w:rPr>
+        <w:t>Resultados</w:t>
+      </w:r>
+      <w:r>
+        <w:rPr>
+          <w:b/>
+          <w:bCs/>
+        </w:rPr>
+        <w:t xml:space="preserve"> obtidos</w:t>
+      </w:r>
+      <w:r>
+        <w:rPr>
+          <w:b/>
+          <w:bCs/>
+        </w:rPr>
+        <w:t>:</w:t>
+      </w:r>
+      <w:r>
+        <w:rPr>
+          <w:b/>
+          <w:bCs/>
+        </w:rPr>
+        <w:t xml:space="preserve"> </w:t>
+      </w:r>
+      <w:r>
+        <w:rPr>
+          <w:i/>
+          <w:iCs/>
+        </w:rPr>
+        <w:t>Os</w:t>
+      </w:r>
+      <w:r>
+        <w:rPr>
+          <w:b/>
+          <w:bCs/>
+          <w:i/>
+          <w:iCs/>
+        </w:rPr>
+        <w:t xml:space="preserve"> </w:t>
+      </w:r>
+      <w:r>
+        <w:rPr>
+          <w:i/>
+          <w:iCs/>
+          <w:color w:val="000000" w:themeColor="text1"/>
+        </w:rPr>
+        <w:t xml:space="preserve">Logs do </w:t>
+      </w:r>
+      <w:proofErr w:type="spellStart"/>
+      <w:r>
+        <w:rPr>
+          <w:i/>
+          <w:iCs/>
+          <w:color w:val="000000" w:themeColor="text1"/>
+        </w:rPr>
+        <w:t>Pycharm</w:t>
+      </w:r>
+      <w:proofErr w:type="spellEnd"/>
+      <w:r>
+        <w:rPr>
+          <w:i/>
+          <w:iCs/>
+          <w:color w:val="000000" w:themeColor="text1"/>
+        </w:rPr>
+        <w:t xml:space="preserve"> estão localizados em </w:t>
+      </w:r>
+      <w:r>
+        <w:rPr>
+          <w:i/>
+          <w:iCs/>
+        </w:rPr>
+        <w:t>"</w:t>
+      </w:r>
+      <w:r>
+        <w:rPr>
+          <w:i/>
+          <w:iCs/>
+        </w:rPr>
+        <w:t xml:space="preserve">\Projeto-Classificadores\Main_Project\ResNet\Results\Experimento </w:t>
+      </w:r>
+      <w:r>
+        <w:rPr>
+          <w:i/>
+          <w:iCs/>
+        </w:rPr>
+        <w:t>1</w:t>
+      </w:r>
+      <w:r>
+        <w:rPr>
+          <w:i/>
+          <w:iCs/>
+        </w:rPr>
+        <w:t>3</w:t>
+      </w:r>
+      <w:r>
+        <w:rPr>
+          <w:i/>
+          <w:iCs/>
+        </w:rPr>
+        <w:t xml:space="preserve"> </w:t>
+      </w:r>
+      <w:r>
+        <w:rPr>
+          <w:i/>
+          <w:iCs/>
+        </w:rPr>
+        <w:t xml:space="preserve">- </w:t>
+      </w:r>
+      <w:proofErr w:type="spellStart"/>
+      <w:r>
+        <w:rPr>
+          <w:i/>
+          <w:iCs/>
+        </w:rPr>
+        <w:t>ResNet</w:t>
+      </w:r>
+      <w:proofErr w:type="spellEnd"/>
+      <w:r>
+        <w:rPr>
+          <w:i/>
+          <w:iCs/>
+        </w:rPr>
+        <w:t xml:space="preserve">\Experimento </w:t>
+      </w:r>
+      <w:r>
+        <w:rPr>
+          <w:i/>
+          <w:iCs/>
+        </w:rPr>
+        <w:t>1</w:t>
+      </w:r>
+      <w:r>
+        <w:rPr>
+          <w:i/>
+          <w:iCs/>
+        </w:rPr>
+        <w:t>3</w:t>
+      </w:r>
+      <w:r>
+        <w:rPr>
+          <w:i/>
+          <w:iCs/>
+        </w:rPr>
+        <w:t xml:space="preserve">- </w:t>
+      </w:r>
+      <w:proofErr w:type="spellStart"/>
+      <w:r>
+        <w:rPr>
+          <w:i/>
+          <w:iCs/>
+        </w:rPr>
+        <w:t>Pycharm</w:t>
+      </w:r>
+      <w:proofErr w:type="spellEnd"/>
+      <w:r>
+        <w:rPr>
+          <w:i/>
+          <w:iCs/>
+        </w:rPr>
+        <w:t xml:space="preserve"> LOG.txt"</w:t>
+      </w:r>
+    </w:p>
+    <w:p>
+      <w:pPr>
+        <w:pStyle w:val="PargrafodaLista"/>
+        <w:ind w:left="2160"/>
+      </w:pPr>
+    </w:p>
+    <w:p>
+      <w:pPr>
+        <w:pStyle w:val="PargrafodaLista"/>
+        <w:numPr>
+          <w:ilvl w:val="0"/>
+          <w:numId w:val="19"/>
+        </w:numPr>
+        <w:rPr>
+          <w:b/>
+          <w:bCs/>
+        </w:rPr>
+      </w:pPr>
+      <w:r>
+        <w:rPr>
+          <w:b/>
+          <w:bCs/>
+        </w:rPr>
+        <w:t>Analise dos resultados obtidos:</w:t>
+      </w:r>
+    </w:p>
+    <w:p>
+      <w:pPr>
+        <w:pStyle w:val="PargrafodaLista"/>
+        <w:ind w:left="2160"/>
+        <w:jc w:val="both"/>
+      </w:pPr>
+      <w:r>
+        <w:t xml:space="preserve">Em termos de desempenho, </w:t>
+      </w:r>
+      <w:r>
+        <w:t xml:space="preserve">o resultado obteve uma melhora expressiva, com acurácia alcançando valores em torno de 95% e a perda ficando em torno de 0,40. Contudo, a curva de acurácia apresentava uma inclinação clara, o que indica que o platô ainda não havia sido alcançado. </w:t>
+      </w:r>
+    </w:p>
+    <w:p>
+      <w:pPr>
+        <w:spacing w:after="0"/>
+        <w:ind w:left="2160"/>
+        <w:jc w:val="center"/>
+        <w:rPr>
+          <w:sz w:val="18"/>
+          <w:szCs w:val="18"/>
+        </w:rPr>
+      </w:pPr>
+      <w:r>
+        <w:rPr>
+          <w:sz w:val="18"/>
+          <w:szCs w:val="18"/>
+        </w:rPr>
+        <w:t xml:space="preserve">Figura </w:t>
+      </w:r>
+      <w:r>
+        <w:rPr>
+          <w:sz w:val="18"/>
+          <w:szCs w:val="18"/>
+        </w:rPr>
+        <w:t>58</w:t>
+      </w:r>
+      <w:r>
+        <w:rPr>
+          <w:sz w:val="18"/>
+          <w:szCs w:val="18"/>
+        </w:rPr>
+        <w:t xml:space="preserve">: </w:t>
+      </w:r>
+      <w:r>
+        <w:rPr>
+          <w:sz w:val="18"/>
+          <w:szCs w:val="18"/>
+        </w:rPr>
+        <w:t>Curva de acurácia</w:t>
+      </w:r>
+    </w:p>
+    <w:p>
+      <w:pPr>
+        <w:pStyle w:val="PargrafodaLista"/>
+        <w:ind w:left="0"/>
+        <w:jc w:val="center"/>
+      </w:pPr>
+      <w:r>
+        <w:drawing>
+          <wp:inline distT="0" distB="0" distL="0" distR="0" wp14:anchorId="56DA2DD4" wp14:editId="79AA8367">
+            <wp:extent cx="6054409" cy="1558455"/>
+            <wp:effectExtent l="0" t="0" r="3810" b="3810"/>
+            <wp:docPr id="547347280" name="Imagem 1"/>
+            <wp:cNvGraphicFramePr>
+              <a:graphicFrameLocks xmlns:a="http://schemas.openxmlformats.org/drawingml/2006/main" noChangeAspect="1"/>
+            </wp:cNvGraphicFramePr>
+            <a:graphic xmlns:a="http://schemas.openxmlformats.org/drawingml/2006/main">
+              <a:graphicData uri="http://schemas.openxmlformats.org/drawingml/2006/picture">
+                <pic:pic xmlns:pic="http://schemas.openxmlformats.org/drawingml/2006/picture">
+                  <pic:nvPicPr>
+                    <pic:cNvPr id="547347280" name=""/>
+                    <pic:cNvPicPr/>
+                  </pic:nvPicPr>
+                  <pic:blipFill>
+                    <a:blip r:embed="rId65"/>
+                    <a:stretch>
+                      <a:fillRect/>
+                    </a:stretch>
+                  </pic:blipFill>
+                  <pic:spPr>
+                    <a:xfrm>
+                      <a:off x="0" y="0"/>
+                      <a:ext cx="6060925" cy="1560132"/>
+                    </a:xfrm>
+                    <a:prstGeom prst="rect">
+                      <a:avLst/>
+                    </a:prstGeom>
+                  </pic:spPr>
+                </pic:pic>
+              </a:graphicData>
+            </a:graphic>
+          </wp:inline>
+        </w:drawing>
+      </w:r>
+    </w:p>
+    <w:p>
+      <w:pPr>
+        <w:tabs>
+          <w:tab w:val="left" w:pos="4658"/>
+        </w:tabs>
+        <w:ind w:left="2124" w:firstLine="6"/>
+        <w:jc w:val="both"/>
+      </w:pPr>
+      <w:r>
+        <w:rPr>
+          <w:b/>
+          <w:bCs/>
+        </w:rPr>
+        <w:t>Conclusão:</w:t>
+      </w:r>
+      <w:r>
+        <w:t xml:space="preserve"> Este experimento ressalta </w:t>
+      </w:r>
+      <w:r>
+        <w:t>a necessidade de ampliar ainda mais a quantidade de épocas de treinamento, de modo que seja possível extrair o desempenho máximo possível da rede.</w:t>
+      </w:r>
+    </w:p>
+    <w:p>
+      <w:pPr>
+        <w:tabs>
+          <w:tab w:val="left" w:pos="4658"/>
+        </w:tabs>
+        <w:ind w:left="2124" w:firstLine="6"/>
+        <w:jc w:val="both"/>
+      </w:pPr>
+    </w:p>
+    <w:p>
+      <w:pPr>
+        <w:pStyle w:val="PargrafodaLista"/>
+        <w:numPr>
+          <w:ilvl w:val="1"/>
+          <w:numId w:val="1"/>
+        </w:numPr>
+        <w:jc w:val="both"/>
+        <w:rPr>
+          <w:b/>
+          <w:bCs/>
+        </w:rPr>
+      </w:pPr>
+      <w:r>
+        <w:rPr>
+          <w:b/>
+          <w:bCs/>
+        </w:rPr>
+        <w:t>EXPERIMENTO 1</w:t>
+      </w:r>
+      <w:r>
+        <w:rPr>
+          <w:b/>
+          <w:bCs/>
+        </w:rPr>
+        <w:t>4</w:t>
+      </w:r>
+      <w:r>
+        <w:rPr>
+          <w:b/>
+          <w:bCs/>
+        </w:rPr>
+        <w:t xml:space="preserve"> (RESNET) – TESTE </w:t>
+      </w:r>
+      <w:r>
+        <w:rPr>
+          <w:b/>
+          <w:bCs/>
+        </w:rPr>
+        <w:t>DE</w:t>
+      </w:r>
+      <w:r>
+        <w:rPr>
+          <w:b/>
+          <w:bCs/>
+        </w:rPr>
+        <w:t xml:space="preserve"> </w:t>
+      </w:r>
+      <w:r>
+        <w:rPr>
+          <w:b/>
+          <w:bCs/>
+        </w:rPr>
+        <w:t>3</w:t>
+      </w:r>
+      <w:r>
+        <w:rPr>
+          <w:b/>
+          <w:bCs/>
+        </w:rPr>
+        <w:t xml:space="preserve">000 ÉPOCAS COM RESNET18 E BS = 32 </w:t>
+      </w:r>
+    </w:p>
+    <w:p>
+      <w:pPr>
+        <w:ind w:left="1416" w:firstLine="24"/>
+        <w:jc w:val="both"/>
+      </w:pPr>
+      <w:r>
+        <w:t xml:space="preserve">O objetivo </w:t>
+      </w:r>
+      <w:r>
+        <w:t xml:space="preserve">deste experimento é </w:t>
+      </w:r>
+      <w:r>
+        <w:t xml:space="preserve">repetir o experimento 13 ampliando consideravelmente a quantidade de épocas, </w:t>
+      </w:r>
+      <w:r>
+        <w:t>tenta</w:t>
+      </w:r>
+      <w:r>
+        <w:t>ndo novamente</w:t>
+      </w:r>
+      <w:r>
+        <w:t xml:space="preserve"> alcançar um platô nos resultados, utilizando a configuração que obteve a maior eficiência dentre os experimentos anteriores (Variante 18 com Batch </w:t>
+      </w:r>
+      <w:proofErr w:type="spellStart"/>
+      <w:r>
+        <w:t>Size</w:t>
+      </w:r>
+      <w:proofErr w:type="spellEnd"/>
+      <w:r>
+        <w:t xml:space="preserve"> = 32)</w:t>
+      </w:r>
+    </w:p>
+    <w:p>
+      <w:pPr>
+        <w:ind w:left="1416" w:firstLine="24"/>
+        <w:jc w:val="both"/>
+      </w:pPr>
+    </w:p>
+    <w:p>
+      <w:pPr>
+        <w:ind w:left="1416" w:firstLine="24"/>
+        <w:jc w:val="both"/>
+      </w:pPr>
+    </w:p>
+    <w:p>
+      <w:pPr>
+        <w:pStyle w:val="PargrafodaLista"/>
+        <w:numPr>
+          <w:ilvl w:val="0"/>
+          <w:numId w:val="27"/>
+        </w:numPr>
+        <w:jc w:val="both"/>
+        <w:rPr>
+          <w:b/>
+          <w:bCs/>
+        </w:rPr>
+      </w:pPr>
+      <w:r>
+        <w:rPr>
+          <w:b/>
+          <w:bCs/>
+        </w:rPr>
+        <w:lastRenderedPageBreak/>
+        <w:t>Configurações do Treinamento:</w:t>
+      </w:r>
+    </w:p>
+    <w:p>
+      <w:pPr>
+        <w:spacing w:after="0"/>
+        <w:ind w:left="2160"/>
+        <w:jc w:val="center"/>
+        <w:rPr>
+          <w:sz w:val="18"/>
+          <w:szCs w:val="18"/>
+        </w:rPr>
+      </w:pPr>
+      <w:r>
+        <w:rPr>
+          <w:sz w:val="18"/>
+          <w:szCs w:val="18"/>
+        </w:rPr>
+        <w:t xml:space="preserve">Figura </w:t>
+      </w:r>
+      <w:r>
+        <w:rPr>
+          <w:sz w:val="18"/>
+          <w:szCs w:val="18"/>
+        </w:rPr>
+        <w:t>59</w:t>
+      </w:r>
+      <w:r>
+        <w:rPr>
+          <w:sz w:val="18"/>
+          <w:szCs w:val="18"/>
+        </w:rPr>
+        <w:t>: Parâmetros de treinamento</w:t>
+      </w:r>
+    </w:p>
+    <w:p>
+      <w:pPr>
+        <w:pStyle w:val="PargrafodaLista"/>
+        <w:ind w:left="2520"/>
+        <w:jc w:val="center"/>
+      </w:pPr>
+      <w:r>
+        <w:drawing>
+          <wp:inline distT="0" distB="0" distL="0" distR="0" wp14:anchorId="03D37249" wp14:editId="61D40407">
+            <wp:extent cx="1773141" cy="1930057"/>
+            <wp:effectExtent l="0" t="0" r="0" b="0"/>
+            <wp:docPr id="372366908" name="Imagem 1"/>
+            <wp:cNvGraphicFramePr>
+              <a:graphicFrameLocks xmlns:a="http://schemas.openxmlformats.org/drawingml/2006/main" noChangeAspect="1"/>
+            </wp:cNvGraphicFramePr>
+            <a:graphic xmlns:a="http://schemas.openxmlformats.org/drawingml/2006/main">
+              <a:graphicData uri="http://schemas.openxmlformats.org/drawingml/2006/picture">
+                <pic:pic xmlns:pic="http://schemas.openxmlformats.org/drawingml/2006/picture">
+                  <pic:nvPicPr>
+                    <pic:cNvPr id="1917487644" name=""/>
+                    <pic:cNvPicPr/>
+                  </pic:nvPicPr>
+                  <pic:blipFill>
+                    <a:blip r:embed="rId64"/>
+                    <a:stretch>
+                      <a:fillRect/>
+                    </a:stretch>
+                  </pic:blipFill>
+                  <pic:spPr>
+                    <a:xfrm>
+                      <a:off x="0" y="0"/>
+                      <a:ext cx="1777156" cy="1934428"/>
+                    </a:xfrm>
+                    <a:prstGeom prst="rect">
+                      <a:avLst/>
+                    </a:prstGeom>
+                  </pic:spPr>
+                </pic:pic>
+              </a:graphicData>
+            </a:graphic>
+          </wp:inline>
+        </w:drawing>
+      </w:r>
+    </w:p>
+    <w:p>
+      <w:pPr>
+        <w:pStyle w:val="PargrafodaLista"/>
+        <w:ind w:left="2520"/>
+        <w:jc w:val="both"/>
+      </w:pPr>
+    </w:p>
+    <w:p>
+      <w:pPr>
+        <w:pStyle w:val="PargrafodaLista"/>
+        <w:numPr>
+          <w:ilvl w:val="0"/>
+          <w:numId w:val="19"/>
+        </w:numPr>
+      </w:pPr>
+      <w:r>
+        <w:rPr>
+          <w:b/>
+          <w:bCs/>
+        </w:rPr>
+        <w:t>Resultados</w:t>
+      </w:r>
+      <w:r>
+        <w:rPr>
+          <w:b/>
+          <w:bCs/>
+        </w:rPr>
+        <w:t xml:space="preserve"> obtidos</w:t>
+      </w:r>
+      <w:r>
+        <w:rPr>
+          <w:b/>
+          <w:bCs/>
+        </w:rPr>
+        <w:t>:</w:t>
+      </w:r>
+      <w:r>
+        <w:rPr>
+          <w:b/>
+          <w:bCs/>
+        </w:rPr>
+        <w:t xml:space="preserve"> </w:t>
+      </w:r>
+      <w:r>
+        <w:rPr>
+          <w:i/>
+          <w:iCs/>
+        </w:rPr>
+        <w:t>Os</w:t>
+      </w:r>
+      <w:r>
+        <w:rPr>
+          <w:b/>
+          <w:bCs/>
+          <w:i/>
+          <w:iCs/>
+        </w:rPr>
+        <w:t xml:space="preserve"> </w:t>
+      </w:r>
+      <w:r>
+        <w:rPr>
+          <w:i/>
+          <w:iCs/>
+          <w:color w:val="000000" w:themeColor="text1"/>
+        </w:rPr>
+        <w:t xml:space="preserve">Logs do </w:t>
+      </w:r>
+      <w:proofErr w:type="spellStart"/>
+      <w:r>
+        <w:rPr>
+          <w:i/>
+          <w:iCs/>
+          <w:color w:val="000000" w:themeColor="text1"/>
+        </w:rPr>
+        <w:t>Pycharm</w:t>
+      </w:r>
+      <w:proofErr w:type="spellEnd"/>
+      <w:r>
+        <w:rPr>
+          <w:i/>
+          <w:iCs/>
+          <w:color w:val="000000" w:themeColor="text1"/>
+        </w:rPr>
+        <w:t xml:space="preserve"> estão localizados em </w:t>
+      </w:r>
+      <w:r>
+        <w:rPr>
+          <w:i/>
+          <w:iCs/>
+        </w:rPr>
+        <w:t>"</w:t>
+      </w:r>
+      <w:r>
+        <w:rPr>
+          <w:i/>
+          <w:iCs/>
+        </w:rPr>
+        <w:t xml:space="preserve">\Projeto-Classificadores\Main_Project\ResNet\Results\Experimento </w:t>
+      </w:r>
+      <w:r>
+        <w:rPr>
+          <w:i/>
+          <w:iCs/>
+        </w:rPr>
+        <w:t>1</w:t>
+      </w:r>
+      <w:r>
+        <w:rPr>
+          <w:i/>
+          <w:iCs/>
+        </w:rPr>
+        <w:t>4</w:t>
+      </w:r>
+      <w:r>
+        <w:rPr>
+          <w:i/>
+          <w:iCs/>
+        </w:rPr>
+        <w:t xml:space="preserve"> </w:t>
+      </w:r>
+      <w:r>
+        <w:rPr>
+          <w:i/>
+          <w:iCs/>
+        </w:rPr>
+        <w:t xml:space="preserve">- </w:t>
+      </w:r>
+      <w:proofErr w:type="spellStart"/>
+      <w:r>
+        <w:rPr>
+          <w:i/>
+          <w:iCs/>
+        </w:rPr>
+        <w:t>ResNet</w:t>
+      </w:r>
+      <w:proofErr w:type="spellEnd"/>
+      <w:r>
+        <w:rPr>
+          <w:i/>
+          <w:iCs/>
+        </w:rPr>
+        <w:t xml:space="preserve">\Experimento </w:t>
+      </w:r>
+      <w:r>
+        <w:rPr>
+          <w:i/>
+          <w:iCs/>
+        </w:rPr>
+        <w:t>1</w:t>
+      </w:r>
+      <w:r>
+        <w:rPr>
+          <w:i/>
+          <w:iCs/>
+        </w:rPr>
+        <w:t>4</w:t>
+      </w:r>
+      <w:r>
+        <w:rPr>
+          <w:i/>
+          <w:iCs/>
+        </w:rPr>
+        <w:t xml:space="preserve">- </w:t>
+      </w:r>
+      <w:proofErr w:type="spellStart"/>
+      <w:r>
+        <w:rPr>
+          <w:i/>
+          <w:iCs/>
+        </w:rPr>
+        <w:t>Pycharm</w:t>
+      </w:r>
+      <w:proofErr w:type="spellEnd"/>
+      <w:r>
+        <w:rPr>
+          <w:i/>
+          <w:iCs/>
+        </w:rPr>
+        <w:t xml:space="preserve"> LOG.txt"</w:t>
+      </w:r>
+    </w:p>
+    <w:p>
+      <w:pPr>
+        <w:pStyle w:val="PargrafodaLista"/>
+        <w:ind w:left="2160"/>
+      </w:pPr>
+    </w:p>
+    <w:p>
+      <w:pPr>
+        <w:pStyle w:val="PargrafodaLista"/>
+        <w:numPr>
+          <w:ilvl w:val="0"/>
+          <w:numId w:val="19"/>
+        </w:numPr>
+        <w:rPr>
+          <w:b/>
+          <w:bCs/>
+        </w:rPr>
+      </w:pPr>
+      <w:r>
+        <w:rPr>
+          <w:b/>
+          <w:bCs/>
+        </w:rPr>
+        <w:t>Analise dos resultados obtidos:</w:t>
+      </w:r>
+    </w:p>
+    <w:p>
+      <w:pPr>
+        <w:pStyle w:val="PargrafodaLista"/>
+        <w:ind w:left="2160"/>
+        <w:jc w:val="both"/>
+      </w:pPr>
+      <w:r>
+        <w:t xml:space="preserve">O resultado apresentou uma melhora expressiva, atingindo em torno de 98% de acurácia e, dessa vez, sua curva demonstra um platô claro, com a linha estando visivelmente </w:t>
+      </w:r>
+      <w:r>
+        <w:t>na horizontal, com baixíssimas variações.</w:t>
+      </w:r>
+      <w:r>
+        <w:t xml:space="preserve"> </w:t>
+      </w:r>
+    </w:p>
+    <w:p>
+      <w:pPr>
+        <w:spacing w:after="0"/>
+        <w:ind w:left="2160"/>
+        <w:jc w:val="center"/>
+        <w:rPr>
+          <w:sz w:val="18"/>
+          <w:szCs w:val="18"/>
+        </w:rPr>
+      </w:pPr>
+      <w:r>
+        <w:rPr>
+          <w:sz w:val="18"/>
+          <w:szCs w:val="18"/>
+        </w:rPr>
+        <w:t xml:space="preserve">Figura </w:t>
+      </w:r>
+      <w:r>
+        <w:rPr>
+          <w:sz w:val="18"/>
+          <w:szCs w:val="18"/>
+        </w:rPr>
+        <w:t>60</w:t>
+      </w:r>
+      <w:r>
+        <w:rPr>
+          <w:sz w:val="18"/>
+          <w:szCs w:val="18"/>
+        </w:rPr>
+        <w:t xml:space="preserve">: </w:t>
+      </w:r>
+      <w:r>
+        <w:rPr>
+          <w:sz w:val="18"/>
+          <w:szCs w:val="18"/>
+        </w:rPr>
+        <w:t>Curva de acurácia</w:t>
+      </w:r>
+    </w:p>
+    <w:p>
+      <w:pPr>
+        <w:pStyle w:val="PargrafodaLista"/>
+        <w:ind w:left="0"/>
+        <w:jc w:val="center"/>
+      </w:pPr>
+      <w:r>
+        <w:drawing>
+          <wp:inline distT="0" distB="0" distL="0" distR="0" wp14:anchorId="4CF3FD7D" wp14:editId="26510503">
+            <wp:extent cx="6177355" cy="2949934"/>
+            <wp:effectExtent l="0" t="0" r="0" b="3175"/>
+            <wp:docPr id="1586732790" name="Imagem 1"/>
+            <wp:cNvGraphicFramePr>
+              <a:graphicFrameLocks xmlns:a="http://schemas.openxmlformats.org/drawingml/2006/main" noChangeAspect="1"/>
+            </wp:cNvGraphicFramePr>
+            <a:graphic xmlns:a="http://schemas.openxmlformats.org/drawingml/2006/main">
+              <a:graphicData uri="http://schemas.openxmlformats.org/drawingml/2006/picture">
+                <pic:pic xmlns:pic="http://schemas.openxmlformats.org/drawingml/2006/picture">
+                  <pic:nvPicPr>
+                    <pic:cNvPr id="1586732790" name=""/>
+                    <pic:cNvPicPr/>
+                  </pic:nvPicPr>
+                  <pic:blipFill>
+                    <a:blip r:embed="rId66"/>
+                    <a:stretch>
+                      <a:fillRect/>
+                    </a:stretch>
+                  </pic:blipFill>
+                  <pic:spPr>
+                    <a:xfrm>
+                      <a:off x="0" y="0"/>
+                      <a:ext cx="6185598" cy="2953870"/>
+                    </a:xfrm>
+                    <a:prstGeom prst="rect">
+                      <a:avLst/>
+                    </a:prstGeom>
+                  </pic:spPr>
+                </pic:pic>
+              </a:graphicData>
+            </a:graphic>
+          </wp:inline>
+        </w:drawing>
+      </w:r>
+    </w:p>
+    <w:p>
+      <w:pPr>
+        <w:pStyle w:val="PargrafodaLista"/>
+        <w:ind w:left="2160"/>
+        <w:jc w:val="both"/>
+      </w:pPr>
+    </w:p>
+    <w:p>
+      <w:pPr>
+        <w:pStyle w:val="PargrafodaLista"/>
+        <w:ind w:left="2160"/>
+        <w:jc w:val="both"/>
+      </w:pPr>
+      <w:r>
+        <w:t xml:space="preserve">A perda também apresentou uma queda considerável, ficando em 0,25 para o treinamento e 0,65 para a validação. A curva da função perda para validação é visivelmente mais instável e é possível que esse comportamento ocorra pelo tamanho do conjunto de validação, mas ainda assim é um avanço considerável </w:t>
+      </w:r>
+    </w:p>
+    <w:p>
+      <w:pPr>
+        <w:pStyle w:val="PargrafodaLista"/>
+        <w:ind w:left="2160"/>
+        <w:jc w:val="both"/>
+      </w:pPr>
+    </w:p>
+    <w:p>
+      <w:pPr>
+        <w:pStyle w:val="PargrafodaLista"/>
+        <w:ind w:left="2160"/>
+        <w:jc w:val="both"/>
+      </w:pPr>
+    </w:p>
+    <w:p>
+      <w:pPr>
+        <w:spacing w:after="0"/>
+        <w:ind w:left="2160"/>
+        <w:jc w:val="center"/>
+        <w:rPr>
+          <w:sz w:val="18"/>
+          <w:szCs w:val="18"/>
+        </w:rPr>
+      </w:pPr>
+      <w:r>
+        <w:rPr>
+          <w:sz w:val="18"/>
+          <w:szCs w:val="18"/>
+        </w:rPr>
+        <w:lastRenderedPageBreak/>
+        <w:t xml:space="preserve">Figura </w:t>
+      </w:r>
+      <w:r>
+        <w:rPr>
+          <w:sz w:val="18"/>
+          <w:szCs w:val="18"/>
+        </w:rPr>
+        <w:t>61</w:t>
+      </w:r>
+      <w:r>
+        <w:rPr>
+          <w:sz w:val="18"/>
+          <w:szCs w:val="18"/>
+        </w:rPr>
+        <w:t xml:space="preserve">: </w:t>
+      </w:r>
+      <w:r>
+        <w:rPr>
+          <w:sz w:val="18"/>
+          <w:szCs w:val="18"/>
+        </w:rPr>
+        <w:t xml:space="preserve">Curva de </w:t>
+      </w:r>
+      <w:r>
+        <w:rPr>
+          <w:sz w:val="18"/>
+          <w:szCs w:val="18"/>
+        </w:rPr>
+        <w:t>perda</w:t>
+      </w:r>
+    </w:p>
+    <w:p>
+      <w:pPr>
+        <w:pStyle w:val="PargrafodaLista"/>
+        <w:ind w:left="0"/>
+        <w:jc w:val="center"/>
+      </w:pPr>
+      <w:r>
+        <w:drawing>
+          <wp:inline distT="0" distB="0" distL="0" distR="0" wp14:anchorId="75AA48CF" wp14:editId="3728DC02">
+            <wp:extent cx="5987333" cy="2865527"/>
+            <wp:effectExtent l="0" t="0" r="0" b="0"/>
+            <wp:docPr id="632584829" name="Imagem 1"/>
+            <wp:cNvGraphicFramePr>
+              <a:graphicFrameLocks xmlns:a="http://schemas.openxmlformats.org/drawingml/2006/main" noChangeAspect="1"/>
+            </wp:cNvGraphicFramePr>
+            <a:graphic xmlns:a="http://schemas.openxmlformats.org/drawingml/2006/main">
+              <a:graphicData uri="http://schemas.openxmlformats.org/drawingml/2006/picture">
+                <pic:pic xmlns:pic="http://schemas.openxmlformats.org/drawingml/2006/picture">
+                  <pic:nvPicPr>
+                    <pic:cNvPr id="632584829" name=""/>
+                    <pic:cNvPicPr/>
+                  </pic:nvPicPr>
+                  <pic:blipFill>
+                    <a:blip r:embed="rId67"/>
+                    <a:stretch>
+                      <a:fillRect/>
+                    </a:stretch>
+                  </pic:blipFill>
+                  <pic:spPr>
+                    <a:xfrm>
+                      <a:off x="0" y="0"/>
+                      <a:ext cx="6004134" cy="2873568"/>
+                    </a:xfrm>
+                    <a:prstGeom prst="rect">
+                      <a:avLst/>
+                    </a:prstGeom>
+                  </pic:spPr>
+                </pic:pic>
+              </a:graphicData>
+            </a:graphic>
+          </wp:inline>
+        </w:drawing>
+      </w:r>
+    </w:p>
+    <w:p>
+      <w:pPr>
+        <w:tabs>
+          <w:tab w:val="left" w:pos="4658"/>
+        </w:tabs>
+        <w:ind w:left="2124" w:firstLine="6"/>
+        <w:jc w:val="both"/>
+      </w:pPr>
+      <w:r>
+        <w:rPr>
+          <w:b/>
+          <w:bCs/>
+        </w:rPr>
+        <w:t>Conclusão:</w:t>
+      </w:r>
+      <w:r>
+        <w:t xml:space="preserve"> Este experimento ressalta a necessidade de ampliar ainda mais a quantidade de épocas de treinamento, de modo que seja possível extrair o desempenho máximo possível da rede.</w:t>
+      </w:r>
+    </w:p>
+    <w:p>
+      <w:pPr>
+        <w:pStyle w:val="PargrafodaLista"/>
+        <w:ind w:left="1440"/>
+        <w:jc w:val="both"/>
+        <w:rPr>
+          <w:b/>
+          <w:bCs/>
+        </w:rPr>
+      </w:pPr>
     </w:p>
     <w:p>
       <w:pPr>
@@ -19295,7 +20356,7 @@
         <v:path o:extrusionok="f" gradientshapeok="t" o:connecttype="rect"/>
         <o:lock v:ext="edit" aspectratio="t"/>
       </v:shapetype>
-      <v:shape id="_x0000_i1035" type="#_x0000_t75" style="width:693.1pt;height:487.7pt;visibility:visible;mso-wrap-style:square" o:bullet="t">
+      <v:shape id="_x0000_i1037" type="#_x0000_t75" style="width:691.2pt;height:489.6pt;visibility:visible;mso-wrap-style:square" o:bullet="t">
         <v:imagedata r:id="rId1" o:title="" croptop="19686f" cropbottom="43833f" cropleft="8606f" cropright="55951f"/>
       </v:shape>
     </w:pict>

</xml_diff>

<commit_message>
Atualização da documentação 03/03
</commit_message>
<xml_diff>
--- a/Documentation/Documentacao Unificada de Experimentos.docx
+++ b/Documentation/Documentacao Unificada de Experimentos.docx
@@ -7982,7 +7982,35 @@
           <w:b/>
           <w:bCs/>
         </w:rPr>
-        <w:t>EXPERIMENTO 2 (RESNET)</w:t>
+        <w:t xml:space="preserve">EXPERIMENTO </w:t>
+      </w:r>
+      <w:r>
+        <w:rPr>
+          <w:b/>
+          <w:bCs/>
+        </w:rPr>
+        <w:t>2</w:t>
+      </w:r>
+      <w:r>
+        <w:rPr>
+          <w:b/>
+          <w:bCs/>
+        </w:rPr>
+        <w:t xml:space="preserve"> (</w:t>
+      </w:r>
+      <w:r>
+        <w:rPr>
+          <w:b/>
+          <w:bCs/>
+        </w:rPr>
+        <w:t>RESNET</w:t>
+      </w:r>
+      <w:r>
+        <w:rPr>
+          <w:b/>
+          <w:bCs/>
+        </w:rPr>
+        <w:t>)</w:t>
       </w:r>
       <w:r>
         <w:rPr>
@@ -19234,6 +19262,9 @@
         <w:jc w:val="center"/>
       </w:pPr>
       <w:r>
+        <w:rPr>
+          <w:noProof/>
+        </w:rPr>
         <w:drawing>
           <wp:inline distT="0" distB="0" distL="0" distR="0" wp14:anchorId="3AB81ED3" wp14:editId="130AE787">
             <wp:extent cx="1773141" cy="1930057"/>
@@ -19375,21 +19406,7 @@
           <w:i/>
           <w:iCs/>
         </w:rPr>
-        <w:t>1</w:t>
-      </w:r>
-      <w:r>
-        <w:rPr>
-          <w:i/>
-          <w:iCs/>
-        </w:rPr>
-        <w:t>3</w:t>
-      </w:r>
-      <w:r>
-        <w:rPr>
-          <w:i/>
-          <w:iCs/>
-        </w:rPr>
-        <w:t xml:space="preserve"> </w:t>
+        <w:t xml:space="preserve">13 </w:t>
       </w:r>
       <w:r>
         <w:rPr>
@@ -19419,14 +19436,7 @@
           <w:i/>
           <w:iCs/>
         </w:rPr>
-        <w:t>1</w:t>
-      </w:r>
-      <w:r>
-        <w:rPr>
-          <w:i/>
-          <w:iCs/>
-        </w:rPr>
-        <w:t>3</w:t>
+        <w:t>13</w:t>
       </w:r>
       <w:r>
         <w:rPr>
@@ -19537,6 +19547,9 @@
         <w:jc w:val="center"/>
       </w:pPr>
       <w:r>
+        <w:rPr>
+          <w:noProof/>
+        </w:rPr>
         <w:drawing>
           <wp:inline distT="0" distB="0" distL="0" distR="0" wp14:anchorId="56DA2DD4" wp14:editId="79AA8367">
             <wp:extent cx="6054409" cy="1558455"/>
@@ -19680,16 +19693,7 @@
         <w:t xml:space="preserve">deste experimento é </w:t>
       </w:r>
       <w:r>
-        <w:t xml:space="preserve">repetir o experimento 13 ampliando consideravelmente a quantidade de épocas, </w:t>
-      </w:r>
-      <w:r>
-        <w:t>tenta</w:t>
-      </w:r>
-      <w:r>
-        <w:t>ndo novamente</w:t>
-      </w:r>
-      <w:r>
-        <w:t xml:space="preserve"> alcançar um platô nos resultados, utilizando a configuração que obteve a maior eficiência dentre os experimentos anteriores (Variante 18 com Batch </w:t>
+        <w:t xml:space="preserve">repetir o experimento 13 ampliando consideravelmente a quantidade de épocas, tentando novamente alcançar um platô nos resultados, utilizando a configuração que obteve a maior eficiência dentre os experimentos anteriores (Variante 18 com Batch </w:t>
       </w:r>
       <w:proofErr w:type="spellStart"/>
       <w:r>
@@ -19773,6 +19777,9 @@
         <w:jc w:val="center"/>
       </w:pPr>
       <w:r>
+        <w:rPr>
+          <w:noProof/>
+        </w:rPr>
         <w:drawing>
           <wp:inline distT="0" distB="0" distL="0" distR="0" wp14:anchorId="03D37249" wp14:editId="61D40407">
             <wp:extent cx="1773141" cy="1930057"/>
@@ -19914,21 +19921,7 @@
           <w:i/>
           <w:iCs/>
         </w:rPr>
-        <w:t>1</w:t>
-      </w:r>
-      <w:r>
-        <w:rPr>
-          <w:i/>
-          <w:iCs/>
-        </w:rPr>
-        <w:t>4</w:t>
-      </w:r>
-      <w:r>
-        <w:rPr>
-          <w:i/>
-          <w:iCs/>
-        </w:rPr>
-        <w:t xml:space="preserve"> </w:t>
+        <w:t xml:space="preserve">14 </w:t>
       </w:r>
       <w:r>
         <w:rPr>
@@ -19958,14 +19951,7 @@
           <w:i/>
           <w:iCs/>
         </w:rPr>
-        <w:t>1</w:t>
-      </w:r>
-      <w:r>
-        <w:rPr>
-          <w:i/>
-          <w:iCs/>
-        </w:rPr>
-        <w:t>4</w:t>
+        <w:t>14</w:t>
       </w:r>
       <w:r>
         <w:rPr>
@@ -20079,6 +20065,9 @@
         <w:jc w:val="center"/>
       </w:pPr>
       <w:r>
+        <w:rPr>
+          <w:noProof/>
+        </w:rPr>
         <w:drawing>
           <wp:inline distT="0" distB="0" distL="0" distR="0" wp14:anchorId="4CF3FD7D" wp14:editId="26510503">
             <wp:extent cx="6177355" cy="2949934"/>
@@ -20184,14 +20173,7 @@
           <w:sz w:val="18"/>
           <w:szCs w:val="18"/>
         </w:rPr>
-        <w:t xml:space="preserve">Curva de </w:t>
-      </w:r>
-      <w:r>
-        <w:rPr>
-          <w:sz w:val="18"/>
-          <w:szCs w:val="18"/>
-        </w:rPr>
-        <w:t>perda</w:t>
+        <w:t>Curva de perda</w:t>
       </w:r>
     </w:p>
     <w:p>
@@ -20201,6 +20183,9 @@
         <w:jc w:val="center"/>
       </w:pPr>
       <w:r>
+        <w:rPr>
+          <w:noProof/>
+        </w:rPr>
         <w:drawing>
           <wp:inline distT="0" distB="0" distL="0" distR="0" wp14:anchorId="75AA48CF" wp14:editId="3728DC02">
             <wp:extent cx="5987333" cy="2865527"/>
@@ -20356,7 +20341,7 @@
         <v:path o:extrusionok="f" gradientshapeok="t" o:connecttype="rect"/>
         <o:lock v:ext="edit" aspectratio="t"/>
       </v:shapetype>
-      <v:shape id="_x0000_i1037" type="#_x0000_t75" style="width:691.2pt;height:489.6pt;visibility:visible;mso-wrap-style:square" o:bullet="t">
+      <v:shape id="_x0000_i1033" type="#_x0000_t75" style="width:692.95pt;height:487.3pt;visibility:visible;mso-wrap-style:square" o:bullet="t">
         <v:imagedata r:id="rId1" o:title="" croptop="19686f" cropbottom="43833f" cropleft="8606f" cropright="55951f"/>
       </v:shape>
     </w:pict>

</xml_diff>